<commit_message>
docs: update project report for Supabase backend integration
Replace JSON POC documentation with Supabase Auth, PostgreSQL schema, RLS, deployment, and server-side data access details.

Co-authored-by: Cursor <cursoragent@cursor.com>
</commit_message>
<xml_diff>
--- a/docs/driveease-project-report.docx
+++ b/docs/driveease-project-report.docx
@@ -31,7 +31,7 @@
           <w:b w:val="0"/>
           <w:sz w:val="28"/>
         </w:rPr>
-        <w:t>A Next.js Proof-of-Concept for Online Car Booking and Admin Management</w:t>
+        <w:t>A Next.js Full-Stack Application with Supabase Auth and PostgreSQL Backend</w:t>
       </w:r>
     </w:p>
     <w:p/>
@@ -1349,7 +1349,7 @@
           <w:b w:val="0"/>
           <w:sz w:val="24"/>
         </w:rPr>
-        <w:t>DriveEase is a web-based car rental application developed as a proof-of-concept (POC) using Next.js 14 with the App Router. The system allows visitors to browse a catalog of rental cars, apply filters by name, fuel type, seats, and price, and view detailed car information. Registered users can log in with mock credentials, book cars by selecting pickup and return dates, and view their booking history. Administrators access a dedicated panel to view dashboard statistics, manage the car fleet (create, update, delete), and update booking statuses.</w:t>
+        <w:t>DriveEase is a web-based car rental application developed as a proof-of-concept (POC) using Next.js 14 with the App Router. The system allows visitors to browse a catalog of rental cars, apply filters by name, fuel type, seats, and price, and Registered users authenticate with Supabase Auth, book cars by selecting pickup and return dates, and view their booking history. Administrators access a dedicated panel to view dashboard statistics, manage the car fleet (create, update, delete), and update booking statuses.</w:t>
       </w:r>
     </w:p>
     <w:p>
@@ -1362,7 +1362,7 @@
           <w:b w:val="0"/>
           <w:sz w:val="24"/>
         </w:rPr>
-        <w:t>The application uses TypeScript for type safety, Tailwind CSS and shadcn/ui for responsive UI components, and JSON files for data persistence instead of a production database. Authentication is implemented using HMAC-signed HTTP-only session cookies with middleware-based route protection. Server Actions handle booking creation and admin mutations with server-side file writes.</w:t>
+        <w:t>The application uses TypeScript for type safety, Tailwind CSS and shadcn/ui for responsive UI components, and Supabase PostgreSQL for persistent storage. Authentication is implemented using Supabase Auth with @supabase/ssr for server-side session management and middleware-based route protection. Row Level Security (RLS) policies enforce user and admin access at the database layer.</w:t>
       </w:r>
     </w:p>
     <w:p>
@@ -1375,7 +1375,7 @@
           <w:b w:val="0"/>
           <w:sz w:val="24"/>
         </w:rPr>
-        <w:t>This POC demonstrates the complete product flow from catalog browsing through booking and administration. It is intended for local demonstration and learning purposes only and is not production-ready due to plain-text password storage and file-based persistence limitations.</w:t>
+        <w:t>All data fetching and mutations run on the Next.js server via Server Components and Server Actions. The application supports local development and deployment to Vercel with environment-based Supabase configuration.</w:t>
       </w:r>
     </w:p>
     <w:p>
@@ -1524,7 +1524,7 @@
           <w:b w:val="0"/>
           <w:sz w:val="24"/>
         </w:rPr>
-        <w:t>Provide mock authentication with user and admin roles, session cookies, and protected routes (Phase 3).</w:t>
+        <w:t>Provide Supabase Auth login with user and admin roles, session cookies, and protected routes (Phase 3).</w:t>
       </w:r>
     </w:p>
     <w:p>
@@ -1568,6 +1568,19 @@
     </w:p>
     <w:p>
       <w:pPr>
+        <w:pStyle w:val="ListBullet"/>
+      </w:pPr>
+      <w:r>
+        <w:rPr>
+          <w:rFonts w:ascii="Times New Roman" w:hAnsi="Times New Roman" w:eastAsia="Times New Roman"/>
+          <w:b w:val="0"/>
+          <w:sz w:val="24"/>
+        </w:rPr>
+        <w:t>Integrate Supabase PostgreSQL for cars, bookings, and profiles with RLS policies (Backend Integration).</w:t>
+      </w:r>
+    </w:p>
+    <w:p>
+      <w:pPr>
         <w:spacing w:before="200" w:after="120"/>
       </w:pPr>
       <w:r>
@@ -1589,7 +1602,7 @@
           <w:b w:val="0"/>
           <w:sz w:val="24"/>
         </w:rPr>
-        <w:t>DriveEase is scoped as a local demonstration POC. Data is stored in JSON files (cars.json, users.json, bookings.json) on the server filesystem. Passwords are stored in plain text for demo purposes only. The application does not integrate payment gateways, email notifications, or a production database. All features are designed to run on a developer machine using npm run dev.</w:t>
+        <w:t>DriveEase is a full-stack car rental web application. Data is stored in Supabase PostgreSQL tables (cars, bookings, profiles) with Row Level Security. User authentication is handled by Supabase Auth with seeded demo accounts for development. The application does not integrate payment gateways or email notifications. It runs locally with npm run dev and can be deployed to Vercel.</w:t>
       </w:r>
     </w:p>
     <w:p>
@@ -1660,7 +1673,7 @@
           <w:b w:val="0"/>
           <w:sz w:val="24"/>
         </w:rPr>
-        <w:t>DriveEase replaces the manual workflow with a single web application. Visitors browse cars at /cars, filter by criteria, and view details at /cars/[id]. Logged-in users book cars at /cars/[id]/book and view reservations at /my-bookings. Administrators manage the fleet and bookings at /admin/dashboard, /admin/cars, and /admin/bookings.</w:t>
+        <w:t>DriveEase replaces the manual workflow with a single web application backed by Supabase. Visitors browse cars at /cars; logged-in users book at /cars/[id]/book and view reservations at /my-bookings; administrators manage fleet and bookings at /admin/*. Data flows through Server Components and Server Actions to Supabase PostgreSQL. Middleware refreshes the Supabase session and enforces access.</w:t>
       </w:r>
     </w:p>
     <w:p>
@@ -1900,7 +1913,7 @@
           <w:b w:val="0"/>
           <w:sz w:val="24"/>
         </w:rPr>
-        <w:t>Technical feasibility: Next.js 14, React 18, and TypeScript provide a mature ecosystem.</w:t>
+        <w:t>Technical feasibility: Next.js 14, React 18, TypeScript, and Supabase provide a mature full-stack ecosystem.</w:t>
       </w:r>
     </w:p>
     <w:p>
@@ -1913,7 +1926,7 @@
           <w:b w:val="0"/>
           <w:sz w:val="24"/>
         </w:rPr>
-        <w:t>Operational feasibility: Demo credentials allow immediate testing without registration.</w:t>
+        <w:t>Operational feasibility: Seeded demo credentials allow immediate testing via Supabase Auth.</w:t>
       </w:r>
     </w:p>
     <w:p>
@@ -1926,7 +1939,7 @@
           <w:b w:val="0"/>
           <w:sz w:val="24"/>
         </w:rPr>
-        <w:t>Economic feasibility: The entire stack is open source with no licensing costs for local development.</w:t>
+        <w:t>Economic feasibility: Open-source stack with Supabase free tier for development and deployment.</w:t>
       </w:r>
     </w:p>
     <w:p>
@@ -2264,6 +2277,38 @@
                 <w:b w:val="0"/>
                 <w:sz w:val="24"/>
               </w:rPr>
+              <w:t>Supabase</w:t>
+            </w:r>
+          </w:p>
+        </w:tc>
+        <w:tc>
+          <w:tcPr>
+            <w:tcW w:type="dxa" w:w="4680"/>
+          </w:tcPr>
+          <w:p>
+            <w:r>
+              <w:rPr>
+                <w:rFonts w:ascii="Times New Roman" w:hAnsi="Times New Roman" w:eastAsia="Times New Roman"/>
+                <w:b w:val="0"/>
+                <w:sz w:val="24"/>
+              </w:rPr>
+              <w:t>Cloud project (PostgreSQL + Auth)</w:t>
+            </w:r>
+          </w:p>
+        </w:tc>
+      </w:tr>
+      <w:tr>
+        <w:tc>
+          <w:tcPr>
+            <w:tcW w:type="dxa" w:w="4680"/>
+          </w:tcPr>
+          <w:p>
+            <w:r>
+              <w:rPr>
+                <w:rFonts w:ascii="Times New Roman" w:hAnsi="Times New Roman" w:eastAsia="Times New Roman"/>
+                <w:b w:val="0"/>
+                <w:sz w:val="24"/>
+              </w:rPr>
               <w:t>npm</w:t>
             </w:r>
           </w:p>
@@ -2495,7 +2540,7 @@
                 <w:b w:val="0"/>
                 <w:sz w:val="24"/>
               </w:rPr>
-              <w:t>10 mock cars, grid listing, search/filter, detail page</w:t>
+              <w:t>Car catalog from Supabase, grid, search/filter, detail page</w:t>
             </w:r>
           </w:p>
         </w:tc>
@@ -2542,7 +2587,7 @@
                 <w:b w:val="0"/>
                 <w:sz w:val="24"/>
               </w:rPr>
-              <w:t>Mock login, signed session cookie, middleware guards</w:t>
+              <w:t>Supabase Auth login, session cookies, middleware guards</w:t>
             </w:r>
           </w:p>
         </w:tc>
@@ -2703,6 +2748,53 @@
           </w:p>
         </w:tc>
       </w:tr>
+      <w:tr>
+        <w:tc>
+          <w:tcPr>
+            <w:tcW w:type="dxa" w:w="3120"/>
+          </w:tcPr>
+          <w:p>
+            <w:r>
+              <w:rPr>
+                <w:rFonts w:ascii="Times New Roman" w:hAnsi="Times New Roman" w:eastAsia="Times New Roman"/>
+                <w:b w:val="0"/>
+                <w:sz w:val="24"/>
+              </w:rPr>
+              <w:t>Backend</w:t>
+            </w:r>
+          </w:p>
+        </w:tc>
+        <w:tc>
+          <w:tcPr>
+            <w:tcW w:type="dxa" w:w="3120"/>
+          </w:tcPr>
+          <w:p>
+            <w:r>
+              <w:rPr>
+                <w:rFonts w:ascii="Times New Roman" w:hAnsi="Times New Roman" w:eastAsia="Times New Roman"/>
+                <w:b w:val="0"/>
+                <w:sz w:val="24"/>
+              </w:rPr>
+              <w:t>Supabase schema, RLS, seed script, server data layer</w:t>
+            </w:r>
+          </w:p>
+        </w:tc>
+        <w:tc>
+          <w:tcPr>
+            <w:tcW w:type="dxa" w:w="3120"/>
+          </w:tcPr>
+          <w:p>
+            <w:r>
+              <w:rPr>
+                <w:rFonts w:ascii="Times New Roman" w:hAnsi="Times New Roman" w:eastAsia="Times New Roman"/>
+                <w:b w:val="0"/>
+                <w:sz w:val="24"/>
+              </w:rPr>
+              <w:t>Implemented</w:t>
+            </w:r>
+          </w:p>
+        </w:tc>
+      </w:tr>
     </w:tbl>
     <w:p/>
     <w:p>
@@ -2741,7 +2833,7 @@
           <w:b w:val="0"/>
           <w:sz w:val="24"/>
         </w:rPr>
-        <w:t>Role-based access control via middleware and layout guards.</w:t>
+        <w:t>Server-side data access: all Supabase queries run on the Next.js server.</w:t>
       </w:r>
     </w:p>
     <w:p>
@@ -3154,6 +3246,100 @@
                 <w:b w:val="0"/>
                 <w:sz w:val="24"/>
               </w:rPr>
+              <w:t>Backend</w:t>
+            </w:r>
+          </w:p>
+        </w:tc>
+        <w:tc>
+          <w:tcPr>
+            <w:tcW w:type="dxa" w:w="3120"/>
+          </w:tcPr>
+          <w:p>
+            <w:r>
+              <w:rPr>
+                <w:rFonts w:ascii="Times New Roman" w:hAnsi="Times New Roman" w:eastAsia="Times New Roman"/>
+                <w:b w:val="0"/>
+                <w:sz w:val="24"/>
+              </w:rPr>
+              <w:t>Supabase</w:t>
+            </w:r>
+          </w:p>
+        </w:tc>
+        <w:tc>
+          <w:tcPr>
+            <w:tcW w:type="dxa" w:w="3120"/>
+          </w:tcPr>
+          <w:p>
+            <w:r>
+              <w:rPr>
+                <w:rFonts w:ascii="Times New Roman" w:hAnsi="Times New Roman" w:eastAsia="Times New Roman"/>
+                <w:b w:val="0"/>
+                <w:sz w:val="24"/>
+              </w:rPr>
+              <w:t>PostgreSQL database + Auth</w:t>
+            </w:r>
+          </w:p>
+        </w:tc>
+      </w:tr>
+      <w:tr>
+        <w:tc>
+          <w:tcPr>
+            <w:tcW w:type="dxa" w:w="3120"/>
+          </w:tcPr>
+          <w:p>
+            <w:r>
+              <w:rPr>
+                <w:rFonts w:ascii="Times New Roman" w:hAnsi="Times New Roman" w:eastAsia="Times New Roman"/>
+                <w:b w:val="0"/>
+                <w:sz w:val="24"/>
+              </w:rPr>
+              <w:t>Supabase Client</w:t>
+            </w:r>
+          </w:p>
+        </w:tc>
+        <w:tc>
+          <w:tcPr>
+            <w:tcW w:type="dxa" w:w="3120"/>
+          </w:tcPr>
+          <w:p>
+            <w:r>
+              <w:rPr>
+                <w:rFonts w:ascii="Times New Roman" w:hAnsi="Times New Roman" w:eastAsia="Times New Roman"/>
+                <w:b w:val="0"/>
+                <w:sz w:val="24"/>
+              </w:rPr>
+              <w:t>@supabase/ssr</w:t>
+            </w:r>
+          </w:p>
+        </w:tc>
+        <w:tc>
+          <w:tcPr>
+            <w:tcW w:type="dxa" w:w="3120"/>
+          </w:tcPr>
+          <w:p>
+            <w:r>
+              <w:rPr>
+                <w:rFonts w:ascii="Times New Roman" w:hAnsi="Times New Roman" w:eastAsia="Times New Roman"/>
+                <w:b w:val="0"/>
+                <w:sz w:val="24"/>
+              </w:rPr>
+              <w:t>Server-side session and queries</w:t>
+            </w:r>
+          </w:p>
+        </w:tc>
+      </w:tr>
+      <w:tr>
+        <w:tc>
+          <w:tcPr>
+            <w:tcW w:type="dxa" w:w="3120"/>
+          </w:tcPr>
+          <w:p>
+            <w:r>
+              <w:rPr>
+                <w:rFonts w:ascii="Times New Roman" w:hAnsi="Times New Roman" w:eastAsia="Times New Roman"/>
+                <w:b w:val="0"/>
+                <w:sz w:val="24"/>
+              </w:rPr>
               <w:t>Unit Tests</w:t>
             </w:r>
           </w:p>
@@ -3248,7 +3434,7 @@
                 <w:b w:val="0"/>
                 <w:sz w:val="24"/>
               </w:rPr>
-              <w:t>Persistence</w:t>
+              <w:t>Deployment</w:t>
             </w:r>
           </w:p>
         </w:tc>
@@ -3263,7 +3449,7 @@
                 <w:b w:val="0"/>
                 <w:sz w:val="24"/>
               </w:rPr>
-              <w:t>JSON files</w:t>
+              <w:t>Vercel (optional)</w:t>
             </w:r>
           </w:p>
         </w:tc>
@@ -3278,7 +3464,7 @@
                 <w:b w:val="0"/>
                 <w:sz w:val="24"/>
               </w:rPr>
-              <w:t>cars, users, bookings data</w:t>
+              <w:t>Hosting with Supabase env vars</w:t>
             </w:r>
           </w:p>
         </w:tc>
@@ -3308,7 +3494,7 @@
           <w:b w:val="0"/>
           <w:sz w:val="24"/>
         </w:rPr>
-        <w:t>The application follows a layered architecture: (1) Presentation layer (app/ + components/) for pages and UI; (2) Business logic layer (lib/) for auth, data access, and booking calculations; (3) Data layer (data/*.json) for persistence; (4) Security layer (middleware.ts) for route protection and session verification.</w:t>
+        <w:t>The application follows a layered architecture: (1) Presentation layer (app/ + components/) for pages and UI; (2) Business logic layer (lib/) for auth and Supabase data access; (3) Supabase layer (lib/supabase/) for server client and middleware session refresh; (4) Data layer (Supabase PostgreSQL) with RLS; (5) Security layer (middleware.ts + RLS) for route and database protection.</w:t>
       </w:r>
     </w:p>
     <w:p>
@@ -3321,7 +3507,7 @@
           <w:b w:val="0"/>
           <w:sz w:val="24"/>
         </w:rPr>
-        <w:t>Server Actions in app/actions/ handle mutations (login, logout, create booking, admin CRUD) and write to JSON files or cookies on the server.</w:t>
+        <w:t>Server Actions in app/actions/ handle mutations (login, logout, create booking, admin CRUD) by calling Supabase on the server with the user's session cookie.</w:t>
       </w:r>
     </w:p>
     <w:p>
@@ -3437,7 +3623,7 @@
                 <w:b w:val="0"/>
                 <w:sz w:val="24"/>
               </w:rPr>
-              <w:t>Credential verification, session user lookup</w:t>
+              <w:t>Map Supabase user to session payload</w:t>
             </w:r>
           </w:p>
         </w:tc>
@@ -3454,7 +3640,7 @@
                 <w:b w:val="0"/>
                 <w:sz w:val="24"/>
               </w:rPr>
-              <w:t>Session token</w:t>
+              <w:t>Supabase server</w:t>
             </w:r>
           </w:p>
         </w:tc>
@@ -3469,7 +3655,7 @@
                 <w:b w:val="0"/>
                 <w:sz w:val="24"/>
               </w:rPr>
-              <w:t>lib/session-token.ts</w:t>
+              <w:t>lib/supabase/server.ts</w:t>
             </w:r>
           </w:p>
         </w:tc>
@@ -3484,7 +3670,54 @@
                 <w:b w:val="0"/>
                 <w:sz w:val="24"/>
               </w:rPr>
-              <w:t>HMAC-signed token create/verify</w:t>
+              <w:t>Server Supabase client with cookies</w:t>
+            </w:r>
+          </w:p>
+        </w:tc>
+      </w:tr>
+      <w:tr>
+        <w:tc>
+          <w:tcPr>
+            <w:tcW w:type="dxa" w:w="3120"/>
+          </w:tcPr>
+          <w:p>
+            <w:r>
+              <w:rPr>
+                <w:rFonts w:ascii="Times New Roman" w:hAnsi="Times New Roman" w:eastAsia="Times New Roman"/>
+                <w:b w:val="0"/>
+                <w:sz w:val="24"/>
+              </w:rPr>
+              <w:t>Supabase middleware</w:t>
+            </w:r>
+          </w:p>
+        </w:tc>
+        <w:tc>
+          <w:tcPr>
+            <w:tcW w:type="dxa" w:w="3120"/>
+          </w:tcPr>
+          <w:p>
+            <w:r>
+              <w:rPr>
+                <w:rFonts w:ascii="Times New Roman" w:hAnsi="Times New Roman" w:eastAsia="Times New Roman"/>
+                <w:b w:val="0"/>
+                <w:sz w:val="24"/>
+              </w:rPr>
+              <w:t>lib/supabase/middleware.ts</w:t>
+            </w:r>
+          </w:p>
+        </w:tc>
+        <w:tc>
+          <w:tcPr>
+            <w:tcW w:type="dxa" w:w="3120"/>
+          </w:tcPr>
+          <w:p>
+            <w:r>
+              <w:rPr>
+                <w:rFonts w:ascii="Times New Roman" w:hAnsi="Times New Roman" w:eastAsia="Times New Roman"/>
+                <w:b w:val="0"/>
+                <w:sz w:val="24"/>
+              </w:rPr>
+              <w:t>Refresh auth session</w:t>
             </w:r>
           </w:p>
         </w:tc>
@@ -3531,7 +3764,54 @@
                 <w:b w:val="0"/>
                 <w:sz w:val="24"/>
               </w:rPr>
-              <w:t>Car listing, filtering, get by ID</w:t>
+              <w:t>Async car listing from Supabase</w:t>
+            </w:r>
+          </w:p>
+        </w:tc>
+      </w:tr>
+      <w:tr>
+        <w:tc>
+          <w:tcPr>
+            <w:tcW w:type="dxa" w:w="3120"/>
+          </w:tcPr>
+          <w:p>
+            <w:r>
+              <w:rPr>
+                <w:rFonts w:ascii="Times New Roman" w:hAnsi="Times New Roman" w:eastAsia="Times New Roman"/>
+                <w:b w:val="0"/>
+                <w:sz w:val="24"/>
+              </w:rPr>
+              <w:t>Car catalog</w:t>
+            </w:r>
+          </w:p>
+        </w:tc>
+        <w:tc>
+          <w:tcPr>
+            <w:tcW w:type="dxa" w:w="3120"/>
+          </w:tcPr>
+          <w:p>
+            <w:r>
+              <w:rPr>
+                <w:rFonts w:ascii="Times New Roman" w:hAnsi="Times New Roman" w:eastAsia="Times New Roman"/>
+                <w:b w:val="0"/>
+                <w:sz w:val="24"/>
+              </w:rPr>
+              <w:t>lib/car-catalog.ts</w:t>
+            </w:r>
+          </w:p>
+        </w:tc>
+        <w:tc>
+          <w:tcPr>
+            <w:tcW w:type="dxa" w:w="3120"/>
+          </w:tcPr>
+          <w:p>
+            <w:r>
+              <w:rPr>
+                <w:rFonts w:ascii="Times New Roman" w:hAnsi="Times New Roman" w:eastAsia="Times New Roman"/>
+                <w:b w:val="0"/>
+                <w:sz w:val="24"/>
+              </w:rPr>
+              <w:t>Client-safe filter helpers</w:t>
             </w:r>
           </w:p>
         </w:tc>
@@ -3578,7 +3858,7 @@
                 <w:b w:val="0"/>
                 <w:sz w:val="24"/>
               </w:rPr>
-              <w:t>Admin car CRUD via filesystem</w:t>
+              <w:t>Admin car CRUD via Supabase</w:t>
             </w:r>
           </w:p>
         </w:tc>
@@ -3625,7 +3905,7 @@
                 <w:b w:val="0"/>
                 <w:sz w:val="24"/>
               </w:rPr>
-              <w:t>Read/write bookings, detailed joins</w:t>
+              <w:t>Read/write bookings with joins</w:t>
             </w:r>
           </w:p>
         </w:tc>
@@ -3672,7 +3952,7 @@
                 <w:b w:val="0"/>
                 <w:sz w:val="24"/>
               </w:rPr>
-              <w:t>Rental days and total price calculation</w:t>
+              <w:t>Rental days and total price</w:t>
             </w:r>
           </w:p>
         </w:tc>
@@ -3766,7 +4046,54 @@
                 <w:b w:val="0"/>
                 <w:sz w:val="24"/>
               </w:rPr>
-              <w:t>Login redirect, route protection</w:t>
+              <w:t>Session refresh and route protection</w:t>
+            </w:r>
+          </w:p>
+        </w:tc>
+      </w:tr>
+      <w:tr>
+        <w:tc>
+          <w:tcPr>
+            <w:tcW w:type="dxa" w:w="3120"/>
+          </w:tcPr>
+          <w:p>
+            <w:r>
+              <w:rPr>
+                <w:rFonts w:ascii="Times New Roman" w:hAnsi="Times New Roman" w:eastAsia="Times New Roman"/>
+                <w:b w:val="0"/>
+                <w:sz w:val="24"/>
+              </w:rPr>
+              <w:t>Seed script</w:t>
+            </w:r>
+          </w:p>
+        </w:tc>
+        <w:tc>
+          <w:tcPr>
+            <w:tcW w:type="dxa" w:w="3120"/>
+          </w:tcPr>
+          <w:p>
+            <w:r>
+              <w:rPr>
+                <w:rFonts w:ascii="Times New Roman" w:hAnsi="Times New Roman" w:eastAsia="Times New Roman"/>
+                <w:b w:val="0"/>
+                <w:sz w:val="24"/>
+              </w:rPr>
+              <w:t>scripts/seed-supabase.ts</w:t>
+            </w:r>
+          </w:p>
+        </w:tc>
+        <w:tc>
+          <w:tcPr>
+            <w:tcW w:type="dxa" w:w="3120"/>
+          </w:tcPr>
+          <w:p>
+            <w:r>
+              <w:rPr>
+                <w:rFonts w:ascii="Times New Roman" w:hAnsi="Times New Roman" w:eastAsia="Times New Roman"/>
+                <w:b w:val="0"/>
+                <w:sz w:val="24"/>
+              </w:rPr>
+              <w:t>Seed demo users, cars, bookings</w:t>
             </w:r>
           </w:p>
         </w:tc>
@@ -4298,7 +4625,7 @@
           <w:b/>
           <w:sz w:val="28"/>
         </w:rPr>
-        <w:t>9.2 Data Model</w:t>
+        <w:t>9.2 Data Model (Supabase PostgreSQL)</w:t>
       </w:r>
     </w:p>
     <w:p>
@@ -4311,7 +4638,7 @@
           <w:b w:val="0"/>
           <w:sz w:val="24"/>
         </w:rPr>
-        <w:t>User (data/users.json): id, email, password, role, name</w:t>
+        <w:t>auth.users: managed by Supabase Auth; role in app_metadata (user | admin)</w:t>
       </w:r>
     </w:p>
     <w:p>
@@ -4324,7 +4651,7 @@
           <w:b w:val="0"/>
           <w:sz w:val="24"/>
         </w:rPr>
-        <w:t>Car (data/cars.json): id, name, seats, fuel, price, available, images, description</w:t>
+        <w:t>profiles: id (uuid), name, email, created_at</w:t>
       </w:r>
     </w:p>
     <w:p>
@@ -4337,7 +4664,20 @@
           <w:b w:val="0"/>
           <w:sz w:val="24"/>
         </w:rPr>
-        <w:t>Booking (data/bookings.json): id, userId, carId, pickupDate, returnDate, totalPrice, status</w:t>
+        <w:t>cars: id, name, seats, fuel, price, available, images[], description</w:t>
+      </w:r>
+    </w:p>
+    <w:p>
+      <w:pPr>
+        <w:pStyle w:val="ListBullet"/>
+      </w:pPr>
+      <w:r>
+        <w:rPr>
+          <w:rFonts w:ascii="Times New Roman" w:hAnsi="Times New Roman" w:eastAsia="Times New Roman"/>
+          <w:b w:val="0"/>
+          <w:sz w:val="24"/>
+        </w:rPr>
+        <w:t>bookings: id, user_id, car_id, pickup_date, return_date, total_price, status</w:t>
       </w:r>
     </w:p>
     <w:p>
@@ -4350,7 +4690,7 @@
           <w:b w:val="0"/>
           <w:sz w:val="24"/>
         </w:rPr>
-        <w:t>Relationships: User places many Bookings; Car appears in many Bookings.</w:t>
+        <w:t>RLS: public car SELECT; users manage own bookings; admins manage cars and all bookings.</w:t>
       </w:r>
     </w:p>
     <w:p>
@@ -4402,7 +4742,7 @@
           <w:b w:val="0"/>
           <w:sz w:val="24"/>
         </w:rPr>
-        <w:t>Phase 3 — Authentication: Single /login page with signed HTTP-only cookie and role-based redirect.</w:t>
+        <w:t>Phase 3 — Authentication: /login uses supabase.auth.signInWithPassword; session in HTTP-only cookies via @supabase/ssr.</w:t>
       </w:r>
     </w:p>
     <w:p>
@@ -4415,7 +4755,7 @@
           <w:b w:val="0"/>
           <w:sz w:val="24"/>
         </w:rPr>
-        <w:t>Phase 4 — Booking: /cars/[id]/book page with date inputs and automatic price calculation.</w:t>
+        <w:t>Phase 4 — Booking: createBookingAction inserts into Supabase bookings table.</w:t>
       </w:r>
     </w:p>
     <w:p>
@@ -4428,7 +4768,7 @@
           <w:b w:val="0"/>
           <w:sz w:val="24"/>
         </w:rPr>
-        <w:t>Phase 5 — Admin: Dashboard, cars CRUD, and booking status management.</w:t>
+        <w:t>Phase 5 — Admin: Dashboard, cars CRUD, and booking status management via Supabase.</w:t>
       </w:r>
     </w:p>
     <w:p>
@@ -4442,6 +4782,19 @@
           <w:sz w:val="24"/>
         </w:rPr>
         <w:t>Phase 6 — Polish: Loading skeletons, custom 404, toast notifications, and empty states.</w:t>
+      </w:r>
+    </w:p>
+    <w:p>
+      <w:pPr>
+        <w:pStyle w:val="ListBullet"/>
+      </w:pPr>
+      <w:r>
+        <w:rPr>
+          <w:rFonts w:ascii="Times New Roman" w:hAnsi="Times New Roman" w:eastAsia="Times New Roman"/>
+          <w:b w:val="0"/>
+          <w:sz w:val="24"/>
+        </w:rPr>
+        <w:t>Backend Integration — Supabase: PostgreSQL schema, RLS, seed script; removed JSON file storage.</w:t>
       </w:r>
     </w:p>
     <w:p>
@@ -4467,7 +4820,7 @@
           <w:b w:val="0"/>
           <w:sz w:val="24"/>
         </w:rPr>
-        <w:t>Session tokens are HMAC-signed payloads in an HTTP-only cookie (driveease_session).</w:t>
+        <w:t>Supabase Auth handles email/password sign-in and sign-out.</w:t>
       </w:r>
     </w:p>
     <w:p>
@@ -4480,7 +4833,33 @@
           <w:b w:val="0"/>
           <w:sz w:val="24"/>
         </w:rPr>
-        <w:t>Middleware verifies tokens on protected routes before allowing access.</w:t>
+        <w:t>@supabase/ssr manages session cookies on the Next.js server and in middleware.</w:t>
+      </w:r>
+    </w:p>
+    <w:p>
+      <w:pPr>
+        <w:pStyle w:val="ListBullet"/>
+      </w:pPr>
+      <w:r>
+        <w:rPr>
+          <w:rFonts w:ascii="Times New Roman" w:hAnsi="Times New Roman" w:eastAsia="Times New Roman"/>
+          <w:b w:val="0"/>
+          <w:sz w:val="24"/>
+        </w:rPr>
+        <w:t>Admin role stored in auth.users raw_app_meta_data.role (not user_metadata).</w:t>
+      </w:r>
+    </w:p>
+    <w:p>
+      <w:pPr>
+        <w:pStyle w:val="ListBullet"/>
+      </w:pPr>
+      <w:r>
+        <w:rPr>
+          <w:rFonts w:ascii="Times New Roman" w:hAnsi="Times New Roman" w:eastAsia="Times New Roman"/>
+          <w:b w:val="0"/>
+          <w:sz w:val="24"/>
+        </w:rPr>
+        <w:t>Row Level Security enforces database access per role.</w:t>
       </w:r>
     </w:p>
     <w:p>
@@ -4519,7 +4898,7 @@
           <w:b w:val="0"/>
           <w:sz w:val="24"/>
         </w:rPr>
-        <w:t>POC limitations: Passwords stored in plain text; no bcrypt hashing. Session secret defaults to a dev value unless SESSION_SECRET environment variable is set.</w:t>
+        <w:t>Environment variables: NEXT_PUBLIC_SUPABASE_URL, NEXT_PUBLIC_SUPABASE_ANON_KEY (required); SUPABASE_SERVICE_ROLE_KEY (local seed script only).</w:t>
       </w:r>
     </w:p>
     <w:p>
@@ -4545,7 +4924,7 @@
           <w:b w:val="0"/>
           <w:sz w:val="24"/>
         </w:rPr>
-        <w:t>Users select pickup and return dates. billableRentalDays calculates inclusive rental days. computeBookingTotal multiplies days by the car's daily price. createBookingAction validates dates and availability, appends to bookings.json, and redirects to my bookings.</w:t>
+        <w:t>Users select pickup and return dates. billableRentalDays calculates inclusive rental days. computeBookingTotal multiplies days by the car's daily price. createBookingAction validates dates and availability, inserts into Supabase bookings, and redirects to my bookings.</w:t>
       </w:r>
     </w:p>
     <w:p>
@@ -4610,7 +4989,7 @@
           <w:b w:val="0"/>
           <w:sz w:val="24"/>
         </w:rPr>
-        <w:t>Known limitation: Catalog reads cars via static import in data.ts while admin writes use runtime filesystem in cars-store.ts. Admin car changes may not appear on the public catalog until application rebuild.</w:t>
+        <w:t>Admin car changes reflect immediately on the public catalog because both read and write use the same Supabase cars table.</w:t>
       </w:r>
     </w:p>
     <w:p>
@@ -4714,7 +5093,7 @@
                 <w:b w:val="0"/>
                 <w:sz w:val="24"/>
               </w:rPr>
-              <w:t>getAllCars, getCarById, filterCars, distinct fuels/seats</w:t>
+              <w:t>filterCars, distinct fuels/seats (pure helpers)</w:t>
             </w:r>
           </w:p>
         </w:tc>
@@ -5089,7 +5468,7 @@
           <w:b w:val="0"/>
           <w:sz w:val="24"/>
         </w:rPr>
-        <w:t>Run with: npm run test:e2e</w:t>
+        <w:t>Run npm run seed before e2e tests on a fresh Supabase project. Then: npm run test:e2e</w:t>
       </w:r>
     </w:p>
     <w:p>
@@ -5115,7 +5494,20 @@
           <w:b w:val="0"/>
           <w:sz w:val="24"/>
         </w:rPr>
-        <w:t>Open home page; click Browse Cars; verify 10 cars load.</w:t>
+        <w:t>Configure .env.local with Supabase keys; run npm run seed.</w:t>
+      </w:r>
+    </w:p>
+    <w:p>
+      <w:pPr>
+        <w:pStyle w:val="ListBullet"/>
+      </w:pPr>
+      <w:r>
+        <w:rPr>
+          <w:rFonts w:ascii="Times New Roman" w:hAnsi="Times New Roman" w:eastAsia="Times New Roman"/>
+          <w:b w:val="0"/>
+          <w:sz w:val="24"/>
+        </w:rPr>
+        <w:t>Open home page; click Browse Cars; verify 10 cars load from Supabase.</w:t>
       </w:r>
     </w:p>
     <w:p>
@@ -5277,6 +5669,32 @@
           <w:b w:val="0"/>
           <w:sz w:val="24"/>
         </w:rPr>
+        <w:t>cp .env.local.example .env.local  # add Supabase keys</w:t>
+      </w:r>
+    </w:p>
+    <w:p>
+      <w:pPr>
+        <w:spacing w:after="120" w:line="276" w:lineRule="auto"/>
+      </w:pPr>
+      <w:r>
+        <w:rPr>
+          <w:rFonts w:ascii="Times New Roman" w:hAnsi="Times New Roman" w:eastAsia="Times New Roman"/>
+          <w:b w:val="0"/>
+          <w:sz w:val="24"/>
+        </w:rPr>
+        <w:t>npm run seed  # after applying supabase/migrations SQL</w:t>
+      </w:r>
+    </w:p>
+    <w:p>
+      <w:pPr>
+        <w:spacing w:after="120" w:line="276" w:lineRule="auto"/>
+      </w:pPr>
+      <w:r>
+        <w:rPr>
+          <w:rFonts w:ascii="Times New Roman" w:hAnsi="Times New Roman" w:eastAsia="Times New Roman"/>
+          <w:b w:val="0"/>
+          <w:sz w:val="24"/>
+        </w:rPr>
         <w:t>npm run dev</w:t>
       </w:r>
     </w:p>
@@ -5291,19 +5709,6 @@
           <w:sz w:val="24"/>
         </w:rPr>
         <w:t>Open http://localhost:3000 in a browser.</w:t>
-      </w:r>
-    </w:p>
-    <w:p>
-      <w:pPr>
-        <w:spacing w:after="120" w:line="276" w:lineRule="auto"/>
-      </w:pPr>
-      <w:r>
-        <w:rPr>
-          <w:rFonts w:ascii="Times New Roman" w:hAnsi="Times New Roman" w:eastAsia="Times New Roman"/>
-          <w:b w:val="0"/>
-          <w:sz w:val="24"/>
-        </w:rPr>
-        <w:t>Optional: set SESSION_SECRET environment variable for session signing.</w:t>
       </w:r>
     </w:p>
     <w:p>
@@ -5345,23 +5750,21 @@
         <w:br/>
         <w:t>├── components/             # React components</w:t>
         <w:br/>
-        <w:t>│   ├── admin/              # Admin-specific components</w:t>
+        <w:t>├── lib/                    # Business logic and Supabase access</w:t>
         <w:br/>
-        <w:t>│   ├── providers/          # Auth and toast providers</w:t>
+        <w:t>│   └── supabase/           # Server, middleware, admin clients</w:t>
         <w:br/>
-        <w:t>│   └── ui/                 # shadcn UI primitives</w:t>
+        <w:t>├── scripts/                # Seed script and seed data</w:t>
         <w:br/>
-        <w:t>├── data/                   # JSON data files</w:t>
+        <w:t>├── supabase/migrations/    # Postgres schema and RLS SQL</w:t>
         <w:br/>
         <w:t>├── e2e/                    # Playwright end-to-end tests</w:t>
-        <w:br/>
-        <w:t>├── lib/                    # Business logic and utilities</w:t>
         <w:br/>
         <w:t>├── projectplan/            # Phase documentation</w:t>
         <w:br/>
         <w:t>├── docs/                   # Project reports</w:t>
         <w:br/>
-        <w:t>└── middleware.ts           # Route protection</w:t>
+        <w:t>└── middleware.ts           # Session refresh and route protection</w:t>
       </w:r>
     </w:p>
     <w:p>
@@ -5417,6 +5820,19 @@
       </w:r>
     </w:p>
     <w:p>
+      <w:pPr>
+        <w:spacing w:after="120" w:line="276" w:lineRule="auto"/>
+      </w:pPr>
+      <w:r>
+        <w:rPr>
+          <w:rFonts w:ascii="Times New Roman" w:hAnsi="Times New Roman" w:eastAsia="Times New Roman"/>
+          <w:b w:val="0"/>
+          <w:sz w:val="24"/>
+        </w:rPr>
+        <w:t>Vercel: set NEXT_PUBLIC_SUPABASE_URL and NEXT_PUBLIC_SUPABASE_ANON_KEY; add site URL in Supabase Auth settings.</w:t>
+      </w:r>
+    </w:p>
+    <w:p>
       <w:r>
         <w:br w:type="page"/>
       </w:r>
@@ -5458,7 +5874,7 @@
           <w:b w:val="0"/>
           <w:sz w:val="24"/>
         </w:rPr>
-        <w:t>DriveEase successfully implements the planned car rental POC across six development phases. The application delivers a complete customer journey from browsing the fleet through booking and viewing reservations, as well as a full admin workflow for fleet and booking management.</w:t>
+        <w:t>DriveEase successfully implements a full-stack car rental application across six phases plus Supabase backend integration. The application delivers a complete customer journey from browsing the fleet through authenticated booking and viewing reservations, as well as a full admin workflow backed by Supabase PostgreSQL and real authentication.</w:t>
       </w:r>
     </w:p>
     <w:p>
@@ -5484,20 +5900,7 @@
           <w:b w:val="0"/>
           <w:sz w:val="24"/>
         </w:rPr>
-        <w:t>Database integration: Replace JSON files with PostgreSQL or MongoDB.</w:t>
-      </w:r>
-    </w:p>
-    <w:p>
-      <w:pPr>
-        <w:pStyle w:val="ListBullet"/>
-      </w:pPr>
-      <w:r>
-        <w:rPr>
-          <w:rFonts w:ascii="Times New Roman" w:hAnsi="Times New Roman" w:eastAsia="Times New Roman"/>
-          <w:b w:val="0"/>
-          <w:sz w:val="24"/>
-        </w:rPr>
-        <w:t>Secure authentication: Hash passwords with bcrypt; add registration and OAuth.</w:t>
+        <w:t>User registration: Add sign-up page and email confirmation via Supabase Auth.</w:t>
       </w:r>
     </w:p>
     <w:p>
@@ -5523,7 +5926,7 @@
           <w:b w:val="0"/>
           <w:sz w:val="24"/>
         </w:rPr>
-        <w:t>Email notifications: Send booking confirmation and reminder emails.</w:t>
+        <w:t>Email notifications: Booking confirmation and reminder emails.</w:t>
       </w:r>
     </w:p>
     <w:p>
@@ -5549,7 +5952,7 @@
           <w:b w:val="0"/>
           <w:sz w:val="24"/>
         </w:rPr>
-        <w:t>Image upload: Allow admins to upload car photos.</w:t>
+        <w:t>Image upload: Use Supabase Storage for admin car photos.</w:t>
       </w:r>
     </w:p>
     <w:p>
@@ -5562,7 +5965,7 @@
           <w:b w:val="0"/>
           <w:sz w:val="24"/>
         </w:rPr>
-        <w:t>Catalog sync fix: Unify car read path for immediate admin edit reflection.</w:t>
+        <w:t>OAuth providers: Add Google or GitHub login via Supabase Auth.</w:t>
       </w:r>
     </w:p>
     <w:p>
@@ -5575,7 +5978,7 @@
           <w:b w:val="0"/>
           <w:sz w:val="24"/>
         </w:rPr>
-        <w:t>Production deployment: Deploy with CI/CD pipeline.</w:t>
+        <w:t>CI/CD pipeline: Automated tests and deployment on pull requests.</w:t>
       </w:r>
     </w:p>
     <w:p>
@@ -6006,7 +6409,7 @@
           <w:b/>
           <w:sz w:val="28"/>
         </w:rPr>
-        <w:t>Appendix B — Sample Data Structures</w:t>
+        <w:t>Appendix B — Database Schema (Supabase)</w:t>
       </w:r>
     </w:p>
     <w:p>
@@ -6019,7 +6422,7 @@
           <w:b w:val="0"/>
           <w:sz w:val="24"/>
         </w:rPr>
-        <w:t>User: {"id": 1, "email": "user@gmail.com", "password": "123456", "role": "user", "name": "Demo User"}</w:t>
+        <w:t>profiles: id uuid PK, name text, email text, created_at timestamptz</w:t>
       </w:r>
     </w:p>
     <w:p>
@@ -6032,7 +6435,7 @@
           <w:b w:val="0"/>
           <w:sz w:val="24"/>
         </w:rPr>
-        <w:t>Car: {"id": 1, "name": "Toyota Innova Crysta", "seats": 7, "fuel": "Diesel", "price": 4200, "available": true, "images": [...], "description": "..."}</w:t>
+        <w:t>cars: id bigserial PK, name, seats, fuel, price, available, images text[], description</w:t>
       </w:r>
     </w:p>
     <w:p>
@@ -6045,7 +6448,7 @@
           <w:b w:val="0"/>
           <w:sz w:val="24"/>
         </w:rPr>
-        <w:t>Booking: {"id": 1, "userId": 1, "carId": 2, "pickupDate": "2026-04-01", "returnDate": "2026-04-03", "totalPrice": 8400, "status": "confirmed"}</w:t>
+        <w:t>bookings: id bigserial PK, user_id uuid, car_id bigint, pickup_date, return_date, total_price, status</w:t>
       </w:r>
     </w:p>
     <w:p>
@@ -6058,7 +6461,221 @@
           <w:b/>
           <w:sz w:val="28"/>
         </w:rPr>
-        <w:t>Appendix C — Screenshot Placeholders</w:t>
+        <w:t>Appendix C — Environment Variables</w:t>
+      </w:r>
+    </w:p>
+    <w:tbl>
+      <w:tblPr>
+        <w:tblStyle w:val="TableGrid"/>
+        <w:tblW w:type="auto" w:w="0"/>
+        <w:tblLook w:firstColumn="1" w:firstRow="1" w:lastColumn="0" w:lastRow="0" w:noHBand="0" w:noVBand="1" w:val="04A0"/>
+      </w:tblPr>
+      <w:tblGrid>
+        <w:gridCol w:w="3120"/>
+        <w:gridCol w:w="3120"/>
+        <w:gridCol w:w="3120"/>
+      </w:tblGrid>
+      <w:tr>
+        <w:tc>
+          <w:tcPr>
+            <w:tcW w:type="dxa" w:w="3120"/>
+          </w:tcPr>
+          <w:p>
+            <w:r>
+              <w:rPr>
+                <w:rFonts w:ascii="Times New Roman" w:hAnsi="Times New Roman" w:eastAsia="Times New Roman"/>
+                <w:b/>
+                <w:sz w:val="24"/>
+              </w:rPr>
+              <w:t>Variable</w:t>
+            </w:r>
+          </w:p>
+        </w:tc>
+        <w:tc>
+          <w:tcPr>
+            <w:tcW w:type="dxa" w:w="3120"/>
+          </w:tcPr>
+          <w:p>
+            <w:r>
+              <w:rPr>
+                <w:rFonts w:ascii="Times New Roman" w:hAnsi="Times New Roman" w:eastAsia="Times New Roman"/>
+                <w:b/>
+                <w:sz w:val="24"/>
+              </w:rPr>
+              <w:t>Required</w:t>
+            </w:r>
+          </w:p>
+        </w:tc>
+        <w:tc>
+          <w:tcPr>
+            <w:tcW w:type="dxa" w:w="3120"/>
+          </w:tcPr>
+          <w:p>
+            <w:r>
+              <w:rPr>
+                <w:rFonts w:ascii="Times New Roman" w:hAnsi="Times New Roman" w:eastAsia="Times New Roman"/>
+                <w:b/>
+                <w:sz w:val="24"/>
+              </w:rPr>
+              <w:t>Purpose</w:t>
+            </w:r>
+          </w:p>
+        </w:tc>
+      </w:tr>
+      <w:tr>
+        <w:tc>
+          <w:tcPr>
+            <w:tcW w:type="dxa" w:w="3120"/>
+          </w:tcPr>
+          <w:p>
+            <w:r>
+              <w:rPr>
+                <w:rFonts w:ascii="Times New Roman" w:hAnsi="Times New Roman" w:eastAsia="Times New Roman"/>
+                <w:b w:val="0"/>
+                <w:sz w:val="24"/>
+              </w:rPr>
+              <w:t>NEXT_PUBLIC_SUPABASE_URL</w:t>
+            </w:r>
+          </w:p>
+        </w:tc>
+        <w:tc>
+          <w:tcPr>
+            <w:tcW w:type="dxa" w:w="3120"/>
+          </w:tcPr>
+          <w:p>
+            <w:r>
+              <w:rPr>
+                <w:rFonts w:ascii="Times New Roman" w:hAnsi="Times New Roman" w:eastAsia="Times New Roman"/>
+                <w:b w:val="0"/>
+                <w:sz w:val="24"/>
+              </w:rPr>
+              <w:t>Yes</w:t>
+            </w:r>
+          </w:p>
+        </w:tc>
+        <w:tc>
+          <w:tcPr>
+            <w:tcW w:type="dxa" w:w="3120"/>
+          </w:tcPr>
+          <w:p>
+            <w:r>
+              <w:rPr>
+                <w:rFonts w:ascii="Times New Roman" w:hAnsi="Times New Roman" w:eastAsia="Times New Roman"/>
+                <w:b w:val="0"/>
+                <w:sz w:val="24"/>
+              </w:rPr>
+              <w:t>Supabase project URL</w:t>
+            </w:r>
+          </w:p>
+        </w:tc>
+      </w:tr>
+      <w:tr>
+        <w:tc>
+          <w:tcPr>
+            <w:tcW w:type="dxa" w:w="3120"/>
+          </w:tcPr>
+          <w:p>
+            <w:r>
+              <w:rPr>
+                <w:rFonts w:ascii="Times New Roman" w:hAnsi="Times New Roman" w:eastAsia="Times New Roman"/>
+                <w:b w:val="0"/>
+                <w:sz w:val="24"/>
+              </w:rPr>
+              <w:t>NEXT_PUBLIC_SUPABASE_ANON_KEY</w:t>
+            </w:r>
+          </w:p>
+        </w:tc>
+        <w:tc>
+          <w:tcPr>
+            <w:tcW w:type="dxa" w:w="3120"/>
+          </w:tcPr>
+          <w:p>
+            <w:r>
+              <w:rPr>
+                <w:rFonts w:ascii="Times New Roman" w:hAnsi="Times New Roman" w:eastAsia="Times New Roman"/>
+                <w:b w:val="0"/>
+                <w:sz w:val="24"/>
+              </w:rPr>
+              <w:t>Yes</w:t>
+            </w:r>
+          </w:p>
+        </w:tc>
+        <w:tc>
+          <w:tcPr>
+            <w:tcW w:type="dxa" w:w="3120"/>
+          </w:tcPr>
+          <w:p>
+            <w:r>
+              <w:rPr>
+                <w:rFonts w:ascii="Times New Roman" w:hAnsi="Times New Roman" w:eastAsia="Times New Roman"/>
+                <w:b w:val="0"/>
+                <w:sz w:val="24"/>
+              </w:rPr>
+              <w:t>Server-side Supabase client</w:t>
+            </w:r>
+          </w:p>
+        </w:tc>
+      </w:tr>
+      <w:tr>
+        <w:tc>
+          <w:tcPr>
+            <w:tcW w:type="dxa" w:w="3120"/>
+          </w:tcPr>
+          <w:p>
+            <w:r>
+              <w:rPr>
+                <w:rFonts w:ascii="Times New Roman" w:hAnsi="Times New Roman" w:eastAsia="Times New Roman"/>
+                <w:b w:val="0"/>
+                <w:sz w:val="24"/>
+              </w:rPr>
+              <w:t>SUPABASE_SERVICE_ROLE_KEY</w:t>
+            </w:r>
+          </w:p>
+        </w:tc>
+        <w:tc>
+          <w:tcPr>
+            <w:tcW w:type="dxa" w:w="3120"/>
+          </w:tcPr>
+          <w:p>
+            <w:r>
+              <w:rPr>
+                <w:rFonts w:ascii="Times New Roman" w:hAnsi="Times New Roman" w:eastAsia="Times New Roman"/>
+                <w:b w:val="0"/>
+                <w:sz w:val="24"/>
+              </w:rPr>
+              <w:t>Seed only</w:t>
+            </w:r>
+          </w:p>
+        </w:tc>
+        <w:tc>
+          <w:tcPr>
+            <w:tcW w:type="dxa" w:w="3120"/>
+          </w:tcPr>
+          <w:p>
+            <w:r>
+              <w:rPr>
+                <w:rFonts w:ascii="Times New Roman" w:hAnsi="Times New Roman" w:eastAsia="Times New Roman"/>
+                <w:b w:val="0"/>
+                <w:sz w:val="24"/>
+              </w:rPr>
+              <w:t>Local npm run seed script</w:t>
+            </w:r>
+          </w:p>
+        </w:tc>
+      </w:tr>
+    </w:tbl>
+    <w:p/>
+    <w:p>
+      <w:pPr>
+        <w:spacing w:before="200" w:after="120"/>
+      </w:pPr>
+      <w:r>
+        <w:rPr>
+          <w:rFonts w:ascii="Times New Roman" w:hAnsi="Times New Roman" w:eastAsia="Times New Roman"/>
+          <w:b/>
+          <w:sz w:val="28"/>
+        </w:rPr>
+        <w:t>Appendix D — Screenshot Placeholders</w:t>
       </w:r>
     </w:p>
     <w:p>
@@ -6149,7 +6766,7 @@
           <w:b/>
           <w:sz w:val="28"/>
         </w:rPr>
-        <w:t>Appendix D — npm Scripts Reference</w:t>
+        <w:t>Appendix E — npm Scripts Reference</w:t>
       </w:r>
     </w:p>
     <w:tbl>
@@ -6366,6 +6983,38 @@
                 <w:b w:val="0"/>
                 <w:sz w:val="24"/>
               </w:rPr>
+              <w:t>npm run seed</w:t>
+            </w:r>
+          </w:p>
+        </w:tc>
+        <w:tc>
+          <w:tcPr>
+            <w:tcW w:type="dxa" w:w="4680"/>
+          </w:tcPr>
+          <w:p>
+            <w:r>
+              <w:rPr>
+                <w:rFonts w:ascii="Times New Roman" w:hAnsi="Times New Roman" w:eastAsia="Times New Roman"/>
+                <w:b w:val="0"/>
+                <w:sz w:val="24"/>
+              </w:rPr>
+              <w:t>Seed Supabase demo users, cars, bookings</w:t>
+            </w:r>
+          </w:p>
+        </w:tc>
+      </w:tr>
+      <w:tr>
+        <w:tc>
+          <w:tcPr>
+            <w:tcW w:type="dxa" w:w="4680"/>
+          </w:tcPr>
+          <w:p>
+            <w:r>
+              <w:rPr>
+                <w:rFonts w:ascii="Times New Roman" w:hAnsi="Times New Roman" w:eastAsia="Times New Roman"/>
+                <w:b w:val="0"/>
+                <w:sz w:val="24"/>
+              </w:rPr>
               <w:t>npm run test:e2e</w:t>
             </w:r>
           </w:p>
@@ -6456,7 +7105,7 @@
           <w:b w:val="0"/>
           <w:sz w:val="24"/>
         </w:rPr>
-        <w:t>4. Tailwind CSS Documentation — https://tailwindcss.com/docs</w:t>
+        <w:t>4. Supabase Documentation — https://supabase.com/docs</w:t>
       </w:r>
     </w:p>
     <w:p>
@@ -6469,7 +7118,7 @@
           <w:b w:val="0"/>
           <w:sz w:val="24"/>
         </w:rPr>
-        <w:t>5. shadcn/ui — https://ui.shadcn.com</w:t>
+        <w:t>5. Supabase Auth with Next.js — https://supabase.com/docs/guides/auth/server-side/nextjs</w:t>
       </w:r>
     </w:p>
     <w:p>
@@ -6482,7 +7131,7 @@
           <w:b w:val="0"/>
           <w:sz w:val="24"/>
         </w:rPr>
-        <w:t>6. Sonner Toast Library — https://sonner.emilkowal.ski</w:t>
+        <w:t>6. Tailwind CSS Documentation — https://tailwindcss.com/docs</w:t>
       </w:r>
     </w:p>
     <w:p>
@@ -6495,7 +7144,7 @@
           <w:b w:val="0"/>
           <w:sz w:val="24"/>
         </w:rPr>
-        <w:t>7. Vitest — https://vitest.dev</w:t>
+        <w:t>7. shadcn/ui — https://ui.shadcn.com</w:t>
       </w:r>
     </w:p>
     <w:p>
@@ -6508,7 +7157,7 @@
           <w:b w:val="0"/>
           <w:sz w:val="24"/>
         </w:rPr>
-        <w:t>8. Playwright — https://playwright.dev</w:t>
+        <w:t>8. Sonner Toast Library — https://sonner.emilkowal.ski</w:t>
       </w:r>
     </w:p>
     <w:p>
@@ -6521,7 +7170,46 @@
           <w:b w:val="0"/>
           <w:sz w:val="24"/>
         </w:rPr>
-        <w:t>9. MDN Web Docs — https://developer.mozilla.org</w:t>
+        <w:t>9. Vitest — https://vitest.dev</w:t>
+      </w:r>
+    </w:p>
+    <w:p>
+      <w:pPr>
+        <w:spacing w:after="120" w:line="276" w:lineRule="auto"/>
+      </w:pPr>
+      <w:r>
+        <w:rPr>
+          <w:rFonts w:ascii="Times New Roman" w:hAnsi="Times New Roman" w:eastAsia="Times New Roman"/>
+          <w:b w:val="0"/>
+          <w:sz w:val="24"/>
+        </w:rPr>
+        <w:t>10. Playwright — https://playwright.dev</w:t>
+      </w:r>
+    </w:p>
+    <w:p>
+      <w:pPr>
+        <w:spacing w:after="120" w:line="276" w:lineRule="auto"/>
+      </w:pPr>
+      <w:r>
+        <w:rPr>
+          <w:rFonts w:ascii="Times New Roman" w:hAnsi="Times New Roman" w:eastAsia="Times New Roman"/>
+          <w:b w:val="0"/>
+          <w:sz w:val="24"/>
+        </w:rPr>
+        <w:t>11. Vercel Deployment — https://vercel.com/docs</w:t>
+      </w:r>
+    </w:p>
+    <w:p>
+      <w:pPr>
+        <w:spacing w:after="120" w:line="276" w:lineRule="auto"/>
+      </w:pPr>
+      <w:r>
+        <w:rPr>
+          <w:rFonts w:ascii="Times New Roman" w:hAnsi="Times New Roman" w:eastAsia="Times New Roman"/>
+          <w:b w:val="0"/>
+          <w:sz w:val="24"/>
+        </w:rPr>
+        <w:t>12. MDN Web Docs — https://developer.mozilla.org</w:t>
       </w:r>
     </w:p>
     <w:sectPr>

</xml_diff>

<commit_message>
docs: finalize project report as final Supabase system
Remove POC, phase-wise, and JSON migration narrative from the report and Word generator; describe only the implemented Supabase-backed system with renamed sections and expanded architecture detail.

Co-authored-by: Cursor <cursoragent@cursor.com>
</commit_message>
<xml_diff>
--- a/docs/driveease-project-report.docx
+++ b/docs/driveease-project-report.docx
@@ -1375,7 +1375,20 @@
           <w:b w:val="0"/>
           <w:sz w:val="24"/>
         </w:rPr>
-        <w:t>All data fetching and mutations run on the Next.js server via Server Components and Server Actions. The application supports local development and deployment to Vercel with environment-based Supabase configuration.</w:t>
+        <w:t>All data fetching and mutations run on the Next.js server via Server Components and Server Actions. The client browser communicates only with the Next.js application and does not make direct network requests to Supabase.</w:t>
+      </w:r>
+    </w:p>
+    <w:p>
+      <w:pPr>
+        <w:spacing w:after="120" w:line="276" w:lineRule="auto"/>
+      </w:pPr>
+      <w:r>
+        <w:rPr>
+          <w:rFonts w:ascii="Times New Roman" w:hAnsi="Times New Roman" w:eastAsia="Times New Roman"/>
+          <w:b w:val="0"/>
+          <w:sz w:val="24"/>
+        </w:rPr>
+        <w:t>The project was developed in six incremental phases followed by backend integration that replaced JSON file storage with Supabase PostgreSQL, real authentication, and Row Level Security policies.</w:t>
       </w:r>
     </w:p>
     <w:p>
@@ -1577,6 +1590,32 @@
           <w:sz w:val="24"/>
         </w:rPr>
         <w:t>Integrate Supabase PostgreSQL for cars, bookings, and profiles with RLS policies (Backend Integration).</w:t>
+      </w:r>
+    </w:p>
+    <w:p>
+      <w:pPr>
+        <w:spacing w:before="200" w:after="120"/>
+      </w:pPr>
+      <w:r>
+        <w:rPr>
+          <w:rFonts w:ascii="Times New Roman" w:hAnsi="Times New Roman" w:eastAsia="Times New Roman"/>
+          <w:b/>
+          <w:sz w:val="28"/>
+        </w:rPr>
+        <w:t>5.5 Project Evolution (POC to Backend Integration)</w:t>
+      </w:r>
+    </w:p>
+    <w:p>
+      <w:pPr>
+        <w:spacing w:after="120" w:line="276" w:lineRule="auto"/>
+      </w:pPr>
+      <w:r>
+        <w:rPr>
+          <w:rFonts w:ascii="Times New Roman" w:hAnsi="Times New Roman" w:eastAsia="Times New Roman"/>
+          <w:b w:val="0"/>
+          <w:sz w:val="24"/>
+        </w:rPr>
+        <w:t>The project evolved from a JSON file-based proof-of-concept with custom HMAC session cookies to a Supabase-backed full-stack application. JSON files (cars.json, users.json, bookings.json) and custom session modules were removed. Supabase migrations, RLS policies, seed scripts, and server-side client helpers were added to support real authentication and PostgreSQL persistence.</w:t>
       </w:r>
     </w:p>
     <w:p>
@@ -1943,6 +1982,32 @@
       </w:r>
     </w:p>
     <w:p>
+      <w:pPr>
+        <w:spacing w:before="200" w:after="120"/>
+      </w:pPr>
+      <w:r>
+        <w:rPr>
+          <w:rFonts w:ascii="Times New Roman" w:hAnsi="Times New Roman" w:eastAsia="Times New Roman"/>
+          <w:b/>
+          <w:sz w:val="28"/>
+        </w:rPr>
+        <w:t>6.5 Context Diagram and Data Flow</w:t>
+      </w:r>
+    </w:p>
+    <w:p>
+      <w:pPr>
+        <w:spacing w:after="120" w:line="276" w:lineRule="auto"/>
+      </w:pPr>
+      <w:r>
+        <w:rPr>
+          <w:rFonts w:ascii="Times New Roman" w:hAnsi="Times New Roman" w:eastAsia="Times New Roman"/>
+          <w:b w:val="0"/>
+          <w:sz w:val="24"/>
+        </w:rPr>
+        <w:t>Visitors and users interact with the Next.js application through a web browser. The Next.js server handles page rendering, Server Actions, and middleware session refresh. All database and authentication calls go from Next.js to Supabase Cloud. For catalog reads, Server Components query the cars table and render HTML. For bookings, Server Actions insert rows with the authenticated user UUID. The browser Network tab shows requests only to the application domain, not to supabase.co.</w:t>
+      </w:r>
+    </w:p>
+    <w:p>
       <w:r>
         <w:br w:type="page"/>
       </w:r>
@@ -2863,6 +2928,71 @@
       </w:r>
     </w:p>
     <w:p>
+      <w:pPr>
+        <w:spacing w:before="200" w:after="120"/>
+      </w:pPr>
+      <w:r>
+        <w:rPr>
+          <w:rFonts w:ascii="Times New Roman" w:hAnsi="Times New Roman" w:eastAsia="Times New Roman"/>
+          <w:b/>
+          <w:sz w:val="28"/>
+        </w:rPr>
+        <w:t>7.5 Constraints and Assumptions</w:t>
+      </w:r>
+    </w:p>
+    <w:p>
+      <w:pPr>
+        <w:pStyle w:val="ListBullet"/>
+      </w:pPr>
+      <w:r>
+        <w:rPr>
+          <w:rFonts w:ascii="Times New Roman" w:hAnsi="Times New Roman" w:eastAsia="Times New Roman"/>
+          <w:b w:val="0"/>
+          <w:sz w:val="24"/>
+        </w:rPr>
+        <w:t>Demo accounts are pre-seeded; no public registration page.</w:t>
+      </w:r>
+    </w:p>
+    <w:p>
+      <w:pPr>
+        <w:pStyle w:val="ListBullet"/>
+      </w:pPr>
+      <w:r>
+        <w:rPr>
+          <w:rFonts w:ascii="Times New Roman" w:hAnsi="Times New Roman" w:eastAsia="Times New Roman"/>
+          <w:b w:val="0"/>
+          <w:sz w:val="24"/>
+        </w:rPr>
+        <w:t>Car images use external URLs; Supabase Storage not used.</w:t>
+      </w:r>
+    </w:p>
+    <w:p>
+      <w:pPr>
+        <w:pStyle w:val="ListBullet"/>
+      </w:pPr>
+      <w:r>
+        <w:rPr>
+          <w:rFonts w:ascii="Times New Roman" w:hAnsi="Times New Roman" w:eastAsia="Times New Roman"/>
+          <w:b w:val="0"/>
+          <w:sz w:val="24"/>
+        </w:rPr>
+        <w:t>Availability checks use car.available flag only, not date overlap.</w:t>
+      </w:r>
+    </w:p>
+    <w:p>
+      <w:pPr>
+        <w:pStyle w:val="ListBullet"/>
+      </w:pPr>
+      <w:r>
+        <w:rPr>
+          <w:rFonts w:ascii="Times New Roman" w:hAnsi="Times New Roman" w:eastAsia="Times New Roman"/>
+          <w:b w:val="0"/>
+          <w:sz w:val="24"/>
+        </w:rPr>
+        <w:t>Assumes Supabase migrations applied and npm run seed executed before testing.</w:t>
+      </w:r>
+    </w:p>
+    <w:p>
       <w:r>
         <w:br w:type="page"/>
       </w:r>
@@ -4101,6 +4231,670 @@
     </w:tbl>
     <w:p/>
     <w:p>
+      <w:pPr>
+        <w:spacing w:before="200" w:after="120"/>
+      </w:pPr>
+      <w:r>
+        <w:rPr>
+          <w:rFonts w:ascii="Times New Roman" w:hAnsi="Times New Roman" w:eastAsia="Times New Roman"/>
+          <w:b/>
+          <w:sz w:val="28"/>
+        </w:rPr>
+        <w:t>8.4 Server-Side vs Client-Side Responsibilities</w:t>
+      </w:r>
+    </w:p>
+    <w:p>
+      <w:pPr>
+        <w:spacing w:after="120" w:line="276" w:lineRule="auto"/>
+      </w:pPr>
+      <w:r>
+        <w:rPr>
+          <w:rFonts w:ascii="Times New Roman" w:hAnsi="Times New Roman" w:eastAsia="Times New Roman"/>
+          <w:b w:val="0"/>
+          <w:sz w:val="24"/>
+        </w:rPr>
+        <w:t>The browser never communicates directly with Supabase. Server Components and Server Actions fetch and mutate data. Client components handle form UI, in-memory catalog filtering, and toast notifications only.</w:t>
+      </w:r>
+    </w:p>
+    <w:tbl>
+      <w:tblPr>
+        <w:tblStyle w:val="TableGrid"/>
+        <w:tblW w:type="auto" w:w="0"/>
+        <w:tblLook w:firstColumn="1" w:firstRow="1" w:lastColumn="0" w:lastRow="0" w:noHBand="0" w:noVBand="1" w:val="04A0"/>
+      </w:tblPr>
+      <w:tblGrid>
+        <w:gridCol w:w="4680"/>
+        <w:gridCol w:w="4680"/>
+      </w:tblGrid>
+      <w:tr>
+        <w:tc>
+          <w:tcPr>
+            <w:tcW w:type="dxa" w:w="4680"/>
+          </w:tcPr>
+          <w:p>
+            <w:r>
+              <w:rPr>
+                <w:rFonts w:ascii="Times New Roman" w:hAnsi="Times New Roman" w:eastAsia="Times New Roman"/>
+                <w:b/>
+                <w:sz w:val="24"/>
+              </w:rPr>
+              <w:t>Task</w:t>
+            </w:r>
+          </w:p>
+        </w:tc>
+        <w:tc>
+          <w:tcPr>
+            <w:tcW w:type="dxa" w:w="4680"/>
+          </w:tcPr>
+          <w:p>
+            <w:r>
+              <w:rPr>
+                <w:rFonts w:ascii="Times New Roman" w:hAnsi="Times New Roman" w:eastAsia="Times New Roman"/>
+                <w:b/>
+                <w:sz w:val="24"/>
+              </w:rPr>
+              <w:t>Runs on</w:t>
+            </w:r>
+          </w:p>
+        </w:tc>
+      </w:tr>
+      <w:tr>
+        <w:tc>
+          <w:tcPr>
+            <w:tcW w:type="dxa" w:w="4680"/>
+          </w:tcPr>
+          <w:p>
+            <w:r>
+              <w:rPr>
+                <w:rFonts w:ascii="Times New Roman" w:hAnsi="Times New Roman" w:eastAsia="Times New Roman"/>
+                <w:b w:val="0"/>
+                <w:sz w:val="24"/>
+              </w:rPr>
+              <w:t>Load car catalog</w:t>
+            </w:r>
+          </w:p>
+        </w:tc>
+        <w:tc>
+          <w:tcPr>
+            <w:tcW w:type="dxa" w:w="4680"/>
+          </w:tcPr>
+          <w:p>
+            <w:r>
+              <w:rPr>
+                <w:rFonts w:ascii="Times New Roman" w:hAnsi="Times New Roman" w:eastAsia="Times New Roman"/>
+                <w:b w:val="0"/>
+                <w:sz w:val="24"/>
+              </w:rPr>
+              <w:t>Server</w:t>
+            </w:r>
+          </w:p>
+        </w:tc>
+      </w:tr>
+      <w:tr>
+        <w:tc>
+          <w:tcPr>
+            <w:tcW w:type="dxa" w:w="4680"/>
+          </w:tcPr>
+          <w:p>
+            <w:r>
+              <w:rPr>
+                <w:rFonts w:ascii="Times New Roman" w:hAnsi="Times New Roman" w:eastAsia="Times New Roman"/>
+                <w:b w:val="0"/>
+                <w:sz w:val="24"/>
+              </w:rPr>
+              <w:t>Load user bookings</w:t>
+            </w:r>
+          </w:p>
+        </w:tc>
+        <w:tc>
+          <w:tcPr>
+            <w:tcW w:type="dxa" w:w="4680"/>
+          </w:tcPr>
+          <w:p>
+            <w:r>
+              <w:rPr>
+                <w:rFonts w:ascii="Times New Roman" w:hAnsi="Times New Roman" w:eastAsia="Times New Roman"/>
+                <w:b w:val="0"/>
+                <w:sz w:val="24"/>
+              </w:rPr>
+              <w:t>Server</w:t>
+            </w:r>
+          </w:p>
+        </w:tc>
+      </w:tr>
+      <w:tr>
+        <w:tc>
+          <w:tcPr>
+            <w:tcW w:type="dxa" w:w="4680"/>
+          </w:tcPr>
+          <w:p>
+            <w:r>
+              <w:rPr>
+                <w:rFonts w:ascii="Times New Roman" w:hAnsi="Times New Roman" w:eastAsia="Times New Roman"/>
+                <w:b w:val="0"/>
+                <w:sz w:val="24"/>
+              </w:rPr>
+              <w:t>Login and logout</w:t>
+            </w:r>
+          </w:p>
+        </w:tc>
+        <w:tc>
+          <w:tcPr>
+            <w:tcW w:type="dxa" w:w="4680"/>
+          </w:tcPr>
+          <w:p>
+            <w:r>
+              <w:rPr>
+                <w:rFonts w:ascii="Times New Roman" w:hAnsi="Times New Roman" w:eastAsia="Times New Roman"/>
+                <w:b w:val="0"/>
+                <w:sz w:val="24"/>
+              </w:rPr>
+              <w:t>Server Action</w:t>
+            </w:r>
+          </w:p>
+        </w:tc>
+      </w:tr>
+      <w:tr>
+        <w:tc>
+          <w:tcPr>
+            <w:tcW w:type="dxa" w:w="4680"/>
+          </w:tcPr>
+          <w:p>
+            <w:r>
+              <w:rPr>
+                <w:rFonts w:ascii="Times New Roman" w:hAnsi="Times New Roman" w:eastAsia="Times New Roman"/>
+                <w:b w:val="0"/>
+                <w:sz w:val="24"/>
+              </w:rPr>
+              <w:t>Create booking</w:t>
+            </w:r>
+          </w:p>
+        </w:tc>
+        <w:tc>
+          <w:tcPr>
+            <w:tcW w:type="dxa" w:w="4680"/>
+          </w:tcPr>
+          <w:p>
+            <w:r>
+              <w:rPr>
+                <w:rFonts w:ascii="Times New Roman" w:hAnsi="Times New Roman" w:eastAsia="Times New Roman"/>
+                <w:b w:val="0"/>
+                <w:sz w:val="24"/>
+              </w:rPr>
+              <w:t>Server Action</w:t>
+            </w:r>
+          </w:p>
+        </w:tc>
+      </w:tr>
+      <w:tr>
+        <w:tc>
+          <w:tcPr>
+            <w:tcW w:type="dxa" w:w="4680"/>
+          </w:tcPr>
+          <w:p>
+            <w:r>
+              <w:rPr>
+                <w:rFonts w:ascii="Times New Roman" w:hAnsi="Times New Roman" w:eastAsia="Times New Roman"/>
+                <w:b w:val="0"/>
+                <w:sz w:val="24"/>
+              </w:rPr>
+              <w:t>Admin car CRUD</w:t>
+            </w:r>
+          </w:p>
+        </w:tc>
+        <w:tc>
+          <w:tcPr>
+            <w:tcW w:type="dxa" w:w="4680"/>
+          </w:tcPr>
+          <w:p>
+            <w:r>
+              <w:rPr>
+                <w:rFonts w:ascii="Times New Roman" w:hAnsi="Times New Roman" w:eastAsia="Times New Roman"/>
+                <w:b w:val="0"/>
+                <w:sz w:val="24"/>
+              </w:rPr>
+              <w:t>Server Action</w:t>
+            </w:r>
+          </w:p>
+        </w:tc>
+      </w:tr>
+      <w:tr>
+        <w:tc>
+          <w:tcPr>
+            <w:tcW w:type="dxa" w:w="4680"/>
+          </w:tcPr>
+          <w:p>
+            <w:r>
+              <w:rPr>
+                <w:rFonts w:ascii="Times New Roman" w:hAnsi="Times New Roman" w:eastAsia="Times New Roman"/>
+                <w:b w:val="0"/>
+                <w:sz w:val="24"/>
+              </w:rPr>
+              <w:t>Filter cars by fuel/price</w:t>
+            </w:r>
+          </w:p>
+        </w:tc>
+        <w:tc>
+          <w:tcPr>
+            <w:tcW w:type="dxa" w:w="4680"/>
+          </w:tcPr>
+          <w:p>
+            <w:r>
+              <w:rPr>
+                <w:rFonts w:ascii="Times New Roman" w:hAnsi="Times New Roman" w:eastAsia="Times New Roman"/>
+                <w:b w:val="0"/>
+                <w:sz w:val="24"/>
+              </w:rPr>
+              <w:t>Client (in-memory)</w:t>
+            </w:r>
+          </w:p>
+        </w:tc>
+      </w:tr>
+    </w:tbl>
+    <w:p/>
+    <w:p>
+      <w:pPr>
+        <w:spacing w:before="200" w:after="120"/>
+      </w:pPr>
+      <w:r>
+        <w:rPr>
+          <w:rFonts w:ascii="Times New Roman" w:hAnsi="Times New Roman" w:eastAsia="Times New Roman"/>
+          <w:b/>
+          <w:sz w:val="28"/>
+        </w:rPr>
+        <w:t>8.5 Server Actions Reference</w:t>
+      </w:r>
+    </w:p>
+    <w:tbl>
+      <w:tblPr>
+        <w:tblStyle w:val="TableGrid"/>
+        <w:tblW w:type="auto" w:w="0"/>
+        <w:tblLook w:firstColumn="1" w:firstRow="1" w:lastColumn="0" w:lastRow="0" w:noHBand="0" w:noVBand="1" w:val="04A0"/>
+      </w:tblPr>
+      <w:tblGrid>
+        <w:gridCol w:w="3120"/>
+        <w:gridCol w:w="3120"/>
+        <w:gridCol w:w="3120"/>
+      </w:tblGrid>
+      <w:tr>
+        <w:tc>
+          <w:tcPr>
+            <w:tcW w:type="dxa" w:w="3120"/>
+          </w:tcPr>
+          <w:p>
+            <w:r>
+              <w:rPr>
+                <w:rFonts w:ascii="Times New Roman" w:hAnsi="Times New Roman" w:eastAsia="Times New Roman"/>
+                <w:b/>
+                <w:sz w:val="24"/>
+              </w:rPr>
+              <w:t>Action</w:t>
+            </w:r>
+          </w:p>
+        </w:tc>
+        <w:tc>
+          <w:tcPr>
+            <w:tcW w:type="dxa" w:w="3120"/>
+          </w:tcPr>
+          <w:p>
+            <w:r>
+              <w:rPr>
+                <w:rFonts w:ascii="Times New Roman" w:hAnsi="Times New Roman" w:eastAsia="Times New Roman"/>
+                <w:b/>
+                <w:sz w:val="24"/>
+              </w:rPr>
+              <w:t>File</w:t>
+            </w:r>
+          </w:p>
+        </w:tc>
+        <w:tc>
+          <w:tcPr>
+            <w:tcW w:type="dxa" w:w="3120"/>
+          </w:tcPr>
+          <w:p>
+            <w:r>
+              <w:rPr>
+                <w:rFonts w:ascii="Times New Roman" w:hAnsi="Times New Roman" w:eastAsia="Times New Roman"/>
+                <w:b/>
+                <w:sz w:val="24"/>
+              </w:rPr>
+              <w:t>Effect</w:t>
+            </w:r>
+          </w:p>
+        </w:tc>
+      </w:tr>
+      <w:tr>
+        <w:tc>
+          <w:tcPr>
+            <w:tcW w:type="dxa" w:w="3120"/>
+          </w:tcPr>
+          <w:p>
+            <w:r>
+              <w:rPr>
+                <w:rFonts w:ascii="Times New Roman" w:hAnsi="Times New Roman" w:eastAsia="Times New Roman"/>
+                <w:b w:val="0"/>
+                <w:sz w:val="24"/>
+              </w:rPr>
+              <w:t>loginAction</w:t>
+            </w:r>
+          </w:p>
+        </w:tc>
+        <w:tc>
+          <w:tcPr>
+            <w:tcW w:type="dxa" w:w="3120"/>
+          </w:tcPr>
+          <w:p>
+            <w:r>
+              <w:rPr>
+                <w:rFonts w:ascii="Times New Roman" w:hAnsi="Times New Roman" w:eastAsia="Times New Roman"/>
+                <w:b w:val="0"/>
+                <w:sz w:val="24"/>
+              </w:rPr>
+              <w:t>app/actions/auth.ts</w:t>
+            </w:r>
+          </w:p>
+        </w:tc>
+        <w:tc>
+          <w:tcPr>
+            <w:tcW w:type="dxa" w:w="3120"/>
+          </w:tcPr>
+          <w:p>
+            <w:r>
+              <w:rPr>
+                <w:rFonts w:ascii="Times New Roman" w:hAnsi="Times New Roman" w:eastAsia="Times New Roman"/>
+                <w:b w:val="0"/>
+                <w:sz w:val="24"/>
+              </w:rPr>
+              <w:t>Supabase sign-in; role redirect</w:t>
+            </w:r>
+          </w:p>
+        </w:tc>
+      </w:tr>
+      <w:tr>
+        <w:tc>
+          <w:tcPr>
+            <w:tcW w:type="dxa" w:w="3120"/>
+          </w:tcPr>
+          <w:p>
+            <w:r>
+              <w:rPr>
+                <w:rFonts w:ascii="Times New Roman" w:hAnsi="Times New Roman" w:eastAsia="Times New Roman"/>
+                <w:b w:val="0"/>
+                <w:sz w:val="24"/>
+              </w:rPr>
+              <w:t>logoutAction</w:t>
+            </w:r>
+          </w:p>
+        </w:tc>
+        <w:tc>
+          <w:tcPr>
+            <w:tcW w:type="dxa" w:w="3120"/>
+          </w:tcPr>
+          <w:p>
+            <w:r>
+              <w:rPr>
+                <w:rFonts w:ascii="Times New Roman" w:hAnsi="Times New Roman" w:eastAsia="Times New Roman"/>
+                <w:b w:val="0"/>
+                <w:sz w:val="24"/>
+              </w:rPr>
+              <w:t>app/actions/auth.ts</w:t>
+            </w:r>
+          </w:p>
+        </w:tc>
+        <w:tc>
+          <w:tcPr>
+            <w:tcW w:type="dxa" w:w="3120"/>
+          </w:tcPr>
+          <w:p>
+            <w:r>
+              <w:rPr>
+                <w:rFonts w:ascii="Times New Roman" w:hAnsi="Times New Roman" w:eastAsia="Times New Roman"/>
+                <w:b w:val="0"/>
+                <w:sz w:val="24"/>
+              </w:rPr>
+              <w:t>Supabase sign-out</w:t>
+            </w:r>
+          </w:p>
+        </w:tc>
+      </w:tr>
+      <w:tr>
+        <w:tc>
+          <w:tcPr>
+            <w:tcW w:type="dxa" w:w="3120"/>
+          </w:tcPr>
+          <w:p>
+            <w:r>
+              <w:rPr>
+                <w:rFonts w:ascii="Times New Roman" w:hAnsi="Times New Roman" w:eastAsia="Times New Roman"/>
+                <w:b w:val="0"/>
+                <w:sz w:val="24"/>
+              </w:rPr>
+              <w:t>createBookingAction</w:t>
+            </w:r>
+          </w:p>
+        </w:tc>
+        <w:tc>
+          <w:tcPr>
+            <w:tcW w:type="dxa" w:w="3120"/>
+          </w:tcPr>
+          <w:p>
+            <w:r>
+              <w:rPr>
+                <w:rFonts w:ascii="Times New Roman" w:hAnsi="Times New Roman" w:eastAsia="Times New Roman"/>
+                <w:b w:val="0"/>
+                <w:sz w:val="24"/>
+              </w:rPr>
+              <w:t>app/actions/booking.ts</w:t>
+            </w:r>
+          </w:p>
+        </w:tc>
+        <w:tc>
+          <w:tcPr>
+            <w:tcW w:type="dxa" w:w="3120"/>
+          </w:tcPr>
+          <w:p>
+            <w:r>
+              <w:rPr>
+                <w:rFonts w:ascii="Times New Roman" w:hAnsi="Times New Roman" w:eastAsia="Times New Roman"/>
+                <w:b w:val="0"/>
+                <w:sz w:val="24"/>
+              </w:rPr>
+              <w:t>Insert booking row</w:t>
+            </w:r>
+          </w:p>
+        </w:tc>
+      </w:tr>
+      <w:tr>
+        <w:tc>
+          <w:tcPr>
+            <w:tcW w:type="dxa" w:w="3120"/>
+          </w:tcPr>
+          <w:p>
+            <w:r>
+              <w:rPr>
+                <w:rFonts w:ascii="Times New Roman" w:hAnsi="Times New Roman" w:eastAsia="Times New Roman"/>
+                <w:b w:val="0"/>
+                <w:sz w:val="24"/>
+              </w:rPr>
+              <w:t>createCarAction</w:t>
+            </w:r>
+          </w:p>
+        </w:tc>
+        <w:tc>
+          <w:tcPr>
+            <w:tcW w:type="dxa" w:w="3120"/>
+          </w:tcPr>
+          <w:p>
+            <w:r>
+              <w:rPr>
+                <w:rFonts w:ascii="Times New Roman" w:hAnsi="Times New Roman" w:eastAsia="Times New Roman"/>
+                <w:b w:val="0"/>
+                <w:sz w:val="24"/>
+              </w:rPr>
+              <w:t>app/actions/admin.ts</w:t>
+            </w:r>
+          </w:p>
+        </w:tc>
+        <w:tc>
+          <w:tcPr>
+            <w:tcW w:type="dxa" w:w="3120"/>
+          </w:tcPr>
+          <w:p>
+            <w:r>
+              <w:rPr>
+                <w:rFonts w:ascii="Times New Roman" w:hAnsi="Times New Roman" w:eastAsia="Times New Roman"/>
+                <w:b w:val="0"/>
+                <w:sz w:val="24"/>
+              </w:rPr>
+              <w:t>Insert car (admin)</w:t>
+            </w:r>
+          </w:p>
+        </w:tc>
+      </w:tr>
+      <w:tr>
+        <w:tc>
+          <w:tcPr>
+            <w:tcW w:type="dxa" w:w="3120"/>
+          </w:tcPr>
+          <w:p>
+            <w:r>
+              <w:rPr>
+                <w:rFonts w:ascii="Times New Roman" w:hAnsi="Times New Roman" w:eastAsia="Times New Roman"/>
+                <w:b w:val="0"/>
+                <w:sz w:val="24"/>
+              </w:rPr>
+              <w:t>updateCarAction</w:t>
+            </w:r>
+          </w:p>
+        </w:tc>
+        <w:tc>
+          <w:tcPr>
+            <w:tcW w:type="dxa" w:w="3120"/>
+          </w:tcPr>
+          <w:p>
+            <w:r>
+              <w:rPr>
+                <w:rFonts w:ascii="Times New Roman" w:hAnsi="Times New Roman" w:eastAsia="Times New Roman"/>
+                <w:b w:val="0"/>
+                <w:sz w:val="24"/>
+              </w:rPr>
+              <w:t>app/actions/admin.ts</w:t>
+            </w:r>
+          </w:p>
+        </w:tc>
+        <w:tc>
+          <w:tcPr>
+            <w:tcW w:type="dxa" w:w="3120"/>
+          </w:tcPr>
+          <w:p>
+            <w:r>
+              <w:rPr>
+                <w:rFonts w:ascii="Times New Roman" w:hAnsi="Times New Roman" w:eastAsia="Times New Roman"/>
+                <w:b w:val="0"/>
+                <w:sz w:val="24"/>
+              </w:rPr>
+              <w:t>Update car (admin)</w:t>
+            </w:r>
+          </w:p>
+        </w:tc>
+      </w:tr>
+      <w:tr>
+        <w:tc>
+          <w:tcPr>
+            <w:tcW w:type="dxa" w:w="3120"/>
+          </w:tcPr>
+          <w:p>
+            <w:r>
+              <w:rPr>
+                <w:rFonts w:ascii="Times New Roman" w:hAnsi="Times New Roman" w:eastAsia="Times New Roman"/>
+                <w:b w:val="0"/>
+                <w:sz w:val="24"/>
+              </w:rPr>
+              <w:t>deleteCarAction</w:t>
+            </w:r>
+          </w:p>
+        </w:tc>
+        <w:tc>
+          <w:tcPr>
+            <w:tcW w:type="dxa" w:w="3120"/>
+          </w:tcPr>
+          <w:p>
+            <w:r>
+              <w:rPr>
+                <w:rFonts w:ascii="Times New Roman" w:hAnsi="Times New Roman" w:eastAsia="Times New Roman"/>
+                <w:b w:val="0"/>
+                <w:sz w:val="24"/>
+              </w:rPr>
+              <w:t>app/actions/admin.ts</w:t>
+            </w:r>
+          </w:p>
+        </w:tc>
+        <w:tc>
+          <w:tcPr>
+            <w:tcW w:type="dxa" w:w="3120"/>
+          </w:tcPr>
+          <w:p>
+            <w:r>
+              <w:rPr>
+                <w:rFonts w:ascii="Times New Roman" w:hAnsi="Times New Roman" w:eastAsia="Times New Roman"/>
+                <w:b w:val="0"/>
+                <w:sz w:val="24"/>
+              </w:rPr>
+              <w:t>Delete car (admin)</w:t>
+            </w:r>
+          </w:p>
+        </w:tc>
+      </w:tr>
+      <w:tr>
+        <w:tc>
+          <w:tcPr>
+            <w:tcW w:type="dxa" w:w="3120"/>
+          </w:tcPr>
+          <w:p>
+            <w:r>
+              <w:rPr>
+                <w:rFonts w:ascii="Times New Roman" w:hAnsi="Times New Roman" w:eastAsia="Times New Roman"/>
+                <w:b w:val="0"/>
+                <w:sz w:val="24"/>
+              </w:rPr>
+              <w:t>updateBookingStatusAction</w:t>
+            </w:r>
+          </w:p>
+        </w:tc>
+        <w:tc>
+          <w:tcPr>
+            <w:tcW w:type="dxa" w:w="3120"/>
+          </w:tcPr>
+          <w:p>
+            <w:r>
+              <w:rPr>
+                <w:rFonts w:ascii="Times New Roman" w:hAnsi="Times New Roman" w:eastAsia="Times New Roman"/>
+                <w:b w:val="0"/>
+                <w:sz w:val="24"/>
+              </w:rPr>
+              <w:t>app/actions/admin.ts</w:t>
+            </w:r>
+          </w:p>
+        </w:tc>
+        <w:tc>
+          <w:tcPr>
+            <w:tcW w:type="dxa" w:w="3120"/>
+          </w:tcPr>
+          <w:p>
+            <w:r>
+              <w:rPr>
+                <w:rFonts w:ascii="Times New Roman" w:hAnsi="Times New Roman" w:eastAsia="Times New Roman"/>
+                <w:b w:val="0"/>
+                <w:sz w:val="24"/>
+              </w:rPr>
+              <w:t>Update status (admin)</w:t>
+            </w:r>
+          </w:p>
+        </w:tc>
+      </w:tr>
+    </w:tbl>
+    <w:p/>
+    <w:p>
       <w:r>
         <w:br w:type="page"/>
       </w:r>
@@ -4993,6 +5787,240 @@
       </w:r>
     </w:p>
     <w:p>
+      <w:pPr>
+        <w:spacing w:before="200" w:after="120"/>
+      </w:pPr>
+      <w:r>
+        <w:rPr>
+          <w:rFonts w:ascii="Times New Roman" w:hAnsi="Times New Roman" w:eastAsia="Times New Roman"/>
+          <w:b/>
+          <w:sz w:val="28"/>
+        </w:rPr>
+        <w:t>9.7 Backend Integration (Supabase Migration)</w:t>
+      </w:r>
+    </w:p>
+    <w:p>
+      <w:pPr>
+        <w:spacing w:after="120" w:line="276" w:lineRule="auto"/>
+      </w:pPr>
+      <w:r>
+        <w:rPr>
+          <w:rFonts w:ascii="Times New Roman" w:hAnsi="Times New Roman" w:eastAsia="Times New Roman"/>
+          <w:b w:val="0"/>
+          <w:sz w:val="24"/>
+        </w:rPr>
+        <w:t>The backend integration replaced JSON filesystem persistence with Supabase PostgreSQL. Migration SQL files define profiles, cars, and bookings tables with foreign keys, check constraints, and RLS policies. The seed script creates demo auth users via Admin API, inserts ten cars, and seeds sample bookings.</w:t>
+      </w:r>
+    </w:p>
+    <w:p>
+      <w:pPr>
+        <w:spacing w:before="200" w:after="120"/>
+      </w:pPr>
+      <w:r>
+        <w:rPr>
+          <w:rFonts w:ascii="Times New Roman" w:hAnsi="Times New Roman" w:eastAsia="Times New Roman"/>
+          <w:b/>
+          <w:sz w:val="28"/>
+        </w:rPr>
+        <w:t>9.8 Database Schema and Row Level Security</w:t>
+      </w:r>
+    </w:p>
+    <w:p>
+      <w:pPr>
+        <w:pStyle w:val="ListBullet"/>
+      </w:pPr>
+      <w:r>
+        <w:rPr>
+          <w:rFonts w:ascii="Times New Roman" w:hAnsi="Times New Roman" w:eastAsia="Times New Roman"/>
+          <w:b w:val="0"/>
+          <w:sz w:val="24"/>
+        </w:rPr>
+        <w:t>profiles: users read/update own row; admins read all profiles.</w:t>
+      </w:r>
+    </w:p>
+    <w:p>
+      <w:pPr>
+        <w:pStyle w:val="ListBullet"/>
+      </w:pPr>
+      <w:r>
+        <w:rPr>
+          <w:rFonts w:ascii="Times New Roman" w:hAnsi="Times New Roman" w:eastAsia="Times New Roman"/>
+          <w:b w:val="0"/>
+          <w:sz w:val="24"/>
+        </w:rPr>
+        <w:t>cars: public SELECT for catalog; admin-only INSERT, UPDATE, DELETE.</w:t>
+      </w:r>
+    </w:p>
+    <w:p>
+      <w:pPr>
+        <w:pStyle w:val="ListBullet"/>
+      </w:pPr>
+      <w:r>
+        <w:rPr>
+          <w:rFonts w:ascii="Times New Roman" w:hAnsi="Times New Roman" w:eastAsia="Times New Roman"/>
+          <w:b w:val="0"/>
+          <w:sz w:val="24"/>
+        </w:rPr>
+        <w:t>bookings: users SELECT and INSERT own rows; admins SELECT and UPDATE all.</w:t>
+      </w:r>
+    </w:p>
+    <w:p>
+      <w:pPr>
+        <w:spacing w:after="120" w:line="276" w:lineRule="auto"/>
+      </w:pPr>
+      <w:r>
+        <w:rPr>
+          <w:rFonts w:ascii="Times New Roman" w:hAnsi="Times New Roman" w:eastAsia="Times New Roman"/>
+          <w:b w:val="0"/>
+          <w:sz w:val="24"/>
+        </w:rPr>
+        <w:t>Admin role checks use auth.jwt() app_metadata.role = admin. Profile auto-creation trigger runs on new auth.users insert for future registration support.</w:t>
+      </w:r>
+    </w:p>
+    <w:p>
+      <w:pPr>
+        <w:spacing w:before="200" w:after="120"/>
+      </w:pPr>
+      <w:r>
+        <w:rPr>
+          <w:rFonts w:ascii="Times New Roman" w:hAnsi="Times New Roman" w:eastAsia="Times New Roman"/>
+          <w:b/>
+          <w:sz w:val="28"/>
+        </w:rPr>
+        <w:t>9.9 User Interface Components</w:t>
+      </w:r>
+    </w:p>
+    <w:p>
+      <w:pPr>
+        <w:pStyle w:val="ListBullet"/>
+      </w:pPr>
+      <w:r>
+        <w:rPr>
+          <w:rFonts w:ascii="Times New Roman" w:hAnsi="Times New Roman" w:eastAsia="Times New Roman"/>
+          <w:b w:val="0"/>
+          <w:sz w:val="24"/>
+        </w:rPr>
+        <w:t>Navbar and MobileNav: site navigation and logout.</w:t>
+      </w:r>
+    </w:p>
+    <w:p>
+      <w:pPr>
+        <w:pStyle w:val="ListBullet"/>
+      </w:pPr>
+      <w:r>
+        <w:rPr>
+          <w:rFonts w:ascii="Times New Roman" w:hAnsi="Times New Roman" w:eastAsia="Times New Roman"/>
+          <w:b w:val="0"/>
+          <w:sz w:val="24"/>
+        </w:rPr>
+        <w:t>CarsCatalog and CarCard: catalog grid and filtering.</w:t>
+      </w:r>
+    </w:p>
+    <w:p>
+      <w:pPr>
+        <w:pStyle w:val="ListBullet"/>
+      </w:pPr>
+      <w:r>
+        <w:rPr>
+          <w:rFonts w:ascii="Times New Roman" w:hAnsi="Times New Roman" w:eastAsia="Times New Roman"/>
+          <w:b w:val="0"/>
+          <w:sz w:val="24"/>
+        </w:rPr>
+        <w:t>CarImageGallery: detail page image display.</w:t>
+      </w:r>
+    </w:p>
+    <w:p>
+      <w:pPr>
+        <w:pStyle w:val="ListBullet"/>
+      </w:pPr>
+      <w:r>
+        <w:rPr>
+          <w:rFonts w:ascii="Times New Roman" w:hAnsi="Times New Roman" w:eastAsia="Times New Roman"/>
+          <w:b w:val="0"/>
+          <w:sz w:val="24"/>
+        </w:rPr>
+        <w:t>LoginForm and CarBookingForm: authenticated user interactions.</w:t>
+      </w:r>
+    </w:p>
+    <w:p>
+      <w:pPr>
+        <w:pStyle w:val="ListBullet"/>
+      </w:pPr>
+      <w:r>
+        <w:rPr>
+          <w:rFonts w:ascii="Times New Roman" w:hAnsi="Times New Roman" w:eastAsia="Times New Roman"/>
+          <w:b w:val="0"/>
+          <w:sz w:val="24"/>
+        </w:rPr>
+        <w:t>AdminNav and admin tables: fleet and booking management.</w:t>
+      </w:r>
+    </w:p>
+    <w:p>
+      <w:pPr>
+        <w:spacing w:before="200" w:after="120"/>
+      </w:pPr>
+      <w:r>
+        <w:rPr>
+          <w:rFonts w:ascii="Times New Roman" w:hAnsi="Times New Roman" w:eastAsia="Times New Roman"/>
+          <w:b/>
+          <w:sz w:val="28"/>
+        </w:rPr>
+        <w:t>9.10 Validation and Error Handling</w:t>
+      </w:r>
+    </w:p>
+    <w:p>
+      <w:pPr>
+        <w:pStyle w:val="ListBullet"/>
+      </w:pPr>
+      <w:r>
+        <w:rPr>
+          <w:rFonts w:ascii="Times New Roman" w:hAnsi="Times New Roman" w:eastAsia="Times New Roman"/>
+          <w:b w:val="0"/>
+          <w:sz w:val="24"/>
+        </w:rPr>
+        <w:t>Invalid login credentials show generic error without revealing which field failed.</w:t>
+      </w:r>
+    </w:p>
+    <w:p>
+      <w:pPr>
+        <w:pStyle w:val="ListBullet"/>
+      </w:pPr>
+      <w:r>
+        <w:rPr>
+          <w:rFonts w:ascii="Times New Roman" w:hAnsi="Times New Roman" w:eastAsia="Times New Roman"/>
+          <w:b w:val="0"/>
+          <w:sz w:val="24"/>
+        </w:rPr>
+        <w:t>Booking rejects invalid dates, unavailable cars, and unauthenticated sessions.</w:t>
+      </w:r>
+    </w:p>
+    <w:p>
+      <w:pPr>
+        <w:pStyle w:val="ListBullet"/>
+      </w:pPr>
+      <w:r>
+        <w:rPr>
+          <w:rFonts w:ascii="Times New Roman" w:hAnsi="Times New Roman" w:eastAsia="Times New Roman"/>
+          <w:b w:val="0"/>
+          <w:sz w:val="24"/>
+        </w:rPr>
+        <w:t>Admin actions validate role, record existence, and allowed status values.</w:t>
+      </w:r>
+    </w:p>
+    <w:p>
+      <w:pPr>
+        <w:pStyle w:val="ListBullet"/>
+      </w:pPr>
+      <w:r>
+        <w:rPr>
+          <w:rFonts w:ascii="Times New Roman" w:hAnsi="Times New Roman" w:eastAsia="Times New Roman"/>
+          <w:b w:val="0"/>
+          <w:sz w:val="24"/>
+        </w:rPr>
+        <w:t>Empty filter results and empty booking lists show dedicated empty states.</w:t>
+      </w:r>
+    </w:p>
+    <w:p>
       <w:r>
         <w:br w:type="page"/>
       </w:r>
@@ -5601,6 +6629,361 @@
         <w:t>Visit invalid URL; verify custom 404 page.</w:t>
       </w:r>
     </w:p>
+    <w:p>
+      <w:pPr>
+        <w:spacing w:before="200" w:after="120"/>
+      </w:pPr>
+      <w:r>
+        <w:rPr>
+          <w:rFonts w:ascii="Times New Roman" w:hAnsi="Times New Roman" w:eastAsia="Times New Roman"/>
+          <w:b/>
+          <w:sz w:val="28"/>
+        </w:rPr>
+        <w:t>10.4 Sample Test Cases</w:t>
+      </w:r>
+    </w:p>
+    <w:tbl>
+      <w:tblPr>
+        <w:tblStyle w:val="TableGrid"/>
+        <w:tblW w:type="auto" w:w="0"/>
+        <w:tblLook w:firstColumn="1" w:firstRow="1" w:lastColumn="0" w:lastRow="0" w:noHBand="0" w:noVBand="1" w:val="04A0"/>
+      </w:tblPr>
+      <w:tblGrid>
+        <w:gridCol w:w="3120"/>
+        <w:gridCol w:w="3120"/>
+        <w:gridCol w:w="3120"/>
+      </w:tblGrid>
+      <w:tr>
+        <w:tc>
+          <w:tcPr>
+            <w:tcW w:type="dxa" w:w="3120"/>
+          </w:tcPr>
+          <w:p>
+            <w:r>
+              <w:rPr>
+                <w:rFonts w:ascii="Times New Roman" w:hAnsi="Times New Roman" w:eastAsia="Times New Roman"/>
+                <w:b/>
+                <w:sz w:val="24"/>
+              </w:rPr>
+              <w:t>TC ID</w:t>
+            </w:r>
+          </w:p>
+        </w:tc>
+        <w:tc>
+          <w:tcPr>
+            <w:tcW w:type="dxa" w:w="3120"/>
+          </w:tcPr>
+          <w:p>
+            <w:r>
+              <w:rPr>
+                <w:rFonts w:ascii="Times New Roman" w:hAnsi="Times New Roman" w:eastAsia="Times New Roman"/>
+                <w:b/>
+                <w:sz w:val="24"/>
+              </w:rPr>
+              <w:t>Module</w:t>
+            </w:r>
+          </w:p>
+        </w:tc>
+        <w:tc>
+          <w:tcPr>
+            <w:tcW w:type="dxa" w:w="3120"/>
+          </w:tcPr>
+          <w:p>
+            <w:r>
+              <w:rPr>
+                <w:rFonts w:ascii="Times New Roman" w:hAnsi="Times New Roman" w:eastAsia="Times New Roman"/>
+                <w:b/>
+                <w:sz w:val="24"/>
+              </w:rPr>
+              <w:t>Expected Result</w:t>
+            </w:r>
+          </w:p>
+        </w:tc>
+      </w:tr>
+      <w:tr>
+        <w:tc>
+          <w:tcPr>
+            <w:tcW w:type="dxa" w:w="3120"/>
+          </w:tcPr>
+          <w:p>
+            <w:r>
+              <w:rPr>
+                <w:rFonts w:ascii="Times New Roman" w:hAnsi="Times New Roman" w:eastAsia="Times New Roman"/>
+                <w:b w:val="0"/>
+                <w:sz w:val="24"/>
+              </w:rPr>
+              <w:t>TC-01</w:t>
+            </w:r>
+          </w:p>
+        </w:tc>
+        <w:tc>
+          <w:tcPr>
+            <w:tcW w:type="dxa" w:w="3120"/>
+          </w:tcPr>
+          <w:p>
+            <w:r>
+              <w:rPr>
+                <w:rFonts w:ascii="Times New Roman" w:hAnsi="Times New Roman" w:eastAsia="Times New Roman"/>
+                <w:b w:val="0"/>
+                <w:sz w:val="24"/>
+              </w:rPr>
+              <w:t>Catalog</w:t>
+            </w:r>
+          </w:p>
+        </w:tc>
+        <w:tc>
+          <w:tcPr>
+            <w:tcW w:type="dxa" w:w="3120"/>
+          </w:tcPr>
+          <w:p>
+            <w:r>
+              <w:rPr>
+                <w:rFonts w:ascii="Times New Roman" w:hAnsi="Times New Roman" w:eastAsia="Times New Roman"/>
+                <w:b w:val="0"/>
+                <w:sz w:val="24"/>
+              </w:rPr>
+              <w:t>10 cars displayed on /cars</w:t>
+            </w:r>
+          </w:p>
+        </w:tc>
+      </w:tr>
+      <w:tr>
+        <w:tc>
+          <w:tcPr>
+            <w:tcW w:type="dxa" w:w="3120"/>
+          </w:tcPr>
+          <w:p>
+            <w:r>
+              <w:rPr>
+                <w:rFonts w:ascii="Times New Roman" w:hAnsi="Times New Roman" w:eastAsia="Times New Roman"/>
+                <w:b w:val="0"/>
+                <w:sz w:val="24"/>
+              </w:rPr>
+              <w:t>TC-03</w:t>
+            </w:r>
+          </w:p>
+        </w:tc>
+        <w:tc>
+          <w:tcPr>
+            <w:tcW w:type="dxa" w:w="3120"/>
+          </w:tcPr>
+          <w:p>
+            <w:r>
+              <w:rPr>
+                <w:rFonts w:ascii="Times New Roman" w:hAnsi="Times New Roman" w:eastAsia="Times New Roman"/>
+                <w:b w:val="0"/>
+                <w:sz w:val="24"/>
+              </w:rPr>
+              <w:t>Auth</w:t>
+            </w:r>
+          </w:p>
+        </w:tc>
+        <w:tc>
+          <w:tcPr>
+            <w:tcW w:type="dxa" w:w="3120"/>
+          </w:tcPr>
+          <w:p>
+            <w:r>
+              <w:rPr>
+                <w:rFonts w:ascii="Times New Roman" w:hAnsi="Times New Roman" w:eastAsia="Times New Roman"/>
+                <w:b w:val="0"/>
+                <w:sz w:val="24"/>
+              </w:rPr>
+              <w:t>Wrong password shows error alert</w:t>
+            </w:r>
+          </w:p>
+        </w:tc>
+      </w:tr>
+      <w:tr>
+        <w:tc>
+          <w:tcPr>
+            <w:tcW w:type="dxa" w:w="3120"/>
+          </w:tcPr>
+          <w:p>
+            <w:r>
+              <w:rPr>
+                <w:rFonts w:ascii="Times New Roman" w:hAnsi="Times New Roman" w:eastAsia="Times New Roman"/>
+                <w:b w:val="0"/>
+                <w:sz w:val="24"/>
+              </w:rPr>
+              <w:t>TC-05</w:t>
+            </w:r>
+          </w:p>
+        </w:tc>
+        <w:tc>
+          <w:tcPr>
+            <w:tcW w:type="dxa" w:w="3120"/>
+          </w:tcPr>
+          <w:p>
+            <w:r>
+              <w:rPr>
+                <w:rFonts w:ascii="Times New Roman" w:hAnsi="Times New Roman" w:eastAsia="Times New Roman"/>
+                <w:b w:val="0"/>
+                <w:sz w:val="24"/>
+              </w:rPr>
+              <w:t>Auth</w:t>
+            </w:r>
+          </w:p>
+        </w:tc>
+        <w:tc>
+          <w:tcPr>
+            <w:tcW w:type="dxa" w:w="3120"/>
+          </w:tcPr>
+          <w:p>
+            <w:r>
+              <w:rPr>
+                <w:rFonts w:ascii="Times New Roman" w:hAnsi="Times New Roman" w:eastAsia="Times New Roman"/>
+                <w:b w:val="0"/>
+                <w:sz w:val="24"/>
+              </w:rPr>
+              <w:t>Admin login redirects to dashboard</w:t>
+            </w:r>
+          </w:p>
+        </w:tc>
+      </w:tr>
+      <w:tr>
+        <w:tc>
+          <w:tcPr>
+            <w:tcW w:type="dxa" w:w="3120"/>
+          </w:tcPr>
+          <w:p>
+            <w:r>
+              <w:rPr>
+                <w:rFonts w:ascii="Times New Roman" w:hAnsi="Times New Roman" w:eastAsia="Times New Roman"/>
+                <w:b w:val="0"/>
+                <w:sz w:val="24"/>
+              </w:rPr>
+              <w:t>TC-07</w:t>
+            </w:r>
+          </w:p>
+        </w:tc>
+        <w:tc>
+          <w:tcPr>
+            <w:tcW w:type="dxa" w:w="3120"/>
+          </w:tcPr>
+          <w:p>
+            <w:r>
+              <w:rPr>
+                <w:rFonts w:ascii="Times New Roman" w:hAnsi="Times New Roman" w:eastAsia="Times New Roman"/>
+                <w:b w:val="0"/>
+                <w:sz w:val="24"/>
+              </w:rPr>
+              <w:t>Guard</w:t>
+            </w:r>
+          </w:p>
+        </w:tc>
+        <w:tc>
+          <w:tcPr>
+            <w:tcW w:type="dxa" w:w="3120"/>
+          </w:tcPr>
+          <w:p>
+            <w:r>
+              <w:rPr>
+                <w:rFonts w:ascii="Times New Roman" w:hAnsi="Times New Roman" w:eastAsia="Times New Roman"/>
+                <w:b w:val="0"/>
+                <w:sz w:val="24"/>
+              </w:rPr>
+              <w:t>User blocked from /admin/cars</w:t>
+            </w:r>
+          </w:p>
+        </w:tc>
+      </w:tr>
+      <w:tr>
+        <w:tc>
+          <w:tcPr>
+            <w:tcW w:type="dxa" w:w="3120"/>
+          </w:tcPr>
+          <w:p>
+            <w:r>
+              <w:rPr>
+                <w:rFonts w:ascii="Times New Roman" w:hAnsi="Times New Roman" w:eastAsia="Times New Roman"/>
+                <w:b w:val="0"/>
+                <w:sz w:val="24"/>
+              </w:rPr>
+              <w:t>TC-08</w:t>
+            </w:r>
+          </w:p>
+        </w:tc>
+        <w:tc>
+          <w:tcPr>
+            <w:tcW w:type="dxa" w:w="3120"/>
+          </w:tcPr>
+          <w:p>
+            <w:r>
+              <w:rPr>
+                <w:rFonts w:ascii="Times New Roman" w:hAnsi="Times New Roman" w:eastAsia="Times New Roman"/>
+                <w:b w:val="0"/>
+                <w:sz w:val="24"/>
+              </w:rPr>
+              <w:t>Booking</w:t>
+            </w:r>
+          </w:p>
+        </w:tc>
+        <w:tc>
+          <w:tcPr>
+            <w:tcW w:type="dxa" w:w="3120"/>
+          </w:tcPr>
+          <w:p>
+            <w:r>
+              <w:rPr>
+                <w:rFonts w:ascii="Times New Roman" w:hAnsi="Times New Roman" w:eastAsia="Times New Roman"/>
+                <w:b w:val="0"/>
+                <w:sz w:val="24"/>
+              </w:rPr>
+              <w:t>3-day rental computes correct total price</w:t>
+            </w:r>
+          </w:p>
+        </w:tc>
+      </w:tr>
+      <w:tr>
+        <w:tc>
+          <w:tcPr>
+            <w:tcW w:type="dxa" w:w="3120"/>
+          </w:tcPr>
+          <w:p>
+            <w:r>
+              <w:rPr>
+                <w:rFonts w:ascii="Times New Roman" w:hAnsi="Times New Roman" w:eastAsia="Times New Roman"/>
+                <w:b w:val="0"/>
+                <w:sz w:val="24"/>
+              </w:rPr>
+              <w:t>TC-11</w:t>
+            </w:r>
+          </w:p>
+        </w:tc>
+        <w:tc>
+          <w:tcPr>
+            <w:tcW w:type="dxa" w:w="3120"/>
+          </w:tcPr>
+          <w:p>
+            <w:r>
+              <w:rPr>
+                <w:rFonts w:ascii="Times New Roman" w:hAnsi="Times New Roman" w:eastAsia="Times New Roman"/>
+                <w:b w:val="0"/>
+                <w:sz w:val="24"/>
+              </w:rPr>
+              <w:t>Admin</w:t>
+            </w:r>
+          </w:p>
+        </w:tc>
+        <w:tc>
+          <w:tcPr>
+            <w:tcW w:type="dxa" w:w="3120"/>
+          </w:tcPr>
+          <w:p>
+            <w:r>
+              <w:rPr>
+                <w:rFonts w:ascii="Times New Roman" w:hAnsi="Times New Roman" w:eastAsia="Times New Roman"/>
+                <w:b w:val="0"/>
+                <w:sz w:val="24"/>
+              </w:rPr>
+              <w:t>Deleted car removed from catalog</w:t>
+            </w:r>
+          </w:p>
+        </w:tc>
+      </w:tr>
+    </w:tbl>
+    <w:p/>
     <w:p>
       <w:r>
         <w:br w:type="page"/>
@@ -5833,6 +7216,188 @@
       </w:r>
     </w:p>
     <w:p>
+      <w:pPr>
+        <w:spacing w:before="200" w:after="120"/>
+      </w:pPr>
+      <w:r>
+        <w:rPr>
+          <w:rFonts w:ascii="Times New Roman" w:hAnsi="Times New Roman" w:eastAsia="Times New Roman"/>
+          <w:b/>
+          <w:sz w:val="28"/>
+        </w:rPr>
+        <w:t>11.4 Supabase Project Setup</w:t>
+      </w:r>
+    </w:p>
+    <w:p>
+      <w:pPr>
+        <w:pStyle w:val="ListBullet"/>
+      </w:pPr>
+      <w:r>
+        <w:rPr>
+          <w:rFonts w:ascii="Times New Roman" w:hAnsi="Times New Roman" w:eastAsia="Times New Roman"/>
+          <w:b w:val="0"/>
+          <w:sz w:val="24"/>
+        </w:rPr>
+        <w:t>Create Supabase account and new project.</w:t>
+      </w:r>
+    </w:p>
+    <w:p>
+      <w:pPr>
+        <w:pStyle w:val="ListBullet"/>
+      </w:pPr>
+      <w:r>
+        <w:rPr>
+          <w:rFonts w:ascii="Times New Roman" w:hAnsi="Times New Roman" w:eastAsia="Times New Roman"/>
+          <w:b w:val="0"/>
+          <w:sz w:val="24"/>
+        </w:rPr>
+        <w:t>Run SQL migrations from supabase/migrations/ in SQL Editor.</w:t>
+      </w:r>
+    </w:p>
+    <w:p>
+      <w:pPr>
+        <w:pStyle w:val="ListBullet"/>
+      </w:pPr>
+      <w:r>
+        <w:rPr>
+          <w:rFonts w:ascii="Times New Roman" w:hAnsi="Times New Roman" w:eastAsia="Times New Roman"/>
+          <w:b w:val="0"/>
+          <w:sz w:val="24"/>
+        </w:rPr>
+        <w:t>Copy Project URL, anon key, and service role key to .env.local.</w:t>
+      </w:r>
+    </w:p>
+    <w:p>
+      <w:pPr>
+        <w:pStyle w:val="ListBullet"/>
+      </w:pPr>
+      <w:r>
+        <w:rPr>
+          <w:rFonts w:ascii="Times New Roman" w:hAnsi="Times New Roman" w:eastAsia="Times New Roman"/>
+          <w:b w:val="0"/>
+          <w:sz w:val="24"/>
+        </w:rPr>
+        <w:t>Run npm run seed to create demo users, cars, and bookings.</w:t>
+      </w:r>
+    </w:p>
+    <w:p>
+      <w:pPr>
+        <w:pStyle w:val="ListBullet"/>
+      </w:pPr>
+      <w:r>
+        <w:rPr>
+          <w:rFonts w:ascii="Times New Roman" w:hAnsi="Times New Roman" w:eastAsia="Times New Roman"/>
+          <w:b w:val="0"/>
+          <w:sz w:val="24"/>
+        </w:rPr>
+        <w:t>Configure Auth redirect URLs for localhost and Vercel domain.</w:t>
+      </w:r>
+    </w:p>
+    <w:p>
+      <w:pPr>
+        <w:spacing w:before="200" w:after="120"/>
+      </w:pPr>
+      <w:r>
+        <w:rPr>
+          <w:rFonts w:ascii="Times New Roman" w:hAnsi="Times New Roman" w:eastAsia="Times New Roman"/>
+          <w:b/>
+          <w:sz w:val="28"/>
+        </w:rPr>
+        <w:t>11.5 Vercel Deployment Guide</w:t>
+      </w:r>
+    </w:p>
+    <w:p>
+      <w:pPr>
+        <w:pStyle w:val="ListBullet"/>
+      </w:pPr>
+      <w:r>
+        <w:rPr>
+          <w:rFonts w:ascii="Times New Roman" w:hAnsi="Times New Roman" w:eastAsia="Times New Roman"/>
+          <w:b w:val="0"/>
+          <w:sz w:val="24"/>
+        </w:rPr>
+        <w:t>Import GitHub repository into Vercel.</w:t>
+      </w:r>
+    </w:p>
+    <w:p>
+      <w:pPr>
+        <w:pStyle w:val="ListBullet"/>
+      </w:pPr>
+      <w:r>
+        <w:rPr>
+          <w:rFonts w:ascii="Times New Roman" w:hAnsi="Times New Roman" w:eastAsia="Times New Roman"/>
+          <w:b w:val="0"/>
+          <w:sz w:val="24"/>
+        </w:rPr>
+        <w:t>Add NEXT_PUBLIC_SUPABASE_URL and NEXT_PUBLIC_SUPABASE_ANON_KEY env vars.</w:t>
+      </w:r>
+    </w:p>
+    <w:p>
+      <w:pPr>
+        <w:pStyle w:val="ListBullet"/>
+      </w:pPr>
+      <w:r>
+        <w:rPr>
+          <w:rFonts w:ascii="Times New Roman" w:hAnsi="Times New Roman" w:eastAsia="Times New Roman"/>
+          <w:b w:val="0"/>
+          <w:sz w:val="24"/>
+        </w:rPr>
+        <w:t>Do not add SUPABASE_SERVICE_ROLE_KEY to Vercel.</w:t>
+      </w:r>
+    </w:p>
+    <w:p>
+      <w:pPr>
+        <w:pStyle w:val="ListBullet"/>
+      </w:pPr>
+      <w:r>
+        <w:rPr>
+          <w:rFonts w:ascii="Times New Roman" w:hAnsi="Times New Roman" w:eastAsia="Times New Roman"/>
+          <w:b w:val="0"/>
+          <w:sz w:val="24"/>
+        </w:rPr>
+        <w:t>Add Vercel URL to Supabase Auth allowed redirect URLs.</w:t>
+      </w:r>
+    </w:p>
+    <w:p>
+      <w:pPr>
+        <w:pStyle w:val="ListBullet"/>
+      </w:pPr>
+      <w:r>
+        <w:rPr>
+          <w:rFonts w:ascii="Times New Roman" w:hAnsi="Times New Roman" w:eastAsia="Times New Roman"/>
+          <w:b w:val="0"/>
+          <w:sz w:val="24"/>
+        </w:rPr>
+        <w:t>Deploy and verify login, catalog, booking, and admin flows.</w:t>
+      </w:r>
+    </w:p>
+    <w:p>
+      <w:pPr>
+        <w:spacing w:before="200" w:after="120"/>
+      </w:pPr>
+      <w:r>
+        <w:rPr>
+          <w:rFonts w:ascii="Times New Roman" w:hAnsi="Times New Roman" w:eastAsia="Times New Roman"/>
+          <w:b/>
+          <w:sz w:val="28"/>
+        </w:rPr>
+        <w:t>11.6 Network Privacy (Browser vs Server)</w:t>
+      </w:r>
+    </w:p>
+    <w:p>
+      <w:pPr>
+        <w:spacing w:after="120" w:line="276" w:lineRule="auto"/>
+      </w:pPr>
+      <w:r>
+        <w:rPr>
+          <w:rFonts w:ascii="Times New Roman" w:hAnsi="Times New Roman" w:eastAsia="Times New Roman"/>
+          <w:b w:val="0"/>
+          <w:sz w:val="24"/>
+        </w:rPr>
+        <w:t>DriveEase ensures the browser does not expose Supabase API traffic. All database queries and authentication API calls execute on the Next.js server. The browser Network tab shows requests only to the application domain. Session cookies are HTTP-only. External requests are primarily Unsplash image URLs for car photos.</w:t>
+      </w:r>
+    </w:p>
+    <w:p>
       <w:r>
         <w:br w:type="page"/>
       </w:r>
@@ -5879,6 +7444,19 @@
     </w:p>
     <w:p>
       <w:pPr>
+        <w:spacing w:after="120" w:line="276" w:lineRule="auto"/>
+      </w:pPr>
+      <w:r>
+        <w:rPr>
+          <w:rFonts w:ascii="Times New Roman" w:hAnsi="Times New Roman" w:eastAsia="Times New Roman"/>
+          <w:b w:val="0"/>
+          <w:sz w:val="24"/>
+        </w:rPr>
+        <w:t>Security is enforced at three levels: Next.js middleware for route protection, Supabase Auth for session management with hashed passwords, and PostgreSQL RLS for database row access control. Server-side-only Supabase queries prevent the browser from exposing database API calls.</w:t>
+      </w:r>
+    </w:p>
+    <w:p>
+      <w:pPr>
         <w:spacing w:before="200" w:after="120"/>
       </w:pPr>
       <w:r>
@@ -5900,7 +7478,7 @@
           <w:b w:val="0"/>
           <w:sz w:val="24"/>
         </w:rPr>
-        <w:t>User registration: Add sign-up page and email confirmation via Supabase Auth.</w:t>
+        <w:t>User registration with email confirmation via Supabase Auth.</w:t>
       </w:r>
     </w:p>
     <w:p>
@@ -5913,7 +7491,7 @@
           <w:b w:val="0"/>
           <w:sz w:val="24"/>
         </w:rPr>
-        <w:t>Payment gateway: Integrate Stripe or Razorpay for online payment.</w:t>
+        <w:t>Payment gateway integration (Stripe or Razorpay).</w:t>
       </w:r>
     </w:p>
     <w:p>
@@ -5926,7 +7504,7 @@
           <w:b w:val="0"/>
           <w:sz w:val="24"/>
         </w:rPr>
-        <w:t>Email notifications: Booking confirmation and reminder emails.</w:t>
+        <w:t>Email booking confirmations via Edge Functions.</w:t>
       </w:r>
     </w:p>
     <w:p>
@@ -5939,7 +7517,7 @@
           <w:b w:val="0"/>
           <w:sz w:val="24"/>
         </w:rPr>
-        <w:t>Availability calendar: Block dates when cars are already booked.</w:t>
+        <w:t>Date-range availability blocking for overlapping bookings.</w:t>
       </w:r>
     </w:p>
     <w:p>
@@ -5952,7 +7530,7 @@
           <w:b w:val="0"/>
           <w:sz w:val="24"/>
         </w:rPr>
-        <w:t>Image upload: Use Supabase Storage for admin car photos.</w:t>
+        <w:t>Supabase Storage for admin car photo uploads.</w:t>
       </w:r>
     </w:p>
     <w:p>
@@ -5965,7 +7543,7 @@
           <w:b w:val="0"/>
           <w:sz w:val="24"/>
         </w:rPr>
-        <w:t>OAuth providers: Add Google or GitHub login via Supabase Auth.</w:t>
+        <w:t>OAuth login (Google, GitHub).</w:t>
       </w:r>
     </w:p>
     <w:p>
@@ -5978,7 +7556,46 @@
           <w:b w:val="0"/>
           <w:sz w:val="24"/>
         </w:rPr>
-        <w:t>CI/CD pipeline: Automated tests and deployment on pull requests.</w:t>
+        <w:t>Audit logging for admin mutations.</w:t>
+      </w:r>
+    </w:p>
+    <w:p>
+      <w:pPr>
+        <w:pStyle w:val="ListBullet"/>
+      </w:pPr>
+      <w:r>
+        <w:rPr>
+          <w:rFonts w:ascii="Times New Roman" w:hAnsi="Times New Roman" w:eastAsia="Times New Roman"/>
+          <w:b w:val="0"/>
+          <w:sz w:val="24"/>
+        </w:rPr>
+        <w:t>CI/CD pipeline with automated tests on pull requests.</w:t>
+      </w:r>
+    </w:p>
+    <w:p>
+      <w:pPr>
+        <w:pStyle w:val="ListBullet"/>
+      </w:pPr>
+      <w:r>
+        <w:rPr>
+          <w:rFonts w:ascii="Times New Roman" w:hAnsi="Times New Roman" w:eastAsia="Times New Roman"/>
+          <w:b w:val="0"/>
+          <w:sz w:val="24"/>
+        </w:rPr>
+        <w:t>Dashboard analytics charts for booking trends.</w:t>
+      </w:r>
+    </w:p>
+    <w:p>
+      <w:pPr>
+        <w:pStyle w:val="ListBullet"/>
+      </w:pPr>
+      <w:r>
+        <w:rPr>
+          <w:rFonts w:ascii="Times New Roman" w:hAnsi="Times New Roman" w:eastAsia="Times New Roman"/>
+          <w:b w:val="0"/>
+          <w:sz w:val="24"/>
+        </w:rPr>
+        <w:t>Multi-location pickup/drop-off support.</w:t>
       </w:r>
     </w:p>
     <w:p>
@@ -6461,7 +8078,7 @@
           <w:b/>
           <w:sz w:val="28"/>
         </w:rPr>
-        <w:t>Appendix C — Environment Variables</w:t>
+        <w:t>Appendix C — Row Level Security Policy Matrix</w:t>
       </w:r>
     </w:p>
     <w:tbl>
@@ -6487,7 +8104,7 @@
                 <w:b/>
                 <w:sz w:val="24"/>
               </w:rPr>
-              <w:t>Variable</w:t>
+              <w:t>Table</w:t>
             </w:r>
           </w:p>
         </w:tc>
@@ -6502,7 +8119,7 @@
                 <w:b/>
                 <w:sz w:val="24"/>
               </w:rPr>
-              <w:t>Required</w:t>
+              <w:t>Operation</w:t>
             </w:r>
           </w:p>
         </w:tc>
@@ -6517,7 +8134,7 @@
                 <w:b/>
                 <w:sz w:val="24"/>
               </w:rPr>
-              <w:t>Purpose</w:t>
+              <w:t>Who</w:t>
             </w:r>
           </w:p>
         </w:tc>
@@ -6534,7 +8151,7 @@
                 <w:b w:val="0"/>
                 <w:sz w:val="24"/>
               </w:rPr>
-              <w:t>NEXT_PUBLIC_SUPABASE_URL</w:t>
+              <w:t>profiles</w:t>
             </w:r>
           </w:p>
         </w:tc>
@@ -6549,7 +8166,7 @@
                 <w:b w:val="0"/>
                 <w:sz w:val="24"/>
               </w:rPr>
-              <w:t>Yes</w:t>
+              <w:t>SELECT</w:t>
             </w:r>
           </w:p>
         </w:tc>
@@ -6564,7 +8181,7 @@
                 <w:b w:val="0"/>
                 <w:sz w:val="24"/>
               </w:rPr>
-              <w:t>Supabase project URL</w:t>
+              <w:t>own user or admin</w:t>
             </w:r>
           </w:p>
         </w:tc>
@@ -6581,7 +8198,7 @@
                 <w:b w:val="0"/>
                 <w:sz w:val="24"/>
               </w:rPr>
-              <w:t>NEXT_PUBLIC_SUPABASE_ANON_KEY</w:t>
+              <w:t>cars</w:t>
             </w:r>
           </w:p>
         </w:tc>
@@ -6596,7 +8213,7 @@
                 <w:b w:val="0"/>
                 <w:sz w:val="24"/>
               </w:rPr>
-              <w:t>Yes</w:t>
+              <w:t>SELECT</w:t>
             </w:r>
           </w:p>
         </w:tc>
@@ -6611,7 +8228,7 @@
                 <w:b w:val="0"/>
                 <w:sz w:val="24"/>
               </w:rPr>
-              <w:t>Server-side Supabase client</w:t>
+              <w:t>everyone (anon + auth)</w:t>
             </w:r>
           </w:p>
         </w:tc>
@@ -6628,7 +8245,7 @@
                 <w:b w:val="0"/>
                 <w:sz w:val="24"/>
               </w:rPr>
-              <w:t>SUPABASE_SERVICE_ROLE_KEY</w:t>
+              <w:t>cars</w:t>
             </w:r>
           </w:p>
         </w:tc>
@@ -6643,7 +8260,7 @@
                 <w:b w:val="0"/>
                 <w:sz w:val="24"/>
               </w:rPr>
-              <w:t>Seed only</w:t>
+              <w:t>INSERT/UPDATE/DELETE</w:t>
             </w:r>
           </w:p>
         </w:tc>
@@ -6658,7 +8275,101 @@
                 <w:b w:val="0"/>
                 <w:sz w:val="24"/>
               </w:rPr>
-              <w:t>Local npm run seed script</w:t>
+              <w:t>admin only</w:t>
+            </w:r>
+          </w:p>
+        </w:tc>
+      </w:tr>
+      <w:tr>
+        <w:tc>
+          <w:tcPr>
+            <w:tcW w:type="dxa" w:w="3120"/>
+          </w:tcPr>
+          <w:p>
+            <w:r>
+              <w:rPr>
+                <w:rFonts w:ascii="Times New Roman" w:hAnsi="Times New Roman" w:eastAsia="Times New Roman"/>
+                <w:b w:val="0"/>
+                <w:sz w:val="24"/>
+              </w:rPr>
+              <w:t>bookings</w:t>
+            </w:r>
+          </w:p>
+        </w:tc>
+        <w:tc>
+          <w:tcPr>
+            <w:tcW w:type="dxa" w:w="3120"/>
+          </w:tcPr>
+          <w:p>
+            <w:r>
+              <w:rPr>
+                <w:rFonts w:ascii="Times New Roman" w:hAnsi="Times New Roman" w:eastAsia="Times New Roman"/>
+                <w:b w:val="0"/>
+                <w:sz w:val="24"/>
+              </w:rPr>
+              <w:t>SELECT/INSERT</w:t>
+            </w:r>
+          </w:p>
+        </w:tc>
+        <w:tc>
+          <w:tcPr>
+            <w:tcW w:type="dxa" w:w="3120"/>
+          </w:tcPr>
+          <w:p>
+            <w:r>
+              <w:rPr>
+                <w:rFonts w:ascii="Times New Roman" w:hAnsi="Times New Roman" w:eastAsia="Times New Roman"/>
+                <w:b w:val="0"/>
+                <w:sz w:val="24"/>
+              </w:rPr>
+              <w:t>own user</w:t>
+            </w:r>
+          </w:p>
+        </w:tc>
+      </w:tr>
+      <w:tr>
+        <w:tc>
+          <w:tcPr>
+            <w:tcW w:type="dxa" w:w="3120"/>
+          </w:tcPr>
+          <w:p>
+            <w:r>
+              <w:rPr>
+                <w:rFonts w:ascii="Times New Roman" w:hAnsi="Times New Roman" w:eastAsia="Times New Roman"/>
+                <w:b w:val="0"/>
+                <w:sz w:val="24"/>
+              </w:rPr>
+              <w:t>bookings</w:t>
+            </w:r>
+          </w:p>
+        </w:tc>
+        <w:tc>
+          <w:tcPr>
+            <w:tcW w:type="dxa" w:w="3120"/>
+          </w:tcPr>
+          <w:p>
+            <w:r>
+              <w:rPr>
+                <w:rFonts w:ascii="Times New Roman" w:hAnsi="Times New Roman" w:eastAsia="Times New Roman"/>
+                <w:b w:val="0"/>
+                <w:sz w:val="24"/>
+              </w:rPr>
+              <w:t>SELECT/UPDATE</w:t>
+            </w:r>
+          </w:p>
+        </w:tc>
+        <w:tc>
+          <w:tcPr>
+            <w:tcW w:type="dxa" w:w="3120"/>
+          </w:tcPr>
+          <w:p>
+            <w:r>
+              <w:rPr>
+                <w:rFonts w:ascii="Times New Roman" w:hAnsi="Times New Roman" w:eastAsia="Times New Roman"/>
+                <w:b w:val="0"/>
+                <w:sz w:val="24"/>
+              </w:rPr>
+              <w:t>admin (all rows)</w:t>
             </w:r>
           </w:p>
         </w:tc>
@@ -6675,7 +8386,581 @@
           <w:b/>
           <w:sz w:val="28"/>
         </w:rPr>
-        <w:t>Appendix D — Screenshot Placeholders</w:t>
+        <w:t>Appendix D — Environment Variables</w:t>
+      </w:r>
+    </w:p>
+    <w:tbl>
+      <w:tblPr>
+        <w:tblStyle w:val="TableGrid"/>
+        <w:tblW w:type="auto" w:w="0"/>
+        <w:tblLook w:firstColumn="1" w:firstRow="1" w:lastColumn="0" w:lastRow="0" w:noHBand="0" w:noVBand="1" w:val="04A0"/>
+      </w:tblPr>
+      <w:tblGrid>
+        <w:gridCol w:w="3120"/>
+        <w:gridCol w:w="3120"/>
+        <w:gridCol w:w="3120"/>
+      </w:tblGrid>
+      <w:tr>
+        <w:tc>
+          <w:tcPr>
+            <w:tcW w:type="dxa" w:w="3120"/>
+          </w:tcPr>
+          <w:p>
+            <w:r>
+              <w:rPr>
+                <w:rFonts w:ascii="Times New Roman" w:hAnsi="Times New Roman" w:eastAsia="Times New Roman"/>
+                <w:b/>
+                <w:sz w:val="24"/>
+              </w:rPr>
+              <w:t>Variable</w:t>
+            </w:r>
+          </w:p>
+        </w:tc>
+        <w:tc>
+          <w:tcPr>
+            <w:tcW w:type="dxa" w:w="3120"/>
+          </w:tcPr>
+          <w:p>
+            <w:r>
+              <w:rPr>
+                <w:rFonts w:ascii="Times New Roman" w:hAnsi="Times New Roman" w:eastAsia="Times New Roman"/>
+                <w:b/>
+                <w:sz w:val="24"/>
+              </w:rPr>
+              <w:t>Required</w:t>
+            </w:r>
+          </w:p>
+        </w:tc>
+        <w:tc>
+          <w:tcPr>
+            <w:tcW w:type="dxa" w:w="3120"/>
+          </w:tcPr>
+          <w:p>
+            <w:r>
+              <w:rPr>
+                <w:rFonts w:ascii="Times New Roman" w:hAnsi="Times New Roman" w:eastAsia="Times New Roman"/>
+                <w:b/>
+                <w:sz w:val="24"/>
+              </w:rPr>
+              <w:t>Purpose</w:t>
+            </w:r>
+          </w:p>
+        </w:tc>
+      </w:tr>
+      <w:tr>
+        <w:tc>
+          <w:tcPr>
+            <w:tcW w:type="dxa" w:w="3120"/>
+          </w:tcPr>
+          <w:p>
+            <w:r>
+              <w:rPr>
+                <w:rFonts w:ascii="Times New Roman" w:hAnsi="Times New Roman" w:eastAsia="Times New Roman"/>
+                <w:b w:val="0"/>
+                <w:sz w:val="24"/>
+              </w:rPr>
+              <w:t>NEXT_PUBLIC_SUPABASE_URL</w:t>
+            </w:r>
+          </w:p>
+        </w:tc>
+        <w:tc>
+          <w:tcPr>
+            <w:tcW w:type="dxa" w:w="3120"/>
+          </w:tcPr>
+          <w:p>
+            <w:r>
+              <w:rPr>
+                <w:rFonts w:ascii="Times New Roman" w:hAnsi="Times New Roman" w:eastAsia="Times New Roman"/>
+                <w:b w:val="0"/>
+                <w:sz w:val="24"/>
+              </w:rPr>
+              <w:t>Yes</w:t>
+            </w:r>
+          </w:p>
+        </w:tc>
+        <w:tc>
+          <w:tcPr>
+            <w:tcW w:type="dxa" w:w="3120"/>
+          </w:tcPr>
+          <w:p>
+            <w:r>
+              <w:rPr>
+                <w:rFonts w:ascii="Times New Roman" w:hAnsi="Times New Roman" w:eastAsia="Times New Roman"/>
+                <w:b w:val="0"/>
+                <w:sz w:val="24"/>
+              </w:rPr>
+              <w:t>Supabase project URL</w:t>
+            </w:r>
+          </w:p>
+        </w:tc>
+      </w:tr>
+      <w:tr>
+        <w:tc>
+          <w:tcPr>
+            <w:tcW w:type="dxa" w:w="3120"/>
+          </w:tcPr>
+          <w:p>
+            <w:r>
+              <w:rPr>
+                <w:rFonts w:ascii="Times New Roman" w:hAnsi="Times New Roman" w:eastAsia="Times New Roman"/>
+                <w:b w:val="0"/>
+                <w:sz w:val="24"/>
+              </w:rPr>
+              <w:t>NEXT_PUBLIC_SUPABASE_ANON_KEY</w:t>
+            </w:r>
+          </w:p>
+        </w:tc>
+        <w:tc>
+          <w:tcPr>
+            <w:tcW w:type="dxa" w:w="3120"/>
+          </w:tcPr>
+          <w:p>
+            <w:r>
+              <w:rPr>
+                <w:rFonts w:ascii="Times New Roman" w:hAnsi="Times New Roman" w:eastAsia="Times New Roman"/>
+                <w:b w:val="0"/>
+                <w:sz w:val="24"/>
+              </w:rPr>
+              <w:t>Yes</w:t>
+            </w:r>
+          </w:p>
+        </w:tc>
+        <w:tc>
+          <w:tcPr>
+            <w:tcW w:type="dxa" w:w="3120"/>
+          </w:tcPr>
+          <w:p>
+            <w:r>
+              <w:rPr>
+                <w:rFonts w:ascii="Times New Roman" w:hAnsi="Times New Roman" w:eastAsia="Times New Roman"/>
+                <w:b w:val="0"/>
+                <w:sz w:val="24"/>
+              </w:rPr>
+              <w:t>Server-side Supabase client</w:t>
+            </w:r>
+          </w:p>
+        </w:tc>
+      </w:tr>
+      <w:tr>
+        <w:tc>
+          <w:tcPr>
+            <w:tcW w:type="dxa" w:w="3120"/>
+          </w:tcPr>
+          <w:p>
+            <w:r>
+              <w:rPr>
+                <w:rFonts w:ascii="Times New Roman" w:hAnsi="Times New Roman" w:eastAsia="Times New Roman"/>
+                <w:b w:val="0"/>
+                <w:sz w:val="24"/>
+              </w:rPr>
+              <w:t>SUPABASE_SERVICE_ROLE_KEY</w:t>
+            </w:r>
+          </w:p>
+        </w:tc>
+        <w:tc>
+          <w:tcPr>
+            <w:tcW w:type="dxa" w:w="3120"/>
+          </w:tcPr>
+          <w:p>
+            <w:r>
+              <w:rPr>
+                <w:rFonts w:ascii="Times New Roman" w:hAnsi="Times New Roman" w:eastAsia="Times New Roman"/>
+                <w:b w:val="0"/>
+                <w:sz w:val="24"/>
+              </w:rPr>
+              <w:t>Seed only</w:t>
+            </w:r>
+          </w:p>
+        </w:tc>
+        <w:tc>
+          <w:tcPr>
+            <w:tcW w:type="dxa" w:w="3120"/>
+          </w:tcPr>
+          <w:p>
+            <w:r>
+              <w:rPr>
+                <w:rFonts w:ascii="Times New Roman" w:hAnsi="Times New Roman" w:eastAsia="Times New Roman"/>
+                <w:b w:val="0"/>
+                <w:sz w:val="24"/>
+              </w:rPr>
+              <w:t>Local npm run seed script</w:t>
+            </w:r>
+          </w:p>
+        </w:tc>
+      </w:tr>
+    </w:tbl>
+    <w:p/>
+    <w:p>
+      <w:pPr>
+        <w:spacing w:before="200" w:after="120"/>
+      </w:pPr>
+      <w:r>
+        <w:rPr>
+          <w:rFonts w:ascii="Times New Roman" w:hAnsi="Times New Roman" w:eastAsia="Times New Roman"/>
+          <w:b/>
+          <w:sz w:val="28"/>
+        </w:rPr>
+        <w:t>Appendix E — Server Actions Summary</w:t>
+      </w:r>
+    </w:p>
+    <w:tbl>
+      <w:tblPr>
+        <w:tblStyle w:val="TableGrid"/>
+        <w:tblW w:type="auto" w:w="0"/>
+        <w:tblLook w:firstColumn="1" w:firstRow="1" w:lastColumn="0" w:lastRow="0" w:noHBand="0" w:noVBand="1" w:val="04A0"/>
+      </w:tblPr>
+      <w:tblGrid>
+        <w:gridCol w:w="3120"/>
+        <w:gridCol w:w="3120"/>
+        <w:gridCol w:w="3120"/>
+      </w:tblGrid>
+      <w:tr>
+        <w:tc>
+          <w:tcPr>
+            <w:tcW w:type="dxa" w:w="3120"/>
+          </w:tcPr>
+          <w:p>
+            <w:r>
+              <w:rPr>
+                <w:rFonts w:ascii="Times New Roman" w:hAnsi="Times New Roman" w:eastAsia="Times New Roman"/>
+                <w:b/>
+                <w:sz w:val="24"/>
+              </w:rPr>
+              <w:t>Action</w:t>
+            </w:r>
+          </w:p>
+        </w:tc>
+        <w:tc>
+          <w:tcPr>
+            <w:tcW w:type="dxa" w:w="3120"/>
+          </w:tcPr>
+          <w:p>
+            <w:r>
+              <w:rPr>
+                <w:rFonts w:ascii="Times New Roman" w:hAnsi="Times New Roman" w:eastAsia="Times New Roman"/>
+                <w:b/>
+                <w:sz w:val="24"/>
+              </w:rPr>
+              <w:t>Auth</w:t>
+            </w:r>
+          </w:p>
+        </w:tc>
+        <w:tc>
+          <w:tcPr>
+            <w:tcW w:type="dxa" w:w="3120"/>
+          </w:tcPr>
+          <w:p>
+            <w:r>
+              <w:rPr>
+                <w:rFonts w:ascii="Times New Roman" w:hAnsi="Times New Roman" w:eastAsia="Times New Roman"/>
+                <w:b/>
+                <w:sz w:val="24"/>
+              </w:rPr>
+              <w:t>Supabase operation</w:t>
+            </w:r>
+          </w:p>
+        </w:tc>
+      </w:tr>
+      <w:tr>
+        <w:tc>
+          <w:tcPr>
+            <w:tcW w:type="dxa" w:w="3120"/>
+          </w:tcPr>
+          <w:p>
+            <w:r>
+              <w:rPr>
+                <w:rFonts w:ascii="Times New Roman" w:hAnsi="Times New Roman" w:eastAsia="Times New Roman"/>
+                <w:b w:val="0"/>
+                <w:sz w:val="24"/>
+              </w:rPr>
+              <w:t>loginAction</w:t>
+            </w:r>
+          </w:p>
+        </w:tc>
+        <w:tc>
+          <w:tcPr>
+            <w:tcW w:type="dxa" w:w="3120"/>
+          </w:tcPr>
+          <w:p>
+            <w:r>
+              <w:rPr>
+                <w:rFonts w:ascii="Times New Roman" w:hAnsi="Times New Roman" w:eastAsia="Times New Roman"/>
+                <w:b w:val="0"/>
+                <w:sz w:val="24"/>
+              </w:rPr>
+              <w:t>No</w:t>
+            </w:r>
+          </w:p>
+        </w:tc>
+        <w:tc>
+          <w:tcPr>
+            <w:tcW w:type="dxa" w:w="3120"/>
+          </w:tcPr>
+          <w:p>
+            <w:r>
+              <w:rPr>
+                <w:rFonts w:ascii="Times New Roman" w:hAnsi="Times New Roman" w:eastAsia="Times New Roman"/>
+                <w:b w:val="0"/>
+                <w:sz w:val="24"/>
+              </w:rPr>
+              <w:t>auth.signInWithPassword</w:t>
+            </w:r>
+          </w:p>
+        </w:tc>
+      </w:tr>
+      <w:tr>
+        <w:tc>
+          <w:tcPr>
+            <w:tcW w:type="dxa" w:w="3120"/>
+          </w:tcPr>
+          <w:p>
+            <w:r>
+              <w:rPr>
+                <w:rFonts w:ascii="Times New Roman" w:hAnsi="Times New Roman" w:eastAsia="Times New Roman"/>
+                <w:b w:val="0"/>
+                <w:sz w:val="24"/>
+              </w:rPr>
+              <w:t>logoutAction</w:t>
+            </w:r>
+          </w:p>
+        </w:tc>
+        <w:tc>
+          <w:tcPr>
+            <w:tcW w:type="dxa" w:w="3120"/>
+          </w:tcPr>
+          <w:p>
+            <w:r>
+              <w:rPr>
+                <w:rFonts w:ascii="Times New Roman" w:hAnsi="Times New Roman" w:eastAsia="Times New Roman"/>
+                <w:b w:val="0"/>
+                <w:sz w:val="24"/>
+              </w:rPr>
+              <w:t>Yes</w:t>
+            </w:r>
+          </w:p>
+        </w:tc>
+        <w:tc>
+          <w:tcPr>
+            <w:tcW w:type="dxa" w:w="3120"/>
+          </w:tcPr>
+          <w:p>
+            <w:r>
+              <w:rPr>
+                <w:rFonts w:ascii="Times New Roman" w:hAnsi="Times New Roman" w:eastAsia="Times New Roman"/>
+                <w:b w:val="0"/>
+                <w:sz w:val="24"/>
+              </w:rPr>
+              <w:t>auth.signOut</w:t>
+            </w:r>
+          </w:p>
+        </w:tc>
+      </w:tr>
+      <w:tr>
+        <w:tc>
+          <w:tcPr>
+            <w:tcW w:type="dxa" w:w="3120"/>
+          </w:tcPr>
+          <w:p>
+            <w:r>
+              <w:rPr>
+                <w:rFonts w:ascii="Times New Roman" w:hAnsi="Times New Roman" w:eastAsia="Times New Roman"/>
+                <w:b w:val="0"/>
+                <w:sz w:val="24"/>
+              </w:rPr>
+              <w:t>createBookingAction</w:t>
+            </w:r>
+          </w:p>
+        </w:tc>
+        <w:tc>
+          <w:tcPr>
+            <w:tcW w:type="dxa" w:w="3120"/>
+          </w:tcPr>
+          <w:p>
+            <w:r>
+              <w:rPr>
+                <w:rFonts w:ascii="Times New Roman" w:hAnsi="Times New Roman" w:eastAsia="Times New Roman"/>
+                <w:b w:val="0"/>
+                <w:sz w:val="24"/>
+              </w:rPr>
+              <w:t>Yes</w:t>
+            </w:r>
+          </w:p>
+        </w:tc>
+        <w:tc>
+          <w:tcPr>
+            <w:tcW w:type="dxa" w:w="3120"/>
+          </w:tcPr>
+          <w:p>
+            <w:r>
+              <w:rPr>
+                <w:rFonts w:ascii="Times New Roman" w:hAnsi="Times New Roman" w:eastAsia="Times New Roman"/>
+                <w:b w:val="0"/>
+                <w:sz w:val="24"/>
+              </w:rPr>
+              <w:t>INSERT bookings</w:t>
+            </w:r>
+          </w:p>
+        </w:tc>
+      </w:tr>
+      <w:tr>
+        <w:tc>
+          <w:tcPr>
+            <w:tcW w:type="dxa" w:w="3120"/>
+          </w:tcPr>
+          <w:p>
+            <w:r>
+              <w:rPr>
+                <w:rFonts w:ascii="Times New Roman" w:hAnsi="Times New Roman" w:eastAsia="Times New Roman"/>
+                <w:b w:val="0"/>
+                <w:sz w:val="24"/>
+              </w:rPr>
+              <w:t>createCarAction</w:t>
+            </w:r>
+          </w:p>
+        </w:tc>
+        <w:tc>
+          <w:tcPr>
+            <w:tcW w:type="dxa" w:w="3120"/>
+          </w:tcPr>
+          <w:p>
+            <w:r>
+              <w:rPr>
+                <w:rFonts w:ascii="Times New Roman" w:hAnsi="Times New Roman" w:eastAsia="Times New Roman"/>
+                <w:b w:val="0"/>
+                <w:sz w:val="24"/>
+              </w:rPr>
+              <w:t>Admin</w:t>
+            </w:r>
+          </w:p>
+        </w:tc>
+        <w:tc>
+          <w:tcPr>
+            <w:tcW w:type="dxa" w:w="3120"/>
+          </w:tcPr>
+          <w:p>
+            <w:r>
+              <w:rPr>
+                <w:rFonts w:ascii="Times New Roman" w:hAnsi="Times New Roman" w:eastAsia="Times New Roman"/>
+                <w:b w:val="0"/>
+                <w:sz w:val="24"/>
+              </w:rPr>
+              <w:t>INSERT cars</w:t>
+            </w:r>
+          </w:p>
+        </w:tc>
+      </w:tr>
+      <w:tr>
+        <w:tc>
+          <w:tcPr>
+            <w:tcW w:type="dxa" w:w="3120"/>
+          </w:tcPr>
+          <w:p>
+            <w:r>
+              <w:rPr>
+                <w:rFonts w:ascii="Times New Roman" w:hAnsi="Times New Roman" w:eastAsia="Times New Roman"/>
+                <w:b w:val="0"/>
+                <w:sz w:val="24"/>
+              </w:rPr>
+              <w:t>updateBookingStatusAction</w:t>
+            </w:r>
+          </w:p>
+        </w:tc>
+        <w:tc>
+          <w:tcPr>
+            <w:tcW w:type="dxa" w:w="3120"/>
+          </w:tcPr>
+          <w:p>
+            <w:r>
+              <w:rPr>
+                <w:rFonts w:ascii="Times New Roman" w:hAnsi="Times New Roman" w:eastAsia="Times New Roman"/>
+                <w:b w:val="0"/>
+                <w:sz w:val="24"/>
+              </w:rPr>
+              <w:t>Admin</w:t>
+            </w:r>
+          </w:p>
+        </w:tc>
+        <w:tc>
+          <w:tcPr>
+            <w:tcW w:type="dxa" w:w="3120"/>
+          </w:tcPr>
+          <w:p>
+            <w:r>
+              <w:rPr>
+                <w:rFonts w:ascii="Times New Roman" w:hAnsi="Times New Roman" w:eastAsia="Times New Roman"/>
+                <w:b w:val="0"/>
+                <w:sz w:val="24"/>
+              </w:rPr>
+              <w:t>UPDATE bookings</w:t>
+            </w:r>
+          </w:p>
+        </w:tc>
+      </w:tr>
+    </w:tbl>
+    <w:p/>
+    <w:p>
+      <w:pPr>
+        <w:spacing w:before="200" w:after="120"/>
+      </w:pPr>
+      <w:r>
+        <w:rPr>
+          <w:rFonts w:ascii="Times New Roman" w:hAnsi="Times New Roman" w:eastAsia="Times New Roman"/>
+          <w:b/>
+          <w:sz w:val="28"/>
+        </w:rPr>
+        <w:t>Appendix F — Seeded Demo Data</w:t>
+      </w:r>
+    </w:p>
+    <w:p>
+      <w:pPr>
+        <w:pStyle w:val="ListBullet"/>
+      </w:pPr>
+      <w:r>
+        <w:rPr>
+          <w:rFonts w:ascii="Times New Roman" w:hAnsi="Times New Roman" w:eastAsia="Times New Roman"/>
+          <w:b w:val="0"/>
+          <w:sz w:val="24"/>
+        </w:rPr>
+        <w:t>10 cars (IDs 1–10) with mixed fuel types; Ford EcoSport unavailable.</w:t>
+      </w:r>
+    </w:p>
+    <w:p>
+      <w:pPr>
+        <w:pStyle w:val="ListBullet"/>
+      </w:pPr>
+      <w:r>
+        <w:rPr>
+          <w:rFonts w:ascii="Times New Roman" w:hAnsi="Times New Roman" w:eastAsia="Times New Roman"/>
+          <w:b w:val="0"/>
+          <w:sz w:val="24"/>
+        </w:rPr>
+        <w:t>2 users: user@gmail.com (user), admin@gmail.com (admin).</w:t>
+      </w:r>
+    </w:p>
+    <w:p>
+      <w:pPr>
+        <w:pStyle w:val="ListBullet"/>
+      </w:pPr>
+      <w:r>
+        <w:rPr>
+          <w:rFonts w:ascii="Times New Roman" w:hAnsi="Times New Roman" w:eastAsia="Times New Roman"/>
+          <w:b w:val="0"/>
+          <w:sz w:val="24"/>
+        </w:rPr>
+        <w:t>2 sample bookings for demo user.</w:t>
+      </w:r>
+    </w:p>
+    <w:p>
+      <w:pPr>
+        <w:spacing w:before="200" w:after="120"/>
+      </w:pPr>
+      <w:r>
+        <w:rPr>
+          <w:rFonts w:ascii="Times New Roman" w:hAnsi="Times New Roman" w:eastAsia="Times New Roman"/>
+          <w:b/>
+          <w:sz w:val="28"/>
+        </w:rPr>
+        <w:t>Appendix G — Screenshot Placeholders</w:t>
       </w:r>
     </w:p>
     <w:p>
@@ -6758,6 +9043,58 @@
     </w:p>
     <w:p>
       <w:pPr>
+        <w:pStyle w:val="ListBullet"/>
+      </w:pPr>
+      <w:r>
+        <w:rPr>
+          <w:rFonts w:ascii="Times New Roman" w:hAnsi="Times New Roman" w:eastAsia="Times New Roman"/>
+          <w:b w:val="0"/>
+          <w:sz w:val="24"/>
+        </w:rPr>
+        <w:t>7. Admin Cars — inventory table with create form</w:t>
+      </w:r>
+    </w:p>
+    <w:p>
+      <w:pPr>
+        <w:pStyle w:val="ListBullet"/>
+      </w:pPr>
+      <w:r>
+        <w:rPr>
+          <w:rFonts w:ascii="Times New Roman" w:hAnsi="Times New Roman" w:eastAsia="Times New Roman"/>
+          <w:b w:val="0"/>
+          <w:sz w:val="24"/>
+        </w:rPr>
+        <w:t>8. Admin Bookings — status dropdown</w:t>
+      </w:r>
+    </w:p>
+    <w:p>
+      <w:pPr>
+        <w:pStyle w:val="ListBullet"/>
+      </w:pPr>
+      <w:r>
+        <w:rPr>
+          <w:rFonts w:ascii="Times New Roman" w:hAnsi="Times New Roman" w:eastAsia="Times New Roman"/>
+          <w:b w:val="0"/>
+          <w:sz w:val="24"/>
+        </w:rPr>
+        <w:t>9. Vercel deployment — production URL</w:t>
+      </w:r>
+    </w:p>
+    <w:p>
+      <w:pPr>
+        <w:pStyle w:val="ListBullet"/>
+      </w:pPr>
+      <w:r>
+        <w:rPr>
+          <w:rFonts w:ascii="Times New Roman" w:hAnsi="Times New Roman" w:eastAsia="Times New Roman"/>
+          <w:b w:val="0"/>
+          <w:sz w:val="24"/>
+        </w:rPr>
+        <w:t>10. Supabase dashboard — Table Editor showing cars</w:t>
+      </w:r>
+    </w:p>
+    <w:p>
+      <w:pPr>
         <w:spacing w:before="200" w:after="120"/>
       </w:pPr>
       <w:r>
@@ -6766,7 +9103,85 @@
           <w:b/>
           <w:sz w:val="28"/>
         </w:rPr>
-        <w:t>Appendix E — npm Scripts Reference</w:t>
+        <w:t>Appendix H — Glossary</w:t>
+      </w:r>
+    </w:p>
+    <w:p>
+      <w:pPr>
+        <w:pStyle w:val="ListBullet"/>
+      </w:pPr>
+      <w:r>
+        <w:rPr>
+          <w:rFonts w:ascii="Times New Roman" w:hAnsi="Times New Roman" w:eastAsia="Times New Roman"/>
+          <w:b w:val="0"/>
+          <w:sz w:val="24"/>
+        </w:rPr>
+        <w:t>RLS — Row Level Security; PostgreSQL row filtering per user</w:t>
+      </w:r>
+    </w:p>
+    <w:p>
+      <w:pPr>
+        <w:pStyle w:val="ListBullet"/>
+      </w:pPr>
+      <w:r>
+        <w:rPr>
+          <w:rFonts w:ascii="Times New Roman" w:hAnsi="Times New Roman" w:eastAsia="Times New Roman"/>
+          <w:b w:val="0"/>
+          <w:sz w:val="24"/>
+        </w:rPr>
+        <w:t>Server Component — React component rendered on the Next.js server</w:t>
+      </w:r>
+    </w:p>
+    <w:p>
+      <w:pPr>
+        <w:pStyle w:val="ListBullet"/>
+      </w:pPr>
+      <w:r>
+        <w:rPr>
+          <w:rFonts w:ascii="Times New Roman" w:hAnsi="Times New Roman" w:eastAsia="Times New Roman"/>
+          <w:b w:val="0"/>
+          <w:sz w:val="24"/>
+        </w:rPr>
+        <w:t>Server Action — Server-side mutation invoked from client forms</w:t>
+      </w:r>
+    </w:p>
+    <w:p>
+      <w:pPr>
+        <w:pStyle w:val="ListBullet"/>
+      </w:pPr>
+      <w:r>
+        <w:rPr>
+          <w:rFonts w:ascii="Times New Roman" w:hAnsi="Times New Roman" w:eastAsia="Times New Roman"/>
+          <w:b w:val="0"/>
+          <w:sz w:val="24"/>
+        </w:rPr>
+        <w:t>JWT — JSON Web Token used by Supabase Auth for session claims</w:t>
+      </w:r>
+    </w:p>
+    <w:p>
+      <w:pPr>
+        <w:pStyle w:val="ListBullet"/>
+      </w:pPr>
+      <w:r>
+        <w:rPr>
+          <w:rFonts w:ascii="Times New Roman" w:hAnsi="Times New Roman" w:eastAsia="Times New Roman"/>
+          <w:b w:val="0"/>
+          <w:sz w:val="24"/>
+        </w:rPr>
+        <w:t>UUID — Unique identifier for Supabase auth user IDs</w:t>
+      </w:r>
+    </w:p>
+    <w:p>
+      <w:pPr>
+        <w:spacing w:before="200" w:after="120"/>
+      </w:pPr>
+      <w:r>
+        <w:rPr>
+          <w:rFonts w:ascii="Times New Roman" w:hAnsi="Times New Roman" w:eastAsia="Times New Roman"/>
+          <w:b/>
+          <w:sz w:val="28"/>
+        </w:rPr>
+        <w:t>Appendix I — npm Scripts Reference</w:t>
       </w:r>
     </w:p>
     <w:tbl>
@@ -7131,7 +9546,7 @@
           <w:b w:val="0"/>
           <w:sz w:val="24"/>
         </w:rPr>
-        <w:t>6. Tailwind CSS Documentation — https://tailwindcss.com/docs</w:t>
+        <w:t>6. Supabase Row Level Security — https://supabase.com/docs/guides/database/postgres/row-level-security</w:t>
       </w:r>
     </w:p>
     <w:p>
@@ -7144,7 +9559,7 @@
           <w:b w:val="0"/>
           <w:sz w:val="24"/>
         </w:rPr>
-        <w:t>7. shadcn/ui — https://ui.shadcn.com</w:t>
+        <w:t>7. Tailwind CSS Documentation — https://tailwindcss.com/docs</w:t>
       </w:r>
     </w:p>
     <w:p>
@@ -7157,7 +9572,7 @@
           <w:b w:val="0"/>
           <w:sz w:val="24"/>
         </w:rPr>
-        <w:t>8. Sonner Toast Library — https://sonner.emilkowal.ski</w:t>
+        <w:t>8. shadcn/ui — https://ui.shadcn.com</w:t>
       </w:r>
     </w:p>
     <w:p>
@@ -7170,7 +9585,7 @@
           <w:b w:val="0"/>
           <w:sz w:val="24"/>
         </w:rPr>
-        <w:t>9. Vitest — https://vitest.dev</w:t>
+        <w:t>9. Sonner Toast Library — https://sonner.emilkowal.ski</w:t>
       </w:r>
     </w:p>
     <w:p>
@@ -7183,7 +9598,7 @@
           <w:b w:val="0"/>
           <w:sz w:val="24"/>
         </w:rPr>
-        <w:t>10. Playwright — https://playwright.dev</w:t>
+        <w:t>10. Vitest — https://vitest.dev</w:t>
       </w:r>
     </w:p>
     <w:p>
@@ -7196,7 +9611,7 @@
           <w:b w:val="0"/>
           <w:sz w:val="24"/>
         </w:rPr>
-        <w:t>11. Vercel Deployment — https://vercel.com/docs</w:t>
+        <w:t>11. Playwright — https://playwright.dev</w:t>
       </w:r>
     </w:p>
     <w:p>
@@ -7209,7 +9624,33 @@
           <w:b w:val="0"/>
           <w:sz w:val="24"/>
         </w:rPr>
-        <w:t>12. MDN Web Docs — https://developer.mozilla.org</w:t>
+        <w:t>12. Vercel Deployment — https://vercel.com/docs</w:t>
+      </w:r>
+    </w:p>
+    <w:p>
+      <w:pPr>
+        <w:spacing w:after="120" w:line="276" w:lineRule="auto"/>
+      </w:pPr>
+      <w:r>
+        <w:rPr>
+          <w:rFonts w:ascii="Times New Roman" w:hAnsi="Times New Roman" w:eastAsia="Times New Roman"/>
+          <w:b w:val="0"/>
+          <w:sz w:val="24"/>
+        </w:rPr>
+        <w:t>13. PostgreSQL Documentation — https://www.postgresql.org/docs/</w:t>
+      </w:r>
+    </w:p>
+    <w:p>
+      <w:pPr>
+        <w:spacing w:after="120" w:line="276" w:lineRule="auto"/>
+      </w:pPr>
+      <w:r>
+        <w:rPr>
+          <w:rFonts w:ascii="Times New Roman" w:hAnsi="Times New Roman" w:eastAsia="Times New Roman"/>
+          <w:b w:val="0"/>
+          <w:sz w:val="24"/>
+        </w:rPr>
+        <w:t>14. MDN Web Docs — https://developer.mozilla.org</w:t>
       </w:r>
     </w:p>
     <w:sectPr>

</xml_diff>

<commit_message>
fix: demo-ready UI copy, screenshots, and demo guide
Remove POC/phase text from home, footer, and login. Add screenshot capture script, refresh report assets, and a short demo guide for the Vercel deployment.

Co-authored-by: Cursor <cursoragent@cursor.com>
</commit_message>
<xml_diff>
--- a/docs/driveease-project-report.docx
+++ b/docs/driveease-project-report.docx
@@ -732,22 +732,22 @@
                 <w:b w:val="0"/>
                 <w:sz w:val="24"/>
               </w:rPr>
-              <w:t>6</w:t>
-            </w:r>
-          </w:p>
-        </w:tc>
-        <w:tc>
-          <w:tcPr>
-            <w:tcW w:type="dxa" w:w="3120"/>
-          </w:tcPr>
-          <w:p>
-            <w:r>
-              <w:rPr>
-                <w:rFonts w:ascii="Times New Roman" w:hAnsi="Times New Roman" w:eastAsia="Times New Roman"/>
-                <w:b w:val="0"/>
-                <w:sz w:val="24"/>
-              </w:rPr>
-              <w:t>System Analysis</w:t>
+              <w:t>5.5</w:t>
+            </w:r>
+          </w:p>
+        </w:tc>
+        <w:tc>
+          <w:tcPr>
+            <w:tcW w:type="dxa" w:w="3120"/>
+          </w:tcPr>
+          <w:p>
+            <w:r>
+              <w:rPr>
+                <w:rFonts w:ascii="Times New Roman" w:hAnsi="Times New Roman" w:eastAsia="Times New Roman"/>
+                <w:b w:val="0"/>
+                <w:sz w:val="24"/>
+              </w:rPr>
+              <w:t>Key Features and System Capabilities</w:t>
             </w:r>
           </w:p>
         </w:tc>
@@ -778,22 +778,22 @@
                 <w:b w:val="0"/>
                 <w:sz w:val="24"/>
               </w:rPr>
-              <w:t>6.1</w:t>
-            </w:r>
-          </w:p>
-        </w:tc>
-        <w:tc>
-          <w:tcPr>
-            <w:tcW w:type="dxa" w:w="3120"/>
-          </w:tcPr>
-          <w:p>
-            <w:r>
-              <w:rPr>
-                <w:rFonts w:ascii="Times New Roman" w:hAnsi="Times New Roman" w:eastAsia="Times New Roman"/>
-                <w:b w:val="0"/>
-                <w:sz w:val="24"/>
-              </w:rPr>
-              <w:t>Existing System</w:t>
+              <w:t>6</w:t>
+            </w:r>
+          </w:p>
+        </w:tc>
+        <w:tc>
+          <w:tcPr>
+            <w:tcW w:type="dxa" w:w="3120"/>
+          </w:tcPr>
+          <w:p>
+            <w:r>
+              <w:rPr>
+                <w:rFonts w:ascii="Times New Roman" w:hAnsi="Times New Roman" w:eastAsia="Times New Roman"/>
+                <w:b w:val="0"/>
+                <w:sz w:val="24"/>
+              </w:rPr>
+              <w:t>System Analysis</w:t>
             </w:r>
           </w:p>
         </w:tc>
@@ -824,22 +824,22 @@
                 <w:b w:val="0"/>
                 <w:sz w:val="24"/>
               </w:rPr>
-              <w:t>6.2</w:t>
-            </w:r>
-          </w:p>
-        </w:tc>
-        <w:tc>
-          <w:tcPr>
-            <w:tcW w:type="dxa" w:w="3120"/>
-          </w:tcPr>
-          <w:p>
-            <w:r>
-              <w:rPr>
-                <w:rFonts w:ascii="Times New Roman" w:hAnsi="Times New Roman" w:eastAsia="Times New Roman"/>
-                <w:b w:val="0"/>
-                <w:sz w:val="24"/>
-              </w:rPr>
-              <w:t>Proposed System</w:t>
+              <w:t>6.1</w:t>
+            </w:r>
+          </w:p>
+        </w:tc>
+        <w:tc>
+          <w:tcPr>
+            <w:tcW w:type="dxa" w:w="3120"/>
+          </w:tcPr>
+          <w:p>
+            <w:r>
+              <w:rPr>
+                <w:rFonts w:ascii="Times New Roman" w:hAnsi="Times New Roman" w:eastAsia="Times New Roman"/>
+                <w:b w:val="0"/>
+                <w:sz w:val="24"/>
+              </w:rPr>
+              <w:t>Existing System</w:t>
             </w:r>
           </w:p>
         </w:tc>
@@ -870,22 +870,22 @@
                 <w:b w:val="0"/>
                 <w:sz w:val="24"/>
               </w:rPr>
-              <w:t>6.3</w:t>
-            </w:r>
-          </w:p>
-        </w:tc>
-        <w:tc>
-          <w:tcPr>
-            <w:tcW w:type="dxa" w:w="3120"/>
-          </w:tcPr>
-          <w:p>
-            <w:r>
-              <w:rPr>
-                <w:rFonts w:ascii="Times New Roman" w:hAnsi="Times New Roman" w:eastAsia="Times New Roman"/>
-                <w:b w:val="0"/>
-                <w:sz w:val="24"/>
-              </w:rPr>
-              <w:t>User Roles</w:t>
+              <w:t>6.2</w:t>
+            </w:r>
+          </w:p>
+        </w:tc>
+        <w:tc>
+          <w:tcPr>
+            <w:tcW w:type="dxa" w:w="3120"/>
+          </w:tcPr>
+          <w:p>
+            <w:r>
+              <w:rPr>
+                <w:rFonts w:ascii="Times New Roman" w:hAnsi="Times New Roman" w:eastAsia="Times New Roman"/>
+                <w:b w:val="0"/>
+                <w:sz w:val="24"/>
+              </w:rPr>
+              <w:t>Proposed System</w:t>
             </w:r>
           </w:p>
         </w:tc>
@@ -916,22 +916,22 @@
                 <w:b w:val="0"/>
                 <w:sz w:val="24"/>
               </w:rPr>
-              <w:t>6.4</w:t>
-            </w:r>
-          </w:p>
-        </w:tc>
-        <w:tc>
-          <w:tcPr>
-            <w:tcW w:type="dxa" w:w="3120"/>
-          </w:tcPr>
-          <w:p>
-            <w:r>
-              <w:rPr>
-                <w:rFonts w:ascii="Times New Roman" w:hAnsi="Times New Roman" w:eastAsia="Times New Roman"/>
-                <w:b w:val="0"/>
-                <w:sz w:val="24"/>
-              </w:rPr>
-              <w:t>Feasibility Study</w:t>
+              <w:t>6.3</w:t>
+            </w:r>
+          </w:p>
+        </w:tc>
+        <w:tc>
+          <w:tcPr>
+            <w:tcW w:type="dxa" w:w="3120"/>
+          </w:tcPr>
+          <w:p>
+            <w:r>
+              <w:rPr>
+                <w:rFonts w:ascii="Times New Roman" w:hAnsi="Times New Roman" w:eastAsia="Times New Roman"/>
+                <w:b w:val="0"/>
+                <w:sz w:val="24"/>
+              </w:rPr>
+              <w:t>User Roles</w:t>
             </w:r>
           </w:p>
         </w:tc>
@@ -962,22 +962,22 @@
                 <w:b w:val="0"/>
                 <w:sz w:val="24"/>
               </w:rPr>
-              <w:t>7</w:t>
-            </w:r>
-          </w:p>
-        </w:tc>
-        <w:tc>
-          <w:tcPr>
-            <w:tcW w:type="dxa" w:w="3120"/>
-          </w:tcPr>
-          <w:p>
-            <w:r>
-              <w:rPr>
-                <w:rFonts w:ascii="Times New Roman" w:hAnsi="Times New Roman" w:eastAsia="Times New Roman"/>
-                <w:b w:val="0"/>
-                <w:sz w:val="24"/>
-              </w:rPr>
-              <w:t>System Specification</w:t>
+              <w:t>6.4</w:t>
+            </w:r>
+          </w:p>
+        </w:tc>
+        <w:tc>
+          <w:tcPr>
+            <w:tcW w:type="dxa" w:w="3120"/>
+          </w:tcPr>
+          <w:p>
+            <w:r>
+              <w:rPr>
+                <w:rFonts w:ascii="Times New Roman" w:hAnsi="Times New Roman" w:eastAsia="Times New Roman"/>
+                <w:b w:val="0"/>
+                <w:sz w:val="24"/>
+              </w:rPr>
+              <w:t>Feasibility Study</w:t>
             </w:r>
           </w:p>
         </w:tc>
@@ -1008,22 +1008,22 @@
                 <w:b w:val="0"/>
                 <w:sz w:val="24"/>
               </w:rPr>
-              <w:t>8</w:t>
-            </w:r>
-          </w:p>
-        </w:tc>
-        <w:tc>
-          <w:tcPr>
-            <w:tcW w:type="dxa" w:w="3120"/>
-          </w:tcPr>
-          <w:p>
-            <w:r>
-              <w:rPr>
-                <w:rFonts w:ascii="Times New Roman" w:hAnsi="Times New Roman" w:eastAsia="Times New Roman"/>
-                <w:b w:val="0"/>
-                <w:sz w:val="24"/>
-              </w:rPr>
-              <w:t>Software Description</w:t>
+              <w:t>7</w:t>
+            </w:r>
+          </w:p>
+        </w:tc>
+        <w:tc>
+          <w:tcPr>
+            <w:tcW w:type="dxa" w:w="3120"/>
+          </w:tcPr>
+          <w:p>
+            <w:r>
+              <w:rPr>
+                <w:rFonts w:ascii="Times New Roman" w:hAnsi="Times New Roman" w:eastAsia="Times New Roman"/>
+                <w:b w:val="0"/>
+                <w:sz w:val="24"/>
+              </w:rPr>
+              <w:t>System Specification</w:t>
             </w:r>
           </w:p>
         </w:tc>
@@ -1054,22 +1054,22 @@
                 <w:b w:val="0"/>
                 <w:sz w:val="24"/>
               </w:rPr>
-              <w:t>9</w:t>
-            </w:r>
-          </w:p>
-        </w:tc>
-        <w:tc>
-          <w:tcPr>
-            <w:tcW w:type="dxa" w:w="3120"/>
-          </w:tcPr>
-          <w:p>
-            <w:r>
-              <w:rPr>
-                <w:rFonts w:ascii="Times New Roman" w:hAnsi="Times New Roman" w:eastAsia="Times New Roman"/>
-                <w:b w:val="0"/>
-                <w:sz w:val="24"/>
-              </w:rPr>
-              <w:t>Project Description</w:t>
+              <w:t>8</w:t>
+            </w:r>
+          </w:p>
+        </w:tc>
+        <w:tc>
+          <w:tcPr>
+            <w:tcW w:type="dxa" w:w="3120"/>
+          </w:tcPr>
+          <w:p>
+            <w:r>
+              <w:rPr>
+                <w:rFonts w:ascii="Times New Roman" w:hAnsi="Times New Roman" w:eastAsia="Times New Roman"/>
+                <w:b w:val="0"/>
+                <w:sz w:val="24"/>
+              </w:rPr>
+              <w:t>Software Description</w:t>
             </w:r>
           </w:p>
         </w:tc>
@@ -1100,22 +1100,22 @@
                 <w:b w:val="0"/>
                 <w:sz w:val="24"/>
               </w:rPr>
-              <w:t>10</w:t>
-            </w:r>
-          </w:p>
-        </w:tc>
-        <w:tc>
-          <w:tcPr>
-            <w:tcW w:type="dxa" w:w="3120"/>
-          </w:tcPr>
-          <w:p>
-            <w:r>
-              <w:rPr>
-                <w:rFonts w:ascii="Times New Roman" w:hAnsi="Times New Roman" w:eastAsia="Times New Roman"/>
-                <w:b w:val="0"/>
-                <w:sz w:val="24"/>
-              </w:rPr>
-              <w:t>System Testing</w:t>
+              <w:t>9</w:t>
+            </w:r>
+          </w:p>
+        </w:tc>
+        <w:tc>
+          <w:tcPr>
+            <w:tcW w:type="dxa" w:w="3120"/>
+          </w:tcPr>
+          <w:p>
+            <w:r>
+              <w:rPr>
+                <w:rFonts w:ascii="Times New Roman" w:hAnsi="Times New Roman" w:eastAsia="Times New Roman"/>
+                <w:b w:val="0"/>
+                <w:sz w:val="24"/>
+              </w:rPr>
+              <w:t>Project Description</w:t>
             </w:r>
           </w:p>
         </w:tc>
@@ -1146,22 +1146,22 @@
                 <w:b w:val="0"/>
                 <w:sz w:val="24"/>
               </w:rPr>
-              <w:t>11</w:t>
-            </w:r>
-          </w:p>
-        </w:tc>
-        <w:tc>
-          <w:tcPr>
-            <w:tcW w:type="dxa" w:w="3120"/>
-          </w:tcPr>
-          <w:p>
-            <w:r>
-              <w:rPr>
-                <w:rFonts w:ascii="Times New Roman" w:hAnsi="Times New Roman" w:eastAsia="Times New Roman"/>
-                <w:b w:val="0"/>
-                <w:sz w:val="24"/>
-              </w:rPr>
-              <w:t>System Implementation</w:t>
+              <w:t>10</w:t>
+            </w:r>
+          </w:p>
+        </w:tc>
+        <w:tc>
+          <w:tcPr>
+            <w:tcW w:type="dxa" w:w="3120"/>
+          </w:tcPr>
+          <w:p>
+            <w:r>
+              <w:rPr>
+                <w:rFonts w:ascii="Times New Roman" w:hAnsi="Times New Roman" w:eastAsia="Times New Roman"/>
+                <w:b w:val="0"/>
+                <w:sz w:val="24"/>
+              </w:rPr>
+              <w:t>System Testing</w:t>
             </w:r>
           </w:p>
         </w:tc>
@@ -1192,22 +1192,22 @@
                 <w:b w:val="0"/>
                 <w:sz w:val="24"/>
               </w:rPr>
-              <w:t>12</w:t>
-            </w:r>
-          </w:p>
-        </w:tc>
-        <w:tc>
-          <w:tcPr>
-            <w:tcW w:type="dxa" w:w="3120"/>
-          </w:tcPr>
-          <w:p>
-            <w:r>
-              <w:rPr>
-                <w:rFonts w:ascii="Times New Roman" w:hAnsi="Times New Roman" w:eastAsia="Times New Roman"/>
-                <w:b w:val="0"/>
-                <w:sz w:val="24"/>
-              </w:rPr>
-              <w:t>Conclusion and Future Enhancement</w:t>
+              <w:t>11</w:t>
+            </w:r>
+          </w:p>
+        </w:tc>
+        <w:tc>
+          <w:tcPr>
+            <w:tcW w:type="dxa" w:w="3120"/>
+          </w:tcPr>
+          <w:p>
+            <w:r>
+              <w:rPr>
+                <w:rFonts w:ascii="Times New Roman" w:hAnsi="Times New Roman" w:eastAsia="Times New Roman"/>
+                <w:b w:val="0"/>
+                <w:sz w:val="24"/>
+              </w:rPr>
+              <w:t>System Implementation</w:t>
             </w:r>
           </w:p>
         </w:tc>
@@ -1238,6 +1238,144 @@
                 <w:b w:val="0"/>
                 <w:sz w:val="24"/>
               </w:rPr>
+              <w:t>11.6</w:t>
+            </w:r>
+          </w:p>
+        </w:tc>
+        <w:tc>
+          <w:tcPr>
+            <w:tcW w:type="dxa" w:w="3120"/>
+          </w:tcPr>
+          <w:p>
+            <w:r>
+              <w:rPr>
+                <w:rFonts w:ascii="Times New Roman" w:hAnsi="Times New Roman" w:eastAsia="Times New Roman"/>
+                <w:b w:val="0"/>
+                <w:sz w:val="24"/>
+              </w:rPr>
+              <w:t>Network Privacy (Browser vs Server)</w:t>
+            </w:r>
+          </w:p>
+        </w:tc>
+        <w:tc>
+          <w:tcPr>
+            <w:tcW w:type="dxa" w:w="3120"/>
+          </w:tcPr>
+          <w:p>
+            <w:r>
+              <w:rPr>
+                <w:rFonts w:ascii="Times New Roman" w:hAnsi="Times New Roman" w:eastAsia="Times New Roman"/>
+                <w:b w:val="0"/>
+                <w:sz w:val="24"/>
+              </w:rPr>
+            </w:r>
+          </w:p>
+        </w:tc>
+      </w:tr>
+      <w:tr>
+        <w:tc>
+          <w:tcPr>
+            <w:tcW w:type="dxa" w:w="3120"/>
+          </w:tcPr>
+          <w:p>
+            <w:r>
+              <w:rPr>
+                <w:rFonts w:ascii="Times New Roman" w:hAnsi="Times New Roman" w:eastAsia="Times New Roman"/>
+                <w:b w:val="0"/>
+                <w:sz w:val="24"/>
+              </w:rPr>
+              <w:t>11.7</w:t>
+            </w:r>
+          </w:p>
+        </w:tc>
+        <w:tc>
+          <w:tcPr>
+            <w:tcW w:type="dxa" w:w="3120"/>
+          </w:tcPr>
+          <w:p>
+            <w:r>
+              <w:rPr>
+                <w:rFonts w:ascii="Times New Roman" w:hAnsi="Times New Roman" w:eastAsia="Times New Roman"/>
+                <w:b w:val="0"/>
+                <w:sz w:val="24"/>
+              </w:rPr>
+              <w:t>Source Code Repository</w:t>
+            </w:r>
+          </w:p>
+        </w:tc>
+        <w:tc>
+          <w:tcPr>
+            <w:tcW w:type="dxa" w:w="3120"/>
+          </w:tcPr>
+          <w:p>
+            <w:r>
+              <w:rPr>
+                <w:rFonts w:ascii="Times New Roman" w:hAnsi="Times New Roman" w:eastAsia="Times New Roman"/>
+                <w:b w:val="0"/>
+                <w:sz w:val="24"/>
+              </w:rPr>
+            </w:r>
+          </w:p>
+        </w:tc>
+      </w:tr>
+      <w:tr>
+        <w:tc>
+          <w:tcPr>
+            <w:tcW w:type="dxa" w:w="3120"/>
+          </w:tcPr>
+          <w:p>
+            <w:r>
+              <w:rPr>
+                <w:rFonts w:ascii="Times New Roman" w:hAnsi="Times New Roman" w:eastAsia="Times New Roman"/>
+                <w:b w:val="0"/>
+                <w:sz w:val="24"/>
+              </w:rPr>
+              <w:t>12</w:t>
+            </w:r>
+          </w:p>
+        </w:tc>
+        <w:tc>
+          <w:tcPr>
+            <w:tcW w:type="dxa" w:w="3120"/>
+          </w:tcPr>
+          <w:p>
+            <w:r>
+              <w:rPr>
+                <w:rFonts w:ascii="Times New Roman" w:hAnsi="Times New Roman" w:eastAsia="Times New Roman"/>
+                <w:b w:val="0"/>
+                <w:sz w:val="24"/>
+              </w:rPr>
+              <w:t>Conclusion and Future Enhancement</w:t>
+            </w:r>
+          </w:p>
+        </w:tc>
+        <w:tc>
+          <w:tcPr>
+            <w:tcW w:type="dxa" w:w="3120"/>
+          </w:tcPr>
+          <w:p>
+            <w:r>
+              <w:rPr>
+                <w:rFonts w:ascii="Times New Roman" w:hAnsi="Times New Roman" w:eastAsia="Times New Roman"/>
+                <w:b w:val="0"/>
+                <w:sz w:val="24"/>
+              </w:rPr>
+            </w:r>
+          </w:p>
+        </w:tc>
+      </w:tr>
+      <w:tr>
+        <w:tc>
+          <w:tcPr>
+            <w:tcW w:type="dxa" w:w="3120"/>
+          </w:tcPr>
+          <w:p>
+            <w:r>
+              <w:rPr>
+                <w:rFonts w:ascii="Times New Roman" w:hAnsi="Times New Roman" w:eastAsia="Times New Roman"/>
+                <w:b w:val="0"/>
+                <w:sz w:val="24"/>
+              </w:rPr>
               <w:t>13</w:t>
             </w:r>
           </w:p>
@@ -1254,6 +1392,98 @@
                 <w:sz w:val="24"/>
               </w:rPr>
               <w:t>Appendix</w:t>
+            </w:r>
+          </w:p>
+        </w:tc>
+        <w:tc>
+          <w:tcPr>
+            <w:tcW w:type="dxa" w:w="3120"/>
+          </w:tcPr>
+          <w:p>
+            <w:r>
+              <w:rPr>
+                <w:rFonts w:ascii="Times New Roman" w:hAnsi="Times New Roman" w:eastAsia="Times New Roman"/>
+                <w:b w:val="0"/>
+                <w:sz w:val="24"/>
+              </w:rPr>
+            </w:r>
+          </w:p>
+        </w:tc>
+      </w:tr>
+      <w:tr>
+        <w:tc>
+          <w:tcPr>
+            <w:tcW w:type="dxa" w:w="3120"/>
+          </w:tcPr>
+          <w:p>
+            <w:r>
+              <w:rPr>
+                <w:rFonts w:ascii="Times New Roman" w:hAnsi="Times New Roman" w:eastAsia="Times New Roman"/>
+                <w:b w:val="0"/>
+                <w:sz w:val="24"/>
+              </w:rPr>
+              <w:t>13.1</w:t>
+            </w:r>
+          </w:p>
+        </w:tc>
+        <w:tc>
+          <w:tcPr>
+            <w:tcW w:type="dxa" w:w="3120"/>
+          </w:tcPr>
+          <w:p>
+            <w:r>
+              <w:rPr>
+                <w:rFonts w:ascii="Times New Roman" w:hAnsi="Times New Roman" w:eastAsia="Times New Roman"/>
+                <w:b w:val="0"/>
+                <w:sz w:val="24"/>
+              </w:rPr>
+              <w:t>Appendix G — Application Screenshots</w:t>
+            </w:r>
+          </w:p>
+        </w:tc>
+        <w:tc>
+          <w:tcPr>
+            <w:tcW w:type="dxa" w:w="3120"/>
+          </w:tcPr>
+          <w:p>
+            <w:r>
+              <w:rPr>
+                <w:rFonts w:ascii="Times New Roman" w:hAnsi="Times New Roman" w:eastAsia="Times New Roman"/>
+                <w:b w:val="0"/>
+                <w:sz w:val="24"/>
+              </w:rPr>
+            </w:r>
+          </w:p>
+        </w:tc>
+      </w:tr>
+      <w:tr>
+        <w:tc>
+          <w:tcPr>
+            <w:tcW w:type="dxa" w:w="3120"/>
+          </w:tcPr>
+          <w:p>
+            <w:r>
+              <w:rPr>
+                <w:rFonts w:ascii="Times New Roman" w:hAnsi="Times New Roman" w:eastAsia="Times New Roman"/>
+                <w:b w:val="0"/>
+                <w:sz w:val="24"/>
+              </w:rPr>
+              <w:t>13.2</w:t>
+            </w:r>
+          </w:p>
+        </w:tc>
+        <w:tc>
+          <w:tcPr>
+            <w:tcW w:type="dxa" w:w="3120"/>
+          </w:tcPr>
+          <w:p>
+            <w:r>
+              <w:rPr>
+                <w:rFonts w:ascii="Times New Roman" w:hAnsi="Times New Roman" w:eastAsia="Times New Roman"/>
+                <w:b w:val="0"/>
+                <w:sz w:val="24"/>
+              </w:rPr>
+              <w:t>Appendix J — Source Code Listing</w:t>
             </w:r>
           </w:p>
         </w:tc>
@@ -1349,7 +1579,7 @@
           <w:b w:val="0"/>
           <w:sz w:val="24"/>
         </w:rPr>
-        <w:t>DriveEase is a web-based car rental application developed as a proof-of-concept (POC) using Next.js 14 with the App Router. The system allows visitors to browse a catalog of rental cars, apply filters by name, fuel type, seats, and price, and Registered users authenticate with Supabase Auth, book cars by selecting pickup and return dates, and view their booking history. Administrators access a dedicated panel to view dashboard statistics, manage the car fleet (create, update, delete), and update booking statuses.</w:t>
+        <w:t>DriveEase is a web-based car rental application built with Next.js 14 (App Router) and Supabase as the backend platform. The system allows visitors to browse a catalog of rental cars, apply filters by name, fuel type, seats, and price, and view detailed car information. Registered users authenticate through Supabase Auth, book cars by selecting pickup and return dates, and view their booking history. Administrators access a dedicated panel to view dashboard statistics, manage the car fleet, and update booking statuses.</w:t>
       </w:r>
     </w:p>
     <w:p>
@@ -1388,7 +1618,7 @@
           <w:b w:val="0"/>
           <w:sz w:val="24"/>
         </w:rPr>
-        <w:t>The project was developed in six incremental phases followed by backend integration that replaced JSON file storage with Supabase PostgreSQL, real authentication, and Row Level Security policies.</w:t>
+        <w:t>The application supports local development, automated testing with Vitest and Playwright, and cloud deployment to Vercel with environment-based Supabase configuration. DriveEase is designed as a production-style full-stack web application suitable for academic evaluation, portfolio presentation, and live demonstration on a cloud-hosted URL.</w:t>
       </w:r>
     </w:p>
     <w:p>
@@ -1446,7 +1676,7 @@
           <w:b w:val="0"/>
           <w:sz w:val="24"/>
         </w:rPr>
-        <w:t>Modern full-stack frameworks such as Next.js enable rapid development of such applications with server-side rendering, API routes, and integrated authentication patterns suitable for proof-of-concept and prototype deployments.</w:t>
+        <w:t>Modern full-stack frameworks such as Next.js enable rapid development of such applications with server-side rendering, Server Actions, and integrated authentication backed by Supabase PostgreSQL and Row Level Security.</w:t>
       </w:r>
     </w:p>
     <w:p>
@@ -1485,7 +1715,7 @@
           <w:b w:val="0"/>
           <w:sz w:val="24"/>
         </w:rPr>
-        <w:t>There is a need for a structured web application that demonstrates the core flows of an online car rental service: catalog discovery, user authentication, booking management, and administrative control.</w:t>
+        <w:t>There is a need for a structured web application that demonstrates the core flows of an online car rental service: catalog discovery, secure user authentication, database-backed booking management, and administrative control — backed by Supabase PostgreSQL and deployable to a cloud hosting platform such as Vercel.</w:t>
       </w:r>
     </w:p>
     <w:p>
@@ -1511,7 +1741,7 @@
           <w:b w:val="0"/>
           <w:sz w:val="24"/>
         </w:rPr>
-        <w:t>Build a responsive web application shell with navigation, home page, and mobile-friendly layout (Phase 1).</w:t>
+        <w:t>Application shell: responsive navigation, footer, home hero, and mobile-friendly layout.</w:t>
       </w:r>
     </w:p>
     <w:p>
@@ -1524,7 +1754,7 @@
           <w:b w:val="0"/>
           <w:sz w:val="24"/>
         </w:rPr>
-        <w:t>Implement a car catalog with search and filter capabilities and individual car detail pages (Phase 2).</w:t>
+        <w:t>Vehicle catalog: search and filter capabilities, detail pages with image galleries, data in Supabase.</w:t>
       </w:r>
     </w:p>
     <w:p>
@@ -1537,7 +1767,7 @@
           <w:b w:val="0"/>
           <w:sz w:val="24"/>
         </w:rPr>
-        <w:t>Provide Supabase Auth login with user and admin roles, session cookies, and protected routes (Phase 3).</w:t>
+        <w:t>Authentication: Supabase Auth login with user and admin roles, session cookies, and protected routes.</w:t>
       </w:r>
     </w:p>
     <w:p>
@@ -1550,7 +1780,7 @@
           <w:b w:val="0"/>
           <w:sz w:val="24"/>
         </w:rPr>
-        <w:t>Enable authenticated users to create bookings with date selection and automatic price calculation, and view their booking history (Phase 4).</w:t>
+        <w:t>Booking workflow: date selection, automatic price calculation, and personal booking history in Supabase.</w:t>
       </w:r>
     </w:p>
     <w:p>
@@ -1563,7 +1793,7 @@
           <w:b w:val="0"/>
           <w:sz w:val="24"/>
         </w:rPr>
-        <w:t>Deliver an admin panel with dashboard statistics, cars CRUD, and booking status management (Phase 5).</w:t>
+        <w:t>Administration: dashboard statistics, cars CRUD, and booking status management.</w:t>
       </w:r>
     </w:p>
     <w:p>
@@ -1576,7 +1806,7 @@
           <w:b w:val="0"/>
           <w:sz w:val="24"/>
         </w:rPr>
-        <w:t>Apply UX polish including loading skeletons, error pages, toast notifications, and empty states (Phase 6).</w:t>
+        <w:t>User experience: loading skeletons, custom 404, toast notifications, and empty states.</w:t>
       </w:r>
     </w:p>
     <w:p>
@@ -1589,7 +1819,7 @@
           <w:b w:val="0"/>
           <w:sz w:val="24"/>
         </w:rPr>
-        <w:t>Integrate Supabase PostgreSQL for cars, bookings, and profiles with RLS policies (Backend Integration).</w:t>
+        <w:t>Cloud-ready backend: Supabase PostgreSQL with RLS, server-side data access, schema setup, and seed script.</w:t>
       </w:r>
     </w:p>
     <w:p>
@@ -1602,9 +1832,351 @@
           <w:b/>
           <w:sz w:val="28"/>
         </w:rPr>
-        <w:t>5.5 Project Evolution (POC to Backend Integration)</w:t>
+        <w:t>5.5 Key Features and System Capabilities</w:t>
       </w:r>
     </w:p>
+    <w:tbl>
+      <w:tblPr>
+        <w:tblStyle w:val="TableGrid"/>
+        <w:tblW w:type="auto" w:w="0"/>
+        <w:tblLook w:firstColumn="1" w:firstRow="1" w:lastColumn="0" w:lastRow="0" w:noHBand="0" w:noVBand="1" w:val="04A0"/>
+      </w:tblPr>
+      <w:tblGrid>
+        <w:gridCol w:w="3120"/>
+        <w:gridCol w:w="3120"/>
+        <w:gridCol w:w="3120"/>
+      </w:tblGrid>
+      <w:tr>
+        <w:tc>
+          <w:tcPr>
+            <w:tcW w:type="dxa" w:w="3120"/>
+          </w:tcPr>
+          <w:p>
+            <w:r>
+              <w:rPr>
+                <w:rFonts w:ascii="Times New Roman" w:hAnsi="Times New Roman" w:eastAsia="Times New Roman"/>
+                <w:b/>
+                <w:sz w:val="24"/>
+              </w:rPr>
+              <w:t>Module</w:t>
+            </w:r>
+          </w:p>
+        </w:tc>
+        <w:tc>
+          <w:tcPr>
+            <w:tcW w:type="dxa" w:w="3120"/>
+          </w:tcPr>
+          <w:p>
+            <w:r>
+              <w:rPr>
+                <w:rFonts w:ascii="Times New Roman" w:hAnsi="Times New Roman" w:eastAsia="Times New Roman"/>
+                <w:b/>
+                <w:sz w:val="24"/>
+              </w:rPr>
+              <w:t>Capability</w:t>
+            </w:r>
+          </w:p>
+        </w:tc>
+        <w:tc>
+          <w:tcPr>
+            <w:tcW w:type="dxa" w:w="3120"/>
+          </w:tcPr>
+          <w:p>
+            <w:r>
+              <w:rPr>
+                <w:rFonts w:ascii="Times New Roman" w:hAnsi="Times New Roman" w:eastAsia="Times New Roman"/>
+                <w:b/>
+                <w:sz w:val="24"/>
+              </w:rPr>
+              <w:t>Technology</w:t>
+            </w:r>
+          </w:p>
+        </w:tc>
+      </w:tr>
+      <w:tr>
+        <w:tc>
+          <w:tcPr>
+            <w:tcW w:type="dxa" w:w="3120"/>
+          </w:tcPr>
+          <w:p>
+            <w:r>
+              <w:rPr>
+                <w:rFonts w:ascii="Times New Roman" w:hAnsi="Times New Roman" w:eastAsia="Times New Roman"/>
+                <w:b w:val="0"/>
+                <w:sz w:val="24"/>
+              </w:rPr>
+              <w:t>Layout</w:t>
+            </w:r>
+          </w:p>
+        </w:tc>
+        <w:tc>
+          <w:tcPr>
+            <w:tcW w:type="dxa" w:w="3120"/>
+          </w:tcPr>
+          <w:p>
+            <w:r>
+              <w:rPr>
+                <w:rFonts w:ascii="Times New Roman" w:hAnsi="Times New Roman" w:eastAsia="Times New Roman"/>
+                <w:b w:val="0"/>
+                <w:sz w:val="24"/>
+              </w:rPr>
+              <w:t>Navbar, footer, mobile nav, home hero</w:t>
+            </w:r>
+          </w:p>
+        </w:tc>
+        <w:tc>
+          <w:tcPr>
+            <w:tcW w:type="dxa" w:w="3120"/>
+          </w:tcPr>
+          <w:p>
+            <w:r>
+              <w:rPr>
+                <w:rFonts w:ascii="Times New Roman" w:hAnsi="Times New Roman" w:eastAsia="Times New Roman"/>
+                <w:b w:val="0"/>
+                <w:sz w:val="24"/>
+              </w:rPr>
+              <w:t>Next.js, Tailwind, shadcn/ui</w:t>
+            </w:r>
+          </w:p>
+        </w:tc>
+      </w:tr>
+      <w:tr>
+        <w:tc>
+          <w:tcPr>
+            <w:tcW w:type="dxa" w:w="3120"/>
+          </w:tcPr>
+          <w:p>
+            <w:r>
+              <w:rPr>
+                <w:rFonts w:ascii="Times New Roman" w:hAnsi="Times New Roman" w:eastAsia="Times New Roman"/>
+                <w:b w:val="0"/>
+                <w:sz w:val="24"/>
+              </w:rPr>
+              <w:t>Catalog</w:t>
+            </w:r>
+          </w:p>
+        </w:tc>
+        <w:tc>
+          <w:tcPr>
+            <w:tcW w:type="dxa" w:w="3120"/>
+          </w:tcPr>
+          <w:p>
+            <w:r>
+              <w:rPr>
+                <w:rFonts w:ascii="Times New Roman" w:hAnsi="Times New Roman" w:eastAsia="Times New Roman"/>
+                <w:b w:val="0"/>
+                <w:sz w:val="24"/>
+              </w:rPr>
+              <w:t>Ten-vehicle grid, search/filter, detail galleries</w:t>
+            </w:r>
+          </w:p>
+        </w:tc>
+        <w:tc>
+          <w:tcPr>
+            <w:tcW w:type="dxa" w:w="3120"/>
+          </w:tcPr>
+          <w:p>
+            <w:r>
+              <w:rPr>
+                <w:rFonts w:ascii="Times New Roman" w:hAnsi="Times New Roman" w:eastAsia="Times New Roman"/>
+                <w:b w:val="0"/>
+                <w:sz w:val="24"/>
+              </w:rPr>
+              <w:t>Supabase cars table</w:t>
+            </w:r>
+          </w:p>
+        </w:tc>
+      </w:tr>
+      <w:tr>
+        <w:tc>
+          <w:tcPr>
+            <w:tcW w:type="dxa" w:w="3120"/>
+          </w:tcPr>
+          <w:p>
+            <w:r>
+              <w:rPr>
+                <w:rFonts w:ascii="Times New Roman" w:hAnsi="Times New Roman" w:eastAsia="Times New Roman"/>
+                <w:b w:val="0"/>
+                <w:sz w:val="24"/>
+              </w:rPr>
+              <w:t>Authentication</w:t>
+            </w:r>
+          </w:p>
+        </w:tc>
+        <w:tc>
+          <w:tcPr>
+            <w:tcW w:type="dxa" w:w="3120"/>
+          </w:tcPr>
+          <w:p>
+            <w:r>
+              <w:rPr>
+                <w:rFonts w:ascii="Times New Roman" w:hAnsi="Times New Roman" w:eastAsia="Times New Roman"/>
+                <w:b w:val="0"/>
+                <w:sz w:val="24"/>
+              </w:rPr>
+              <w:t>Email/password login, role redirect, session cookies</w:t>
+            </w:r>
+          </w:p>
+        </w:tc>
+        <w:tc>
+          <w:tcPr>
+            <w:tcW w:type="dxa" w:w="3120"/>
+          </w:tcPr>
+          <w:p>
+            <w:r>
+              <w:rPr>
+                <w:rFonts w:ascii="Times New Roman" w:hAnsi="Times New Roman" w:eastAsia="Times New Roman"/>
+                <w:b w:val="0"/>
+                <w:sz w:val="24"/>
+              </w:rPr>
+              <w:t>Supabase Auth, @supabase/ssr</w:t>
+            </w:r>
+          </w:p>
+        </w:tc>
+      </w:tr>
+      <w:tr>
+        <w:tc>
+          <w:tcPr>
+            <w:tcW w:type="dxa" w:w="3120"/>
+          </w:tcPr>
+          <w:p>
+            <w:r>
+              <w:rPr>
+                <w:rFonts w:ascii="Times New Roman" w:hAnsi="Times New Roman" w:eastAsia="Times New Roman"/>
+                <w:b w:val="0"/>
+                <w:sz w:val="24"/>
+              </w:rPr>
+              <w:t>Booking</w:t>
+            </w:r>
+          </w:p>
+        </w:tc>
+        <w:tc>
+          <w:tcPr>
+            <w:tcW w:type="dxa" w:w="3120"/>
+          </w:tcPr>
+          <w:p>
+            <w:r>
+              <w:rPr>
+                <w:rFonts w:ascii="Times New Roman" w:hAnsi="Times New Roman" w:eastAsia="Times New Roman"/>
+                <w:b w:val="0"/>
+                <w:sz w:val="24"/>
+              </w:rPr>
+              <w:t>Date selection, price calculation, booking history</w:t>
+            </w:r>
+          </w:p>
+        </w:tc>
+        <w:tc>
+          <w:tcPr>
+            <w:tcW w:type="dxa" w:w="3120"/>
+          </w:tcPr>
+          <w:p>
+            <w:r>
+              <w:rPr>
+                <w:rFonts w:ascii="Times New Roman" w:hAnsi="Times New Roman" w:eastAsia="Times New Roman"/>
+                <w:b w:val="0"/>
+                <w:sz w:val="24"/>
+              </w:rPr>
+              <w:t>Supabase bookings table</w:t>
+            </w:r>
+          </w:p>
+        </w:tc>
+      </w:tr>
+      <w:tr>
+        <w:tc>
+          <w:tcPr>
+            <w:tcW w:type="dxa" w:w="3120"/>
+          </w:tcPr>
+          <w:p>
+            <w:r>
+              <w:rPr>
+                <w:rFonts w:ascii="Times New Roman" w:hAnsi="Times New Roman" w:eastAsia="Times New Roman"/>
+                <w:b w:val="0"/>
+                <w:sz w:val="24"/>
+              </w:rPr>
+              <w:t>Administration</w:t>
+            </w:r>
+          </w:p>
+        </w:tc>
+        <w:tc>
+          <w:tcPr>
+            <w:tcW w:type="dxa" w:w="3120"/>
+          </w:tcPr>
+          <w:p>
+            <w:r>
+              <w:rPr>
+                <w:rFonts w:ascii="Times New Roman" w:hAnsi="Times New Roman" w:eastAsia="Times New Roman"/>
+                <w:b w:val="0"/>
+                <w:sz w:val="24"/>
+              </w:rPr>
+              <w:t>Dashboard, cars CRUD, booking status</w:t>
+            </w:r>
+          </w:p>
+        </w:tc>
+        <w:tc>
+          <w:tcPr>
+            <w:tcW w:type="dxa" w:w="3120"/>
+          </w:tcPr>
+          <w:p>
+            <w:r>
+              <w:rPr>
+                <w:rFonts w:ascii="Times New Roman" w:hAnsi="Times New Roman" w:eastAsia="Times New Roman"/>
+                <w:b w:val="0"/>
+                <w:sz w:val="24"/>
+              </w:rPr>
+              <w:t>RLS admin policies</w:t>
+            </w:r>
+          </w:p>
+        </w:tc>
+      </w:tr>
+      <w:tr>
+        <w:tc>
+          <w:tcPr>
+            <w:tcW w:type="dxa" w:w="3120"/>
+          </w:tcPr>
+          <w:p>
+            <w:r>
+              <w:rPr>
+                <w:rFonts w:ascii="Times New Roman" w:hAnsi="Times New Roman" w:eastAsia="Times New Roman"/>
+                <w:b w:val="0"/>
+                <w:sz w:val="24"/>
+              </w:rPr>
+              <w:t>Backend</w:t>
+            </w:r>
+          </w:p>
+        </w:tc>
+        <w:tc>
+          <w:tcPr>
+            <w:tcW w:type="dxa" w:w="3120"/>
+          </w:tcPr>
+          <w:p>
+            <w:r>
+              <w:rPr>
+                <w:rFonts w:ascii="Times New Roman" w:hAnsi="Times New Roman" w:eastAsia="Times New Roman"/>
+                <w:b w:val="0"/>
+                <w:sz w:val="24"/>
+              </w:rPr>
+              <w:t>PostgreSQL, RLS, seed script, server-side queries</w:t>
+            </w:r>
+          </w:p>
+        </w:tc>
+        <w:tc>
+          <w:tcPr>
+            <w:tcW w:type="dxa" w:w="3120"/>
+          </w:tcPr>
+          <w:p>
+            <w:r>
+              <w:rPr>
+                <w:rFonts w:ascii="Times New Roman" w:hAnsi="Times New Roman" w:eastAsia="Times New Roman"/>
+                <w:b w:val="0"/>
+                <w:sz w:val="24"/>
+              </w:rPr>
+              <w:t>Supabase cloud</w:t>
+            </w:r>
+          </w:p>
+        </w:tc>
+      </w:tr>
+    </w:tbl>
+    <w:p/>
     <w:p>
       <w:pPr>
         <w:spacing w:after="120" w:line="276" w:lineRule="auto"/>
@@ -1615,7 +2187,7 @@
           <w:b w:val="0"/>
           <w:sz w:val="24"/>
         </w:rPr>
-        <w:t>The project evolved from a JSON file-based proof-of-concept with custom HMAC session cookies to a Supabase-backed full-stack application. JSON files (cars.json, users.json, bookings.json) and custom session modules were removed. Supabase migrations, RLS policies, seed scripts, and server-side client helpers were added to support real authentication and PostgreSQL persistence.</w:t>
+        <w:t>Public catalog pages load car data from Supabase on the server. Authenticated users book vehicles with RLS-scoped inserts. Administrators manage fleet and bookings through role-enforced middleware and database policies. All Supabase communication runs on the Next.js server; the browser interacts only with the application domain.</w:t>
       </w:r>
     </w:p>
     <w:p>
@@ -1983,6 +2555,19 @@
     </w:p>
     <w:p>
       <w:pPr>
+        <w:pStyle w:val="ListBullet"/>
+      </w:pPr>
+      <w:r>
+        <w:rPr>
+          <w:rFonts w:ascii="Times New Roman" w:hAnsi="Times New Roman" w:eastAsia="Times New Roman"/>
+          <w:b w:val="0"/>
+          <w:sz w:val="24"/>
+        </w:rPr>
+        <w:t>Operational readiness: Modular separation of presentation, business logic, and Supabase integration supports independent testing and Vercel deployment via environment variables.</w:t>
+      </w:r>
+    </w:p>
+    <w:p>
+      <w:pPr>
         <w:spacing w:before="200" w:after="120"/>
       </w:pPr>
       <w:r>
@@ -2496,7 +3081,7 @@
                 <w:b/>
                 <w:sz w:val="24"/>
               </w:rPr>
-              <w:t>Phase</w:t>
+              <w:t>Module</w:t>
             </w:r>
           </w:p>
         </w:tc>
@@ -2543,7 +3128,7 @@
                 <w:b w:val="0"/>
                 <w:sz w:val="24"/>
               </w:rPr>
-              <w:t>1</w:t>
+              <w:t>Layout</w:t>
             </w:r>
           </w:p>
         </w:tc>
@@ -2590,7 +3175,7 @@
                 <w:b w:val="0"/>
                 <w:sz w:val="24"/>
               </w:rPr>
-              <w:t>2</w:t>
+              <w:t>Catalog</w:t>
             </w:r>
           </w:p>
         </w:tc>
@@ -2637,7 +3222,7 @@
                 <w:b w:val="0"/>
                 <w:sz w:val="24"/>
               </w:rPr>
-              <w:t>3</w:t>
+              <w:t>Authentication</w:t>
             </w:r>
           </w:p>
         </w:tc>
@@ -2684,7 +3269,7 @@
                 <w:b w:val="0"/>
                 <w:sz w:val="24"/>
               </w:rPr>
-              <w:t>4</w:t>
+              <w:t>Booking</w:t>
             </w:r>
           </w:p>
         </w:tc>
@@ -2731,7 +3316,7 @@
                 <w:b w:val="0"/>
                 <w:sz w:val="24"/>
               </w:rPr>
-              <w:t>5</w:t>
+              <w:t>Administration</w:t>
             </w:r>
           </w:p>
         </w:tc>
@@ -2778,22 +3363,22 @@
                 <w:b w:val="0"/>
                 <w:sz w:val="24"/>
               </w:rPr>
-              <w:t>6</w:t>
-            </w:r>
-          </w:p>
-        </w:tc>
-        <w:tc>
-          <w:tcPr>
-            <w:tcW w:type="dxa" w:w="3120"/>
-          </w:tcPr>
-          <w:p>
-            <w:r>
-              <w:rPr>
-                <w:rFonts w:ascii="Times New Roman" w:hAnsi="Times New Roman" w:eastAsia="Times New Roman"/>
-                <w:b w:val="0"/>
-                <w:sz w:val="24"/>
-              </w:rPr>
-              <w:t>Loading skeletons, 404 page, toasts, empty states, README</w:t>
+              <w:t>User Experience</w:t>
+            </w:r>
+          </w:p>
+        </w:tc>
+        <w:tc>
+          <w:tcPr>
+            <w:tcW w:type="dxa" w:w="3120"/>
+          </w:tcPr>
+          <w:p>
+            <w:r>
+              <w:rPr>
+                <w:rFonts w:ascii="Times New Roman" w:hAnsi="Times New Roman" w:eastAsia="Times New Roman"/>
+                <w:b w:val="0"/>
+                <w:sz w:val="24"/>
+              </w:rPr>
+              <w:t>Loading skeletons, 404 page, toasts, empty states</w:t>
             </w:r>
           </w:p>
         </w:tc>
@@ -2825,7 +3410,7 @@
                 <w:b w:val="0"/>
                 <w:sz w:val="24"/>
               </w:rPr>
-              <w:t>Backend</w:t>
+              <w:t>Database &amp; Security</w:t>
             </w:r>
           </w:p>
         </w:tc>
@@ -2925,6 +3510,32 @@
           <w:sz w:val="24"/>
         </w:rPr>
         <w:t>Semantic HTML and ARIA attributes for accessibility.</w:t>
+      </w:r>
+    </w:p>
+    <w:p>
+      <w:pPr>
+        <w:pStyle w:val="ListBullet"/>
+      </w:pPr>
+      <w:r>
+        <w:rPr>
+          <w:rFonts w:ascii="Times New Roman" w:hAnsi="Times New Roman" w:eastAsia="Times New Roman"/>
+          <w:b w:val="0"/>
+          <w:sz w:val="24"/>
+        </w:rPr>
+        <w:t>Production security: hashed passwords via Supabase Auth, HTTP-only cookies, admin role in JWT app_metadata enforced at middleware and RLS.</w:t>
+      </w:r>
+    </w:p>
+    <w:p>
+      <w:pPr>
+        <w:pStyle w:val="ListBullet"/>
+      </w:pPr>
+      <w:r>
+        <w:rPr>
+          <w:rFonts w:ascii="Times New Roman" w:hAnsi="Times New Roman" w:eastAsia="Times New Roman"/>
+          <w:b w:val="0"/>
+          <w:sz w:val="24"/>
+        </w:rPr>
+        <w:t>Deployment readiness: builds with npm run build; Vercel runtime requires only NEXT_PUBLIC_SUPABASE_URL and NEXT_PUBLIC_SUPABASE_ANON_KEY.</w:t>
       </w:r>
     </w:p>
     <w:p>
@@ -3642,6 +4253,19 @@
     </w:p>
     <w:p>
       <w:pPr>
+        <w:spacing w:after="120" w:line="276" w:lineRule="auto"/>
+      </w:pPr>
+      <w:r>
+        <w:rPr>
+          <w:rFonts w:ascii="Times New Roman" w:hAnsi="Times New Roman" w:eastAsia="Times New Roman"/>
+          <w:b w:val="0"/>
+          <w:sz w:val="24"/>
+        </w:rPr>
+        <w:t>Three-tier request flow: the browser sends HTTP requests only to Next.js (Vercel or localhost). Server Components and Server Actions invoke Supabase clients to read or write PostgreSQL data and manage Auth sessions. Supabase returns results to the server, which renders HTML or redirects the browser.</w:t>
+      </w:r>
+    </w:p>
+    <w:p>
+      <w:pPr>
         <w:spacing w:before="200" w:after="120"/>
       </w:pPr>
       <w:r>
@@ -5411,6 +6035,19 @@
     <w:p/>
     <w:p>
       <w:pPr>
+        <w:spacing w:after="120" w:line="276" w:lineRule="auto"/>
+      </w:pPr>
+      <w:r>
+        <w:rPr>
+          <w:rFonts w:ascii="Times New Roman" w:hAnsi="Times New Roman" w:eastAsia="Times New Roman"/>
+          <w:b w:val="0"/>
+          <w:sz w:val="24"/>
+        </w:rPr>
+        <w:t>Public routes (/, /cars, /cars/[id]) load catalog data without authentication. Auth routes (/login) redirect signed-in users by role. User routes (/cars/[id]/book, /my-bookings) require middleware session validation. Admin routes (/admin/*) require app_metadata.role = admin.</w:t>
+      </w:r>
+    </w:p>
+    <w:p>
+      <w:pPr>
         <w:spacing w:before="200" w:after="120"/>
       </w:pPr>
       <w:r>
@@ -5497,7 +6134,7 @@
           <w:b/>
           <w:sz w:val="28"/>
         </w:rPr>
-        <w:t>9.3 Phase-wise Implementation</w:t>
+        <w:t>9.3 Application Modules and Features</w:t>
       </w:r>
     </w:p>
     <w:p>
@@ -5510,7 +6147,7 @@
           <w:b w:val="0"/>
           <w:sz w:val="24"/>
         </w:rPr>
-        <w:t>Phase 1 — Layout shell: Root layout with Navbar, Footer, AuthProvider, and Sonner toast provider.</w:t>
+        <w:t>Layout Shell: Root layout with Navbar, Footer, AuthProvider, and Sonner toast provider.</w:t>
       </w:r>
     </w:p>
     <w:p>
@@ -5523,7 +6160,7 @@
           <w:b w:val="0"/>
           <w:sz w:val="24"/>
         </w:rPr>
-        <w:t>Phase 2 — Catalog: CarsCatalog component with responsive grid, filters, and empty state.</w:t>
+        <w:t>Vehicle Catalog: CarsCatalog with responsive grid, filters, CarCard, and CarImageGallery.</w:t>
       </w:r>
     </w:p>
     <w:p>
@@ -5536,7 +6173,7 @@
           <w:b w:val="0"/>
           <w:sz w:val="24"/>
         </w:rPr>
-        <w:t>Phase 3 — Authentication: /login uses supabase.auth.signInWithPassword; session in HTTP-only cookies via @supabase/ssr.</w:t>
+        <w:t>Authentication: /login uses supabase.auth.signInWithPassword; session in HTTP-only cookies via @supabase/ssr.</w:t>
       </w:r>
     </w:p>
     <w:p>
@@ -5549,7 +6186,7 @@
           <w:b w:val="0"/>
           <w:sz w:val="24"/>
         </w:rPr>
-        <w:t>Phase 4 — Booking: createBookingAction inserts into Supabase bookings table.</w:t>
+        <w:t>Booking Workflow: createBookingAction inserts into Supabase bookings; my bookings lists user reservations.</w:t>
       </w:r>
     </w:p>
     <w:p>
@@ -5562,7 +6199,7 @@
           <w:b w:val="0"/>
           <w:sz w:val="24"/>
         </w:rPr>
-        <w:t>Phase 5 — Admin: Dashboard, cars CRUD, and booking status management via Supabase.</w:t>
+        <w:t>Administration: Dashboard, cars CRUD, and booking status management via Supabase.</w:t>
       </w:r>
     </w:p>
     <w:p>
@@ -5575,20 +6212,7 @@
           <w:b w:val="0"/>
           <w:sz w:val="24"/>
         </w:rPr>
-        <w:t>Phase 6 — Polish: Loading skeletons, custom 404, toast notifications, and empty states.</w:t>
-      </w:r>
-    </w:p>
-    <w:p>
-      <w:pPr>
-        <w:pStyle w:val="ListBullet"/>
-      </w:pPr>
-      <w:r>
-        <w:rPr>
-          <w:rFonts w:ascii="Times New Roman" w:hAnsi="Times New Roman" w:eastAsia="Times New Roman"/>
-          <w:b w:val="0"/>
-          <w:sz w:val="24"/>
-        </w:rPr>
-        <w:t>Backend Integration — Supabase: PostgreSQL schema, RLS, seed script; removed JSON file storage.</w:t>
+        <w:t>User Experience: Loading skeletons, custom 404, toast notifications, and empty states.</w:t>
       </w:r>
     </w:p>
     <w:p>
@@ -5796,7 +6420,7 @@
           <w:b/>
           <w:sz w:val="28"/>
         </w:rPr>
-        <w:t>9.7 Backend Integration (Supabase Migration)</w:t>
+        <w:t>9.7 Supabase Backend Architecture</w:t>
       </w:r>
     </w:p>
     <w:p>
@@ -5809,7 +6433,85 @@
           <w:b w:val="0"/>
           <w:sz w:val="24"/>
         </w:rPr>
-        <w:t>The backend integration replaced JSON filesystem persistence with Supabase PostgreSQL. Migration SQL files define profiles, cars, and bookings tables with foreign keys, check constraints, and RLS policies. The seed script creates demo auth users via Admin API, inserts ten cars, and seeds sample bookings.</w:t>
+        <w:t>DriveEase persists all application data in Supabase PostgreSQL and authenticates users through Supabase Auth. Tables profiles, cars, and bookings are linked by foreign keys and protected by Row Level Security policies.</w:t>
+      </w:r>
+    </w:p>
+    <w:p>
+      <w:pPr>
+        <w:pStyle w:val="ListBullet"/>
+      </w:pPr>
+      <w:r>
+        <w:rPr>
+          <w:rFonts w:ascii="Times New Roman" w:hAnsi="Times New Roman" w:eastAsia="Times New Roman"/>
+          <w:b w:val="0"/>
+          <w:sz w:val="24"/>
+        </w:rPr>
+        <w:t>lib/supabase/server.ts — cookie-aware client for Server Components and Actions.</w:t>
+      </w:r>
+    </w:p>
+    <w:p>
+      <w:pPr>
+        <w:pStyle w:val="ListBullet"/>
+      </w:pPr>
+      <w:r>
+        <w:rPr>
+          <w:rFonts w:ascii="Times New Roman" w:hAnsi="Times New Roman" w:eastAsia="Times New Roman"/>
+          <w:b w:val="0"/>
+          <w:sz w:val="24"/>
+        </w:rPr>
+        <w:t>lib/supabase/middleware.ts — refreshes auth tokens on each request.</w:t>
+      </w:r>
+    </w:p>
+    <w:p>
+      <w:pPr>
+        <w:pStyle w:val="ListBullet"/>
+      </w:pPr>
+      <w:r>
+        <w:rPr>
+          <w:rFonts w:ascii="Times New Roman" w:hAnsi="Times New Roman" w:eastAsia="Times New Roman"/>
+          <w:b w:val="0"/>
+          <w:sz w:val="24"/>
+        </w:rPr>
+        <w:t>lib/supabase/admin.ts — service-role client for npm run seed only.</w:t>
+      </w:r>
+    </w:p>
+    <w:p>
+      <w:pPr>
+        <w:pStyle w:val="ListBullet"/>
+      </w:pPr>
+      <w:r>
+        <w:rPr>
+          <w:rFonts w:ascii="Times New Roman" w:hAnsi="Times New Roman" w:eastAsia="Times New Roman"/>
+          <w:b w:val="0"/>
+          <w:sz w:val="24"/>
+        </w:rPr>
+        <w:t>supabase/migrations/ — initial schema setup SQL for greenfield installation.</w:t>
+      </w:r>
+    </w:p>
+    <w:p>
+      <w:pPr>
+        <w:pStyle w:val="ListBullet"/>
+      </w:pPr>
+      <w:r>
+        <w:rPr>
+          <w:rFonts w:ascii="Times New Roman" w:hAnsi="Times New Roman" w:eastAsia="Times New Roman"/>
+          <w:b w:val="0"/>
+          <w:sz w:val="24"/>
+        </w:rPr>
+        <w:t>scripts/seed-supabase.ts — creates demo users, ten cars, and sample bookings.</w:t>
+      </w:r>
+    </w:p>
+    <w:p>
+      <w:pPr>
+        <w:spacing w:after="120" w:line="276" w:lineRule="auto"/>
+      </w:pPr>
+      <w:r>
+        <w:rPr>
+          <w:rFonts w:ascii="Times New Roman" w:hAnsi="Times New Roman" w:eastAsia="Times New Roman"/>
+          <w:b w:val="0"/>
+          <w:sz w:val="24"/>
+        </w:rPr>
+        <w:t>Environment variables: NEXT_PUBLIC_SUPABASE_URL and NEXT_PUBLIC_SUPABASE_ANON_KEY (required at runtime); SUPABASE_SERVICE_ROLE_KEY (local seed script only).</w:t>
       </w:r>
     </w:p>
     <w:p>
@@ -5890,71 +6592,348 @@
         <w:t>9.9 User Interface Components</w:t>
       </w:r>
     </w:p>
-    <w:p>
-      <w:pPr>
-        <w:pStyle w:val="ListBullet"/>
-      </w:pPr>
-      <w:r>
-        <w:rPr>
-          <w:rFonts w:ascii="Times New Roman" w:hAnsi="Times New Roman" w:eastAsia="Times New Roman"/>
-          <w:b w:val="0"/>
-          <w:sz w:val="24"/>
-        </w:rPr>
-        <w:t>Navbar and MobileNav: site navigation and logout.</w:t>
-      </w:r>
-    </w:p>
-    <w:p>
-      <w:pPr>
-        <w:pStyle w:val="ListBullet"/>
-      </w:pPr>
-      <w:r>
-        <w:rPr>
-          <w:rFonts w:ascii="Times New Roman" w:hAnsi="Times New Roman" w:eastAsia="Times New Roman"/>
-          <w:b w:val="0"/>
-          <w:sz w:val="24"/>
-        </w:rPr>
-        <w:t>CarsCatalog and CarCard: catalog grid and filtering.</w:t>
-      </w:r>
-    </w:p>
-    <w:p>
-      <w:pPr>
-        <w:pStyle w:val="ListBullet"/>
-      </w:pPr>
-      <w:r>
-        <w:rPr>
-          <w:rFonts w:ascii="Times New Roman" w:hAnsi="Times New Roman" w:eastAsia="Times New Roman"/>
-          <w:b w:val="0"/>
-          <w:sz w:val="24"/>
-        </w:rPr>
-        <w:t>CarImageGallery: detail page image display.</w:t>
-      </w:r>
-    </w:p>
-    <w:p>
-      <w:pPr>
-        <w:pStyle w:val="ListBullet"/>
-      </w:pPr>
-      <w:r>
-        <w:rPr>
-          <w:rFonts w:ascii="Times New Roman" w:hAnsi="Times New Roman" w:eastAsia="Times New Roman"/>
-          <w:b w:val="0"/>
-          <w:sz w:val="24"/>
-        </w:rPr>
-        <w:t>LoginForm and CarBookingForm: authenticated user interactions.</w:t>
-      </w:r>
-    </w:p>
-    <w:p>
-      <w:pPr>
-        <w:pStyle w:val="ListBullet"/>
-      </w:pPr>
-      <w:r>
-        <w:rPr>
-          <w:rFonts w:ascii="Times New Roman" w:hAnsi="Times New Roman" w:eastAsia="Times New Roman"/>
-          <w:b w:val="0"/>
-          <w:sz w:val="24"/>
-        </w:rPr>
-        <w:t>AdminNav and admin tables: fleet and booking management.</w:t>
-      </w:r>
-    </w:p>
+    <w:tbl>
+      <w:tblPr>
+        <w:tblStyle w:val="TableGrid"/>
+        <w:tblW w:type="auto" w:w="0"/>
+        <w:tblLook w:firstColumn="1" w:firstRow="1" w:lastColumn="0" w:lastRow="0" w:noHBand="0" w:noVBand="1" w:val="04A0"/>
+      </w:tblPr>
+      <w:tblGrid>
+        <w:gridCol w:w="3120"/>
+        <w:gridCol w:w="3120"/>
+        <w:gridCol w:w="3120"/>
+      </w:tblGrid>
+      <w:tr>
+        <w:tc>
+          <w:tcPr>
+            <w:tcW w:type="dxa" w:w="3120"/>
+          </w:tcPr>
+          <w:p>
+            <w:r>
+              <w:rPr>
+                <w:rFonts w:ascii="Times New Roman" w:hAnsi="Times New Roman" w:eastAsia="Times New Roman"/>
+                <w:b/>
+                <w:sz w:val="24"/>
+              </w:rPr>
+              <w:t>Component</w:t>
+            </w:r>
+          </w:p>
+        </w:tc>
+        <w:tc>
+          <w:tcPr>
+            <w:tcW w:type="dxa" w:w="3120"/>
+          </w:tcPr>
+          <w:p>
+            <w:r>
+              <w:rPr>
+                <w:rFonts w:ascii="Times New Roman" w:hAnsi="Times New Roman" w:eastAsia="Times New Roman"/>
+                <w:b/>
+                <w:sz w:val="24"/>
+              </w:rPr>
+              <w:t>Type</w:t>
+            </w:r>
+          </w:p>
+        </w:tc>
+        <w:tc>
+          <w:tcPr>
+            <w:tcW w:type="dxa" w:w="3120"/>
+          </w:tcPr>
+          <w:p>
+            <w:r>
+              <w:rPr>
+                <w:rFonts w:ascii="Times New Roman" w:hAnsi="Times New Roman" w:eastAsia="Times New Roman"/>
+                <w:b/>
+                <w:sz w:val="24"/>
+              </w:rPr>
+              <w:t>Responsibility</w:t>
+            </w:r>
+          </w:p>
+        </w:tc>
+      </w:tr>
+      <w:tr>
+        <w:tc>
+          <w:tcPr>
+            <w:tcW w:type="dxa" w:w="3120"/>
+          </w:tcPr>
+          <w:p>
+            <w:r>
+              <w:rPr>
+                <w:rFonts w:ascii="Times New Roman" w:hAnsi="Times New Roman" w:eastAsia="Times New Roman"/>
+                <w:b w:val="0"/>
+                <w:sz w:val="24"/>
+              </w:rPr>
+              <w:t>Navbar</w:t>
+            </w:r>
+          </w:p>
+        </w:tc>
+        <w:tc>
+          <w:tcPr>
+            <w:tcW w:type="dxa" w:w="3120"/>
+          </w:tcPr>
+          <w:p>
+            <w:r>
+              <w:rPr>
+                <w:rFonts w:ascii="Times New Roman" w:hAnsi="Times New Roman" w:eastAsia="Times New Roman"/>
+                <w:b w:val="0"/>
+                <w:sz w:val="24"/>
+              </w:rPr>
+              <w:t>Client</w:t>
+            </w:r>
+          </w:p>
+        </w:tc>
+        <w:tc>
+          <w:tcPr>
+            <w:tcW w:type="dxa" w:w="3120"/>
+          </w:tcPr>
+          <w:p>
+            <w:r>
+              <w:rPr>
+                <w:rFonts w:ascii="Times New Roman" w:hAnsi="Times New Roman" w:eastAsia="Times New Roman"/>
+                <w:b w:val="0"/>
+                <w:sz w:val="24"/>
+              </w:rPr>
+              <w:t>Navigation, user greeting, logout</w:t>
+            </w:r>
+          </w:p>
+        </w:tc>
+      </w:tr>
+      <w:tr>
+        <w:tc>
+          <w:tcPr>
+            <w:tcW w:type="dxa" w:w="3120"/>
+          </w:tcPr>
+          <w:p>
+            <w:r>
+              <w:rPr>
+                <w:rFonts w:ascii="Times New Roman" w:hAnsi="Times New Roman" w:eastAsia="Times New Roman"/>
+                <w:b w:val="0"/>
+                <w:sz w:val="24"/>
+              </w:rPr>
+              <w:t>CarsCatalog</w:t>
+            </w:r>
+          </w:p>
+        </w:tc>
+        <w:tc>
+          <w:tcPr>
+            <w:tcW w:type="dxa" w:w="3120"/>
+          </w:tcPr>
+          <w:p>
+            <w:r>
+              <w:rPr>
+                <w:rFonts w:ascii="Times New Roman" w:hAnsi="Times New Roman" w:eastAsia="Times New Roman"/>
+                <w:b w:val="0"/>
+                <w:sz w:val="24"/>
+              </w:rPr>
+              <w:t>Client</w:t>
+            </w:r>
+          </w:p>
+        </w:tc>
+        <w:tc>
+          <w:tcPr>
+            <w:tcW w:type="dxa" w:w="3120"/>
+          </w:tcPr>
+          <w:p>
+            <w:r>
+              <w:rPr>
+                <w:rFonts w:ascii="Times New Roman" w:hAnsi="Times New Roman" w:eastAsia="Times New Roman"/>
+                <w:b w:val="0"/>
+                <w:sz w:val="24"/>
+              </w:rPr>
+              <w:t>Filter controls and car grid</w:t>
+            </w:r>
+          </w:p>
+        </w:tc>
+      </w:tr>
+      <w:tr>
+        <w:tc>
+          <w:tcPr>
+            <w:tcW w:type="dxa" w:w="3120"/>
+          </w:tcPr>
+          <w:p>
+            <w:r>
+              <w:rPr>
+                <w:rFonts w:ascii="Times New Roman" w:hAnsi="Times New Roman" w:eastAsia="Times New Roman"/>
+                <w:b w:val="0"/>
+                <w:sz w:val="24"/>
+              </w:rPr>
+              <w:t>CarCard</w:t>
+            </w:r>
+          </w:p>
+        </w:tc>
+        <w:tc>
+          <w:tcPr>
+            <w:tcW w:type="dxa" w:w="3120"/>
+          </w:tcPr>
+          <w:p>
+            <w:r>
+              <w:rPr>
+                <w:rFonts w:ascii="Times New Roman" w:hAnsi="Times New Roman" w:eastAsia="Times New Roman"/>
+                <w:b w:val="0"/>
+                <w:sz w:val="24"/>
+              </w:rPr>
+              <w:t>Server</w:t>
+            </w:r>
+          </w:p>
+        </w:tc>
+        <w:tc>
+          <w:tcPr>
+            <w:tcW w:type="dxa" w:w="3120"/>
+          </w:tcPr>
+          <w:p>
+            <w:r>
+              <w:rPr>
+                <w:rFonts w:ascii="Times New Roman" w:hAnsi="Times New Roman" w:eastAsia="Times New Roman"/>
+                <w:b w:val="0"/>
+                <w:sz w:val="24"/>
+              </w:rPr>
+              <w:t>Individual car summary card</w:t>
+            </w:r>
+          </w:p>
+        </w:tc>
+      </w:tr>
+      <w:tr>
+        <w:tc>
+          <w:tcPr>
+            <w:tcW w:type="dxa" w:w="3120"/>
+          </w:tcPr>
+          <w:p>
+            <w:r>
+              <w:rPr>
+                <w:rFonts w:ascii="Times New Roman" w:hAnsi="Times New Roman" w:eastAsia="Times New Roman"/>
+                <w:b w:val="0"/>
+                <w:sz w:val="24"/>
+              </w:rPr>
+              <w:t>LoginForm</w:t>
+            </w:r>
+          </w:p>
+        </w:tc>
+        <w:tc>
+          <w:tcPr>
+            <w:tcW w:type="dxa" w:w="3120"/>
+          </w:tcPr>
+          <w:p>
+            <w:r>
+              <w:rPr>
+                <w:rFonts w:ascii="Times New Roman" w:hAnsi="Times New Roman" w:eastAsia="Times New Roman"/>
+                <w:b w:val="0"/>
+                <w:sz w:val="24"/>
+              </w:rPr>
+              <w:t>Client</w:t>
+            </w:r>
+          </w:p>
+        </w:tc>
+        <w:tc>
+          <w:tcPr>
+            <w:tcW w:type="dxa" w:w="3120"/>
+          </w:tcPr>
+          <w:p>
+            <w:r>
+              <w:rPr>
+                <w:rFonts w:ascii="Times New Roman" w:hAnsi="Times New Roman" w:eastAsia="Times New Roman"/>
+                <w:b w:val="0"/>
+                <w:sz w:val="24"/>
+              </w:rPr>
+              <w:t>Email/password form with error alert</w:t>
+            </w:r>
+          </w:p>
+        </w:tc>
+      </w:tr>
+      <w:tr>
+        <w:tc>
+          <w:tcPr>
+            <w:tcW w:type="dxa" w:w="3120"/>
+          </w:tcPr>
+          <w:p>
+            <w:r>
+              <w:rPr>
+                <w:rFonts w:ascii="Times New Roman" w:hAnsi="Times New Roman" w:eastAsia="Times New Roman"/>
+                <w:b w:val="0"/>
+                <w:sz w:val="24"/>
+              </w:rPr>
+              <w:t>CarBookingForm</w:t>
+            </w:r>
+          </w:p>
+        </w:tc>
+        <w:tc>
+          <w:tcPr>
+            <w:tcW w:type="dxa" w:w="3120"/>
+          </w:tcPr>
+          <w:p>
+            <w:r>
+              <w:rPr>
+                <w:rFonts w:ascii="Times New Roman" w:hAnsi="Times New Roman" w:eastAsia="Times New Roman"/>
+                <w:b w:val="0"/>
+                <w:sz w:val="24"/>
+              </w:rPr>
+              <w:t>Client</w:t>
+            </w:r>
+          </w:p>
+        </w:tc>
+        <w:tc>
+          <w:tcPr>
+            <w:tcW w:type="dxa" w:w="3120"/>
+          </w:tcPr>
+          <w:p>
+            <w:r>
+              <w:rPr>
+                <w:rFonts w:ascii="Times New Roman" w:hAnsi="Times New Roman" w:eastAsia="Times New Roman"/>
+                <w:b w:val="0"/>
+                <w:sz w:val="24"/>
+              </w:rPr>
+              <w:t>Date pickers and booking submit</w:t>
+            </w:r>
+          </w:p>
+        </w:tc>
+      </w:tr>
+      <w:tr>
+        <w:tc>
+          <w:tcPr>
+            <w:tcW w:type="dxa" w:w="3120"/>
+          </w:tcPr>
+          <w:p>
+            <w:r>
+              <w:rPr>
+                <w:rFonts w:ascii="Times New Roman" w:hAnsi="Times New Roman" w:eastAsia="Times New Roman"/>
+                <w:b w:val="0"/>
+                <w:sz w:val="24"/>
+              </w:rPr>
+              <w:t>AdminNav</w:t>
+            </w:r>
+          </w:p>
+        </w:tc>
+        <w:tc>
+          <w:tcPr>
+            <w:tcW w:type="dxa" w:w="3120"/>
+          </w:tcPr>
+          <w:p>
+            <w:r>
+              <w:rPr>
+                <w:rFonts w:ascii="Times New Roman" w:hAnsi="Times New Roman" w:eastAsia="Times New Roman"/>
+                <w:b w:val="0"/>
+                <w:sz w:val="24"/>
+              </w:rPr>
+              <w:t>Client</w:t>
+            </w:r>
+          </w:p>
+        </w:tc>
+        <w:tc>
+          <w:tcPr>
+            <w:tcW w:type="dxa" w:w="3120"/>
+          </w:tcPr>
+          <w:p>
+            <w:r>
+              <w:rPr>
+                <w:rFonts w:ascii="Times New Roman" w:hAnsi="Times New Roman" w:eastAsia="Times New Roman"/>
+                <w:b w:val="0"/>
+                <w:sz w:val="24"/>
+              </w:rPr>
+              <w:t>Admin sidebar navigation</w:t>
+            </w:r>
+          </w:p>
+        </w:tc>
+      </w:tr>
+    </w:tbl>
+    <w:p/>
     <w:p>
       <w:pPr>
         <w:spacing w:before="200" w:after="120"/>
@@ -6018,6 +6997,19 @@
           <w:sz w:val="24"/>
         </w:rPr>
         <w:t>Empty filter results and empty booking lists show dedicated empty states.</w:t>
+      </w:r>
+    </w:p>
+    <w:p>
+      <w:pPr>
+        <w:pStyle w:val="ListBullet"/>
+      </w:pPr>
+      <w:r>
+        <w:rPr>
+          <w:rFonts w:ascii="Times New Roman" w:hAnsi="Times New Roman" w:eastAsia="Times New Roman"/>
+          <w:b w:val="0"/>
+          <w:sz w:val="24"/>
+        </w:rPr>
+        <w:t>Expired session on protected routes redirects to login; non-admin users blocked from /admin/*.</w:t>
       </w:r>
     </w:p>
     <w:p>
@@ -7143,8 +8135,6 @@
         <w:br/>
         <w:t>├── e2e/                    # Playwright end-to-end tests</w:t>
         <w:br/>
-        <w:t>├── projectplan/            # Phase documentation</w:t>
-        <w:br/>
         <w:t>├── docs/                   # Project reports</w:t>
         <w:br/>
         <w:t>└── middleware.ts           # Session refresh and route protection</w:t>
@@ -7398,6 +8388,268 @@
       </w:r>
     </w:p>
     <w:p>
+      <w:pPr>
+        <w:spacing w:before="200" w:after="120"/>
+      </w:pPr>
+      <w:r>
+        <w:rPr>
+          <w:rFonts w:ascii="Times New Roman" w:hAnsi="Times New Roman" w:eastAsia="Times New Roman"/>
+          <w:b/>
+          <w:sz w:val="28"/>
+        </w:rPr>
+        <w:t>11.7 Source Code Repository</w:t>
+      </w:r>
+    </w:p>
+    <w:tbl>
+      <w:tblPr>
+        <w:tblStyle w:val="TableGrid"/>
+        <w:tblW w:type="auto" w:w="0"/>
+        <w:tblLook w:firstColumn="1" w:firstRow="1" w:lastColumn="0" w:lastRow="0" w:noHBand="0" w:noVBand="1" w:val="04A0"/>
+      </w:tblPr>
+      <w:tblGrid>
+        <w:gridCol w:w="4680"/>
+        <w:gridCol w:w="4680"/>
+      </w:tblGrid>
+      <w:tr>
+        <w:tc>
+          <w:tcPr>
+            <w:tcW w:type="dxa" w:w="4680"/>
+          </w:tcPr>
+          <w:p>
+            <w:r>
+              <w:rPr>
+                <w:rFonts w:ascii="Times New Roman" w:hAnsi="Times New Roman" w:eastAsia="Times New Roman"/>
+                <w:b/>
+                <w:sz w:val="24"/>
+              </w:rPr>
+              <w:t>Item</w:t>
+            </w:r>
+          </w:p>
+        </w:tc>
+        <w:tc>
+          <w:tcPr>
+            <w:tcW w:type="dxa" w:w="4680"/>
+          </w:tcPr>
+          <w:p>
+            <w:r>
+              <w:rPr>
+                <w:rFonts w:ascii="Times New Roman" w:hAnsi="Times New Roman" w:eastAsia="Times New Roman"/>
+                <w:b/>
+                <w:sz w:val="24"/>
+              </w:rPr>
+              <w:t>Location</w:t>
+            </w:r>
+          </w:p>
+        </w:tc>
+      </w:tr>
+      <w:tr>
+        <w:tc>
+          <w:tcPr>
+            <w:tcW w:type="dxa" w:w="4680"/>
+          </w:tcPr>
+          <w:p>
+            <w:r>
+              <w:rPr>
+                <w:rFonts w:ascii="Times New Roman" w:hAnsi="Times New Roman" w:eastAsia="Times New Roman"/>
+                <w:b w:val="0"/>
+                <w:sz w:val="24"/>
+              </w:rPr>
+              <w:t>Primary repository</w:t>
+            </w:r>
+          </w:p>
+        </w:tc>
+        <w:tc>
+          <w:tcPr>
+            <w:tcW w:type="dxa" w:w="4680"/>
+          </w:tcPr>
+          <w:p>
+            <w:r>
+              <w:rPr>
+                <w:rFonts w:ascii="Times New Roman" w:hAnsi="Times New Roman" w:eastAsia="Times New Roman"/>
+                <w:b w:val="0"/>
+                <w:sz w:val="24"/>
+              </w:rPr>
+              <w:t>https://github.com/ghariharanit/car-rental</w:t>
+            </w:r>
+          </w:p>
+        </w:tc>
+      </w:tr>
+      <w:tr>
+        <w:tc>
+          <w:tcPr>
+            <w:tcW w:type="dxa" w:w="4680"/>
+          </w:tcPr>
+          <w:p>
+            <w:r>
+              <w:rPr>
+                <w:rFonts w:ascii="Times New Roman" w:hAnsi="Times New Roman" w:eastAsia="Times New Roman"/>
+                <w:b w:val="0"/>
+                <w:sz w:val="24"/>
+              </w:rPr>
+              <w:t>Main branch</w:t>
+            </w:r>
+          </w:p>
+        </w:tc>
+        <w:tc>
+          <w:tcPr>
+            <w:tcW w:type="dxa" w:w="4680"/>
+          </w:tcPr>
+          <w:p>
+            <w:r>
+              <w:rPr>
+                <w:rFonts w:ascii="Times New Roman" w:hAnsi="Times New Roman" w:eastAsia="Times New Roman"/>
+                <w:b w:val="0"/>
+                <w:sz w:val="24"/>
+              </w:rPr>
+              <w:t>main — Supabase-backed application and documentation</w:t>
+            </w:r>
+          </w:p>
+        </w:tc>
+      </w:tr>
+      <w:tr>
+        <w:tc>
+          <w:tcPr>
+            <w:tcW w:type="dxa" w:w="4680"/>
+          </w:tcPr>
+          <w:p>
+            <w:r>
+              <w:rPr>
+                <w:rFonts w:ascii="Times New Roman" w:hAnsi="Times New Roman" w:eastAsia="Times New Roman"/>
+                <w:b w:val="0"/>
+                <w:sz w:val="24"/>
+              </w:rPr>
+              <w:t>Collaboration branch</w:t>
+            </w:r>
+          </w:p>
+        </w:tc>
+        <w:tc>
+          <w:tcPr>
+            <w:tcW w:type="dxa" w:w="4680"/>
+          </w:tcPr>
+          <w:p>
+            <w:r>
+              <w:rPr>
+                <w:rFonts w:ascii="Times New Roman" w:hAnsi="Times New Roman" w:eastAsia="Times New Roman"/>
+                <w:b w:val="0"/>
+                <w:sz w:val="24"/>
+              </w:rPr>
+              <w:t>https://github.com/sabareesh0609/car-rental/tree/backend-integration</w:t>
+            </w:r>
+          </w:p>
+        </w:tc>
+      </w:tr>
+      <w:tr>
+        <w:tc>
+          <w:tcPr>
+            <w:tcW w:type="dxa" w:w="4680"/>
+          </w:tcPr>
+          <w:p>
+            <w:r>
+              <w:rPr>
+                <w:rFonts w:ascii="Times New Roman" w:hAnsi="Times New Roman" w:eastAsia="Times New Roman"/>
+                <w:b w:val="0"/>
+                <w:sz w:val="24"/>
+              </w:rPr>
+              <w:t>Documentation</w:t>
+            </w:r>
+          </w:p>
+        </w:tc>
+        <w:tc>
+          <w:tcPr>
+            <w:tcW w:type="dxa" w:w="4680"/>
+          </w:tcPr>
+          <w:p>
+            <w:r>
+              <w:rPr>
+                <w:rFonts w:ascii="Times New Roman" w:hAnsi="Times New Roman" w:eastAsia="Times New Roman"/>
+                <w:b w:val="0"/>
+                <w:sz w:val="24"/>
+              </w:rPr>
+              <w:t>docs/driveease-project-report.md, .docx</w:t>
+            </w:r>
+          </w:p>
+        </w:tc>
+      </w:tr>
+      <w:tr>
+        <w:tc>
+          <w:tcPr>
+            <w:tcW w:type="dxa" w:w="4680"/>
+          </w:tcPr>
+          <w:p>
+            <w:r>
+              <w:rPr>
+                <w:rFonts w:ascii="Times New Roman" w:hAnsi="Times New Roman" w:eastAsia="Times New Roman"/>
+                <w:b w:val="0"/>
+                <w:sz w:val="24"/>
+              </w:rPr>
+              <w:t>Database setup</w:t>
+            </w:r>
+          </w:p>
+        </w:tc>
+        <w:tc>
+          <w:tcPr>
+            <w:tcW w:type="dxa" w:w="4680"/>
+          </w:tcPr>
+          <w:p>
+            <w:r>
+              <w:rPr>
+                <w:rFonts w:ascii="Times New Roman" w:hAnsi="Times New Roman" w:eastAsia="Times New Roman"/>
+                <w:b w:val="0"/>
+                <w:sz w:val="24"/>
+              </w:rPr>
+              <w:t>supabase/migrations/</w:t>
+            </w:r>
+          </w:p>
+        </w:tc>
+      </w:tr>
+      <w:tr>
+        <w:tc>
+          <w:tcPr>
+            <w:tcW w:type="dxa" w:w="4680"/>
+          </w:tcPr>
+          <w:p>
+            <w:r>
+              <w:rPr>
+                <w:rFonts w:ascii="Times New Roman" w:hAnsi="Times New Roman" w:eastAsia="Times New Roman"/>
+                <w:b w:val="0"/>
+                <w:sz w:val="24"/>
+              </w:rPr>
+              <w:t>Screenshots</w:t>
+            </w:r>
+          </w:p>
+        </w:tc>
+        <w:tc>
+          <w:tcPr>
+            <w:tcW w:type="dxa" w:w="4680"/>
+          </w:tcPr>
+          <w:p>
+            <w:r>
+              <w:rPr>
+                <w:rFonts w:ascii="Times New Roman" w:hAnsi="Times New Roman" w:eastAsia="Times New Roman"/>
+                <w:b w:val="0"/>
+                <w:sz w:val="24"/>
+              </w:rPr>
+              <w:t>docs/screenshots/ (Appendix G)</w:t>
+            </w:r>
+          </w:p>
+        </w:tc>
+      </w:tr>
+    </w:tbl>
+    <w:p/>
+    <w:p>
+      <w:pPr>
+        <w:spacing w:after="120" w:line="276" w:lineRule="auto"/>
+      </w:pPr>
+      <w:r>
+        <w:rPr>
+          <w:rFonts w:ascii="Times New Roman" w:hAnsi="Times New Roman" w:eastAsia="Times New Roman"/>
+          <w:b w:val="0"/>
+          <w:sz w:val="24"/>
+        </w:rPr>
+        <w:t>Clone with git clone, configure .env.local from .env.local.example, apply SQL migrations, run npm run seed, then npm run dev. Refresh report screenshots with npm run screenshots:report while the dev server is running.</w:t>
+      </w:r>
+    </w:p>
+    <w:p>
       <w:r>
         <w:br w:type="page"/>
       </w:r>
@@ -7439,7 +8691,7 @@
           <w:b w:val="0"/>
           <w:sz w:val="24"/>
         </w:rPr>
-        <w:t>DriveEase successfully implements a full-stack car rental application across six phases plus Supabase backend integration. The application delivers a complete customer journey from browsing the fleet through authenticated booking and viewing reservations, as well as a full admin workflow backed by Supabase PostgreSQL and real authentication.</w:t>
+        <w:t>DriveEase successfully implements a full-stack car rental application with a complete customer journey from browsing the fleet through Supabase-authenticated booking and viewing reservations, as well as a full admin workflow backed by PostgreSQL.</w:t>
       </w:r>
     </w:p>
     <w:p>
@@ -7452,7 +8704,7 @@
           <w:b w:val="0"/>
           <w:sz w:val="24"/>
         </w:rPr>
-        <w:t>Security is enforced at three levels: Next.js middleware for route protection, Supabase Auth for session management with hashed passwords, and PostgreSQL RLS for database row access control. Server-side-only Supabase queries prevent the browser from exposing database API calls.</w:t>
+        <w:t>The system uses industry-standard authentication with hashed passwords, database-enforced Row Level Security, and server-side Supabase data access suitable for cloud deployment on Vercel. Unit tests validate booking math and catalog filters; end-to-end tests cover authentication guards, booking flows, and admin operations.</w:t>
       </w:r>
     </w:p>
     <w:p>
@@ -8952,6 +10204,19 @@
     </w:p>
     <w:p>
       <w:pPr>
+        <w:pStyle w:val="ListBullet"/>
+      </w:pPr>
+      <w:r>
+        <w:rPr>
+          <w:rFonts w:ascii="Times New Roman" w:hAnsi="Times New Roman" w:eastAsia="Times New Roman"/>
+          <w:b w:val="0"/>
+          <w:sz w:val="24"/>
+        </w:rPr>
+        <w:t>Fuel breakdown: 4 Petrol, 3 Diesel, 2 Electric, 1 Hybrid.</w:t>
+      </w:r>
+    </w:p>
+    <w:p>
+      <w:pPr>
         <w:spacing w:before="200" w:after="120"/>
       </w:pPr>
       <w:r>
@@ -8960,12 +10225,12 @@
           <w:b/>
           <w:sz w:val="28"/>
         </w:rPr>
-        <w:t>Appendix G — Screenshot Placeholders</w:t>
+        <w:t>Appendix G — Application Screenshots</w:t>
       </w:r>
     </w:p>
     <w:p>
       <w:pPr>
-        <w:pStyle w:val="ListBullet"/>
+        <w:spacing w:after="120" w:line="276" w:lineRule="auto"/>
       </w:pPr>
       <w:r>
         <w:rPr>
@@ -8973,12 +10238,646 @@
           <w:b w:val="0"/>
           <w:sz w:val="24"/>
         </w:rPr>
-        <w:t>1. Home page — hero section with Browse Cars button</w:t>
+        <w:t>UI screenshots from http://localhost:3000 with seeded Supabase demo data. Regenerate with npm run screenshots:report (requires npm run dev).</w:t>
       </w:r>
     </w:p>
+    <w:tbl>
+      <w:tblPr>
+        <w:tblStyle w:val="TableGrid"/>
+        <w:tblW w:type="auto" w:w="0"/>
+        <w:tblLook w:firstColumn="1" w:firstRow="1" w:lastColumn="0" w:lastRow="0" w:noHBand="0" w:noVBand="1" w:val="04A0"/>
+      </w:tblPr>
+      <w:tblGrid>
+        <w:gridCol w:w="2340"/>
+        <w:gridCol w:w="2340"/>
+        <w:gridCol w:w="2340"/>
+        <w:gridCol w:w="2340"/>
+      </w:tblGrid>
+      <w:tr>
+        <w:tc>
+          <w:tcPr>
+            <w:tcW w:type="dxa" w:w="2340"/>
+          </w:tcPr>
+          <w:p>
+            <w:r>
+              <w:rPr>
+                <w:rFonts w:ascii="Times New Roman" w:hAnsi="Times New Roman" w:eastAsia="Times New Roman"/>
+                <w:b/>
+                <w:sz w:val="24"/>
+              </w:rPr>
+              <w:t>Fig.</w:t>
+            </w:r>
+          </w:p>
+        </w:tc>
+        <w:tc>
+          <w:tcPr>
+            <w:tcW w:type="dxa" w:w="2340"/>
+          </w:tcPr>
+          <w:p>
+            <w:r>
+              <w:rPr>
+                <w:rFonts w:ascii="Times New Roman" w:hAnsi="Times New Roman" w:eastAsia="Times New Roman"/>
+                <w:b/>
+                <w:sz w:val="24"/>
+              </w:rPr>
+              <w:t>Screen</w:t>
+            </w:r>
+          </w:p>
+        </w:tc>
+        <w:tc>
+          <w:tcPr>
+            <w:tcW w:type="dxa" w:w="2340"/>
+          </w:tcPr>
+          <w:p>
+            <w:r>
+              <w:rPr>
+                <w:rFonts w:ascii="Times New Roman" w:hAnsi="Times New Roman" w:eastAsia="Times New Roman"/>
+                <w:b/>
+                <w:sz w:val="24"/>
+              </w:rPr>
+              <w:t>Route</w:t>
+            </w:r>
+          </w:p>
+        </w:tc>
+        <w:tc>
+          <w:tcPr>
+            <w:tcW w:type="dxa" w:w="2340"/>
+          </w:tcPr>
+          <w:p>
+            <w:r>
+              <w:rPr>
+                <w:rFonts w:ascii="Times New Roman" w:hAnsi="Times New Roman" w:eastAsia="Times New Roman"/>
+                <w:b/>
+                <w:sz w:val="24"/>
+              </w:rPr>
+              <w:t>File</w:t>
+            </w:r>
+          </w:p>
+        </w:tc>
+      </w:tr>
+      <w:tr>
+        <w:tc>
+          <w:tcPr>
+            <w:tcW w:type="dxa" w:w="2340"/>
+          </w:tcPr>
+          <w:p>
+            <w:r>
+              <w:rPr>
+                <w:rFonts w:ascii="Times New Roman" w:hAnsi="Times New Roman" w:eastAsia="Times New Roman"/>
+                <w:b w:val="0"/>
+                <w:sz w:val="24"/>
+              </w:rPr>
+              <w:t>G.1</w:t>
+            </w:r>
+          </w:p>
+        </w:tc>
+        <w:tc>
+          <w:tcPr>
+            <w:tcW w:type="dxa" w:w="2340"/>
+          </w:tcPr>
+          <w:p>
+            <w:r>
+              <w:rPr>
+                <w:rFonts w:ascii="Times New Roman" w:hAnsi="Times New Roman" w:eastAsia="Times New Roman"/>
+                <w:b w:val="0"/>
+                <w:sz w:val="24"/>
+              </w:rPr>
+              <w:t>Home page</w:t>
+            </w:r>
+          </w:p>
+        </w:tc>
+        <w:tc>
+          <w:tcPr>
+            <w:tcW w:type="dxa" w:w="2340"/>
+          </w:tcPr>
+          <w:p>
+            <w:r>
+              <w:rPr>
+                <w:rFonts w:ascii="Times New Roman" w:hAnsi="Times New Roman" w:eastAsia="Times New Roman"/>
+                <w:b w:val="0"/>
+                <w:sz w:val="24"/>
+              </w:rPr>
+              <w:t>/</w:t>
+            </w:r>
+          </w:p>
+        </w:tc>
+        <w:tc>
+          <w:tcPr>
+            <w:tcW w:type="dxa" w:w="2340"/>
+          </w:tcPr>
+          <w:p>
+            <w:r>
+              <w:rPr>
+                <w:rFonts w:ascii="Times New Roman" w:hAnsi="Times New Roman" w:eastAsia="Times New Roman"/>
+                <w:b w:val="0"/>
+                <w:sz w:val="24"/>
+              </w:rPr>
+              <w:t>01-home.png</w:t>
+            </w:r>
+          </w:p>
+        </w:tc>
+      </w:tr>
+      <w:tr>
+        <w:tc>
+          <w:tcPr>
+            <w:tcW w:type="dxa" w:w="2340"/>
+          </w:tcPr>
+          <w:p>
+            <w:r>
+              <w:rPr>
+                <w:rFonts w:ascii="Times New Roman" w:hAnsi="Times New Roman" w:eastAsia="Times New Roman"/>
+                <w:b w:val="0"/>
+                <w:sz w:val="24"/>
+              </w:rPr>
+              <w:t>G.2</w:t>
+            </w:r>
+          </w:p>
+        </w:tc>
+        <w:tc>
+          <w:tcPr>
+            <w:tcW w:type="dxa" w:w="2340"/>
+          </w:tcPr>
+          <w:p>
+            <w:r>
+              <w:rPr>
+                <w:rFonts w:ascii="Times New Roman" w:hAnsi="Times New Roman" w:eastAsia="Times New Roman"/>
+                <w:b w:val="0"/>
+                <w:sz w:val="24"/>
+              </w:rPr>
+              <w:t>Cars catalog</w:t>
+            </w:r>
+          </w:p>
+        </w:tc>
+        <w:tc>
+          <w:tcPr>
+            <w:tcW w:type="dxa" w:w="2340"/>
+          </w:tcPr>
+          <w:p>
+            <w:r>
+              <w:rPr>
+                <w:rFonts w:ascii="Times New Roman" w:hAnsi="Times New Roman" w:eastAsia="Times New Roman"/>
+                <w:b w:val="0"/>
+                <w:sz w:val="24"/>
+              </w:rPr>
+              <w:t>/cars</w:t>
+            </w:r>
+          </w:p>
+        </w:tc>
+        <w:tc>
+          <w:tcPr>
+            <w:tcW w:type="dxa" w:w="2340"/>
+          </w:tcPr>
+          <w:p>
+            <w:r>
+              <w:rPr>
+                <w:rFonts w:ascii="Times New Roman" w:hAnsi="Times New Roman" w:eastAsia="Times New Roman"/>
+                <w:b w:val="0"/>
+                <w:sz w:val="24"/>
+              </w:rPr>
+              <w:t>02-cars-catalog.png</w:t>
+            </w:r>
+          </w:p>
+        </w:tc>
+      </w:tr>
+      <w:tr>
+        <w:tc>
+          <w:tcPr>
+            <w:tcW w:type="dxa" w:w="2340"/>
+          </w:tcPr>
+          <w:p>
+            <w:r>
+              <w:rPr>
+                <w:rFonts w:ascii="Times New Roman" w:hAnsi="Times New Roman" w:eastAsia="Times New Roman"/>
+                <w:b w:val="0"/>
+                <w:sz w:val="24"/>
+              </w:rPr>
+              <w:t>G.3</w:t>
+            </w:r>
+          </w:p>
+        </w:tc>
+        <w:tc>
+          <w:tcPr>
+            <w:tcW w:type="dxa" w:w="2340"/>
+          </w:tcPr>
+          <w:p>
+            <w:r>
+              <w:rPr>
+                <w:rFonts w:ascii="Times New Roman" w:hAnsi="Times New Roman" w:eastAsia="Times New Roman"/>
+                <w:b w:val="0"/>
+                <w:sz w:val="24"/>
+              </w:rPr>
+              <w:t>Car detail</w:t>
+            </w:r>
+          </w:p>
+        </w:tc>
+        <w:tc>
+          <w:tcPr>
+            <w:tcW w:type="dxa" w:w="2340"/>
+          </w:tcPr>
+          <w:p>
+            <w:r>
+              <w:rPr>
+                <w:rFonts w:ascii="Times New Roman" w:hAnsi="Times New Roman" w:eastAsia="Times New Roman"/>
+                <w:b w:val="0"/>
+                <w:sz w:val="24"/>
+              </w:rPr>
+              <w:t>/cars/1</w:t>
+            </w:r>
+          </w:p>
+        </w:tc>
+        <w:tc>
+          <w:tcPr>
+            <w:tcW w:type="dxa" w:w="2340"/>
+          </w:tcPr>
+          <w:p>
+            <w:r>
+              <w:rPr>
+                <w:rFonts w:ascii="Times New Roman" w:hAnsi="Times New Roman" w:eastAsia="Times New Roman"/>
+                <w:b w:val="0"/>
+                <w:sz w:val="24"/>
+              </w:rPr>
+              <w:t>03-car-detail.png</w:t>
+            </w:r>
+          </w:p>
+        </w:tc>
+      </w:tr>
+      <w:tr>
+        <w:tc>
+          <w:tcPr>
+            <w:tcW w:type="dxa" w:w="2340"/>
+          </w:tcPr>
+          <w:p>
+            <w:r>
+              <w:rPr>
+                <w:rFonts w:ascii="Times New Roman" w:hAnsi="Times New Roman" w:eastAsia="Times New Roman"/>
+                <w:b w:val="0"/>
+                <w:sz w:val="24"/>
+              </w:rPr>
+              <w:t>G.4</w:t>
+            </w:r>
+          </w:p>
+        </w:tc>
+        <w:tc>
+          <w:tcPr>
+            <w:tcW w:type="dxa" w:w="2340"/>
+          </w:tcPr>
+          <w:p>
+            <w:r>
+              <w:rPr>
+                <w:rFonts w:ascii="Times New Roman" w:hAnsi="Times New Roman" w:eastAsia="Times New Roman"/>
+                <w:b w:val="0"/>
+                <w:sz w:val="24"/>
+              </w:rPr>
+              <w:t>Login</w:t>
+            </w:r>
+          </w:p>
+        </w:tc>
+        <w:tc>
+          <w:tcPr>
+            <w:tcW w:type="dxa" w:w="2340"/>
+          </w:tcPr>
+          <w:p>
+            <w:r>
+              <w:rPr>
+                <w:rFonts w:ascii="Times New Roman" w:hAnsi="Times New Roman" w:eastAsia="Times New Roman"/>
+                <w:b w:val="0"/>
+                <w:sz w:val="24"/>
+              </w:rPr>
+              <w:t>/login</w:t>
+            </w:r>
+          </w:p>
+        </w:tc>
+        <w:tc>
+          <w:tcPr>
+            <w:tcW w:type="dxa" w:w="2340"/>
+          </w:tcPr>
+          <w:p>
+            <w:r>
+              <w:rPr>
+                <w:rFonts w:ascii="Times New Roman" w:hAnsi="Times New Roman" w:eastAsia="Times New Roman"/>
+                <w:b w:val="0"/>
+                <w:sz w:val="24"/>
+              </w:rPr>
+              <w:t>04-login.png</w:t>
+            </w:r>
+          </w:p>
+        </w:tc>
+      </w:tr>
+      <w:tr>
+        <w:tc>
+          <w:tcPr>
+            <w:tcW w:type="dxa" w:w="2340"/>
+          </w:tcPr>
+          <w:p>
+            <w:r>
+              <w:rPr>
+                <w:rFonts w:ascii="Times New Roman" w:hAnsi="Times New Roman" w:eastAsia="Times New Roman"/>
+                <w:b w:val="0"/>
+                <w:sz w:val="24"/>
+              </w:rPr>
+              <w:t>G.5</w:t>
+            </w:r>
+          </w:p>
+        </w:tc>
+        <w:tc>
+          <w:tcPr>
+            <w:tcW w:type="dxa" w:w="2340"/>
+          </w:tcPr>
+          <w:p>
+            <w:r>
+              <w:rPr>
+                <w:rFonts w:ascii="Times New Roman" w:hAnsi="Times New Roman" w:eastAsia="Times New Roman"/>
+                <w:b w:val="0"/>
+                <w:sz w:val="24"/>
+              </w:rPr>
+              <w:t>My Bookings</w:t>
+            </w:r>
+          </w:p>
+        </w:tc>
+        <w:tc>
+          <w:tcPr>
+            <w:tcW w:type="dxa" w:w="2340"/>
+          </w:tcPr>
+          <w:p>
+            <w:r>
+              <w:rPr>
+                <w:rFonts w:ascii="Times New Roman" w:hAnsi="Times New Roman" w:eastAsia="Times New Roman"/>
+                <w:b w:val="0"/>
+                <w:sz w:val="24"/>
+              </w:rPr>
+              <w:t>/my-bookings</w:t>
+            </w:r>
+          </w:p>
+        </w:tc>
+        <w:tc>
+          <w:tcPr>
+            <w:tcW w:type="dxa" w:w="2340"/>
+          </w:tcPr>
+          <w:p>
+            <w:r>
+              <w:rPr>
+                <w:rFonts w:ascii="Times New Roman" w:hAnsi="Times New Roman" w:eastAsia="Times New Roman"/>
+                <w:b w:val="0"/>
+                <w:sz w:val="24"/>
+              </w:rPr>
+              <w:t>05-my-bookings.png</w:t>
+            </w:r>
+          </w:p>
+        </w:tc>
+      </w:tr>
+      <w:tr>
+        <w:tc>
+          <w:tcPr>
+            <w:tcW w:type="dxa" w:w="2340"/>
+          </w:tcPr>
+          <w:p>
+            <w:r>
+              <w:rPr>
+                <w:rFonts w:ascii="Times New Roman" w:hAnsi="Times New Roman" w:eastAsia="Times New Roman"/>
+                <w:b w:val="0"/>
+                <w:sz w:val="24"/>
+              </w:rPr>
+              <w:t>G.6</w:t>
+            </w:r>
+          </w:p>
+        </w:tc>
+        <w:tc>
+          <w:tcPr>
+            <w:tcW w:type="dxa" w:w="2340"/>
+          </w:tcPr>
+          <w:p>
+            <w:r>
+              <w:rPr>
+                <w:rFonts w:ascii="Times New Roman" w:hAnsi="Times New Roman" w:eastAsia="Times New Roman"/>
+                <w:b w:val="0"/>
+                <w:sz w:val="24"/>
+              </w:rPr>
+              <w:t>Booking form</w:t>
+            </w:r>
+          </w:p>
+        </w:tc>
+        <w:tc>
+          <w:tcPr>
+            <w:tcW w:type="dxa" w:w="2340"/>
+          </w:tcPr>
+          <w:p>
+            <w:r>
+              <w:rPr>
+                <w:rFonts w:ascii="Times New Roman" w:hAnsi="Times New Roman" w:eastAsia="Times New Roman"/>
+                <w:b w:val="0"/>
+                <w:sz w:val="24"/>
+              </w:rPr>
+              <w:t>/cars/1/book</w:t>
+            </w:r>
+          </w:p>
+        </w:tc>
+        <w:tc>
+          <w:tcPr>
+            <w:tcW w:type="dxa" w:w="2340"/>
+          </w:tcPr>
+          <w:p>
+            <w:r>
+              <w:rPr>
+                <w:rFonts w:ascii="Times New Roman" w:hAnsi="Times New Roman" w:eastAsia="Times New Roman"/>
+                <w:b w:val="0"/>
+                <w:sz w:val="24"/>
+              </w:rPr>
+              <w:t>06-booking-form.png</w:t>
+            </w:r>
+          </w:p>
+        </w:tc>
+      </w:tr>
+      <w:tr>
+        <w:tc>
+          <w:tcPr>
+            <w:tcW w:type="dxa" w:w="2340"/>
+          </w:tcPr>
+          <w:p>
+            <w:r>
+              <w:rPr>
+                <w:rFonts w:ascii="Times New Roman" w:hAnsi="Times New Roman" w:eastAsia="Times New Roman"/>
+                <w:b w:val="0"/>
+                <w:sz w:val="24"/>
+              </w:rPr>
+              <w:t>G.7</w:t>
+            </w:r>
+          </w:p>
+        </w:tc>
+        <w:tc>
+          <w:tcPr>
+            <w:tcW w:type="dxa" w:w="2340"/>
+          </w:tcPr>
+          <w:p>
+            <w:r>
+              <w:rPr>
+                <w:rFonts w:ascii="Times New Roman" w:hAnsi="Times New Roman" w:eastAsia="Times New Roman"/>
+                <w:b w:val="0"/>
+                <w:sz w:val="24"/>
+              </w:rPr>
+              <w:t>Admin dashboard</w:t>
+            </w:r>
+          </w:p>
+        </w:tc>
+        <w:tc>
+          <w:tcPr>
+            <w:tcW w:type="dxa" w:w="2340"/>
+          </w:tcPr>
+          <w:p>
+            <w:r>
+              <w:rPr>
+                <w:rFonts w:ascii="Times New Roman" w:hAnsi="Times New Roman" w:eastAsia="Times New Roman"/>
+                <w:b w:val="0"/>
+                <w:sz w:val="24"/>
+              </w:rPr>
+              <w:t>/admin/dashboard</w:t>
+            </w:r>
+          </w:p>
+        </w:tc>
+        <w:tc>
+          <w:tcPr>
+            <w:tcW w:type="dxa" w:w="2340"/>
+          </w:tcPr>
+          <w:p>
+            <w:r>
+              <w:rPr>
+                <w:rFonts w:ascii="Times New Roman" w:hAnsi="Times New Roman" w:eastAsia="Times New Roman"/>
+                <w:b w:val="0"/>
+                <w:sz w:val="24"/>
+              </w:rPr>
+              <w:t>07-admin-dashboard.png</w:t>
+            </w:r>
+          </w:p>
+        </w:tc>
+      </w:tr>
+      <w:tr>
+        <w:tc>
+          <w:tcPr>
+            <w:tcW w:type="dxa" w:w="2340"/>
+          </w:tcPr>
+          <w:p>
+            <w:r>
+              <w:rPr>
+                <w:rFonts w:ascii="Times New Roman" w:hAnsi="Times New Roman" w:eastAsia="Times New Roman"/>
+                <w:b w:val="0"/>
+                <w:sz w:val="24"/>
+              </w:rPr>
+              <w:t>G.8</w:t>
+            </w:r>
+          </w:p>
+        </w:tc>
+        <w:tc>
+          <w:tcPr>
+            <w:tcW w:type="dxa" w:w="2340"/>
+          </w:tcPr>
+          <w:p>
+            <w:r>
+              <w:rPr>
+                <w:rFonts w:ascii="Times New Roman" w:hAnsi="Times New Roman" w:eastAsia="Times New Roman"/>
+                <w:b w:val="0"/>
+                <w:sz w:val="24"/>
+              </w:rPr>
+              <w:t>Admin cars</w:t>
+            </w:r>
+          </w:p>
+        </w:tc>
+        <w:tc>
+          <w:tcPr>
+            <w:tcW w:type="dxa" w:w="2340"/>
+          </w:tcPr>
+          <w:p>
+            <w:r>
+              <w:rPr>
+                <w:rFonts w:ascii="Times New Roman" w:hAnsi="Times New Roman" w:eastAsia="Times New Roman"/>
+                <w:b w:val="0"/>
+                <w:sz w:val="24"/>
+              </w:rPr>
+              <w:t>/admin/cars</w:t>
+            </w:r>
+          </w:p>
+        </w:tc>
+        <w:tc>
+          <w:tcPr>
+            <w:tcW w:type="dxa" w:w="2340"/>
+          </w:tcPr>
+          <w:p>
+            <w:r>
+              <w:rPr>
+                <w:rFonts w:ascii="Times New Roman" w:hAnsi="Times New Roman" w:eastAsia="Times New Roman"/>
+                <w:b w:val="0"/>
+                <w:sz w:val="24"/>
+              </w:rPr>
+              <w:t>08-admin-cars.png</w:t>
+            </w:r>
+          </w:p>
+        </w:tc>
+      </w:tr>
+      <w:tr>
+        <w:tc>
+          <w:tcPr>
+            <w:tcW w:type="dxa" w:w="2340"/>
+          </w:tcPr>
+          <w:p>
+            <w:r>
+              <w:rPr>
+                <w:rFonts w:ascii="Times New Roman" w:hAnsi="Times New Roman" w:eastAsia="Times New Roman"/>
+                <w:b w:val="0"/>
+                <w:sz w:val="24"/>
+              </w:rPr>
+              <w:t>G.9</w:t>
+            </w:r>
+          </w:p>
+        </w:tc>
+        <w:tc>
+          <w:tcPr>
+            <w:tcW w:type="dxa" w:w="2340"/>
+          </w:tcPr>
+          <w:p>
+            <w:r>
+              <w:rPr>
+                <w:rFonts w:ascii="Times New Roman" w:hAnsi="Times New Roman" w:eastAsia="Times New Roman"/>
+                <w:b w:val="0"/>
+                <w:sz w:val="24"/>
+              </w:rPr>
+              <w:t>Admin bookings</w:t>
+            </w:r>
+          </w:p>
+        </w:tc>
+        <w:tc>
+          <w:tcPr>
+            <w:tcW w:type="dxa" w:w="2340"/>
+          </w:tcPr>
+          <w:p>
+            <w:r>
+              <w:rPr>
+                <w:rFonts w:ascii="Times New Roman" w:hAnsi="Times New Roman" w:eastAsia="Times New Roman"/>
+                <w:b w:val="0"/>
+                <w:sz w:val="24"/>
+              </w:rPr>
+              <w:t>/admin/bookings</w:t>
+            </w:r>
+          </w:p>
+        </w:tc>
+        <w:tc>
+          <w:tcPr>
+            <w:tcW w:type="dxa" w:w="2340"/>
+          </w:tcPr>
+          <w:p>
+            <w:r>
+              <w:rPr>
+                <w:rFonts w:ascii="Times New Roman" w:hAnsi="Times New Roman" w:eastAsia="Times New Roman"/>
+                <w:b w:val="0"/>
+                <w:sz w:val="24"/>
+              </w:rPr>
+              <w:t>09-admin-bookings.png</w:t>
+            </w:r>
+          </w:p>
+        </w:tc>
+      </w:tr>
+    </w:tbl>
+    <w:p/>
     <w:p>
       <w:pPr>
-        <w:pStyle w:val="ListBullet"/>
+        <w:spacing w:after="120" w:line="276" w:lineRule="auto"/>
       </w:pPr>
       <w:r>
         <w:rPr>
@@ -8986,12 +10885,52 @@
           <w:b w:val="0"/>
           <w:sz w:val="24"/>
         </w:rPr>
-        <w:t>2. Cars listing — grid with filters</w:t>
+        <w:t>Figure G.1 — Home page hero section with Browse Cars button</w:t>
       </w:r>
     </w:p>
     <w:p>
       <w:pPr>
-        <w:pStyle w:val="ListBullet"/>
+        <w:jc w:val="center"/>
+      </w:pPr>
+      <w:r>
+        <w:drawing>
+          <wp:inline xmlns:a="http://schemas.openxmlformats.org/drawingml/2006/main" xmlns:pic="http://schemas.openxmlformats.org/drawingml/2006/picture">
+            <wp:extent cx="5257800" cy="3286125"/>
+            <wp:docPr id="1" name="Picture 1"/>
+            <wp:cNvGraphicFramePr>
+              <a:graphicFrameLocks noChangeAspect="1"/>
+            </wp:cNvGraphicFramePr>
+            <a:graphic>
+              <a:graphicData uri="http://schemas.openxmlformats.org/drawingml/2006/picture">
+                <pic:pic>
+                  <pic:nvPicPr>
+                    <pic:cNvPr id="0" name="01-home.png"/>
+                    <pic:cNvPicPr/>
+                  </pic:nvPicPr>
+                  <pic:blipFill>
+                    <a:blip r:embed="rId9"/>
+                    <a:stretch>
+                      <a:fillRect/>
+                    </a:stretch>
+                  </pic:blipFill>
+                  <pic:spPr>
+                    <a:xfrm>
+                      <a:off x="0" y="0"/>
+                      <a:ext cx="5257800" cy="3286125"/>
+                    </a:xfrm>
+                    <a:prstGeom prst="rect"/>
+                  </pic:spPr>
+                </pic:pic>
+              </a:graphicData>
+            </a:graphic>
+          </wp:inline>
+        </w:drawing>
+      </w:r>
+    </w:p>
+    <w:p/>
+    <w:p>
+      <w:pPr>
+        <w:spacing w:after="120" w:line="276" w:lineRule="auto"/>
       </w:pPr>
       <w:r>
         <w:rPr>
@@ -8999,12 +10938,52 @@
           <w:b w:val="0"/>
           <w:sz w:val="24"/>
         </w:rPr>
-        <w:t>3. Car detail — gallery and Book Now button</w:t>
+        <w:t>Figure G.2 — Cars catalog with search and filters</w:t>
       </w:r>
     </w:p>
     <w:p>
       <w:pPr>
-        <w:pStyle w:val="ListBullet"/>
+        <w:jc w:val="center"/>
+      </w:pPr>
+      <w:r>
+        <w:drawing>
+          <wp:inline xmlns:a="http://schemas.openxmlformats.org/drawingml/2006/main" xmlns:pic="http://schemas.openxmlformats.org/drawingml/2006/picture">
+            <wp:extent cx="5257800" cy="10022681"/>
+            <wp:docPr id="2" name="Picture 2"/>
+            <wp:cNvGraphicFramePr>
+              <a:graphicFrameLocks noChangeAspect="1"/>
+            </wp:cNvGraphicFramePr>
+            <a:graphic>
+              <a:graphicData uri="http://schemas.openxmlformats.org/drawingml/2006/picture">
+                <pic:pic>
+                  <pic:nvPicPr>
+                    <pic:cNvPr id="0" name="02-cars-catalog.png"/>
+                    <pic:cNvPicPr/>
+                  </pic:nvPicPr>
+                  <pic:blipFill>
+                    <a:blip r:embed="rId10"/>
+                    <a:stretch>
+                      <a:fillRect/>
+                    </a:stretch>
+                  </pic:blipFill>
+                  <pic:spPr>
+                    <a:xfrm>
+                      <a:off x="0" y="0"/>
+                      <a:ext cx="5257800" cy="10022681"/>
+                    </a:xfrm>
+                    <a:prstGeom prst="rect"/>
+                  </pic:spPr>
+                </pic:pic>
+              </a:graphicData>
+            </a:graphic>
+          </wp:inline>
+        </w:drawing>
+      </w:r>
+    </w:p>
+    <w:p/>
+    <w:p>
+      <w:pPr>
+        <w:spacing w:after="120" w:line="276" w:lineRule="auto"/>
       </w:pPr>
       <w:r>
         <w:rPr>
@@ -9012,12 +10991,52 @@
           <w:b w:val="0"/>
           <w:sz w:val="24"/>
         </w:rPr>
-        <w:t>4. Login page — email and password form</w:t>
+        <w:t>Figure G.3 — Car detail with image gallery</w:t>
       </w:r>
     </w:p>
     <w:p>
       <w:pPr>
-        <w:pStyle w:val="ListBullet"/>
+        <w:jc w:val="center"/>
+      </w:pPr>
+      <w:r>
+        <w:drawing>
+          <wp:inline xmlns:a="http://schemas.openxmlformats.org/drawingml/2006/main" xmlns:pic="http://schemas.openxmlformats.org/drawingml/2006/picture">
+            <wp:extent cx="5257800" cy="3286125"/>
+            <wp:docPr id="3" name="Picture 3"/>
+            <wp:cNvGraphicFramePr>
+              <a:graphicFrameLocks noChangeAspect="1"/>
+            </wp:cNvGraphicFramePr>
+            <a:graphic>
+              <a:graphicData uri="http://schemas.openxmlformats.org/drawingml/2006/picture">
+                <pic:pic>
+                  <pic:nvPicPr>
+                    <pic:cNvPr id="0" name="03-car-detail.png"/>
+                    <pic:cNvPicPr/>
+                  </pic:nvPicPr>
+                  <pic:blipFill>
+                    <a:blip r:embed="rId11"/>
+                    <a:stretch>
+                      <a:fillRect/>
+                    </a:stretch>
+                  </pic:blipFill>
+                  <pic:spPr>
+                    <a:xfrm>
+                      <a:off x="0" y="0"/>
+                      <a:ext cx="5257800" cy="3286125"/>
+                    </a:xfrm>
+                    <a:prstGeom prst="rect"/>
+                  </pic:spPr>
+                </pic:pic>
+              </a:graphicData>
+            </a:graphic>
+          </wp:inline>
+        </w:drawing>
+      </w:r>
+    </w:p>
+    <w:p/>
+    <w:p>
+      <w:pPr>
+        <w:spacing w:after="120" w:line="276" w:lineRule="auto"/>
       </w:pPr>
       <w:r>
         <w:rPr>
@@ -9025,12 +11044,52 @@
           <w:b w:val="0"/>
           <w:sz w:val="24"/>
         </w:rPr>
-        <w:t>5. My Bookings — user booking table</w:t>
+        <w:t>Figure G.4 — Login page</w:t>
       </w:r>
     </w:p>
     <w:p>
       <w:pPr>
-        <w:pStyle w:val="ListBullet"/>
+        <w:jc w:val="center"/>
+      </w:pPr>
+      <w:r>
+        <w:drawing>
+          <wp:inline xmlns:a="http://schemas.openxmlformats.org/drawingml/2006/main" xmlns:pic="http://schemas.openxmlformats.org/drawingml/2006/picture">
+            <wp:extent cx="5257800" cy="3286125"/>
+            <wp:docPr id="4" name="Picture 4"/>
+            <wp:cNvGraphicFramePr>
+              <a:graphicFrameLocks noChangeAspect="1"/>
+            </wp:cNvGraphicFramePr>
+            <a:graphic>
+              <a:graphicData uri="http://schemas.openxmlformats.org/drawingml/2006/picture">
+                <pic:pic>
+                  <pic:nvPicPr>
+                    <pic:cNvPr id="0" name="04-login.png"/>
+                    <pic:cNvPicPr/>
+                  </pic:nvPicPr>
+                  <pic:blipFill>
+                    <a:blip r:embed="rId12"/>
+                    <a:stretch>
+                      <a:fillRect/>
+                    </a:stretch>
+                  </pic:blipFill>
+                  <pic:spPr>
+                    <a:xfrm>
+                      <a:off x="0" y="0"/>
+                      <a:ext cx="5257800" cy="3286125"/>
+                    </a:xfrm>
+                    <a:prstGeom prst="rect"/>
+                  </pic:spPr>
+                </pic:pic>
+              </a:graphicData>
+            </a:graphic>
+          </wp:inline>
+        </w:drawing>
+      </w:r>
+    </w:p>
+    <w:p/>
+    <w:p>
+      <w:pPr>
+        <w:spacing w:after="120" w:line="276" w:lineRule="auto"/>
       </w:pPr>
       <w:r>
         <w:rPr>
@@ -9038,12 +11097,52 @@
           <w:b w:val="0"/>
           <w:sz w:val="24"/>
         </w:rPr>
-        <w:t>6. Admin Dashboard — statistics cards</w:t>
+        <w:t>Figure G.5 — My Bookings table</w:t>
       </w:r>
     </w:p>
     <w:p>
       <w:pPr>
-        <w:pStyle w:val="ListBullet"/>
+        <w:jc w:val="center"/>
+      </w:pPr>
+      <w:r>
+        <w:drawing>
+          <wp:inline xmlns:a="http://schemas.openxmlformats.org/drawingml/2006/main" xmlns:pic="http://schemas.openxmlformats.org/drawingml/2006/picture">
+            <wp:extent cx="5257800" cy="3286125"/>
+            <wp:docPr id="5" name="Picture 5"/>
+            <wp:cNvGraphicFramePr>
+              <a:graphicFrameLocks noChangeAspect="1"/>
+            </wp:cNvGraphicFramePr>
+            <a:graphic>
+              <a:graphicData uri="http://schemas.openxmlformats.org/drawingml/2006/picture">
+                <pic:pic>
+                  <pic:nvPicPr>
+                    <pic:cNvPr id="0" name="05-my-bookings.png"/>
+                    <pic:cNvPicPr/>
+                  </pic:nvPicPr>
+                  <pic:blipFill>
+                    <a:blip r:embed="rId13"/>
+                    <a:stretch>
+                      <a:fillRect/>
+                    </a:stretch>
+                  </pic:blipFill>
+                  <pic:spPr>
+                    <a:xfrm>
+                      <a:off x="0" y="0"/>
+                      <a:ext cx="5257800" cy="3286125"/>
+                    </a:xfrm>
+                    <a:prstGeom prst="rect"/>
+                  </pic:spPr>
+                </pic:pic>
+              </a:graphicData>
+            </a:graphic>
+          </wp:inline>
+        </w:drawing>
+      </w:r>
+    </w:p>
+    <w:p/>
+    <w:p>
+      <w:pPr>
+        <w:spacing w:after="120" w:line="276" w:lineRule="auto"/>
       </w:pPr>
       <w:r>
         <w:rPr>
@@ -9051,12 +11150,52 @@
           <w:b w:val="0"/>
           <w:sz w:val="24"/>
         </w:rPr>
-        <w:t>7. Admin Cars — inventory table with create form</w:t>
+        <w:t>Figure G.6 — Booking form with date pickers</w:t>
       </w:r>
     </w:p>
     <w:p>
       <w:pPr>
-        <w:pStyle w:val="ListBullet"/>
+        <w:jc w:val="center"/>
+      </w:pPr>
+      <w:r>
+        <w:drawing>
+          <wp:inline xmlns:a="http://schemas.openxmlformats.org/drawingml/2006/main" xmlns:pic="http://schemas.openxmlformats.org/drawingml/2006/picture">
+            <wp:extent cx="5257800" cy="3286125"/>
+            <wp:docPr id="6" name="Picture 6"/>
+            <wp:cNvGraphicFramePr>
+              <a:graphicFrameLocks noChangeAspect="1"/>
+            </wp:cNvGraphicFramePr>
+            <a:graphic>
+              <a:graphicData uri="http://schemas.openxmlformats.org/drawingml/2006/picture">
+                <pic:pic>
+                  <pic:nvPicPr>
+                    <pic:cNvPr id="0" name="06-booking-form.png"/>
+                    <pic:cNvPicPr/>
+                  </pic:nvPicPr>
+                  <pic:blipFill>
+                    <a:blip r:embed="rId14"/>
+                    <a:stretch>
+                      <a:fillRect/>
+                    </a:stretch>
+                  </pic:blipFill>
+                  <pic:spPr>
+                    <a:xfrm>
+                      <a:off x="0" y="0"/>
+                      <a:ext cx="5257800" cy="3286125"/>
+                    </a:xfrm>
+                    <a:prstGeom prst="rect"/>
+                  </pic:spPr>
+                </pic:pic>
+              </a:graphicData>
+            </a:graphic>
+          </wp:inline>
+        </w:drawing>
+      </w:r>
+    </w:p>
+    <w:p/>
+    <w:p>
+      <w:pPr>
+        <w:spacing w:after="120" w:line="276" w:lineRule="auto"/>
       </w:pPr>
       <w:r>
         <w:rPr>
@@ -9064,12 +11203,52 @@
           <w:b w:val="0"/>
           <w:sz w:val="24"/>
         </w:rPr>
-        <w:t>8. Admin Bookings — status dropdown</w:t>
+        <w:t>Figure G.7 — Admin dashboard statistics</w:t>
       </w:r>
     </w:p>
     <w:p>
       <w:pPr>
-        <w:pStyle w:val="ListBullet"/>
+        <w:jc w:val="center"/>
+      </w:pPr>
+      <w:r>
+        <w:drawing>
+          <wp:inline xmlns:a="http://schemas.openxmlformats.org/drawingml/2006/main" xmlns:pic="http://schemas.openxmlformats.org/drawingml/2006/picture">
+            <wp:extent cx="5257800" cy="3639383"/>
+            <wp:docPr id="7" name="Picture 7"/>
+            <wp:cNvGraphicFramePr>
+              <a:graphicFrameLocks noChangeAspect="1"/>
+            </wp:cNvGraphicFramePr>
+            <a:graphic>
+              <a:graphicData uri="http://schemas.openxmlformats.org/drawingml/2006/picture">
+                <pic:pic>
+                  <pic:nvPicPr>
+                    <pic:cNvPr id="0" name="07-admin-dashboard.png"/>
+                    <pic:cNvPicPr/>
+                  </pic:nvPicPr>
+                  <pic:blipFill>
+                    <a:blip r:embed="rId15"/>
+                    <a:stretch>
+                      <a:fillRect/>
+                    </a:stretch>
+                  </pic:blipFill>
+                  <pic:spPr>
+                    <a:xfrm>
+                      <a:off x="0" y="0"/>
+                      <a:ext cx="5257800" cy="3639383"/>
+                    </a:xfrm>
+                    <a:prstGeom prst="rect"/>
+                  </pic:spPr>
+                </pic:pic>
+              </a:graphicData>
+            </a:graphic>
+          </wp:inline>
+        </w:drawing>
+      </w:r>
+    </w:p>
+    <w:p/>
+    <w:p>
+      <w:pPr>
+        <w:spacing w:after="120" w:line="276" w:lineRule="auto"/>
       </w:pPr>
       <w:r>
         <w:rPr>
@@ -9077,12 +11256,52 @@
           <w:b w:val="0"/>
           <w:sz w:val="24"/>
         </w:rPr>
-        <w:t>9. Vercel deployment — production URL</w:t>
+        <w:t>Figure G.8 — Admin cars management</w:t>
       </w:r>
     </w:p>
     <w:p>
       <w:pPr>
-        <w:pStyle w:val="ListBullet"/>
+        <w:jc w:val="center"/>
+      </w:pPr>
+      <w:r>
+        <w:drawing>
+          <wp:inline xmlns:a="http://schemas.openxmlformats.org/drawingml/2006/main" xmlns:pic="http://schemas.openxmlformats.org/drawingml/2006/picture">
+            <wp:extent cx="5257800" cy="4781312"/>
+            <wp:docPr id="8" name="Picture 8"/>
+            <wp:cNvGraphicFramePr>
+              <a:graphicFrameLocks noChangeAspect="1"/>
+            </wp:cNvGraphicFramePr>
+            <a:graphic>
+              <a:graphicData uri="http://schemas.openxmlformats.org/drawingml/2006/picture">
+                <pic:pic>
+                  <pic:nvPicPr>
+                    <pic:cNvPr id="0" name="08-admin-cars.png"/>
+                    <pic:cNvPicPr/>
+                  </pic:nvPicPr>
+                  <pic:blipFill>
+                    <a:blip r:embed="rId16"/>
+                    <a:stretch>
+                      <a:fillRect/>
+                    </a:stretch>
+                  </pic:blipFill>
+                  <pic:spPr>
+                    <a:xfrm>
+                      <a:off x="0" y="0"/>
+                      <a:ext cx="5257800" cy="4781312"/>
+                    </a:xfrm>
+                    <a:prstGeom prst="rect"/>
+                  </pic:spPr>
+                </pic:pic>
+              </a:graphicData>
+            </a:graphic>
+          </wp:inline>
+        </w:drawing>
+      </w:r>
+    </w:p>
+    <w:p/>
+    <w:p>
+      <w:pPr>
+        <w:spacing w:after="120" w:line="276" w:lineRule="auto"/>
       </w:pPr>
       <w:r>
         <w:rPr>
@@ -9090,7 +11309,60 @@
           <w:b w:val="0"/>
           <w:sz w:val="24"/>
         </w:rPr>
-        <w:t>10. Supabase dashboard — Table Editor showing cars</w:t>
+        <w:t>Figure G.9 — Admin bookings management</w:t>
+      </w:r>
+    </w:p>
+    <w:p>
+      <w:pPr>
+        <w:jc w:val="center"/>
+      </w:pPr>
+      <w:r>
+        <w:drawing>
+          <wp:inline xmlns:a="http://schemas.openxmlformats.org/drawingml/2006/main" xmlns:pic="http://schemas.openxmlformats.org/drawingml/2006/picture">
+            <wp:extent cx="5257800" cy="3639383"/>
+            <wp:docPr id="9" name="Picture 9"/>
+            <wp:cNvGraphicFramePr>
+              <a:graphicFrameLocks noChangeAspect="1"/>
+            </wp:cNvGraphicFramePr>
+            <a:graphic>
+              <a:graphicData uri="http://schemas.openxmlformats.org/drawingml/2006/picture">
+                <pic:pic>
+                  <pic:nvPicPr>
+                    <pic:cNvPr id="0" name="09-admin-bookings.png"/>
+                    <pic:cNvPicPr/>
+                  </pic:nvPicPr>
+                  <pic:blipFill>
+                    <a:blip r:embed="rId17"/>
+                    <a:stretch>
+                      <a:fillRect/>
+                    </a:stretch>
+                  </pic:blipFill>
+                  <pic:spPr>
+                    <a:xfrm>
+                      <a:off x="0" y="0"/>
+                      <a:ext cx="5257800" cy="3639383"/>
+                    </a:xfrm>
+                    <a:prstGeom prst="rect"/>
+                  </pic:spPr>
+                </pic:pic>
+              </a:graphicData>
+            </a:graphic>
+          </wp:inline>
+        </w:drawing>
+      </w:r>
+    </w:p>
+    <w:p/>
+    <w:p>
+      <w:pPr>
+        <w:spacing w:after="120" w:line="276" w:lineRule="auto"/>
+      </w:pPr>
+      <w:r>
+        <w:rPr>
+          <w:rFonts w:ascii="Times New Roman" w:hAnsi="Times New Roman" w:eastAsia="Times New Roman"/>
+          <w:b w:val="0"/>
+          <w:sz w:val="24"/>
+        </w:rPr>
+        <w:t>Figures G.10 (Supabase Table Editor) and G.11 (Vercel deployment) should be captured manually as 10-supabase-tables.png and 11-vercel-deploy.png.</w:t>
       </w:r>
     </w:p>
     <w:p>
@@ -9430,6 +11702,38 @@
                 <w:b w:val="0"/>
                 <w:sz w:val="24"/>
               </w:rPr>
+              <w:t>npm run screenshots:report</w:t>
+            </w:r>
+          </w:p>
+        </w:tc>
+        <w:tc>
+          <w:tcPr>
+            <w:tcW w:type="dxa" w:w="4680"/>
+          </w:tcPr>
+          <w:p>
+            <w:r>
+              <w:rPr>
+                <w:rFonts w:ascii="Times New Roman" w:hAnsi="Times New Roman" w:eastAsia="Times New Roman"/>
+                <w:b w:val="0"/>
+                <w:sz w:val="24"/>
+              </w:rPr>
+              <w:t>Capture UI screenshots for Appendix G</w:t>
+            </w:r>
+          </w:p>
+        </w:tc>
+      </w:tr>
+      <w:tr>
+        <w:tc>
+          <w:tcPr>
+            <w:tcW w:type="dxa" w:w="4680"/>
+          </w:tcPr>
+          <w:p>
+            <w:r>
+              <w:rPr>
+                <w:rFonts w:ascii="Times New Roman" w:hAnsi="Times New Roman" w:eastAsia="Times New Roman"/>
+                <w:b w:val="0"/>
+                <w:sz w:val="24"/>
+              </w:rPr>
               <w:t>npm run test:e2e</w:t>
             </w:r>
           </w:p>
@@ -9452,6 +11756,648 @@
       </w:tr>
     </w:tbl>
     <w:p/>
+    <w:p>
+      <w:pPr>
+        <w:spacing w:before="200" w:after="120"/>
+      </w:pPr>
+      <w:r>
+        <w:rPr>
+          <w:rFonts w:ascii="Times New Roman" w:hAnsi="Times New Roman" w:eastAsia="Times New Roman"/>
+          <w:b/>
+          <w:sz w:val="28"/>
+        </w:rPr>
+        <w:t>Appendix J — Source Code Listing</w:t>
+      </w:r>
+    </w:p>
+    <w:p>
+      <w:pPr>
+        <w:spacing w:after="120" w:line="276" w:lineRule="auto"/>
+      </w:pPr>
+      <w:r>
+        <w:rPr>
+          <w:rFonts w:ascii="Times New Roman" w:hAnsi="Times New Roman" w:eastAsia="Times New Roman"/>
+          <w:b w:val="0"/>
+          <w:sz w:val="24"/>
+        </w:rPr>
+        <w:t>Main source files for DriveEase. Full repository: https://github.com/ghariharanit/car-rental (branch main).</w:t>
+      </w:r>
+    </w:p>
+    <w:tbl>
+      <w:tblPr>
+        <w:tblStyle w:val="TableGrid"/>
+        <w:tblW w:type="auto" w:w="0"/>
+        <w:tblLook w:firstColumn="1" w:firstRow="1" w:lastColumn="0" w:lastRow="0" w:noHBand="0" w:noVBand="1" w:val="04A0"/>
+      </w:tblPr>
+      <w:tblGrid>
+        <w:gridCol w:w="3120"/>
+        <w:gridCol w:w="3120"/>
+        <w:gridCol w:w="3120"/>
+      </w:tblGrid>
+      <w:tr>
+        <w:tc>
+          <w:tcPr>
+            <w:tcW w:type="dxa" w:w="3120"/>
+          </w:tcPr>
+          <w:p>
+            <w:r>
+              <w:rPr>
+                <w:rFonts w:ascii="Times New Roman" w:hAnsi="Times New Roman" w:eastAsia="Times New Roman"/>
+                <w:b/>
+                <w:sz w:val="24"/>
+              </w:rPr>
+              <w:t>Layer</w:t>
+            </w:r>
+          </w:p>
+        </w:tc>
+        <w:tc>
+          <w:tcPr>
+            <w:tcW w:type="dxa" w:w="3120"/>
+          </w:tcPr>
+          <w:p>
+            <w:r>
+              <w:rPr>
+                <w:rFonts w:ascii="Times New Roman" w:hAnsi="Times New Roman" w:eastAsia="Times New Roman"/>
+                <w:b/>
+                <w:sz w:val="24"/>
+              </w:rPr>
+              <w:t>Path</w:t>
+            </w:r>
+          </w:p>
+        </w:tc>
+        <w:tc>
+          <w:tcPr>
+            <w:tcW w:type="dxa" w:w="3120"/>
+          </w:tcPr>
+          <w:p>
+            <w:r>
+              <w:rPr>
+                <w:rFonts w:ascii="Times New Roman" w:hAnsi="Times New Roman" w:eastAsia="Times New Roman"/>
+                <w:b/>
+                <w:sz w:val="24"/>
+              </w:rPr>
+              <w:t>Description</w:t>
+            </w:r>
+          </w:p>
+        </w:tc>
+      </w:tr>
+      <w:tr>
+        <w:tc>
+          <w:tcPr>
+            <w:tcW w:type="dxa" w:w="3120"/>
+          </w:tcPr>
+          <w:p>
+            <w:r>
+              <w:rPr>
+                <w:rFonts w:ascii="Times New Roman" w:hAnsi="Times New Roman" w:eastAsia="Times New Roman"/>
+                <w:b w:val="0"/>
+                <w:sz w:val="24"/>
+              </w:rPr>
+              <w:t>Routes</w:t>
+            </w:r>
+          </w:p>
+        </w:tc>
+        <w:tc>
+          <w:tcPr>
+            <w:tcW w:type="dxa" w:w="3120"/>
+          </w:tcPr>
+          <w:p>
+            <w:r>
+              <w:rPr>
+                <w:rFonts w:ascii="Times New Roman" w:hAnsi="Times New Roman" w:eastAsia="Times New Roman"/>
+                <w:b w:val="0"/>
+                <w:sz w:val="24"/>
+              </w:rPr>
+              <w:t>app/page.tsx</w:t>
+            </w:r>
+          </w:p>
+        </w:tc>
+        <w:tc>
+          <w:tcPr>
+            <w:tcW w:type="dxa" w:w="3120"/>
+          </w:tcPr>
+          <w:p>
+            <w:r>
+              <w:rPr>
+                <w:rFonts w:ascii="Times New Roman" w:hAnsi="Times New Roman" w:eastAsia="Times New Roman"/>
+                <w:b w:val="0"/>
+                <w:sz w:val="24"/>
+              </w:rPr>
+              <w:t>Home page</w:t>
+            </w:r>
+          </w:p>
+        </w:tc>
+      </w:tr>
+      <w:tr>
+        <w:tc>
+          <w:tcPr>
+            <w:tcW w:type="dxa" w:w="3120"/>
+          </w:tcPr>
+          <w:p>
+            <w:r>
+              <w:rPr>
+                <w:rFonts w:ascii="Times New Roman" w:hAnsi="Times New Roman" w:eastAsia="Times New Roman"/>
+                <w:b w:val="0"/>
+                <w:sz w:val="24"/>
+              </w:rPr>
+              <w:t>Routes</w:t>
+            </w:r>
+          </w:p>
+        </w:tc>
+        <w:tc>
+          <w:tcPr>
+            <w:tcW w:type="dxa" w:w="3120"/>
+          </w:tcPr>
+          <w:p>
+            <w:r>
+              <w:rPr>
+                <w:rFonts w:ascii="Times New Roman" w:hAnsi="Times New Roman" w:eastAsia="Times New Roman"/>
+                <w:b w:val="0"/>
+                <w:sz w:val="24"/>
+              </w:rPr>
+              <w:t>app/cars/</w:t>
+            </w:r>
+          </w:p>
+        </w:tc>
+        <w:tc>
+          <w:tcPr>
+            <w:tcW w:type="dxa" w:w="3120"/>
+          </w:tcPr>
+          <w:p>
+            <w:r>
+              <w:rPr>
+                <w:rFonts w:ascii="Times New Roman" w:hAnsi="Times New Roman" w:eastAsia="Times New Roman"/>
+                <w:b w:val="0"/>
+                <w:sz w:val="24"/>
+              </w:rPr>
+              <w:t>Catalog and car detail pages</w:t>
+            </w:r>
+          </w:p>
+        </w:tc>
+      </w:tr>
+      <w:tr>
+        <w:tc>
+          <w:tcPr>
+            <w:tcW w:type="dxa" w:w="3120"/>
+          </w:tcPr>
+          <w:p>
+            <w:r>
+              <w:rPr>
+                <w:rFonts w:ascii="Times New Roman" w:hAnsi="Times New Roman" w:eastAsia="Times New Roman"/>
+                <w:b w:val="0"/>
+                <w:sz w:val="24"/>
+              </w:rPr>
+              <w:t>Routes</w:t>
+            </w:r>
+          </w:p>
+        </w:tc>
+        <w:tc>
+          <w:tcPr>
+            <w:tcW w:type="dxa" w:w="3120"/>
+          </w:tcPr>
+          <w:p>
+            <w:r>
+              <w:rPr>
+                <w:rFonts w:ascii="Times New Roman" w:hAnsi="Times New Roman" w:eastAsia="Times New Roman"/>
+                <w:b w:val="0"/>
+                <w:sz w:val="24"/>
+              </w:rPr>
+              <w:t>app/admin/</w:t>
+            </w:r>
+          </w:p>
+        </w:tc>
+        <w:tc>
+          <w:tcPr>
+            <w:tcW w:type="dxa" w:w="3120"/>
+          </w:tcPr>
+          <w:p>
+            <w:r>
+              <w:rPr>
+                <w:rFonts w:ascii="Times New Roman" w:hAnsi="Times New Roman" w:eastAsia="Times New Roman"/>
+                <w:b w:val="0"/>
+                <w:sz w:val="24"/>
+              </w:rPr>
+              <w:t>Admin dashboard, cars, bookings</w:t>
+            </w:r>
+          </w:p>
+        </w:tc>
+      </w:tr>
+      <w:tr>
+        <w:tc>
+          <w:tcPr>
+            <w:tcW w:type="dxa" w:w="3120"/>
+          </w:tcPr>
+          <w:p>
+            <w:r>
+              <w:rPr>
+                <w:rFonts w:ascii="Times New Roman" w:hAnsi="Times New Roman" w:eastAsia="Times New Roman"/>
+                <w:b w:val="0"/>
+                <w:sz w:val="24"/>
+              </w:rPr>
+              <w:t>Server Actions</w:t>
+            </w:r>
+          </w:p>
+        </w:tc>
+        <w:tc>
+          <w:tcPr>
+            <w:tcW w:type="dxa" w:w="3120"/>
+          </w:tcPr>
+          <w:p>
+            <w:r>
+              <w:rPr>
+                <w:rFonts w:ascii="Times New Roman" w:hAnsi="Times New Roman" w:eastAsia="Times New Roman"/>
+                <w:b w:val="0"/>
+                <w:sz w:val="24"/>
+              </w:rPr>
+              <w:t>app/actions/</w:t>
+            </w:r>
+          </w:p>
+        </w:tc>
+        <w:tc>
+          <w:tcPr>
+            <w:tcW w:type="dxa" w:w="3120"/>
+          </w:tcPr>
+          <w:p>
+            <w:r>
+              <w:rPr>
+                <w:rFonts w:ascii="Times New Roman" w:hAnsi="Times New Roman" w:eastAsia="Times New Roman"/>
+                <w:b w:val="0"/>
+                <w:sz w:val="24"/>
+              </w:rPr>
+              <w:t>Auth, booking, admin mutations</w:t>
+            </w:r>
+          </w:p>
+        </w:tc>
+      </w:tr>
+      <w:tr>
+        <w:tc>
+          <w:tcPr>
+            <w:tcW w:type="dxa" w:w="3120"/>
+          </w:tcPr>
+          <w:p>
+            <w:r>
+              <w:rPr>
+                <w:rFonts w:ascii="Times New Roman" w:hAnsi="Times New Roman" w:eastAsia="Times New Roman"/>
+                <w:b w:val="0"/>
+                <w:sz w:val="24"/>
+              </w:rPr>
+              <w:t>Middleware</w:t>
+            </w:r>
+          </w:p>
+        </w:tc>
+        <w:tc>
+          <w:tcPr>
+            <w:tcW w:type="dxa" w:w="3120"/>
+          </w:tcPr>
+          <w:p>
+            <w:r>
+              <w:rPr>
+                <w:rFonts w:ascii="Times New Roman" w:hAnsi="Times New Roman" w:eastAsia="Times New Roman"/>
+                <w:b w:val="0"/>
+                <w:sz w:val="24"/>
+              </w:rPr>
+              <w:t>middleware.ts</w:t>
+            </w:r>
+          </w:p>
+        </w:tc>
+        <w:tc>
+          <w:tcPr>
+            <w:tcW w:type="dxa" w:w="3120"/>
+          </w:tcPr>
+          <w:p>
+            <w:r>
+              <w:rPr>
+                <w:rFonts w:ascii="Times New Roman" w:hAnsi="Times New Roman" w:eastAsia="Times New Roman"/>
+                <w:b w:val="0"/>
+                <w:sz w:val="24"/>
+              </w:rPr>
+              <w:t>Session refresh and route guards</w:t>
+            </w:r>
+          </w:p>
+        </w:tc>
+      </w:tr>
+      <w:tr>
+        <w:tc>
+          <w:tcPr>
+            <w:tcW w:type="dxa" w:w="3120"/>
+          </w:tcPr>
+          <w:p>
+            <w:r>
+              <w:rPr>
+                <w:rFonts w:ascii="Times New Roman" w:hAnsi="Times New Roman" w:eastAsia="Times New Roman"/>
+                <w:b w:val="0"/>
+                <w:sz w:val="24"/>
+              </w:rPr>
+              <w:t>Supabase</w:t>
+            </w:r>
+          </w:p>
+        </w:tc>
+        <w:tc>
+          <w:tcPr>
+            <w:tcW w:type="dxa" w:w="3120"/>
+          </w:tcPr>
+          <w:p>
+            <w:r>
+              <w:rPr>
+                <w:rFonts w:ascii="Times New Roman" w:hAnsi="Times New Roman" w:eastAsia="Times New Roman"/>
+                <w:b w:val="0"/>
+                <w:sz w:val="24"/>
+              </w:rPr>
+              <w:t>lib/supabase/</w:t>
+            </w:r>
+          </w:p>
+        </w:tc>
+        <w:tc>
+          <w:tcPr>
+            <w:tcW w:type="dxa" w:w="3120"/>
+          </w:tcPr>
+          <w:p>
+            <w:r>
+              <w:rPr>
+                <w:rFonts w:ascii="Times New Roman" w:hAnsi="Times New Roman" w:eastAsia="Times New Roman"/>
+                <w:b w:val="0"/>
+                <w:sz w:val="24"/>
+              </w:rPr>
+              <w:t>Server, middleware, admin clients</w:t>
+            </w:r>
+          </w:p>
+        </w:tc>
+      </w:tr>
+      <w:tr>
+        <w:tc>
+          <w:tcPr>
+            <w:tcW w:type="dxa" w:w="3120"/>
+          </w:tcPr>
+          <w:p>
+            <w:r>
+              <w:rPr>
+                <w:rFonts w:ascii="Times New Roman" w:hAnsi="Times New Roman" w:eastAsia="Times New Roman"/>
+                <w:b w:val="0"/>
+                <w:sz w:val="24"/>
+              </w:rPr>
+              <w:t>Data</w:t>
+            </w:r>
+          </w:p>
+        </w:tc>
+        <w:tc>
+          <w:tcPr>
+            <w:tcW w:type="dxa" w:w="3120"/>
+          </w:tcPr>
+          <w:p>
+            <w:r>
+              <w:rPr>
+                <w:rFonts w:ascii="Times New Roman" w:hAnsi="Times New Roman" w:eastAsia="Times New Roman"/>
+                <w:b w:val="0"/>
+                <w:sz w:val="24"/>
+              </w:rPr>
+              <w:t>lib/data.ts, lib/bookings.ts</w:t>
+            </w:r>
+          </w:p>
+        </w:tc>
+        <w:tc>
+          <w:tcPr>
+            <w:tcW w:type="dxa" w:w="3120"/>
+          </w:tcPr>
+          <w:p>
+            <w:r>
+              <w:rPr>
+                <w:rFonts w:ascii="Times New Roman" w:hAnsi="Times New Roman" w:eastAsia="Times New Roman"/>
+                <w:b w:val="0"/>
+                <w:sz w:val="24"/>
+              </w:rPr>
+              <w:t>Supabase read/write helpers</w:t>
+            </w:r>
+          </w:p>
+        </w:tc>
+      </w:tr>
+      <w:tr>
+        <w:tc>
+          <w:tcPr>
+            <w:tcW w:type="dxa" w:w="3120"/>
+          </w:tcPr>
+          <w:p>
+            <w:r>
+              <w:rPr>
+                <w:rFonts w:ascii="Times New Roman" w:hAnsi="Times New Roman" w:eastAsia="Times New Roman"/>
+                <w:b w:val="0"/>
+                <w:sz w:val="24"/>
+              </w:rPr>
+              <w:t>Database</w:t>
+            </w:r>
+          </w:p>
+        </w:tc>
+        <w:tc>
+          <w:tcPr>
+            <w:tcW w:type="dxa" w:w="3120"/>
+          </w:tcPr>
+          <w:p>
+            <w:r>
+              <w:rPr>
+                <w:rFonts w:ascii="Times New Roman" w:hAnsi="Times New Roman" w:eastAsia="Times New Roman"/>
+                <w:b w:val="0"/>
+                <w:sz w:val="24"/>
+              </w:rPr>
+              <w:t>supabase/migrations/</w:t>
+            </w:r>
+          </w:p>
+        </w:tc>
+        <w:tc>
+          <w:tcPr>
+            <w:tcW w:type="dxa" w:w="3120"/>
+          </w:tcPr>
+          <w:p>
+            <w:r>
+              <w:rPr>
+                <w:rFonts w:ascii="Times New Roman" w:hAnsi="Times New Roman" w:eastAsia="Times New Roman"/>
+                <w:b w:val="0"/>
+                <w:sz w:val="24"/>
+              </w:rPr>
+              <w:t>Schema and RLS SQL</w:t>
+            </w:r>
+          </w:p>
+        </w:tc>
+      </w:tr>
+      <w:tr>
+        <w:tc>
+          <w:tcPr>
+            <w:tcW w:type="dxa" w:w="3120"/>
+          </w:tcPr>
+          <w:p>
+            <w:r>
+              <w:rPr>
+                <w:rFonts w:ascii="Times New Roman" w:hAnsi="Times New Roman" w:eastAsia="Times New Roman"/>
+                <w:b w:val="0"/>
+                <w:sz w:val="24"/>
+              </w:rPr>
+              <w:t>Seed</w:t>
+            </w:r>
+          </w:p>
+        </w:tc>
+        <w:tc>
+          <w:tcPr>
+            <w:tcW w:type="dxa" w:w="3120"/>
+          </w:tcPr>
+          <w:p>
+            <w:r>
+              <w:rPr>
+                <w:rFonts w:ascii="Times New Roman" w:hAnsi="Times New Roman" w:eastAsia="Times New Roman"/>
+                <w:b w:val="0"/>
+                <w:sz w:val="24"/>
+              </w:rPr>
+              <w:t>scripts/seed-supabase.ts</w:t>
+            </w:r>
+          </w:p>
+        </w:tc>
+        <w:tc>
+          <w:tcPr>
+            <w:tcW w:type="dxa" w:w="3120"/>
+          </w:tcPr>
+          <w:p>
+            <w:r>
+              <w:rPr>
+                <w:rFonts w:ascii="Times New Roman" w:hAnsi="Times New Roman" w:eastAsia="Times New Roman"/>
+                <w:b w:val="0"/>
+                <w:sz w:val="24"/>
+              </w:rPr>
+              <w:t>Demo users, cars, bookings</w:t>
+            </w:r>
+          </w:p>
+        </w:tc>
+      </w:tr>
+      <w:tr>
+        <w:tc>
+          <w:tcPr>
+            <w:tcW w:type="dxa" w:w="3120"/>
+          </w:tcPr>
+          <w:p>
+            <w:r>
+              <w:rPr>
+                <w:rFonts w:ascii="Times New Roman" w:hAnsi="Times New Roman" w:eastAsia="Times New Roman"/>
+                <w:b w:val="0"/>
+                <w:sz w:val="24"/>
+              </w:rPr>
+              <w:t>Tests</w:t>
+            </w:r>
+          </w:p>
+        </w:tc>
+        <w:tc>
+          <w:tcPr>
+            <w:tcW w:type="dxa" w:w="3120"/>
+          </w:tcPr>
+          <w:p>
+            <w:r>
+              <w:rPr>
+                <w:rFonts w:ascii="Times New Roman" w:hAnsi="Times New Roman" w:eastAsia="Times New Roman"/>
+                <w:b w:val="0"/>
+                <w:sz w:val="24"/>
+              </w:rPr>
+              <w:t>e2e/, lib/*.test.ts</w:t>
+            </w:r>
+          </w:p>
+        </w:tc>
+        <w:tc>
+          <w:tcPr>
+            <w:tcW w:type="dxa" w:w="3120"/>
+          </w:tcPr>
+          <w:p>
+            <w:r>
+              <w:rPr>
+                <w:rFonts w:ascii="Times New Roman" w:hAnsi="Times New Roman" w:eastAsia="Times New Roman"/>
+                <w:b w:val="0"/>
+                <w:sz w:val="24"/>
+              </w:rPr>
+              <w:t>Playwright and Vitest tests</w:t>
+            </w:r>
+          </w:p>
+        </w:tc>
+      </w:tr>
+      <w:tr>
+        <w:tc>
+          <w:tcPr>
+            <w:tcW w:type="dxa" w:w="3120"/>
+          </w:tcPr>
+          <w:p>
+            <w:r>
+              <w:rPr>
+                <w:rFonts w:ascii="Times New Roman" w:hAnsi="Times New Roman" w:eastAsia="Times New Roman"/>
+                <w:b w:val="0"/>
+                <w:sz w:val="24"/>
+              </w:rPr>
+              <w:t>Docs</w:t>
+            </w:r>
+          </w:p>
+        </w:tc>
+        <w:tc>
+          <w:tcPr>
+            <w:tcW w:type="dxa" w:w="3120"/>
+          </w:tcPr>
+          <w:p>
+            <w:r>
+              <w:rPr>
+                <w:rFonts w:ascii="Times New Roman" w:hAnsi="Times New Roman" w:eastAsia="Times New Roman"/>
+                <w:b w:val="0"/>
+                <w:sz w:val="24"/>
+              </w:rPr>
+              <w:t>docs/, scripts/generate-project-doc.py</w:t>
+            </w:r>
+          </w:p>
+        </w:tc>
+        <w:tc>
+          <w:tcPr>
+            <w:tcW w:type="dxa" w:w="3120"/>
+          </w:tcPr>
+          <w:p>
+            <w:r>
+              <w:rPr>
+                <w:rFonts w:ascii="Times New Roman" w:hAnsi="Times New Roman" w:eastAsia="Times New Roman"/>
+                <w:b w:val="0"/>
+                <w:sz w:val="24"/>
+              </w:rPr>
+              <w:t>Report and generator</w:t>
+            </w:r>
+          </w:p>
+        </w:tc>
+      </w:tr>
+    </w:tbl>
+    <w:p/>
+    <w:p>
+      <w:pPr>
+        <w:spacing w:after="120" w:line="276" w:lineRule="auto"/>
+      </w:pPr>
+      <w:r>
+        <w:rPr>
+          <w:rFonts w:ascii="Times New Roman" w:hAnsi="Times New Roman" w:eastAsia="Times New Roman"/>
+          <w:b w:val="0"/>
+          <w:sz w:val="24"/>
+        </w:rPr>
+        <w:t>Representative excerpt — middleware.ts:</w:t>
+      </w:r>
+    </w:p>
+    <w:p>
+      <w:pPr>
+        <w:spacing w:after="120" w:line="276" w:lineRule="auto"/>
+      </w:pPr>
+      <w:r>
+        <w:rPr>
+          <w:rFonts w:ascii="Times New Roman" w:hAnsi="Times New Roman" w:eastAsia="Times New Roman"/>
+          <w:b w:val="0"/>
+          <w:sz w:val="24"/>
+        </w:rPr>
+        <w:t>export async function middleware(request) { return await updateSession(request); }</w:t>
+      </w:r>
+    </w:p>
+    <w:p>
+      <w:pPr>
+        <w:spacing w:after="120" w:line="276" w:lineRule="auto"/>
+      </w:pPr>
+      <w:r>
+        <w:rPr>
+          <w:rFonts w:ascii="Times New Roman" w:hAnsi="Times New Roman" w:eastAsia="Times New Roman"/>
+          <w:b w:val="0"/>
+          <w:sz w:val="24"/>
+        </w:rPr>
+        <w:t>Representative excerpt — createBookingAction validates session before Supabase insert.</w:t>
+      </w:r>
+    </w:p>
     <w:p>
       <w:r>
         <w:br w:type="page"/>

</xml_diff>

<commit_message>
docs: add source code appendix and remove repo sections from report
Embed ~20 pages of implementation source in Appendix G before screenshots; remove repository listing sections from the Word and Markdown reports.

Co-authored-by: Cursor <cursoragent@cursor.com>
</commit_message>
<xml_diff>
--- a/docs/driveease-project-report.docx
+++ b/docs/driveease-project-report.docx
@@ -1284,7 +1284,7 @@
                 <w:b w:val="0"/>
                 <w:sz w:val="24"/>
               </w:rPr>
-              <w:t>11.7</w:t>
+              <w:t>12</w:t>
             </w:r>
           </w:p>
         </w:tc>
@@ -1299,7 +1299,7 @@
                 <w:b w:val="0"/>
                 <w:sz w:val="24"/>
               </w:rPr>
-              <w:t>Source Code Repository</w:t>
+              <w:t>Conclusion and Future Enhancement</w:t>
             </w:r>
           </w:p>
         </w:tc>
@@ -1330,7 +1330,7 @@
                 <w:b w:val="0"/>
                 <w:sz w:val="24"/>
               </w:rPr>
-              <w:t>12</w:t>
+              <w:t>13</w:t>
             </w:r>
           </w:p>
         </w:tc>
@@ -1345,7 +1345,7 @@
                 <w:b w:val="0"/>
                 <w:sz w:val="24"/>
               </w:rPr>
-              <w:t>Conclusion and Future Enhancement</w:t>
+              <w:t>Appendix</w:t>
             </w:r>
           </w:p>
         </w:tc>
@@ -1376,7 +1376,7 @@
                 <w:b w:val="0"/>
                 <w:sz w:val="24"/>
               </w:rPr>
-              <w:t>13</w:t>
+              <w:t>13.1</w:t>
             </w:r>
           </w:p>
         </w:tc>
@@ -1391,7 +1391,7 @@
                 <w:b w:val="0"/>
                 <w:sz w:val="24"/>
               </w:rPr>
-              <w:t>Appendix</w:t>
+              <w:t>Appendix G — Source Code</w:t>
             </w:r>
           </w:p>
         </w:tc>
@@ -1422,7 +1422,7 @@
                 <w:b w:val="0"/>
                 <w:sz w:val="24"/>
               </w:rPr>
-              <w:t>13.1</w:t>
+              <w:t>13.2</w:t>
             </w:r>
           </w:p>
         </w:tc>
@@ -1437,53 +1437,7 @@
                 <w:b w:val="0"/>
                 <w:sz w:val="24"/>
               </w:rPr>
-              <w:t>Appendix G — Application Screenshots</w:t>
-            </w:r>
-          </w:p>
-        </w:tc>
-        <w:tc>
-          <w:tcPr>
-            <w:tcW w:type="dxa" w:w="3120"/>
-          </w:tcPr>
-          <w:p>
-            <w:r>
-              <w:rPr>
-                <w:rFonts w:ascii="Times New Roman" w:hAnsi="Times New Roman" w:eastAsia="Times New Roman"/>
-                <w:b w:val="0"/>
-                <w:sz w:val="24"/>
-              </w:rPr>
-            </w:r>
-          </w:p>
-        </w:tc>
-      </w:tr>
-      <w:tr>
-        <w:tc>
-          <w:tcPr>
-            <w:tcW w:type="dxa" w:w="3120"/>
-          </w:tcPr>
-          <w:p>
-            <w:r>
-              <w:rPr>
-                <w:rFonts w:ascii="Times New Roman" w:hAnsi="Times New Roman" w:eastAsia="Times New Roman"/>
-                <w:b w:val="0"/>
-                <w:sz w:val="24"/>
-              </w:rPr>
-              <w:t>13.2</w:t>
-            </w:r>
-          </w:p>
-        </w:tc>
-        <w:tc>
-          <w:tcPr>
-            <w:tcW w:type="dxa" w:w="3120"/>
-          </w:tcPr>
-          <w:p>
-            <w:r>
-              <w:rPr>
-                <w:rFonts w:ascii="Times New Roman" w:hAnsi="Times New Roman" w:eastAsia="Times New Roman"/>
-                <w:b w:val="0"/>
-                <w:sz w:val="24"/>
-              </w:rPr>
-              <w:t>Appendix J — Source Code Listing</w:t>
+              <w:t>Appendix H — Application Screenshots</w:t>
             </w:r>
           </w:p>
         </w:tc>
@@ -8385,268 +8339,6 @@
           <w:sz w:val="24"/>
         </w:rPr>
         <w:t>DriveEase ensures the browser does not expose Supabase API traffic. All database queries and authentication API calls execute on the Next.js server. The browser Network tab shows requests only to the application domain. Session cookies are HTTP-only. External requests are primarily Unsplash image URLs for car photos.</w:t>
-      </w:r>
-    </w:p>
-    <w:p>
-      <w:pPr>
-        <w:spacing w:before="200" w:after="120"/>
-      </w:pPr>
-      <w:r>
-        <w:rPr>
-          <w:rFonts w:ascii="Times New Roman" w:hAnsi="Times New Roman" w:eastAsia="Times New Roman"/>
-          <w:b/>
-          <w:sz w:val="28"/>
-        </w:rPr>
-        <w:t>11.7 Source Code Repository</w:t>
-      </w:r>
-    </w:p>
-    <w:tbl>
-      <w:tblPr>
-        <w:tblStyle w:val="TableGrid"/>
-        <w:tblW w:type="auto" w:w="0"/>
-        <w:tblLook w:firstColumn="1" w:firstRow="1" w:lastColumn="0" w:lastRow="0" w:noHBand="0" w:noVBand="1" w:val="04A0"/>
-      </w:tblPr>
-      <w:tblGrid>
-        <w:gridCol w:w="4680"/>
-        <w:gridCol w:w="4680"/>
-      </w:tblGrid>
-      <w:tr>
-        <w:tc>
-          <w:tcPr>
-            <w:tcW w:type="dxa" w:w="4680"/>
-          </w:tcPr>
-          <w:p>
-            <w:r>
-              <w:rPr>
-                <w:rFonts w:ascii="Times New Roman" w:hAnsi="Times New Roman" w:eastAsia="Times New Roman"/>
-                <w:b/>
-                <w:sz w:val="24"/>
-              </w:rPr>
-              <w:t>Item</w:t>
-            </w:r>
-          </w:p>
-        </w:tc>
-        <w:tc>
-          <w:tcPr>
-            <w:tcW w:type="dxa" w:w="4680"/>
-          </w:tcPr>
-          <w:p>
-            <w:r>
-              <w:rPr>
-                <w:rFonts w:ascii="Times New Roman" w:hAnsi="Times New Roman" w:eastAsia="Times New Roman"/>
-                <w:b/>
-                <w:sz w:val="24"/>
-              </w:rPr>
-              <w:t>Location</w:t>
-            </w:r>
-          </w:p>
-        </w:tc>
-      </w:tr>
-      <w:tr>
-        <w:tc>
-          <w:tcPr>
-            <w:tcW w:type="dxa" w:w="4680"/>
-          </w:tcPr>
-          <w:p>
-            <w:r>
-              <w:rPr>
-                <w:rFonts w:ascii="Times New Roman" w:hAnsi="Times New Roman" w:eastAsia="Times New Roman"/>
-                <w:b w:val="0"/>
-                <w:sz w:val="24"/>
-              </w:rPr>
-              <w:t>Primary repository</w:t>
-            </w:r>
-          </w:p>
-        </w:tc>
-        <w:tc>
-          <w:tcPr>
-            <w:tcW w:type="dxa" w:w="4680"/>
-          </w:tcPr>
-          <w:p>
-            <w:r>
-              <w:rPr>
-                <w:rFonts w:ascii="Times New Roman" w:hAnsi="Times New Roman" w:eastAsia="Times New Roman"/>
-                <w:b w:val="0"/>
-                <w:sz w:val="24"/>
-              </w:rPr>
-              <w:t>https://github.com/ghariharanit/car-rental</w:t>
-            </w:r>
-          </w:p>
-        </w:tc>
-      </w:tr>
-      <w:tr>
-        <w:tc>
-          <w:tcPr>
-            <w:tcW w:type="dxa" w:w="4680"/>
-          </w:tcPr>
-          <w:p>
-            <w:r>
-              <w:rPr>
-                <w:rFonts w:ascii="Times New Roman" w:hAnsi="Times New Roman" w:eastAsia="Times New Roman"/>
-                <w:b w:val="0"/>
-                <w:sz w:val="24"/>
-              </w:rPr>
-              <w:t>Main branch</w:t>
-            </w:r>
-          </w:p>
-        </w:tc>
-        <w:tc>
-          <w:tcPr>
-            <w:tcW w:type="dxa" w:w="4680"/>
-          </w:tcPr>
-          <w:p>
-            <w:r>
-              <w:rPr>
-                <w:rFonts w:ascii="Times New Roman" w:hAnsi="Times New Roman" w:eastAsia="Times New Roman"/>
-                <w:b w:val="0"/>
-                <w:sz w:val="24"/>
-              </w:rPr>
-              <w:t>main — Supabase-backed application and documentation</w:t>
-            </w:r>
-          </w:p>
-        </w:tc>
-      </w:tr>
-      <w:tr>
-        <w:tc>
-          <w:tcPr>
-            <w:tcW w:type="dxa" w:w="4680"/>
-          </w:tcPr>
-          <w:p>
-            <w:r>
-              <w:rPr>
-                <w:rFonts w:ascii="Times New Roman" w:hAnsi="Times New Roman" w:eastAsia="Times New Roman"/>
-                <w:b w:val="0"/>
-                <w:sz w:val="24"/>
-              </w:rPr>
-              <w:t>Collaboration branch</w:t>
-            </w:r>
-          </w:p>
-        </w:tc>
-        <w:tc>
-          <w:tcPr>
-            <w:tcW w:type="dxa" w:w="4680"/>
-          </w:tcPr>
-          <w:p>
-            <w:r>
-              <w:rPr>
-                <w:rFonts w:ascii="Times New Roman" w:hAnsi="Times New Roman" w:eastAsia="Times New Roman"/>
-                <w:b w:val="0"/>
-                <w:sz w:val="24"/>
-              </w:rPr>
-              <w:t>https://github.com/sabareesh0609/car-rental/tree/backend-integration</w:t>
-            </w:r>
-          </w:p>
-        </w:tc>
-      </w:tr>
-      <w:tr>
-        <w:tc>
-          <w:tcPr>
-            <w:tcW w:type="dxa" w:w="4680"/>
-          </w:tcPr>
-          <w:p>
-            <w:r>
-              <w:rPr>
-                <w:rFonts w:ascii="Times New Roman" w:hAnsi="Times New Roman" w:eastAsia="Times New Roman"/>
-                <w:b w:val="0"/>
-                <w:sz w:val="24"/>
-              </w:rPr>
-              <w:t>Documentation</w:t>
-            </w:r>
-          </w:p>
-        </w:tc>
-        <w:tc>
-          <w:tcPr>
-            <w:tcW w:type="dxa" w:w="4680"/>
-          </w:tcPr>
-          <w:p>
-            <w:r>
-              <w:rPr>
-                <w:rFonts w:ascii="Times New Roman" w:hAnsi="Times New Roman" w:eastAsia="Times New Roman"/>
-                <w:b w:val="0"/>
-                <w:sz w:val="24"/>
-              </w:rPr>
-              <w:t>docs/driveease-project-report.md, .docx</w:t>
-            </w:r>
-          </w:p>
-        </w:tc>
-      </w:tr>
-      <w:tr>
-        <w:tc>
-          <w:tcPr>
-            <w:tcW w:type="dxa" w:w="4680"/>
-          </w:tcPr>
-          <w:p>
-            <w:r>
-              <w:rPr>
-                <w:rFonts w:ascii="Times New Roman" w:hAnsi="Times New Roman" w:eastAsia="Times New Roman"/>
-                <w:b w:val="0"/>
-                <w:sz w:val="24"/>
-              </w:rPr>
-              <w:t>Database setup</w:t>
-            </w:r>
-          </w:p>
-        </w:tc>
-        <w:tc>
-          <w:tcPr>
-            <w:tcW w:type="dxa" w:w="4680"/>
-          </w:tcPr>
-          <w:p>
-            <w:r>
-              <w:rPr>
-                <w:rFonts w:ascii="Times New Roman" w:hAnsi="Times New Roman" w:eastAsia="Times New Roman"/>
-                <w:b w:val="0"/>
-                <w:sz w:val="24"/>
-              </w:rPr>
-              <w:t>supabase/migrations/</w:t>
-            </w:r>
-          </w:p>
-        </w:tc>
-      </w:tr>
-      <w:tr>
-        <w:tc>
-          <w:tcPr>
-            <w:tcW w:type="dxa" w:w="4680"/>
-          </w:tcPr>
-          <w:p>
-            <w:r>
-              <w:rPr>
-                <w:rFonts w:ascii="Times New Roman" w:hAnsi="Times New Roman" w:eastAsia="Times New Roman"/>
-                <w:b w:val="0"/>
-                <w:sz w:val="24"/>
-              </w:rPr>
-              <w:t>Screenshots</w:t>
-            </w:r>
-          </w:p>
-        </w:tc>
-        <w:tc>
-          <w:tcPr>
-            <w:tcW w:type="dxa" w:w="4680"/>
-          </w:tcPr>
-          <w:p>
-            <w:r>
-              <w:rPr>
-                <w:rFonts w:ascii="Times New Roman" w:hAnsi="Times New Roman" w:eastAsia="Times New Roman"/>
-                <w:b w:val="0"/>
-                <w:sz w:val="24"/>
-              </w:rPr>
-              <w:t>docs/screenshots/ (Appendix G)</w:t>
-            </w:r>
-          </w:p>
-        </w:tc>
-      </w:tr>
-    </w:tbl>
-    <w:p/>
-    <w:p>
-      <w:pPr>
-        <w:spacing w:after="120" w:line="276" w:lineRule="auto"/>
-      </w:pPr>
-      <w:r>
-        <w:rPr>
-          <w:rFonts w:ascii="Times New Roman" w:hAnsi="Times New Roman" w:eastAsia="Times New Roman"/>
-          <w:b w:val="0"/>
-          <w:sz w:val="24"/>
-        </w:rPr>
-        <w:t>Clone with git clone, configure .env.local from .env.local.example, apply SQL migrations, run npm run seed, then npm run dev. Refresh report screenshots with npm run screenshots:report while the dev server is running.</w:t>
       </w:r>
     </w:p>
     <w:p>
@@ -10225,7 +9917,2536 @@
           <w:b/>
           <w:sz w:val="28"/>
         </w:rPr>
-        <w:t>Appendix G — Application Screenshots</w:t>
+        <w:t>Appendix G — Source Code</w:t>
+      </w:r>
+    </w:p>
+    <w:p>
+      <w:pPr>
+        <w:spacing w:after="120" w:line="276" w:lineRule="auto"/>
+      </w:pPr>
+      <w:r>
+        <w:rPr>
+          <w:rFonts w:ascii="Times New Roman" w:hAnsi="Times New Roman" w:eastAsia="Times New Roman"/>
+          <w:b w:val="0"/>
+          <w:sz w:val="24"/>
+        </w:rPr>
+        <w:t>The following listings contain the principal source files used to implement DriveEase. Code is reproduced from the project repository at small font size for reference (approximately 20 pages).</w:t>
+      </w:r>
+    </w:p>
+    <w:p>
+      <w:pPr>
+        <w:spacing w:before="160" w:after="40"/>
+      </w:pPr>
+      <w:r>
+        <w:rPr>
+          <w:rFonts w:ascii="Times New Roman" w:hAnsi="Times New Roman" w:eastAsia="Times New Roman"/>
+          <w:b/>
+          <w:sz w:val="18"/>
+        </w:rPr>
+        <w:t>middleware.ts</w:t>
+      </w:r>
+    </w:p>
+    <w:p>
+      <w:pPr>
+        <w:spacing w:after="120" w:line="276" w:lineRule="auto"/>
+      </w:pPr>
+      <w:r>
+        <w:rPr>
+          <w:rFonts w:ascii="Times New Roman" w:hAnsi="Times New Roman" w:eastAsia="Times New Roman"/>
+          <w:b w:val="0"/>
+          <w:sz w:val="24"/>
+        </w:rPr>
+        <w:t>Application middleware — session refresh and route guards</w:t>
+      </w:r>
+    </w:p>
+    <w:p>
+      <w:pPr>
+        <w:spacing w:line="240" w:lineRule="auto" w:after="120"/>
+        <w:ind w:left="0"/>
+      </w:pPr>
+      <w:r>
+        <w:rPr>
+          <w:rFonts w:ascii="Courier New" w:hAnsi="Courier New" w:eastAsia="Courier New"/>
+          <w:sz w:val="14"/>
+        </w:rPr>
+        <w:t>import { NextResponse, type NextRequest } from "next/server";</w:t>
+        <w:br/>
+        <w:t>import { updateSession } from "@/lib/supabase/middleware";</w:t>
+        <w:br/>
+        <w:br/>
+        <w:t>function isCarBookPath(pathname: string): boolean {</w:t>
+        <w:br/>
+        <w:t xml:space="preserve">  return /^\/cars\/[^/]+\/book$/.test(pathname);</w:t>
+        <w:br/>
+        <w:t>}</w:t>
+        <w:br/>
+        <w:br/>
+        <w:t>function needsAuthCheck(pathname: string): boolean {</w:t>
+        <w:br/>
+        <w:t xml:space="preserve">  return (</w:t>
+        <w:br/>
+        <w:t xml:space="preserve">    pathname.startsWith("/login") ||</w:t>
+        <w:br/>
+        <w:t xml:space="preserve">    pathname.startsWith("/my-bookings") ||</w:t>
+        <w:br/>
+        <w:t xml:space="preserve">    pathname.startsWith("/admin") ||</w:t>
+        <w:br/>
+        <w:t xml:space="preserve">    isCarBookPath(pathname)</w:t>
+        <w:br/>
+        <w:t xml:space="preserve">  );</w:t>
+        <w:br/>
+        <w:t>}</w:t>
+        <w:br/>
+        <w:br/>
+        <w:t>function getUserRole(user: {</w:t>
+        <w:br/>
+        <w:t xml:space="preserve">  app_metadata?: Record&lt;string, unknown&gt;;</w:t>
+        <w:br/>
+        <w:t>}): "user" | "admin" {</w:t>
+        <w:br/>
+        <w:t xml:space="preserve">  return user.app_metadata?.role === "admin" ? "admin" : "user";</w:t>
+        <w:br/>
+        <w:t>}</w:t>
+        <w:br/>
+        <w:br/>
+        <w:t>export async function middleware(request: NextRequest) {</w:t>
+        <w:br/>
+        <w:t xml:space="preserve">  const { pathname } = request.nextUrl;</w:t>
+        <w:br/>
+        <w:br/>
+        <w:t xml:space="preserve">  if (!needsAuthCheck(pathname)) {</w:t>
+        <w:br/>
+        <w:t xml:space="preserve">    return updateSession(request);</w:t>
+        <w:br/>
+        <w:t xml:space="preserve">  }</w:t>
+        <w:br/>
+        <w:br/>
+        <w:t xml:space="preserve">  const supabaseResponse = await updateSession(request);</w:t>
+        <w:br/>
+        <w:t xml:space="preserve">  const { createServerClient } = await import("@supabase/ssr");</w:t>
+        <w:br/>
+        <w:br/>
+        <w:t xml:space="preserve">  const url = process.env.NEXT_PUBLIC_SUPABASE_URL;</w:t>
+        <w:br/>
+        <w:t xml:space="preserve">  const key = process.env.NEXT_PUBLIC_SUPABASE_ANON_KEY;</w:t>
+        <w:br/>
+        <w:br/>
+        <w:t xml:space="preserve">  if (!url || !key) {</w:t>
+        <w:br/>
+        <w:t xml:space="preserve">    return supabaseResponse;</w:t>
+        <w:br/>
+        <w:t xml:space="preserve">  }</w:t>
+        <w:br/>
+        <w:br/>
+        <w:t xml:space="preserve">  const supabase = createServerClient(url, key, {</w:t>
+        <w:br/>
+        <w:t xml:space="preserve">    cookies: {</w:t>
+        <w:br/>
+        <w:t xml:space="preserve">      getAll() {</w:t>
+        <w:br/>
+        <w:t xml:space="preserve">        return request.cookies.getAll();</w:t>
+        <w:br/>
+        <w:t xml:space="preserve">      },</w:t>
+        <w:br/>
+        <w:t xml:space="preserve">      setAll(cookiesToSet) {</w:t>
+        <w:br/>
+        <w:t xml:space="preserve">        cookiesToSet.forEach(({ name, value }) =&gt; {</w:t>
+        <w:br/>
+        <w:t xml:space="preserve">          request.cookies.set(name, value);</w:t>
+        <w:br/>
+        <w:t xml:space="preserve">        });</w:t>
+        <w:br/>
+        <w:t xml:space="preserve">        cookiesToSet.forEach(({ name, value, options }) =&gt; {</w:t>
+        <w:br/>
+        <w:t xml:space="preserve">          supabaseResponse.cookies.set(name, value, options);</w:t>
+        <w:br/>
+        <w:t xml:space="preserve">        });</w:t>
+        <w:br/>
+        <w:t xml:space="preserve">      },</w:t>
+        <w:br/>
+        <w:t xml:space="preserve">    },</w:t>
+        <w:br/>
+        <w:t xml:space="preserve">  });</w:t>
+        <w:br/>
+        <w:br/>
+        <w:t xml:space="preserve">  const {</w:t>
+        <w:br/>
+        <w:t xml:space="preserve">    data: { user },</w:t>
+        <w:br/>
+        <w:t xml:space="preserve">  } = await supabase.auth.getUser();</w:t>
+        <w:br/>
+        <w:t xml:space="preserve">  const role = user ? getUserRole(user) : null;</w:t>
+        <w:br/>
+        <w:br/>
+        <w:t xml:space="preserve">  if (pathname.startsWith("/login")) {</w:t>
+        <w:br/>
+        <w:t xml:space="preserve">    if (user) {</w:t>
+        <w:br/>
+        <w:t xml:space="preserve">      const redirectUrl = request.nextUrl.clone();</w:t>
+        <w:br/>
+        <w:t xml:space="preserve">      redirectUrl.pathname = role === "admin" ? "/admin/dashboard" : "/";</w:t>
+        <w:br/>
+        <w:t xml:space="preserve">      redirectUrl.search = "";</w:t>
+        <w:br/>
+        <w:t xml:space="preserve">      return NextResponse.redirect(redirectUrl);</w:t>
+        <w:br/>
+        <w:t xml:space="preserve">    }</w:t>
+        <w:br/>
+        <w:t xml:space="preserve">    return supabaseResponse;</w:t>
+        <w:br/>
+        <w:t xml:space="preserve">  }</w:t>
+        <w:br/>
+        <w:br/>
+        <w:t xml:space="preserve">  if (pathname.startsWith("/admin")) {</w:t>
+        <w:br/>
+        <w:t xml:space="preserve">    if (!user) {</w:t>
+        <w:br/>
+        <w:t xml:space="preserve">      const redirectUrl = request.nextUrl.clone();</w:t>
+        <w:br/>
+        <w:t xml:space="preserve">      redirectUrl.pathname = "/login";</w:t>
+        <w:br/>
+        <w:t xml:space="preserve">      redirectUrl.searchParams.set("callbackUrl", pathname);</w:t>
+        <w:br/>
+        <w:t xml:space="preserve">      return NextResponse.redirect(redirectUrl);</w:t>
+        <w:br/>
+        <w:t xml:space="preserve">    }</w:t>
+        <w:br/>
+        <w:t xml:space="preserve">    if (role !== "admin") {</w:t>
+        <w:br/>
+        <w:t xml:space="preserve">      const redirectUrl = request.nextUrl.clone();</w:t>
+        <w:br/>
+        <w:t xml:space="preserve">      redirectUrl.pathname = "/";</w:t>
+        <w:br/>
+        <w:t xml:space="preserve">      return NextResponse.redirect(redirectUrl);</w:t>
+        <w:br/>
+        <w:t xml:space="preserve">    }</w:t>
+        <w:br/>
+        <w:t xml:space="preserve">    return supabaseResponse;</w:t>
+        <w:br/>
+        <w:t xml:space="preserve">  }</w:t>
+        <w:br/>
+        <w:br/>
+        <w:t xml:space="preserve">  if (pathname.startsWith("/my-bookings") || isCarBookPath(pathname)) {</w:t>
+        <w:br/>
+        <w:t xml:space="preserve">    if (!user) {</w:t>
+        <w:br/>
+        <w:t xml:space="preserve">      const redirectUrl = request.nextUrl.clone();</w:t>
+        <w:br/>
+        <w:t xml:space="preserve">      redirectUrl.pathname = "/login";</w:t>
+        <w:br/>
+        <w:t xml:space="preserve">      redirectUrl.searchParams.set("callbackUrl", pathname);</w:t>
+        <w:br/>
+        <w:t xml:space="preserve">      return NextResponse.redirect(redirectUrl);</w:t>
+        <w:br/>
+        <w:t xml:space="preserve">    }</w:t>
+        <w:br/>
+        <w:t xml:space="preserve">    return supabaseResponse;</w:t>
+        <w:br/>
+        <w:t xml:space="preserve">  }</w:t>
+        <w:br/>
+        <w:br/>
+        <w:t xml:space="preserve">  return supabaseResponse;</w:t>
+        <w:br/>
+        <w:t>}</w:t>
+        <w:br/>
+        <w:br/>
+        <w:t>export const config = {</w:t>
+        <w:br/>
+        <w:t xml:space="preserve">  matcher: [</w:t>
+        <w:br/>
+        <w:t xml:space="preserve">    "/((?!_next/static|_next/image|favicon.ico|.*\\.(?:svg|png|jpg|jpeg|gif|webp|woff|woff2)$).*)",</w:t>
+        <w:br/>
+        <w:t xml:space="preserve">  ],</w:t>
+        <w:br/>
+        <w:t>};</w:t>
+      </w:r>
+    </w:p>
+    <w:p>
+      <w:pPr>
+        <w:spacing w:before="160" w:after="40"/>
+      </w:pPr>
+      <w:r>
+        <w:rPr>
+          <w:rFonts w:ascii="Times New Roman" w:hAnsi="Times New Roman" w:eastAsia="Times New Roman"/>
+          <w:b/>
+          <w:sz w:val="18"/>
+        </w:rPr>
+        <w:t>app/actions/auth.ts</w:t>
+      </w:r>
+    </w:p>
+    <w:p>
+      <w:pPr>
+        <w:spacing w:after="120" w:line="276" w:lineRule="auto"/>
+      </w:pPr>
+      <w:r>
+        <w:rPr>
+          <w:rFonts w:ascii="Times New Roman" w:hAnsi="Times New Roman" w:eastAsia="Times New Roman"/>
+          <w:b w:val="0"/>
+          <w:sz w:val="24"/>
+        </w:rPr>
+        <w:t>Server Actions — login and logout</w:t>
+      </w:r>
+    </w:p>
+    <w:p>
+      <w:pPr>
+        <w:spacing w:line="240" w:lineRule="auto" w:after="120"/>
+        <w:ind w:left="0"/>
+      </w:pPr>
+      <w:r>
+        <w:rPr>
+          <w:rFonts w:ascii="Courier New" w:hAnsi="Courier New" w:eastAsia="Courier New"/>
+          <w:sz w:val="14"/>
+        </w:rPr>
+        <w:t>"use server";</w:t>
+        <w:br/>
+        <w:br/>
+        <w:t>import { redirect } from "next/navigation";</w:t>
+        <w:br/>
+        <w:t>import { createClient } from "@/lib/supabase/server";</w:t>
+        <w:br/>
+        <w:br/>
+        <w:t>function safeCallbackUrl(raw: string | null | undefined): string | null {</w:t>
+        <w:br/>
+        <w:t xml:space="preserve">  if (!raw || typeof raw !== "string") return null;</w:t>
+        <w:br/>
+        <w:t xml:space="preserve">  const t = raw.trim();</w:t>
+        <w:br/>
+        <w:t xml:space="preserve">  if (!t.startsWith("/") || t.startsWith("//")) return null;</w:t>
+        <w:br/>
+        <w:t xml:space="preserve">  return t;</w:t>
+        <w:br/>
+        <w:t>}</w:t>
+        <w:br/>
+        <w:br/>
+        <w:t>function withQuery(path: string, key: string, value: string): string {</w:t>
+        <w:br/>
+        <w:t xml:space="preserve">  const sep = path.includes("?") ? "&amp;" : "?";</w:t>
+        <w:br/>
+        <w:t xml:space="preserve">  return `${path}${sep}${encodeURIComponent(key)}=${encodeURIComponent(value)}`;</w:t>
+        <w:br/>
+        <w:t>}</w:t>
+        <w:br/>
+        <w:br/>
+        <w:t>export async function loginAction(formData: FormData): Promise&lt;{</w:t>
+        <w:br/>
+        <w:t xml:space="preserve">  error: string;</w:t>
+        <w:br/>
+        <w:t>} | void&gt; {</w:t>
+        <w:br/>
+        <w:t xml:space="preserve">  const email = String(formData.get("email") ?? "").trim();</w:t>
+        <w:br/>
+        <w:t xml:space="preserve">  const password = String(formData.get("password") ?? "");</w:t>
+        <w:br/>
+        <w:t xml:space="preserve">  const callbackRaw = String(formData.get("callbackUrl") ?? "").trim();</w:t>
+        <w:br/>
+        <w:t xml:space="preserve">  const callback = safeCallbackUrl(callbackRaw);</w:t>
+        <w:br/>
+        <w:br/>
+        <w:t xml:space="preserve">  const supabase = createClient();</w:t>
+        <w:br/>
+        <w:t xml:space="preserve">  const { error } = await supabase.auth.signInWithPassword({ email, password });</w:t>
+        <w:br/>
+        <w:br/>
+        <w:t xml:space="preserve">  if (error) {</w:t>
+        <w:br/>
+        <w:t xml:space="preserve">    return { error: "Invalid email or password." };</w:t>
+        <w:br/>
+        <w:t xml:space="preserve">  }</w:t>
+        <w:br/>
+        <w:br/>
+        <w:t xml:space="preserve">  const {</w:t>
+        <w:br/>
+        <w:t xml:space="preserve">    data: { user },</w:t>
+        <w:br/>
+        <w:t xml:space="preserve">  } = await supabase.auth.getUser();</w:t>
+        <w:br/>
+        <w:br/>
+        <w:t xml:space="preserve">  const role =</w:t>
+        <w:br/>
+        <w:t xml:space="preserve">    user?.app_metadata?.role === "admin" ? "admin" : "user";</w:t>
+        <w:br/>
+        <w:br/>
+        <w:t xml:space="preserve">  if (role === "admin") {</w:t>
+        <w:br/>
+        <w:t xml:space="preserve">    redirect(withQuery("/admin/dashboard", "loggedIn", "1"));</w:t>
+        <w:br/>
+        <w:t xml:space="preserve">  }</w:t>
+        <w:br/>
+        <w:br/>
+        <w:t xml:space="preserve">  const dest = callback &amp;&amp; callback !== "/login" ? callback : "/";</w:t>
+        <w:br/>
+        <w:t xml:space="preserve">  redirect(withQuery(dest, "loggedIn", "1"));</w:t>
+        <w:br/>
+        <w:t>}</w:t>
+        <w:br/>
+        <w:br/>
+        <w:t>export async function logoutAction(): Promise&lt;void&gt; {</w:t>
+        <w:br/>
+        <w:t xml:space="preserve">  const supabase = createClient();</w:t>
+        <w:br/>
+        <w:t xml:space="preserve">  await supabase.auth.signOut();</w:t>
+        <w:br/>
+        <w:t xml:space="preserve">  redirect("/?loggedOut=1");</w:t>
+        <w:br/>
+        <w:t>}</w:t>
+      </w:r>
+    </w:p>
+    <w:p>
+      <w:pPr>
+        <w:spacing w:before="160" w:after="40"/>
+      </w:pPr>
+      <w:r>
+        <w:rPr>
+          <w:rFonts w:ascii="Times New Roman" w:hAnsi="Times New Roman" w:eastAsia="Times New Roman"/>
+          <w:b/>
+          <w:sz w:val="18"/>
+        </w:rPr>
+        <w:t>app/actions/booking.ts</w:t>
+      </w:r>
+    </w:p>
+    <w:p>
+      <w:pPr>
+        <w:spacing w:after="120" w:line="276" w:lineRule="auto"/>
+      </w:pPr>
+      <w:r>
+        <w:rPr>
+          <w:rFonts w:ascii="Times New Roman" w:hAnsi="Times New Roman" w:eastAsia="Times New Roman"/>
+          <w:b w:val="0"/>
+          <w:sz w:val="24"/>
+        </w:rPr>
+        <w:t>Server Action — create booking</w:t>
+      </w:r>
+    </w:p>
+    <w:p>
+      <w:pPr>
+        <w:spacing w:line="240" w:lineRule="auto" w:after="120"/>
+        <w:ind w:left="0"/>
+      </w:pPr>
+      <w:r>
+        <w:rPr>
+          <w:rFonts w:ascii="Courier New" w:hAnsi="Courier New" w:eastAsia="Courier New"/>
+          <w:sz w:val="14"/>
+        </w:rPr>
+        <w:t>"use server";</w:t>
+        <w:br/>
+        <w:br/>
+        <w:t>import { redirect } from "next/navigation";</w:t>
+        <w:br/>
+        <w:t>import { getSessionUser } from "@/lib/auth";</w:t>
+        <w:br/>
+        <w:t>import { computeBookingTotal } from "@/lib/booking-math";</w:t>
+        <w:br/>
+        <w:t>import { appendBooking } from "@/lib/bookings";</w:t>
+        <w:br/>
+        <w:t>import { getCarById } from "@/lib/data";</w:t>
+        <w:br/>
+        <w:br/>
+        <w:t>export async function createBookingAction(</w:t>
+        <w:br/>
+        <w:t xml:space="preserve">  formData: FormData</w:t>
+        <w:br/>
+        <w:t>): Promise&lt;{ error: string } | void&gt; {</w:t>
+        <w:br/>
+        <w:t xml:space="preserve">  const user = await getSessionUser();</w:t>
+        <w:br/>
+        <w:t xml:space="preserve">  if (!user) {</w:t>
+        <w:br/>
+        <w:t xml:space="preserve">    return { error: "You must be signed in to book." };</w:t>
+        <w:br/>
+        <w:t xml:space="preserve">  }</w:t>
+        <w:br/>
+        <w:br/>
+        <w:t xml:space="preserve">  const carIdRaw = formData.get("carId");</w:t>
+        <w:br/>
+        <w:t xml:space="preserve">  const carId =</w:t>
+        <w:br/>
+        <w:t xml:space="preserve">    typeof carIdRaw === "string" ? Number.parseInt(carIdRaw, 10) : NaN;</w:t>
+        <w:br/>
+        <w:t xml:space="preserve">  const pickupDate = String(formData.get("pickupDate") ?? "").trim();</w:t>
+        <w:br/>
+        <w:t xml:space="preserve">  const returnDate = String(formData.get("returnDate") ?? "").trim();</w:t>
+        <w:br/>
+        <w:br/>
+        <w:t xml:space="preserve">  if (!Number.isFinite(carId) || carId &lt; 1) {</w:t>
+        <w:br/>
+        <w:t xml:space="preserve">    return { error: "Invalid car." };</w:t>
+        <w:br/>
+        <w:t xml:space="preserve">  }</w:t>
+        <w:br/>
+        <w:br/>
+        <w:t xml:space="preserve">  const car = await getCarById(carId);</w:t>
+        <w:br/>
+        <w:t xml:space="preserve">  if (!car) {</w:t>
+        <w:br/>
+        <w:t xml:space="preserve">    return { error: "Car not found." };</w:t>
+        <w:br/>
+        <w:t xml:space="preserve">  }</w:t>
+        <w:br/>
+        <w:t xml:space="preserve">  if (!car.available) {</w:t>
+        <w:br/>
+        <w:t xml:space="preserve">    return { error: "This vehicle is not available for booking." };</w:t>
+        <w:br/>
+        <w:t xml:space="preserve">  }</w:t>
+        <w:br/>
+        <w:br/>
+        <w:t xml:space="preserve">  const totals = computeBookingTotal(car.price, pickupDate, returnDate);</w:t>
+        <w:br/>
+        <w:t xml:space="preserve">  if (!totals) {</w:t>
+        <w:br/>
+        <w:t xml:space="preserve">    return {</w:t>
+        <w:br/>
+        <w:t xml:space="preserve">      error: "Pick valid pickup and return dates (return on or after pickup).",</w:t>
+        <w:br/>
+        <w:t xml:space="preserve">    };</w:t>
+        <w:br/>
+        <w:t xml:space="preserve">  }</w:t>
+        <w:br/>
+        <w:br/>
+        <w:t xml:space="preserve">  await appendBooking({</w:t>
+        <w:br/>
+        <w:t xml:space="preserve">    userId: user.id,</w:t>
+        <w:br/>
+        <w:t xml:space="preserve">    carId,</w:t>
+        <w:br/>
+        <w:t xml:space="preserve">    pickupDate,</w:t>
+        <w:br/>
+        <w:t xml:space="preserve">    returnDate,</w:t>
+        <w:br/>
+        <w:t xml:space="preserve">    totalPrice: totals.totalPrice,</w:t>
+        <w:br/>
+        <w:t xml:space="preserve">    status: "confirmed",</w:t>
+        <w:br/>
+        <w:t xml:space="preserve">  });</w:t>
+        <w:br/>
+        <w:br/>
+        <w:t xml:space="preserve">  redirect("/my-bookings?booked=1");</w:t>
+        <w:br/>
+        <w:t>}</w:t>
+      </w:r>
+    </w:p>
+    <w:p>
+      <w:pPr>
+        <w:spacing w:before="160" w:after="40"/>
+      </w:pPr>
+      <w:r>
+        <w:rPr>
+          <w:rFonts w:ascii="Times New Roman" w:hAnsi="Times New Roman" w:eastAsia="Times New Roman"/>
+          <w:b/>
+          <w:sz w:val="18"/>
+        </w:rPr>
+        <w:t>app/actions/admin.ts</w:t>
+      </w:r>
+    </w:p>
+    <w:p>
+      <w:pPr>
+        <w:spacing w:after="120" w:line="276" w:lineRule="auto"/>
+      </w:pPr>
+      <w:r>
+        <w:rPr>
+          <w:rFonts w:ascii="Times New Roman" w:hAnsi="Times New Roman" w:eastAsia="Times New Roman"/>
+          <w:b w:val="0"/>
+          <w:sz w:val="24"/>
+        </w:rPr>
+        <w:t>Server Actions — admin car CRUD and booking status</w:t>
+      </w:r>
+    </w:p>
+    <w:p>
+      <w:pPr>
+        <w:spacing w:line="240" w:lineRule="auto" w:after="120"/>
+        <w:ind w:left="0"/>
+      </w:pPr>
+      <w:r>
+        <w:rPr>
+          <w:rFonts w:ascii="Courier New" w:hAnsi="Courier New" w:eastAsia="Courier New"/>
+          <w:sz w:val="14"/>
+        </w:rPr>
+        <w:t>"use server";</w:t>
+        <w:br/>
+        <w:br/>
+        <w:t>import { redirect } from "next/navigation";</w:t>
+        <w:br/>
+        <w:t>import { requireAdminUser } from "@/lib/admin-auth";</w:t>
+        <w:br/>
+        <w:t>import { BOOKING_STATUSES, updateBookingStatus } from "@/lib/bookings";</w:t>
+        <w:br/>
+        <w:t>import type { Car } from "@/lib/car-catalog";</w:t>
+        <w:br/>
+        <w:t>import { createCar, deleteCar, getCarForAdmin, updateCar } from "@/lib/cars-store";</w:t>
+        <w:br/>
+        <w:br/>
+        <w:t>function parseNumber(raw: FormDataEntryValue | null): number {</w:t>
+        <w:br/>
+        <w:t xml:space="preserve">  if (typeof raw !== "string") {</w:t>
+        <w:br/>
+        <w:t xml:space="preserve">    return Number.NaN;</w:t>
+        <w:br/>
+        <w:t xml:space="preserve">  }</w:t>
+        <w:br/>
+        <w:t xml:space="preserve">  return Number.parseInt(raw, 10);</w:t>
+        <w:br/>
+        <w:t>}</w:t>
+        <w:br/>
+        <w:br/>
+        <w:t>function parseImages(raw: FormDataEntryValue | null): string[] {</w:t>
+        <w:br/>
+        <w:t xml:space="preserve">  if (typeof raw !== "string") {</w:t>
+        <w:br/>
+        <w:t xml:space="preserve">    return [];</w:t>
+        <w:br/>
+        <w:t xml:space="preserve">  }</w:t>
+        <w:br/>
+        <w:br/>
+        <w:t xml:space="preserve">  return raw</w:t>
+        <w:br/>
+        <w:t xml:space="preserve">    .split(/\r?\n/)</w:t>
+        <w:br/>
+        <w:t xml:space="preserve">    .map((line) =&gt; line.trim())</w:t>
+        <w:br/>
+        <w:t xml:space="preserve">    .filter(Boolean);</w:t>
+        <w:br/>
+        <w:t>}</w:t>
+        <w:br/>
+        <w:br/>
+        <w:t>type ParsedCarInput =</w:t>
+        <w:br/>
+        <w:t xml:space="preserve">  | { error: string }</w:t>
+        <w:br/>
+        <w:t xml:space="preserve">  | { value: Omit&lt;Car, "id"&gt; };</w:t>
+        <w:br/>
+        <w:br/>
+        <w:t>function parseCarInput(formData: FormData): ParsedCarInput {</w:t>
+        <w:br/>
+        <w:t xml:space="preserve">  const name = String(formData.get("name") ?? "").trim();</w:t>
+        <w:br/>
+        <w:t xml:space="preserve">  const fuel = String(formData.get("fuel") ?? "").trim();</w:t>
+        <w:br/>
+        <w:t xml:space="preserve">  const description = String(formData.get("description") ?? "").trim();</w:t>
+        <w:br/>
+        <w:t xml:space="preserve">  const seats = parseNumber(formData.get("seats"));</w:t>
+        <w:br/>
+        <w:t xml:space="preserve">  const price = parseNumber(formData.get("price"));</w:t>
+        <w:br/>
+        <w:t xml:space="preserve">  const images = parseImages(formData.get("images"));</w:t>
+        <w:br/>
+        <w:t xml:space="preserve">  const available = String(formData.get("available") ?? "") === "on";</w:t>
+        <w:br/>
+        <w:br/>
+        <w:t xml:space="preserve">  if (!name || !fuel || !description) {</w:t>
+        <w:br/>
+        <w:t xml:space="preserve">    return { error: "Name, fuel, and description are required." } as const;</w:t>
+        <w:br/>
+        <w:t xml:space="preserve">  }</w:t>
+        <w:br/>
+        <w:br/>
+        <w:t xml:space="preserve">  if (!Number.isFinite(seats) || seats &lt; 2) {</w:t>
+        <w:br/>
+        <w:t xml:space="preserve">    return { error: "Seats must be a valid number." } as const;</w:t>
+        <w:br/>
+        <w:t xml:space="preserve">  }</w:t>
+        <w:br/>
+        <w:br/>
+        <w:t xml:space="preserve">  if (!Number.isFinite(price) || price &lt; 1) {</w:t>
+        <w:br/>
+        <w:t xml:space="preserve">    return { error: "Price must be a valid number." } as const;</w:t>
+        <w:br/>
+        <w:t xml:space="preserve">  }</w:t>
+        <w:br/>
+        <w:br/>
+        <w:t xml:space="preserve">  if (images.length === 0) {</w:t>
+        <w:br/>
+        <w:t xml:space="preserve">    return { error: "Add at least one image URL." } as const;</w:t>
+        <w:br/>
+        <w:t xml:space="preserve">  }</w:t>
+        <w:br/>
+        <w:br/>
+        <w:t xml:space="preserve">  return {</w:t>
+        <w:br/>
+        <w:t xml:space="preserve">    value: {</w:t>
+        <w:br/>
+        <w:t xml:space="preserve">      name,</w:t>
+        <w:br/>
+        <w:t xml:space="preserve">      seats,</w:t>
+        <w:br/>
+        <w:t xml:space="preserve">      fuel,</w:t>
+        <w:br/>
+        <w:t xml:space="preserve">      price,</w:t>
+        <w:br/>
+        <w:t xml:space="preserve">      available,</w:t>
+        <w:br/>
+        <w:t xml:space="preserve">      images,</w:t>
+        <w:br/>
+        <w:t xml:space="preserve">      description,</w:t>
+        <w:br/>
+        <w:t xml:space="preserve">    },</w:t>
+        <w:br/>
+        <w:t xml:space="preserve">  } as const;</w:t>
+        <w:br/>
+        <w:t>}</w:t>
+        <w:br/>
+        <w:br/>
+        <w:t>export async function createCarAction(formData: FormData) {</w:t>
+        <w:br/>
+        <w:t xml:space="preserve">  await requireAdminUser();</w:t>
+        <w:br/>
+        <w:br/>
+        <w:t xml:space="preserve">  const parsed = parseCarInput(formData);</w:t>
+        <w:br/>
+        <w:t xml:space="preserve">  if ("error" in parsed) {</w:t>
+        <w:br/>
+        <w:t xml:space="preserve">    redirect(`/admin/cars?error=${encodeURIComponent(parsed.error)}`);</w:t>
+        <w:br/>
+        <w:t xml:space="preserve">  }</w:t>
+        <w:br/>
+        <w:br/>
+        <w:t xml:space="preserve">  await createCar(parsed.value);</w:t>
+        <w:br/>
+        <w:t xml:space="preserve">  redirect("/admin/cars?created=1");</w:t>
+        <w:br/>
+        <w:t>}</w:t>
+        <w:br/>
+        <w:br/>
+        <w:t>export async function updateCarAction(formData: FormData) {</w:t>
+        <w:br/>
+        <w:t xml:space="preserve">  await requireAdminUser();</w:t>
+        <w:br/>
+        <w:br/>
+        <w:t xml:space="preserve">  const id = parseNumber(formData.get("id"));</w:t>
+        <w:br/>
+        <w:t xml:space="preserve">  if (!Number.isFinite(id)) {</w:t>
+        <w:br/>
+        <w:t xml:space="preserve">    redirect("/admin/cars?error=Invalid%20car%20id");</w:t>
+        <w:br/>
+        <w:t xml:space="preserve">  }</w:t>
+        <w:br/>
+        <w:br/>
+        <w:t xml:space="preserve">  const parsed = parseCarInput(formData);</w:t>
+        <w:br/>
+        <w:t xml:space="preserve">  if ("error" in parsed) {</w:t>
+        <w:br/>
+        <w:t xml:space="preserve">    redirect(`/admin/cars?edit=${id}&amp;error=${encodeURIComponent(parsed.error)}`);</w:t>
+        <w:br/>
+        <w:t xml:space="preserve">  }</w:t>
+        <w:br/>
+        <w:br/>
+        <w:t xml:space="preserve">  const updated = await updateCar(id, parsed.value);</w:t>
+        <w:br/>
+        <w:t xml:space="preserve">  if (!updated) {</w:t>
+        <w:br/>
+        <w:t xml:space="preserve">    redirect("/admin/cars?error=Car%20not%20found");</w:t>
+        <w:br/>
+        <w:t xml:space="preserve">  }</w:t>
+        <w:br/>
+        <w:br/>
+        <w:t xml:space="preserve">  redirect(`/admin/cars?updated=${id}`);</w:t>
+        <w:br/>
+        <w:t>}</w:t>
+        <w:br/>
+        <w:br/>
+        <w:t>export async function deleteCarAction(formData: FormData) {</w:t>
+        <w:br/>
+        <w:t xml:space="preserve">  await requireAdminUser();</w:t>
+        <w:br/>
+        <w:br/>
+        <w:t xml:space="preserve">  const id = parseNumber(formData.get("id"));</w:t>
+        <w:br/>
+        <w:t xml:space="preserve">  if (!Number.isFinite(id)) {</w:t>
+        <w:br/>
+        <w:t xml:space="preserve">    redirect("/admin/cars?error=Invalid%20car%20id");</w:t>
+        <w:br/>
+        <w:t xml:space="preserve">  }</w:t>
+        <w:br/>
+        <w:br/>
+        <w:t xml:space="preserve">  const car = await getCarForAdmin(id);</w:t>
+        <w:br/>
+        <w:t xml:space="preserve">  if (!car) {</w:t>
+        <w:br/>
+        <w:t xml:space="preserve">    redirect("/admin/cars?error=Car%20not%20found");</w:t>
+        <w:br/>
+        <w:t xml:space="preserve">  }</w:t>
+        <w:br/>
+        <w:br/>
+        <w:t xml:space="preserve">  const deleted = await deleteCar(id);</w:t>
+        <w:br/>
+        <w:t xml:space="preserve">  if (!deleted) {</w:t>
+        <w:br/>
+        <w:t xml:space="preserve">    redirect("/admin/cars?error=Car%20not%20found");</w:t>
+        <w:br/>
+        <w:t xml:space="preserve">  }</w:t>
+        <w:br/>
+        <w:br/>
+        <w:t xml:space="preserve">  redirect("/admin/cars?deleted=1");</w:t>
+        <w:br/>
+        <w:t>}</w:t>
+        <w:br/>
+        <w:br/>
+        <w:t>export async function updateBookingStatusAction(formData: FormData) {</w:t>
+        <w:br/>
+        <w:t xml:space="preserve">  await requireAdminUser();</w:t>
+        <w:br/>
+        <w:br/>
+        <w:t xml:space="preserve">  const id = parseNumber(formData.get("id"));</w:t>
+        <w:br/>
+        <w:t xml:space="preserve">  const status = String(formData.get("status") ?? "").trim();</w:t>
+        <w:br/>
+        <w:br/>
+        <w:t xml:space="preserve">  if (!Number.isFinite(id)) {</w:t>
+        <w:br/>
+        <w:t xml:space="preserve">    redirect("/admin/bookings?error=Invalid%20booking%20id");</w:t>
+        <w:br/>
+        <w:t xml:space="preserve">  }</w:t>
+        <w:br/>
+        <w:br/>
+        <w:t xml:space="preserve">  if (!BOOKING_STATUSES.includes(status as (typeof BOOKING_STATUSES)[number])) {</w:t>
+        <w:br/>
+        <w:t xml:space="preserve">    redirect("/admin/bookings?error=Invalid%20status");</w:t>
+        <w:br/>
+        <w:t xml:space="preserve">  }</w:t>
+        <w:br/>
+        <w:br/>
+        <w:t xml:space="preserve">  const updated = await updateBookingStatus(</w:t>
+        <w:br/>
+        <w:t xml:space="preserve">    id,</w:t>
+        <w:br/>
+        <w:t xml:space="preserve">    status as (typeof BOOKING_STATUSES)[number]</w:t>
+        <w:br/>
+        <w:t xml:space="preserve">  );</w:t>
+        <w:br/>
+        <w:br/>
+        <w:t xml:space="preserve">  if (!updated) {</w:t>
+        <w:br/>
+        <w:t xml:space="preserve">    redirect("/admin/bookings?error=Booking%20not%20found");</w:t>
+        <w:br/>
+        <w:t xml:space="preserve">  }</w:t>
+        <w:br/>
+        <w:br/>
+        <w:t xml:space="preserve">  redirect(`/admin/bookings?updated=${id}`);</w:t>
+        <w:br/>
+        <w:t>}</w:t>
+      </w:r>
+    </w:p>
+    <w:p>
+      <w:pPr>
+        <w:spacing w:before="160" w:after="40"/>
+      </w:pPr>
+      <w:r>
+        <w:rPr>
+          <w:rFonts w:ascii="Times New Roman" w:hAnsi="Times New Roman" w:eastAsia="Times New Roman"/>
+          <w:b/>
+          <w:sz w:val="18"/>
+        </w:rPr>
+        <w:t>lib/supabase/server.ts</w:t>
+      </w:r>
+    </w:p>
+    <w:p>
+      <w:pPr>
+        <w:spacing w:after="120" w:line="276" w:lineRule="auto"/>
+      </w:pPr>
+      <w:r>
+        <w:rPr>
+          <w:rFonts w:ascii="Times New Roman" w:hAnsi="Times New Roman" w:eastAsia="Times New Roman"/>
+          <w:b w:val="0"/>
+          <w:sz w:val="24"/>
+        </w:rPr>
+        <w:t>Supabase client for Server Components and Actions</w:t>
+      </w:r>
+    </w:p>
+    <w:p>
+      <w:pPr>
+        <w:spacing w:line="240" w:lineRule="auto" w:after="120"/>
+        <w:ind w:left="0"/>
+      </w:pPr>
+      <w:r>
+        <w:rPr>
+          <w:rFonts w:ascii="Courier New" w:hAnsi="Courier New" w:eastAsia="Courier New"/>
+          <w:sz w:val="14"/>
+        </w:rPr>
+        <w:t>import { createServerClient } from "@supabase/ssr";</w:t>
+        <w:br/>
+        <w:t>import { cookies } from "next/headers";</w:t>
+        <w:br/>
+        <w:br/>
+        <w:t>export function createClient() {</w:t>
+        <w:br/>
+        <w:t xml:space="preserve">  const url = process.env.NEXT_PUBLIC_SUPABASE_URL;</w:t>
+        <w:br/>
+        <w:t xml:space="preserve">  const key = process.env.NEXT_PUBLIC_SUPABASE_ANON_KEY;</w:t>
+        <w:br/>
+        <w:br/>
+        <w:t xml:space="preserve">  if (!url || !key) {</w:t>
+        <w:br/>
+        <w:t xml:space="preserve">    throw new Error(</w:t>
+        <w:br/>
+        <w:t xml:space="preserve">      "Missing NEXT_PUBLIC_SUPABASE_URL or NEXT_PUBLIC_SUPABASE_ANON_KEY"</w:t>
+        <w:br/>
+        <w:t xml:space="preserve">    );</w:t>
+        <w:br/>
+        <w:t xml:space="preserve">  }</w:t>
+        <w:br/>
+        <w:br/>
+        <w:t xml:space="preserve">  const cookieStore = cookies();</w:t>
+        <w:br/>
+        <w:br/>
+        <w:t xml:space="preserve">  return createServerClient(url, key, {</w:t>
+        <w:br/>
+        <w:t xml:space="preserve">    cookies: {</w:t>
+        <w:br/>
+        <w:t xml:space="preserve">      getAll() {</w:t>
+        <w:br/>
+        <w:t xml:space="preserve">        return cookieStore.getAll();</w:t>
+        <w:br/>
+        <w:t xml:space="preserve">      },</w:t>
+        <w:br/>
+        <w:t xml:space="preserve">      setAll(cookiesToSet) {</w:t>
+        <w:br/>
+        <w:t xml:space="preserve">        try {</w:t>
+        <w:br/>
+        <w:t xml:space="preserve">          cookiesToSet.forEach(({ name, value, options }) =&gt; {</w:t>
+        <w:br/>
+        <w:t xml:space="preserve">            cookieStore.set(name, value, options);</w:t>
+        <w:br/>
+        <w:t xml:space="preserve">          });</w:t>
+        <w:br/>
+        <w:t xml:space="preserve">        } catch {</w:t>
+        <w:br/>
+        <w:t xml:space="preserve">          // setAll from Server Component — middleware refreshes session</w:t>
+        <w:br/>
+        <w:t xml:space="preserve">        }</w:t>
+        <w:br/>
+        <w:t xml:space="preserve">      },</w:t>
+        <w:br/>
+        <w:t xml:space="preserve">    },</w:t>
+        <w:br/>
+        <w:t xml:space="preserve">  });</w:t>
+        <w:br/>
+        <w:t>}</w:t>
+      </w:r>
+    </w:p>
+    <w:p>
+      <w:pPr>
+        <w:spacing w:before="160" w:after="40"/>
+      </w:pPr>
+      <w:r>
+        <w:rPr>
+          <w:rFonts w:ascii="Times New Roman" w:hAnsi="Times New Roman" w:eastAsia="Times New Roman"/>
+          <w:b/>
+          <w:sz w:val="18"/>
+        </w:rPr>
+        <w:t>lib/supabase/middleware.ts</w:t>
+      </w:r>
+    </w:p>
+    <w:p>
+      <w:pPr>
+        <w:spacing w:after="120" w:line="276" w:lineRule="auto"/>
+      </w:pPr>
+      <w:r>
+        <w:rPr>
+          <w:rFonts w:ascii="Times New Roman" w:hAnsi="Times New Roman" w:eastAsia="Times New Roman"/>
+          <w:b w:val="0"/>
+          <w:sz w:val="24"/>
+        </w:rPr>
+        <w:t>Supabase session refresh in middleware</w:t>
+      </w:r>
+    </w:p>
+    <w:p>
+      <w:pPr>
+        <w:spacing w:line="240" w:lineRule="auto" w:after="120"/>
+        <w:ind w:left="0"/>
+      </w:pPr>
+      <w:r>
+        <w:rPr>
+          <w:rFonts w:ascii="Courier New" w:hAnsi="Courier New" w:eastAsia="Courier New"/>
+          <w:sz w:val="14"/>
+        </w:rPr>
+        <w:t>import { createServerClient } from "@supabase/ssr";</w:t>
+        <w:br/>
+        <w:t>import { NextResponse, type NextRequest } from "next/server";</w:t>
+        <w:br/>
+        <w:br/>
+        <w:t>export async function updateSession(request: NextRequest) {</w:t>
+        <w:br/>
+        <w:t xml:space="preserve">  let supabaseResponse = NextResponse.next({ request });</w:t>
+        <w:br/>
+        <w:br/>
+        <w:t xml:space="preserve">  const url = process.env.NEXT_PUBLIC_SUPABASE_URL;</w:t>
+        <w:br/>
+        <w:t xml:space="preserve">  const key = process.env.NEXT_PUBLIC_SUPABASE_ANON_KEY;</w:t>
+        <w:br/>
+        <w:br/>
+        <w:t xml:space="preserve">  if (!url || !key) {</w:t>
+        <w:br/>
+        <w:t xml:space="preserve">    return supabaseResponse;</w:t>
+        <w:br/>
+        <w:t xml:space="preserve">  }</w:t>
+        <w:br/>
+        <w:br/>
+        <w:t xml:space="preserve">  const supabase = createServerClient(url, key, {</w:t>
+        <w:br/>
+        <w:t xml:space="preserve">    cookies: {</w:t>
+        <w:br/>
+        <w:t xml:space="preserve">      getAll() {</w:t>
+        <w:br/>
+        <w:t xml:space="preserve">        return request.cookies.getAll();</w:t>
+        <w:br/>
+        <w:t xml:space="preserve">      },</w:t>
+        <w:br/>
+        <w:t xml:space="preserve">      setAll(cookiesToSet) {</w:t>
+        <w:br/>
+        <w:t xml:space="preserve">        cookiesToSet.forEach(({ name, value }) =&gt; {</w:t>
+        <w:br/>
+        <w:t xml:space="preserve">          request.cookies.set(name, value);</w:t>
+        <w:br/>
+        <w:t xml:space="preserve">        });</w:t>
+        <w:br/>
+        <w:t xml:space="preserve">        supabaseResponse = NextResponse.next({ request });</w:t>
+        <w:br/>
+        <w:t xml:space="preserve">        cookiesToSet.forEach(({ name, value, options }) =&gt; {</w:t>
+        <w:br/>
+        <w:t xml:space="preserve">          supabaseResponse.cookies.set(name, value, options);</w:t>
+        <w:br/>
+        <w:t xml:space="preserve">        });</w:t>
+        <w:br/>
+        <w:t xml:space="preserve">      },</w:t>
+        <w:br/>
+        <w:t xml:space="preserve">    },</w:t>
+        <w:br/>
+        <w:t xml:space="preserve">  });</w:t>
+        <w:br/>
+        <w:br/>
+        <w:t xml:space="preserve">  await supabase.auth.getUser();</w:t>
+        <w:br/>
+        <w:br/>
+        <w:t xml:space="preserve">  return supabaseResponse;</w:t>
+        <w:br/>
+        <w:t>}</w:t>
+      </w:r>
+    </w:p>
+    <w:p>
+      <w:pPr>
+        <w:spacing w:before="160" w:after="40"/>
+      </w:pPr>
+      <w:r>
+        <w:rPr>
+          <w:rFonts w:ascii="Times New Roman" w:hAnsi="Times New Roman" w:eastAsia="Times New Roman"/>
+          <w:b/>
+          <w:sz w:val="18"/>
+        </w:rPr>
+        <w:t>lib/supabase/admin.ts</w:t>
+      </w:r>
+    </w:p>
+    <w:p>
+      <w:pPr>
+        <w:spacing w:after="120" w:line="276" w:lineRule="auto"/>
+      </w:pPr>
+      <w:r>
+        <w:rPr>
+          <w:rFonts w:ascii="Times New Roman" w:hAnsi="Times New Roman" w:eastAsia="Times New Roman"/>
+          <w:b w:val="0"/>
+          <w:sz w:val="24"/>
+        </w:rPr>
+        <w:t>Supabase service-role client (seed script only)</w:t>
+      </w:r>
+    </w:p>
+    <w:p>
+      <w:pPr>
+        <w:spacing w:line="240" w:lineRule="auto" w:after="120"/>
+        <w:ind w:left="0"/>
+      </w:pPr>
+      <w:r>
+        <w:rPr>
+          <w:rFonts w:ascii="Courier New" w:hAnsi="Courier New" w:eastAsia="Courier New"/>
+          <w:sz w:val="14"/>
+        </w:rPr>
+        <w:t>import { createClient } from "@supabase/supabase-js";</w:t>
+        <w:br/>
+        <w:br/>
+        <w:t>export function createAdminClient() {</w:t>
+        <w:br/>
+        <w:t xml:space="preserve">  const url = process.env.NEXT_PUBLIC_SUPABASE_URL;</w:t>
+        <w:br/>
+        <w:t xml:space="preserve">  const key = process.env.SUPABASE_SERVICE_ROLE_KEY;</w:t>
+        <w:br/>
+        <w:br/>
+        <w:t xml:space="preserve">  if (!url || !key) {</w:t>
+        <w:br/>
+        <w:t xml:space="preserve">    throw new Error(</w:t>
+        <w:br/>
+        <w:t xml:space="preserve">      "Missing NEXT_PUBLIC_SUPABASE_URL or SUPABASE_SERVICE_ROLE_KEY"</w:t>
+        <w:br/>
+        <w:t xml:space="preserve">    );</w:t>
+        <w:br/>
+        <w:t xml:space="preserve">  }</w:t>
+        <w:br/>
+        <w:br/>
+        <w:t xml:space="preserve">  return createClient(url, key, {</w:t>
+        <w:br/>
+        <w:t xml:space="preserve">    auth: {</w:t>
+        <w:br/>
+        <w:t xml:space="preserve">      autoRefreshToken: false,</w:t>
+        <w:br/>
+        <w:t xml:space="preserve">      persistSession: false,</w:t>
+        <w:br/>
+        <w:t xml:space="preserve">    },</w:t>
+        <w:br/>
+        <w:t xml:space="preserve">  });</w:t>
+        <w:br/>
+        <w:t>}</w:t>
+      </w:r>
+    </w:p>
+    <w:p>
+      <w:pPr>
+        <w:spacing w:before="160" w:after="40"/>
+      </w:pPr>
+      <w:r>
+        <w:rPr>
+          <w:rFonts w:ascii="Times New Roman" w:hAnsi="Times New Roman" w:eastAsia="Times New Roman"/>
+          <w:b/>
+          <w:sz w:val="18"/>
+        </w:rPr>
+        <w:t>lib/auth.ts</w:t>
+      </w:r>
+    </w:p>
+    <w:p>
+      <w:pPr>
+        <w:spacing w:after="120" w:line="276" w:lineRule="auto"/>
+      </w:pPr>
+      <w:r>
+        <w:rPr>
+          <w:rFonts w:ascii="Times New Roman" w:hAnsi="Times New Roman" w:eastAsia="Times New Roman"/>
+          <w:b w:val="0"/>
+          <w:sz w:val="24"/>
+        </w:rPr>
+        <w:t>Map Supabase user to session payload</w:t>
+      </w:r>
+    </w:p>
+    <w:p>
+      <w:pPr>
+        <w:spacing w:line="240" w:lineRule="auto" w:after="120"/>
+        <w:ind w:left="0"/>
+      </w:pPr>
+      <w:r>
+        <w:rPr>
+          <w:rFonts w:ascii="Courier New" w:hAnsi="Courier New" w:eastAsia="Courier New"/>
+          <w:sz w:val="14"/>
+        </w:rPr>
+        <w:t>export type SessionPayload = {</w:t>
+        <w:br/>
+        <w:t xml:space="preserve">  id: string;</w:t>
+        <w:br/>
+        <w:t xml:space="preserve">  email: string;</w:t>
+        <w:br/>
+        <w:t xml:space="preserve">  role: "user" | "admin";</w:t>
+        <w:br/>
+        <w:t xml:space="preserve">  name: string;</w:t>
+        <w:br/>
+        <w:t>};</w:t>
+        <w:br/>
+        <w:br/>
+        <w:t>function parseRole(value: unknown): "user" | "admin" {</w:t>
+        <w:br/>
+        <w:t xml:space="preserve">  return value === "admin" ? "admin" : "user";</w:t>
+        <w:br/>
+        <w:t>}</w:t>
+        <w:br/>
+        <w:br/>
+        <w:t>export function mapSupabaseUser(user: {</w:t>
+        <w:br/>
+        <w:t xml:space="preserve">  id: string;</w:t>
+        <w:br/>
+        <w:t xml:space="preserve">  email?: string;</w:t>
+        <w:br/>
+        <w:t xml:space="preserve">  app_metadata?: Record&lt;string, unknown&gt;;</w:t>
+        <w:br/>
+        <w:t xml:space="preserve">  user_metadata?: Record&lt;string, unknown&gt;;</w:t>
+        <w:br/>
+        <w:t>}): SessionPayload {</w:t>
+        <w:br/>
+        <w:t xml:space="preserve">  const name =</w:t>
+        <w:br/>
+        <w:t xml:space="preserve">    (typeof user.user_metadata?.name === "string" &amp;&amp; user.user_metadata.name) ||</w:t>
+        <w:br/>
+        <w:t xml:space="preserve">    user.email?.split("@")[0] ||</w:t>
+        <w:br/>
+        <w:t xml:space="preserve">    "User";</w:t>
+        <w:br/>
+        <w:br/>
+        <w:t xml:space="preserve">  return {</w:t>
+        <w:br/>
+        <w:t xml:space="preserve">    id: user.id,</w:t>
+        <w:br/>
+        <w:t xml:space="preserve">    email: user.email ?? "",</w:t>
+        <w:br/>
+        <w:t xml:space="preserve">    role: parseRole(user.app_metadata?.role),</w:t>
+        <w:br/>
+        <w:t xml:space="preserve">    name,</w:t>
+        <w:br/>
+        <w:t xml:space="preserve">  };</w:t>
+        <w:br/>
+        <w:t>}</w:t>
+        <w:br/>
+        <w:br/>
+        <w:t>export async function getSessionUser(): Promise&lt;SessionPayload | null&gt; {</w:t>
+        <w:br/>
+        <w:t xml:space="preserve">  const { createClient } = await import("@/lib/supabase/server");</w:t>
+        <w:br/>
+        <w:t xml:space="preserve">  const supabase = createClient();</w:t>
+        <w:br/>
+        <w:t xml:space="preserve">  const {</w:t>
+        <w:br/>
+        <w:t xml:space="preserve">    data: { user },</w:t>
+        <w:br/>
+        <w:t xml:space="preserve">  } = await supabase.auth.getUser();</w:t>
+        <w:br/>
+        <w:br/>
+        <w:t xml:space="preserve">  if (!user) {</w:t>
+        <w:br/>
+        <w:t xml:space="preserve">    return null;</w:t>
+        <w:br/>
+        <w:t xml:space="preserve">  }</w:t>
+        <w:br/>
+        <w:br/>
+        <w:t xml:space="preserve">  const session = mapSupabaseUser(user);</w:t>
+        <w:br/>
+        <w:br/>
+        <w:t xml:space="preserve">  const { data: profile } = await supabase</w:t>
+        <w:br/>
+        <w:t xml:space="preserve">    .from("profiles")</w:t>
+        <w:br/>
+        <w:t xml:space="preserve">    .select("name")</w:t>
+        <w:br/>
+        <w:t xml:space="preserve">    .eq("id", user.id)</w:t>
+        <w:br/>
+        <w:t xml:space="preserve">    .maybeSingle();</w:t>
+        <w:br/>
+        <w:br/>
+        <w:t xml:space="preserve">  if (profile?.name) {</w:t>
+        <w:br/>
+        <w:t xml:space="preserve">    session.name = profile.name;</w:t>
+        <w:br/>
+        <w:t xml:space="preserve">  }</w:t>
+        <w:br/>
+        <w:br/>
+        <w:t xml:space="preserve">  return session;</w:t>
+        <w:br/>
+        <w:t>}</w:t>
+      </w:r>
+    </w:p>
+    <w:p>
+      <w:pPr>
+        <w:spacing w:before="160" w:after="40"/>
+      </w:pPr>
+      <w:r>
+        <w:rPr>
+          <w:rFonts w:ascii="Times New Roman" w:hAnsi="Times New Roman" w:eastAsia="Times New Roman"/>
+          <w:b/>
+          <w:sz w:val="18"/>
+        </w:rPr>
+        <w:t>lib/data.ts</w:t>
+      </w:r>
+    </w:p>
+    <w:p>
+      <w:pPr>
+        <w:spacing w:after="120" w:line="276" w:lineRule="auto"/>
+      </w:pPr>
+      <w:r>
+        <w:rPr>
+          <w:rFonts w:ascii="Times New Roman" w:hAnsi="Times New Roman" w:eastAsia="Times New Roman"/>
+          <w:b w:val="0"/>
+          <w:sz w:val="24"/>
+        </w:rPr>
+        <w:t>Read car catalog from Supabase</w:t>
+      </w:r>
+    </w:p>
+    <w:p>
+      <w:pPr>
+        <w:spacing w:line="240" w:lineRule="auto" w:after="120"/>
+        <w:ind w:left="0"/>
+      </w:pPr>
+      <w:r>
+        <w:rPr>
+          <w:rFonts w:ascii="Courier New" w:hAnsi="Courier New" w:eastAsia="Courier New"/>
+          <w:sz w:val="14"/>
+        </w:rPr>
+        <w:t>import { createClient } from "@/lib/supabase/server";</w:t>
+        <w:br/>
+        <w:t>import { mapCarRow, type Car } from "@/lib/car-catalog";</w:t>
+        <w:br/>
+        <w:br/>
+        <w:t>export type { Car, CarFilterState } from "@/lib/car-catalog";</w:t>
+        <w:br/>
+        <w:t>export {</w:t>
+        <w:br/>
+        <w:t xml:space="preserve">  filterCars,</w:t>
+        <w:br/>
+        <w:t xml:space="preserve">  getDistinctFuels,</w:t>
+        <w:br/>
+        <w:t xml:space="preserve">  getDistinctSeatCounts,</w:t>
+        <w:br/>
+        <w:t>} from "@/lib/car-catalog";</w:t>
+        <w:br/>
+        <w:br/>
+        <w:t>export async function getAllCars(): Promise&lt;Car[]&gt; {</w:t>
+        <w:br/>
+        <w:t xml:space="preserve">  const supabase = createClient();</w:t>
+        <w:br/>
+        <w:t xml:space="preserve">  const { data, error } = await supabase</w:t>
+        <w:br/>
+        <w:t xml:space="preserve">    .from("cars")</w:t>
+        <w:br/>
+        <w:t xml:space="preserve">    .select("*")</w:t>
+        <w:br/>
+        <w:t xml:space="preserve">    .order("id");</w:t>
+        <w:br/>
+        <w:br/>
+        <w:t xml:space="preserve">  if (error) {</w:t>
+        <w:br/>
+        <w:t xml:space="preserve">    throw new Error(`Failed to load cars: ${error.message}`);</w:t>
+        <w:br/>
+        <w:t xml:space="preserve">  }</w:t>
+        <w:br/>
+        <w:br/>
+        <w:t xml:space="preserve">  return (data ?? []).map(mapCarRow);</w:t>
+        <w:br/>
+        <w:t>}</w:t>
+        <w:br/>
+        <w:br/>
+        <w:t>export async function getCarById(</w:t>
+        <w:br/>
+        <w:t xml:space="preserve">  id: string | number</w:t>
+        <w:br/>
+        <w:t>): Promise&lt;Car | undefined&gt; {</w:t>
+        <w:br/>
+        <w:t xml:space="preserve">  const n = typeof id === "string" ? Number.parseInt(id, 10) : id;</w:t>
+        <w:br/>
+        <w:t xml:space="preserve">  if (Number.isNaN(n)) return undefined;</w:t>
+        <w:br/>
+        <w:br/>
+        <w:t xml:space="preserve">  const supabase = createClient();</w:t>
+        <w:br/>
+        <w:t xml:space="preserve">  const { data, error } = await supabase</w:t>
+        <w:br/>
+        <w:t xml:space="preserve">    .from("cars")</w:t>
+        <w:br/>
+        <w:t xml:space="preserve">    .select("*")</w:t>
+        <w:br/>
+        <w:t xml:space="preserve">    .eq("id", n)</w:t>
+        <w:br/>
+        <w:t xml:space="preserve">    .maybeSingle();</w:t>
+        <w:br/>
+        <w:br/>
+        <w:t xml:space="preserve">  if (error) {</w:t>
+        <w:br/>
+        <w:t xml:space="preserve">    throw new Error(`Failed to load car: ${error.message}`);</w:t>
+        <w:br/>
+        <w:t xml:space="preserve">  }</w:t>
+        <w:br/>
+        <w:br/>
+        <w:t xml:space="preserve">  return data ? mapCarRow(data) : undefined;</w:t>
+        <w:br/>
+        <w:t>}</w:t>
+      </w:r>
+    </w:p>
+    <w:p>
+      <w:pPr>
+        <w:spacing w:before="160" w:after="40"/>
+      </w:pPr>
+      <w:r>
+        <w:rPr>
+          <w:rFonts w:ascii="Times New Roman" w:hAnsi="Times New Roman" w:eastAsia="Times New Roman"/>
+          <w:b/>
+          <w:sz w:val="18"/>
+        </w:rPr>
+        <w:t>lib/bookings.ts</w:t>
+      </w:r>
+    </w:p>
+    <w:p>
+      <w:pPr>
+        <w:spacing w:after="120" w:line="276" w:lineRule="auto"/>
+      </w:pPr>
+      <w:r>
+        <w:rPr>
+          <w:rFonts w:ascii="Times New Roman" w:hAnsi="Times New Roman" w:eastAsia="Times New Roman"/>
+          <w:b w:val="0"/>
+          <w:sz w:val="24"/>
+        </w:rPr>
+        <w:t>Booking queries, joins, and inserts</w:t>
+      </w:r>
+    </w:p>
+    <w:p>
+      <w:pPr>
+        <w:spacing w:line="240" w:lineRule="auto" w:after="120"/>
+        <w:ind w:left="0"/>
+      </w:pPr>
+      <w:r>
+        <w:rPr>
+          <w:rFonts w:ascii="Courier New" w:hAnsi="Courier New" w:eastAsia="Courier New"/>
+          <w:sz w:val="14"/>
+        </w:rPr>
+        <w:t>import { createClient } from "@/lib/supabase/server";</w:t>
+        <w:br/>
+        <w:br/>
+        <w:t>export type Booking = {</w:t>
+        <w:br/>
+        <w:t xml:space="preserve">  id: number;</w:t>
+        <w:br/>
+        <w:t xml:space="preserve">  userId: string;</w:t>
+        <w:br/>
+        <w:t xml:space="preserve">  carId: number;</w:t>
+        <w:br/>
+        <w:t xml:space="preserve">  pickupDate: string;</w:t>
+        <w:br/>
+        <w:t xml:space="preserve">  returnDate: string;</w:t>
+        <w:br/>
+        <w:t xml:space="preserve">  totalPrice: number;</w:t>
+        <w:br/>
+        <w:t xml:space="preserve">  status: string;</w:t>
+        <w:br/>
+        <w:t>};</w:t>
+        <w:br/>
+        <w:br/>
+        <w:t>export { computeBookingTotal, billableRentalDays } from "@/lib/booking-math";</w:t>
+        <w:br/>
+        <w:t>export const BOOKING_STATUSES = [</w:t>
+        <w:br/>
+        <w:t xml:space="preserve">  "confirmed",</w:t>
+        <w:br/>
+        <w:t xml:space="preserve">  "pending",</w:t>
+        <w:br/>
+        <w:t xml:space="preserve">  "completed",</w:t>
+        <w:br/>
+        <w:t xml:space="preserve">  "cancelled",</w:t>
+        <w:br/>
+        <w:t>] as const;</w:t>
+        <w:br/>
+        <w:br/>
+        <w:t>type BookingRow = {</w:t>
+        <w:br/>
+        <w:t xml:space="preserve">  id: number;</w:t>
+        <w:br/>
+        <w:t xml:space="preserve">  user_id: string;</w:t>
+        <w:br/>
+        <w:t xml:space="preserve">  car_id: number;</w:t>
+        <w:br/>
+        <w:t xml:space="preserve">  pickup_date: string;</w:t>
+        <w:br/>
+        <w:t xml:space="preserve">  return_date: string;</w:t>
+        <w:br/>
+        <w:t xml:space="preserve">  total_price: number;</w:t>
+        <w:br/>
+        <w:t xml:space="preserve">  status: string;</w:t>
+        <w:br/>
+        <w:t>};</w:t>
+        <w:br/>
+        <w:br/>
+        <w:t>function mapBookingRow(row: BookingRow): Booking {</w:t>
+        <w:br/>
+        <w:t xml:space="preserve">  return {</w:t>
+        <w:br/>
+        <w:t xml:space="preserve">    id: row.id,</w:t>
+        <w:br/>
+        <w:t xml:space="preserve">    userId: row.user_id,</w:t>
+        <w:br/>
+        <w:t xml:space="preserve">    carId: row.car_id,</w:t>
+        <w:br/>
+        <w:t xml:space="preserve">    pickupDate: row.pickup_date,</w:t>
+        <w:br/>
+        <w:t xml:space="preserve">    returnDate: row.return_date,</w:t>
+        <w:br/>
+        <w:t xml:space="preserve">    totalPrice: row.total_price,</w:t>
+        <w:br/>
+        <w:t xml:space="preserve">    status: row.status,</w:t>
+        <w:br/>
+        <w:t xml:space="preserve">  };</w:t>
+        <w:br/>
+        <w:t>}</w:t>
+        <w:br/>
+        <w:br/>
+        <w:t>export async function readBookings(): Promise&lt;Booking[]&gt; {</w:t>
+        <w:br/>
+        <w:t xml:space="preserve">  const supabase = createClient();</w:t>
+        <w:br/>
+        <w:t xml:space="preserve">  const { data, error } = await supabase</w:t>
+        <w:br/>
+        <w:t xml:space="preserve">    .from("bookings")</w:t>
+        <w:br/>
+        <w:t xml:space="preserve">    .select("*")</w:t>
+        <w:br/>
+        <w:t xml:space="preserve">    .order("id", { ascending: false });</w:t>
+        <w:br/>
+        <w:br/>
+        <w:t xml:space="preserve">  if (error) {</w:t>
+        <w:br/>
+        <w:t xml:space="preserve">    throw new Error(`Failed to load bookings: ${error.message}`);</w:t>
+        <w:br/>
+        <w:t xml:space="preserve">  }</w:t>
+        <w:br/>
+        <w:br/>
+        <w:t xml:space="preserve">  return (data ?? []).map(mapBookingRow);</w:t>
+        <w:br/>
+        <w:t>}</w:t>
+        <w:br/>
+        <w:br/>
+        <w:t>export async function getBookingsForUser(userId: string): Promise&lt;Booking[]&gt; {</w:t>
+        <w:br/>
+        <w:t xml:space="preserve">  const supabase = createClient();</w:t>
+        <w:br/>
+        <w:t xml:space="preserve">  const { data, error } = await supabase</w:t>
+        <w:br/>
+        <w:t xml:space="preserve">    .from("bookings")</w:t>
+        <w:br/>
+        <w:t xml:space="preserve">    .select("*")</w:t>
+        <w:br/>
+        <w:t xml:space="preserve">    .eq("user_id", userId)</w:t>
+        <w:br/>
+        <w:t xml:space="preserve">    .order("id", { ascending: false });</w:t>
+        <w:br/>
+        <w:br/>
+        <w:t xml:space="preserve">  if (error) {</w:t>
+        <w:br/>
+        <w:t xml:space="preserve">    throw new Error(`Failed to load bookings: ${error.message}`);</w:t>
+        <w:br/>
+        <w:t xml:space="preserve">  }</w:t>
+        <w:br/>
+        <w:br/>
+        <w:t xml:space="preserve">  return (data ?? []).map(mapBookingRow);</w:t>
+        <w:br/>
+        <w:t>}</w:t>
+        <w:br/>
+        <w:br/>
+        <w:t>export type BookingWithCar = Booking &amp; { carName: string };</w:t>
+        <w:br/>
+        <w:br/>
+        <w:t>export async function getBookingsWithCarForUser(</w:t>
+        <w:br/>
+        <w:t xml:space="preserve">  userId: string</w:t>
+        <w:br/>
+        <w:t>): Promise&lt;BookingWithCar[]&gt; {</w:t>
+        <w:br/>
+        <w:t xml:space="preserve">  const supabase = createClient();</w:t>
+        <w:br/>
+        <w:t xml:space="preserve">  const { data, error } = await supabase</w:t>
+        <w:br/>
+        <w:t xml:space="preserve">    .from("bookings")</w:t>
+        <w:br/>
+        <w:t xml:space="preserve">    .select("*, cars(name)")</w:t>
+        <w:br/>
+        <w:t xml:space="preserve">    .eq("user_id", userId)</w:t>
+        <w:br/>
+        <w:t xml:space="preserve">    .order("id", { ascending: false });</w:t>
+        <w:br/>
+        <w:br/>
+        <w:t xml:space="preserve">  if (error) {</w:t>
+        <w:br/>
+        <w:t xml:space="preserve">    throw new Error(`Failed to load bookings: ${error.message}`);</w:t>
+        <w:br/>
+        <w:t xml:space="preserve">  }</w:t>
+        <w:br/>
+        <w:br/>
+        <w:t xml:space="preserve">  return (data ?? []).map((row) =&gt; {</w:t>
+        <w:br/>
+        <w:t xml:space="preserve">    const cars = row.cars as { name: string } | { name: string }[] | null;</w:t>
+        <w:br/>
+        <w:t xml:space="preserve">    const carName = Array.isArray(cars)</w:t>
+        <w:br/>
+        <w:t xml:space="preserve">      ? cars[0]?.name</w:t>
+        <w:br/>
+        <w:t xml:space="preserve">      : cars?.name;</w:t>
+        <w:br/>
+        <w:br/>
+        <w:t xml:space="preserve">    return {</w:t>
+        <w:br/>
+        <w:t xml:space="preserve">      ...mapBookingRow(row as BookingRow),</w:t>
+        <w:br/>
+        <w:t xml:space="preserve">      carName: carName ?? `Car #${row.car_id}`,</w:t>
+        <w:br/>
+        <w:t xml:space="preserve">    };</w:t>
+        <w:br/>
+        <w:t xml:space="preserve">  });</w:t>
+        <w:br/>
+        <w:t>}</w:t>
+        <w:br/>
+        <w:br/>
+        <w:t>export async function appendBooking(row: Omit&lt;Booking, "id"&gt;): Promise&lt;Booking&gt; {</w:t>
+        <w:br/>
+        <w:t xml:space="preserve">  const supabase = createClient();</w:t>
+        <w:br/>
+        <w:t xml:space="preserve">  const { data, error } = await supabase</w:t>
+        <w:br/>
+        <w:t xml:space="preserve">    .from("bookings")</w:t>
+        <w:br/>
+        <w:t xml:space="preserve">    .insert({</w:t>
+        <w:br/>
+        <w:t xml:space="preserve">      user_id: row.userId,</w:t>
+        <w:br/>
+        <w:t xml:space="preserve">      car_id: row.carId,</w:t>
+        <w:br/>
+        <w:t xml:space="preserve">      pickup_date: row.pickupDate,</w:t>
+        <w:br/>
+        <w:t xml:space="preserve">      return_date: row.returnDate,</w:t>
+        <w:br/>
+        <w:t xml:space="preserve">      total_price: row.totalPrice,</w:t>
+        <w:br/>
+        <w:t xml:space="preserve">      status: row.status,</w:t>
+        <w:br/>
+        <w:t xml:space="preserve">    })</w:t>
+        <w:br/>
+        <w:t xml:space="preserve">    .select("*")</w:t>
+        <w:br/>
+        <w:t xml:space="preserve">    .single();</w:t>
+        <w:br/>
+        <w:br/>
+        <w:t xml:space="preserve">  if (error || !data) {</w:t>
+        <w:br/>
+        <w:t xml:space="preserve">    throw new Error(`Failed to create booking: ${error?.message ?? "unknown"}`);</w:t>
+        <w:br/>
+        <w:t xml:space="preserve">  }</w:t>
+        <w:br/>
+        <w:br/>
+        <w:t xml:space="preserve">  return mapBookingRow(data);</w:t>
+        <w:br/>
+        <w:t>}</w:t>
+        <w:br/>
+        <w:br/>
+        <w:t>export type AdminBookingRow = Booking &amp; {</w:t>
+        <w:br/>
+        <w:t xml:space="preserve">  userEmail: string;</w:t>
+        <w:br/>
+        <w:t xml:space="preserve">  userName: string;</w:t>
+        <w:br/>
+        <w:t xml:space="preserve">  carName: string;</w:t>
+        <w:br/>
+        <w:t>};</w:t>
+        <w:br/>
+        <w:br/>
+        <w:t>export async function getAllBookingsDetailed(): Promise&lt;AdminBookingRow[]&gt; {</w:t>
+        <w:br/>
+        <w:t xml:space="preserve">  const supabase = createClient();</w:t>
+        <w:br/>
+        <w:t xml:space="preserve">  const { data, error } = await supabase</w:t>
+        <w:br/>
+        <w:t xml:space="preserve">    .from("bookings")</w:t>
+        <w:br/>
+        <w:t xml:space="preserve">    .select("*, cars(name), profiles(name, email)")</w:t>
+        <w:br/>
+        <w:t xml:space="preserve">    .order("id", { ascending: false });</w:t>
+        <w:br/>
+        <w:br/>
+        <w:t xml:space="preserve">  if (error) {</w:t>
+        <w:br/>
+        <w:t xml:space="preserve">    throw new Error(`Failed to load bookings: ${error.message}`);</w:t>
+        <w:br/>
+        <w:t xml:space="preserve">  }</w:t>
+        <w:br/>
+        <w:br/>
+        <w:t xml:space="preserve">  return (data ?? []).map((row) =&gt; {</w:t>
+        <w:br/>
+        <w:t xml:space="preserve">    const cars = row.cars as { name: string } | { name: string }[] | null;</w:t>
+        <w:br/>
+        <w:t xml:space="preserve">    const profiles = row.profiles as</w:t>
+        <w:br/>
+        <w:t xml:space="preserve">      | { name: string; email: string | null }</w:t>
+        <w:br/>
+        <w:t xml:space="preserve">      | { name: string; email: string | null }[]</w:t>
+        <w:br/>
+        <w:t xml:space="preserve">      | null;</w:t>
+        <w:br/>
+        <w:t xml:space="preserve">    const carName = Array.isArray(cars) ? cars[0]?.name : cars?.name;</w:t>
+        <w:br/>
+        <w:t xml:space="preserve">    const profile = Array.isArray(profiles) ? profiles[0] : profiles;</w:t>
+        <w:br/>
+        <w:t xml:space="preserve">    const booking = mapBookingRow(row as BookingRow);</w:t>
+        <w:br/>
+        <w:br/>
+        <w:t xml:space="preserve">    return {</w:t>
+        <w:br/>
+        <w:t xml:space="preserve">      ...booking,</w:t>
+        <w:br/>
+        <w:t xml:space="preserve">      userEmail: profile?.email ?? `user-${booking.userId.slice(0, 8)}@unknown`,</w:t>
+        <w:br/>
+        <w:t xml:space="preserve">      userName: profile?.name ?? `User ${booking.userId.slice(0, 8)}`,</w:t>
+        <w:br/>
+        <w:t xml:space="preserve">      carName: carName ?? `Car #${booking.carId}`,</w:t>
+        <w:br/>
+        <w:t xml:space="preserve">    };</w:t>
+        <w:br/>
+        <w:t xml:space="preserve">  });</w:t>
+        <w:br/>
+        <w:t>}</w:t>
+        <w:br/>
+        <w:br/>
+        <w:t>export async function updateBookingStatus(</w:t>
+        <w:br/>
+        <w:t xml:space="preserve">  id: number,</w:t>
+        <w:br/>
+        <w:t xml:space="preserve">  status: (typeof BOOKING_STATUSES)[number]</w:t>
+        <w:br/>
+        <w:t>): Promise&lt;Booking | null&gt; {</w:t>
+        <w:br/>
+        <w:t xml:space="preserve">  const supabase = createClient();</w:t>
+        <w:br/>
+        <w:t xml:space="preserve">  const { data, error } = await supabase</w:t>
+        <w:br/>
+        <w:t xml:space="preserve">    .from("bookings")</w:t>
+        <w:br/>
+        <w:t xml:space="preserve">    .update({ status })</w:t>
+        <w:br/>
+        <w:t xml:space="preserve">    .eq("id", id)</w:t>
+        <w:br/>
+        <w:t xml:space="preserve">    .select("*")</w:t>
+        <w:br/>
+        <w:t xml:space="preserve">    .maybeSingle();</w:t>
+        <w:br/>
+        <w:br/>
+        <w:t xml:space="preserve">  if (error) {</w:t>
+        <w:br/>
+        <w:t xml:space="preserve">    throw new Error(`Failed to update booking: ${error.message}`);</w:t>
+        <w:br/>
+        <w:t xml:space="preserve">  }</w:t>
+        <w:br/>
+        <w:br/>
+        <w:t xml:space="preserve">  return data ? mapBookingRow(data) : null;</w:t>
+        <w:br/>
+        <w:t>}</w:t>
+      </w:r>
+    </w:p>
+    <w:p>
+      <w:pPr>
+        <w:spacing w:before="160" w:after="40"/>
+      </w:pPr>
+      <w:r>
+        <w:rPr>
+          <w:rFonts w:ascii="Times New Roman" w:hAnsi="Times New Roman" w:eastAsia="Times New Roman"/>
+          <w:b/>
+          <w:sz w:val="18"/>
+        </w:rPr>
+        <w:t>lib/cars-store.ts</w:t>
+      </w:r>
+    </w:p>
+    <w:p>
+      <w:pPr>
+        <w:spacing w:after="120" w:line="276" w:lineRule="auto"/>
+      </w:pPr>
+      <w:r>
+        <w:rPr>
+          <w:rFonts w:ascii="Times New Roman" w:hAnsi="Times New Roman" w:eastAsia="Times New Roman"/>
+          <w:b w:val="0"/>
+          <w:sz w:val="24"/>
+        </w:rPr>
+        <w:t>Admin car create, update, delete</w:t>
+      </w:r>
+    </w:p>
+    <w:p>
+      <w:pPr>
+        <w:spacing w:line="240" w:lineRule="auto" w:after="120"/>
+        <w:ind w:left="0"/>
+      </w:pPr>
+      <w:r>
+        <w:rPr>
+          <w:rFonts w:ascii="Courier New" w:hAnsi="Courier New" w:eastAsia="Courier New"/>
+          <w:sz w:val="14"/>
+        </w:rPr>
+        <w:t>import { createClient } from "@/lib/supabase/server";</w:t>
+        <w:br/>
+        <w:t>import type { Car } from "@/lib/car-catalog";</w:t>
+        <w:br/>
+        <w:t>import { mapCarRow } from "@/lib/car-catalog";</w:t>
+        <w:br/>
+        <w:br/>
+        <w:t>export async function readCars(): Promise&lt;Car[]&gt; {</w:t>
+        <w:br/>
+        <w:t xml:space="preserve">  const supabase = createClient();</w:t>
+        <w:br/>
+        <w:t xml:space="preserve">  const { data, error } = await supabase</w:t>
+        <w:br/>
+        <w:t xml:space="preserve">    .from("cars")</w:t>
+        <w:br/>
+        <w:t xml:space="preserve">    .select("*")</w:t>
+        <w:br/>
+        <w:t xml:space="preserve">    .order("id");</w:t>
+        <w:br/>
+        <w:br/>
+        <w:t xml:space="preserve">  if (error) {</w:t>
+        <w:br/>
+        <w:t xml:space="preserve">    throw new Error(`Failed to load cars: ${error.message}`);</w:t>
+        <w:br/>
+        <w:t xml:space="preserve">  }</w:t>
+        <w:br/>
+        <w:br/>
+        <w:t xml:space="preserve">  return (data ?? []).map(mapCarRow);</w:t>
+        <w:br/>
+        <w:t>}</w:t>
+        <w:br/>
+        <w:br/>
+        <w:t>export async function getCarForAdmin(id: number): Promise&lt;Car | undefined&gt; {</w:t>
+        <w:br/>
+        <w:t xml:space="preserve">  const supabase = createClient();</w:t>
+        <w:br/>
+        <w:t xml:space="preserve">  const { data, error } = await supabase</w:t>
+        <w:br/>
+        <w:t xml:space="preserve">    .from("cars")</w:t>
+        <w:br/>
+        <w:t xml:space="preserve">    .select("*")</w:t>
+        <w:br/>
+        <w:t xml:space="preserve">    .eq("id", id)</w:t>
+        <w:br/>
+        <w:t xml:space="preserve">    .maybeSingle();</w:t>
+        <w:br/>
+        <w:br/>
+        <w:t xml:space="preserve">  if (error) {</w:t>
+        <w:br/>
+        <w:t xml:space="preserve">    throw new Error(`Failed to load car: ${error.message}`);</w:t>
+        <w:br/>
+        <w:t xml:space="preserve">  }</w:t>
+        <w:br/>
+        <w:br/>
+        <w:t xml:space="preserve">  return data ? mapCarRow(data) : undefined;</w:t>
+        <w:br/>
+        <w:t>}</w:t>
+        <w:br/>
+        <w:br/>
+        <w:t>export async function createCar(input: Omit&lt;Car, "id"&gt;): Promise&lt;Car&gt; {</w:t>
+        <w:br/>
+        <w:t xml:space="preserve">  const supabase = createClient();</w:t>
+        <w:br/>
+        <w:t xml:space="preserve">  const { data, error } = await supabase</w:t>
+        <w:br/>
+        <w:t xml:space="preserve">    .from("cars")</w:t>
+        <w:br/>
+        <w:t xml:space="preserve">    .insert(input)</w:t>
+        <w:br/>
+        <w:t xml:space="preserve">    .select("*")</w:t>
+        <w:br/>
+        <w:t xml:space="preserve">    .single();</w:t>
+        <w:br/>
+        <w:br/>
+        <w:t xml:space="preserve">  if (error || !data) {</w:t>
+        <w:br/>
+        <w:t xml:space="preserve">    throw new Error(`Failed to create car: ${error?.message ?? "unknown"}`);</w:t>
+        <w:br/>
+        <w:t xml:space="preserve">  }</w:t>
+        <w:br/>
+        <w:br/>
+        <w:t xml:space="preserve">  return mapCarRow(data);</w:t>
+        <w:br/>
+        <w:t>}</w:t>
+        <w:br/>
+        <w:br/>
+        <w:t>export async function updateCar(</w:t>
+        <w:br/>
+        <w:t xml:space="preserve">  id: number,</w:t>
+        <w:br/>
+        <w:t xml:space="preserve">  input: Omit&lt;Car, "id"&gt;</w:t>
+        <w:br/>
+        <w:t>): Promise&lt;Car | null&gt; {</w:t>
+        <w:br/>
+        <w:t xml:space="preserve">  const supabase = createClient();</w:t>
+        <w:br/>
+        <w:t xml:space="preserve">  const { data, error } = await supabase</w:t>
+        <w:br/>
+        <w:t xml:space="preserve">    .from("cars")</w:t>
+        <w:br/>
+        <w:t xml:space="preserve">    .update(input)</w:t>
+        <w:br/>
+        <w:t xml:space="preserve">    .eq("id", id)</w:t>
+        <w:br/>
+        <w:t xml:space="preserve">    .select("*")</w:t>
+        <w:br/>
+        <w:t xml:space="preserve">    .maybeSingle();</w:t>
+        <w:br/>
+        <w:br/>
+        <w:t xml:space="preserve">  if (error) {</w:t>
+        <w:br/>
+        <w:t xml:space="preserve">    throw new Error(`Failed to update car: ${error.message}`);</w:t>
+        <w:br/>
+        <w:t xml:space="preserve">  }</w:t>
+        <w:br/>
+        <w:br/>
+        <w:t xml:space="preserve">  return data ? mapCarRow(data) : null;</w:t>
+        <w:br/>
+        <w:t>}</w:t>
+        <w:br/>
+        <w:br/>
+        <w:t>export async function deleteCar(id: number): Promise&lt;boolean&gt; {</w:t>
+        <w:br/>
+        <w:t xml:space="preserve">  const supabase = createClient();</w:t>
+        <w:br/>
+        <w:t xml:space="preserve">  const { error, count } = await supabase</w:t>
+        <w:br/>
+        <w:t xml:space="preserve">    .from("cars")</w:t>
+        <w:br/>
+        <w:t xml:space="preserve">    .delete({ count: "exact" })</w:t>
+        <w:br/>
+        <w:t xml:space="preserve">    .eq("id", id);</w:t>
+        <w:br/>
+        <w:br/>
+        <w:t xml:space="preserve">  if (error) {</w:t>
+        <w:br/>
+        <w:t xml:space="preserve">    throw new Error(`Failed to delete car: ${error.message}`);</w:t>
+        <w:br/>
+        <w:t xml:space="preserve">  }</w:t>
+        <w:br/>
+        <w:br/>
+        <w:t xml:space="preserve">  return (count ?? 0) &gt; 0;</w:t>
+        <w:br/>
+        <w:t>}</w:t>
+        <w:br/>
+        <w:br/>
+        <w:t>export async function getCarStats() {</w:t>
+        <w:br/>
+        <w:t xml:space="preserve">  const supabase = createClient();</w:t>
+        <w:br/>
+        <w:t xml:space="preserve">  const { count: totalCars, error: totalError } = await supabase</w:t>
+        <w:br/>
+        <w:t xml:space="preserve">    .from("cars")</w:t>
+        <w:br/>
+        <w:t xml:space="preserve">    .select("*", { count: "exact", head: true });</w:t>
+        <w:br/>
+        <w:br/>
+        <w:t xml:space="preserve">  if (totalError) {</w:t>
+        <w:br/>
+        <w:t xml:space="preserve">    throw new Error(`Failed to count cars: ${totalError.message}`);</w:t>
+        <w:br/>
+        <w:t xml:space="preserve">  }</w:t>
+        <w:br/>
+        <w:br/>
+        <w:t xml:space="preserve">  const { count: availableCars, error: availableError } = await supabase</w:t>
+        <w:br/>
+        <w:t xml:space="preserve">    .from("cars")</w:t>
+        <w:br/>
+        <w:t xml:space="preserve">    .select("*", { count: "exact", head: true })</w:t>
+        <w:br/>
+        <w:t xml:space="preserve">    .eq("available", true);</w:t>
+        <w:br/>
+        <w:br/>
+        <w:t xml:space="preserve">  if (availableError) {</w:t>
+        <w:br/>
+        <w:t xml:space="preserve">    throw new Error(`Failed to count available cars: ${availableError.message}`);</w:t>
+        <w:br/>
+        <w:t xml:space="preserve">  }</w:t>
+        <w:br/>
+        <w:br/>
+        <w:t xml:space="preserve">  const total = totalCars ?? 0;</w:t>
+        <w:br/>
+        <w:t xml:space="preserve">  const available = availableCars ?? 0;</w:t>
+        <w:br/>
+        <w:br/>
+        <w:t xml:space="preserve">  return {</w:t>
+        <w:br/>
+        <w:t xml:space="preserve">    totalCars: total,</w:t>
+        <w:br/>
+        <w:t xml:space="preserve">    availableCars: available,</w:t>
+        <w:br/>
+        <w:t xml:space="preserve">    unavailableCars: total - available,</w:t>
+        <w:br/>
+        <w:t xml:space="preserve">  };</w:t>
+        <w:br/>
+        <w:t>}</w:t>
+      </w:r>
+    </w:p>
+    <w:p>
+      <w:pPr>
+        <w:spacing w:before="160" w:after="40"/>
+      </w:pPr>
+      <w:r>
+        <w:rPr>
+          <w:rFonts w:ascii="Times New Roman" w:hAnsi="Times New Roman" w:eastAsia="Times New Roman"/>
+          <w:b/>
+          <w:sz w:val="18"/>
+        </w:rPr>
+        <w:t>lib/booking-math.ts</w:t>
+      </w:r>
+    </w:p>
+    <w:p>
+      <w:pPr>
+        <w:spacing w:after="120" w:line="276" w:lineRule="auto"/>
+      </w:pPr>
+      <w:r>
+        <w:rPr>
+          <w:rFonts w:ascii="Times New Roman" w:hAnsi="Times New Roman" w:eastAsia="Times New Roman"/>
+          <w:b w:val="0"/>
+          <w:sz w:val="24"/>
+        </w:rPr>
+        <w:t>Rental day count and total price calculation</w:t>
+      </w:r>
+    </w:p>
+    <w:p>
+      <w:pPr>
+        <w:spacing w:line="240" w:lineRule="auto" w:after="120"/>
+        <w:ind w:left="0"/>
+      </w:pPr>
+      <w:r>
+        <w:rPr>
+          <w:rFonts w:ascii="Courier New" w:hAnsi="Courier New" w:eastAsia="Courier New"/>
+          <w:sz w:val="14"/>
+        </w:rPr>
+        <w:t>function parseLocalDate(isoDate: string): Date | null {</w:t>
+        <w:br/>
+        <w:t xml:space="preserve">  const m = /^(\d{4})-(\d{2})-(\d{2})$/.exec(isoDate.trim());</w:t>
+        <w:br/>
+        <w:t xml:space="preserve">  if (!m) return null;</w:t>
+        <w:br/>
+        <w:t xml:space="preserve">  const y = Number(m[1]);</w:t>
+        <w:br/>
+        <w:t xml:space="preserve">  const mo = Number(m[2]);</w:t>
+        <w:br/>
+        <w:t xml:space="preserve">  const d = Number(m[3]);</w:t>
+        <w:br/>
+        <w:t xml:space="preserve">  if (!y || mo &lt; 1 || mo &gt; 12 || d &lt; 1 || d &gt; 31) return null;</w:t>
+        <w:br/>
+        <w:t xml:space="preserve">  const dt = new Date(y, mo - 1, d);</w:t>
+        <w:br/>
+        <w:t xml:space="preserve">  if (</w:t>
+        <w:br/>
+        <w:t xml:space="preserve">    dt.getFullYear() !== y ||</w:t>
+        <w:br/>
+        <w:t xml:space="preserve">    dt.getMonth() !== mo - 1 ||</w:t>
+        <w:br/>
+        <w:t xml:space="preserve">    dt.getDate() !== d</w:t>
+        <w:br/>
+        <w:t xml:space="preserve">  ) {</w:t>
+        <w:br/>
+        <w:t xml:space="preserve">    return null;</w:t>
+        <w:br/>
+        <w:t xml:space="preserve">  }</w:t>
+        <w:br/>
+        <w:t xml:space="preserve">  return dt;</w:t>
+        <w:br/>
+        <w:t>}</w:t>
+        <w:br/>
+        <w:br/>
+        <w:t>/** Inclusive calendar days (pickup and return both count as rental days). */</w:t>
+        <w:br/>
+        <w:t>export function billableRentalDays(</w:t>
+        <w:br/>
+        <w:t xml:space="preserve">  pickupDate: string,</w:t>
+        <w:br/>
+        <w:t xml:space="preserve">  returnDate: string</w:t>
+        <w:br/>
+        <w:t>): number | null {</w:t>
+        <w:br/>
+        <w:t xml:space="preserve">  const pickup = parseLocalDate(pickupDate);</w:t>
+        <w:br/>
+        <w:t xml:space="preserve">  const ret = parseLocalDate(returnDate);</w:t>
+        <w:br/>
+        <w:t xml:space="preserve">  if (!pickup || !ret) return null;</w:t>
+        <w:br/>
+        <w:t xml:space="preserve">  const diffDays = Math.round(</w:t>
+        <w:br/>
+        <w:t xml:space="preserve">    (ret.getTime() - pickup.getTime()) / (1000 * 60 * 60 * 24)</w:t>
+        <w:br/>
+        <w:t xml:space="preserve">  );</w:t>
+        <w:br/>
+        <w:t xml:space="preserve">  if (diffDays &lt; 0) return null;</w:t>
+        <w:br/>
+        <w:t xml:space="preserve">  return diffDays + 1;</w:t>
+        <w:br/>
+        <w:t>}</w:t>
+        <w:br/>
+        <w:br/>
+        <w:t>export function computeBookingTotal(</w:t>
+        <w:br/>
+        <w:t xml:space="preserve">  pricePerDay: number,</w:t>
+        <w:br/>
+        <w:t xml:space="preserve">  pickupDate: string,</w:t>
+        <w:br/>
+        <w:t xml:space="preserve">  returnDate: string</w:t>
+        <w:br/>
+        <w:t>): { days: number; totalPrice: number } | null {</w:t>
+        <w:br/>
+        <w:t xml:space="preserve">  const days = billableRentalDays(pickupDate, returnDate);</w:t>
+        <w:br/>
+        <w:t xml:space="preserve">  if (days === null || days &lt; 1) return null;</w:t>
+        <w:br/>
+        <w:t xml:space="preserve">  return { days, totalPrice: days * pricePerDay };</w:t>
+        <w:br/>
+        <w:t>}</w:t>
+      </w:r>
+    </w:p>
+    <w:p>
+      <w:pPr>
+        <w:spacing w:before="160" w:after="40"/>
+      </w:pPr>
+      <w:r>
+        <w:rPr>
+          <w:rFonts w:ascii="Times New Roman" w:hAnsi="Times New Roman" w:eastAsia="Times New Roman"/>
+          <w:b/>
+          <w:sz w:val="18"/>
+        </w:rPr>
+        <w:t>lib/car-catalog.ts</w:t>
+      </w:r>
+    </w:p>
+    <w:p>
+      <w:pPr>
+        <w:spacing w:after="120" w:line="276" w:lineRule="auto"/>
+      </w:pPr>
+      <w:r>
+        <w:rPr>
+          <w:rFonts w:ascii="Times New Roman" w:hAnsi="Times New Roman" w:eastAsia="Times New Roman"/>
+          <w:b w:val="0"/>
+          <w:sz w:val="24"/>
+        </w:rPr>
+        <w:t>Client-safe catalog filter helpers</w:t>
+      </w:r>
+    </w:p>
+    <w:p>
+      <w:pPr>
+        <w:spacing w:line="240" w:lineRule="auto" w:after="120"/>
+        <w:ind w:left="0"/>
+      </w:pPr>
+      <w:r>
+        <w:rPr>
+          <w:rFonts w:ascii="Courier New" w:hAnsi="Courier New" w:eastAsia="Courier New"/>
+          <w:sz w:val="14"/>
+        </w:rPr>
+        <w:t>export type Car = {</w:t>
+        <w:br/>
+        <w:t xml:space="preserve">  id: number;</w:t>
+        <w:br/>
+        <w:t xml:space="preserve">  name: string;</w:t>
+        <w:br/>
+        <w:t xml:space="preserve">  seats: number;</w:t>
+        <w:br/>
+        <w:t xml:space="preserve">  fuel: string;</w:t>
+        <w:br/>
+        <w:t xml:space="preserve">  price: number;</w:t>
+        <w:br/>
+        <w:t xml:space="preserve">  available: boolean;</w:t>
+        <w:br/>
+        <w:t xml:space="preserve">  images: string[];</w:t>
+        <w:br/>
+        <w:t xml:space="preserve">  description: string;</w:t>
+        <w:br/>
+        <w:t>};</w:t>
+        <w:br/>
+        <w:br/>
+        <w:t>export function mapCarRow(row: {</w:t>
+        <w:br/>
+        <w:t xml:space="preserve">  id: number;</w:t>
+        <w:br/>
+        <w:t xml:space="preserve">  name: string;</w:t>
+        <w:br/>
+        <w:t xml:space="preserve">  seats: number;</w:t>
+        <w:br/>
+        <w:t xml:space="preserve">  fuel: string;</w:t>
+        <w:br/>
+        <w:t xml:space="preserve">  price: number;</w:t>
+        <w:br/>
+        <w:t xml:space="preserve">  available: boolean;</w:t>
+        <w:br/>
+        <w:t xml:space="preserve">  images: string[];</w:t>
+        <w:br/>
+        <w:t xml:space="preserve">  description: string;</w:t>
+        <w:br/>
+        <w:t>}): Car {</w:t>
+        <w:br/>
+        <w:t xml:space="preserve">  return {</w:t>
+        <w:br/>
+        <w:t xml:space="preserve">    id: row.id,</w:t>
+        <w:br/>
+        <w:t xml:space="preserve">    name: row.name,</w:t>
+        <w:br/>
+        <w:t xml:space="preserve">    seats: row.seats,</w:t>
+        <w:br/>
+        <w:t xml:space="preserve">    fuel: row.fuel,</w:t>
+        <w:br/>
+        <w:t xml:space="preserve">    price: row.price,</w:t>
+        <w:br/>
+        <w:t xml:space="preserve">    available: row.available,</w:t>
+        <w:br/>
+        <w:t xml:space="preserve">    images: row.images ?? [],</w:t>
+        <w:br/>
+        <w:t xml:space="preserve">    description: row.description,</w:t>
+        <w:br/>
+        <w:t xml:space="preserve">  };</w:t>
+        <w:br/>
+        <w:t>}</w:t>
+        <w:br/>
+        <w:br/>
+        <w:t>export function getDistinctFuels(carsList: Car[]): string[] {</w:t>
+        <w:br/>
+        <w:t xml:space="preserve">  return Array.from(new Set(carsList.map((c) =&gt; c.fuel))).sort();</w:t>
+        <w:br/>
+        <w:t>}</w:t>
+        <w:br/>
+        <w:br/>
+        <w:t>export function getDistinctSeatCounts(carsList: Car[]): number[] {</w:t>
+        <w:br/>
+        <w:t xml:space="preserve">  return Array.from(new Set(carsList.map((c) =&gt; c.seats))).sort(</w:t>
+        <w:br/>
+        <w:t xml:space="preserve">    (a, b) =&gt; a - b</w:t>
+        <w:br/>
+        <w:t xml:space="preserve">  );</w:t>
+        <w:br/>
+        <w:t>}</w:t>
+        <w:br/>
+        <w:br/>
+        <w:t>export type CarFilterState = {</w:t>
+        <w:br/>
+        <w:t xml:space="preserve">  query: string;</w:t>
+        <w:br/>
+        <w:t xml:space="preserve">  fuel: string;</w:t>
+        <w:br/>
+        <w:t xml:space="preserve">  seats: string;</w:t>
+        <w:br/>
+        <w:t xml:space="preserve">  maxPrice: string;</w:t>
+        <w:br/>
+        <w:t>};</w:t>
+        <w:br/>
+        <w:br/>
+        <w:t>export function filterCars(list: Car[], f: CarFilterState): Car[] {</w:t>
+        <w:br/>
+        <w:t xml:space="preserve">  const q = f.query.trim().toLowerCase();</w:t>
+        <w:br/>
+        <w:t xml:space="preserve">  return list.filter((car) =&gt; {</w:t>
+        <w:br/>
+        <w:t xml:space="preserve">    if (q &amp;&amp; !car.name.toLowerCase().includes(q)) return false;</w:t>
+        <w:br/>
+        <w:t xml:space="preserve">    if (f.fuel !== "all" &amp;&amp; car.fuel !== f.fuel) return false;</w:t>
+        <w:br/>
+        <w:t xml:space="preserve">    if (f.seats !== "all" &amp;&amp; String(car.seats) !== f.seats) return false;</w:t>
+        <w:br/>
+        <w:t xml:space="preserve">    if (f.maxPrice !== "all") {</w:t>
+        <w:br/>
+        <w:t xml:space="preserve">      const max = Number(f.maxPrice);</w:t>
+        <w:br/>
+        <w:t xml:space="preserve">      if (!Number.isNaN(max) &amp;&amp; car.price &gt; max) return false;</w:t>
+        <w:br/>
+        <w:t xml:space="preserve">    }</w:t>
+        <w:br/>
+        <w:t xml:space="preserve">    return true;</w:t>
+        <w:br/>
+        <w:t xml:space="preserve">  });</w:t>
+        <w:br/>
+        <w:t>}</w:t>
+      </w:r>
+    </w:p>
+    <w:p>
+      <w:pPr>
+        <w:spacing w:before="160" w:after="40"/>
+      </w:pPr>
+      <w:r>
+        <w:rPr>
+          <w:rFonts w:ascii="Times New Roman" w:hAnsi="Times New Roman" w:eastAsia="Times New Roman"/>
+          <w:b/>
+          <w:sz w:val="18"/>
+        </w:rPr>
+        <w:t>lib/admin-auth.ts</w:t>
+      </w:r>
+    </w:p>
+    <w:p>
+      <w:pPr>
+        <w:spacing w:after="120" w:line="276" w:lineRule="auto"/>
+      </w:pPr>
+      <w:r>
+        <w:rPr>
+          <w:rFonts w:ascii="Times New Roman" w:hAnsi="Times New Roman" w:eastAsia="Times New Roman"/>
+          <w:b w:val="0"/>
+          <w:sz w:val="24"/>
+        </w:rPr>
+        <w:t>Admin layout authorization guard</w:t>
+      </w:r>
+    </w:p>
+    <w:p>
+      <w:pPr>
+        <w:spacing w:line="240" w:lineRule="auto" w:after="120"/>
+        <w:ind w:left="0"/>
+      </w:pPr>
+      <w:r>
+        <w:rPr>
+          <w:rFonts w:ascii="Courier New" w:hAnsi="Courier New" w:eastAsia="Courier New"/>
+          <w:sz w:val="14"/>
+        </w:rPr>
+        <w:t>import { redirect } from "next/navigation";</w:t>
+        <w:br/>
+        <w:t>import { getSessionUser, type SessionPayload } from "@/lib/auth";</w:t>
+        <w:br/>
+        <w:br/>
+        <w:t>export async function requireAdminUser(): Promise&lt;SessionPayload&gt; {</w:t>
+        <w:br/>
+        <w:t xml:space="preserve">  const user = await getSessionUser();</w:t>
+        <w:br/>
+        <w:br/>
+        <w:t xml:space="preserve">  if (!user) {</w:t>
+        <w:br/>
+        <w:t xml:space="preserve">    redirect("/login?callbackUrl=/admin/dashboard");</w:t>
+        <w:br/>
+        <w:t xml:space="preserve">  }</w:t>
+        <w:br/>
+        <w:br/>
+        <w:t xml:space="preserve">  if (user.role !== "admin") {</w:t>
+        <w:br/>
+        <w:t xml:space="preserve">    redirect("/");</w:t>
+        <w:br/>
+        <w:t xml:space="preserve">  }</w:t>
+        <w:br/>
+        <w:br/>
+        <w:t xml:space="preserve">  return user;</w:t>
+        <w:br/>
+        <w:t>}</w:t>
+      </w:r>
+    </w:p>
+    <w:p>
+      <w:pPr>
+        <w:spacing w:before="160" w:after="40"/>
+      </w:pPr>
+      <w:r>
+        <w:rPr>
+          <w:rFonts w:ascii="Times New Roman" w:hAnsi="Times New Roman" w:eastAsia="Times New Roman"/>
+          <w:b/>
+          <w:sz w:val="18"/>
+        </w:rPr>
+        <w:t>supabase/migrations/001_initial_schema.sql</w:t>
+      </w:r>
+    </w:p>
+    <w:p>
+      <w:pPr>
+        <w:spacing w:after="120" w:line="276" w:lineRule="auto"/>
+      </w:pPr>
+      <w:r>
+        <w:rPr>
+          <w:rFonts w:ascii="Times New Roman" w:hAnsi="Times New Roman" w:eastAsia="Times New Roman"/>
+          <w:b w:val="0"/>
+          <w:sz w:val="24"/>
+        </w:rPr>
+        <w:t>PostgreSQL schema, RLS policies, profile trigger</w:t>
+      </w:r>
+    </w:p>
+    <w:p>
+      <w:pPr>
+        <w:spacing w:line="240" w:lineRule="auto" w:after="120"/>
+        <w:ind w:left="0"/>
+      </w:pPr>
+      <w:r>
+        <w:rPr>
+          <w:rFonts w:ascii="Courier New" w:hAnsi="Courier New" w:eastAsia="Courier New"/>
+          <w:sz w:val="14"/>
+        </w:rPr>
+        <w:t>-- DriveEase initial schema: profiles, cars, bookings + RLS</w:t>
+        <w:br/>
+        <w:br/>
+        <w:t>CREATE EXTENSION IF NOT EXISTS pgcrypto;</w:t>
+        <w:br/>
+        <w:br/>
+        <w:t>-- Profiles (display name linked to auth user)</w:t>
+        <w:br/>
+        <w:t>CREATE TABLE public.profiles (</w:t>
+        <w:br/>
+        <w:t xml:space="preserve">  id uuid PRIMARY KEY REFERENCES auth.users (id) ON DELETE CASCADE,</w:t>
+        <w:br/>
+        <w:t xml:space="preserve">  name text NOT NULL,</w:t>
+        <w:br/>
+        <w:t xml:space="preserve">  email text,</w:t>
+        <w:br/>
+        <w:t xml:space="preserve">  created_at timestamptz NOT NULL DEFAULT now()</w:t>
+        <w:br/>
+        <w:t>);</w:t>
+        <w:br/>
+        <w:br/>
+        <w:t>ALTER TABLE public.profiles ENABLE ROW LEVEL SECURITY;</w:t>
+        <w:br/>
+        <w:br/>
+        <w:t>CREATE POLICY "profiles_select_own"</w:t>
+        <w:br/>
+        <w:t xml:space="preserve">  ON public.profiles FOR SELECT</w:t>
+        <w:br/>
+        <w:t xml:space="preserve">  TO authenticated</w:t>
+        <w:br/>
+        <w:t xml:space="preserve">  USING (id = auth.uid());</w:t>
+        <w:br/>
+        <w:br/>
+        <w:t>CREATE POLICY "profiles_select_admin"</w:t>
+        <w:br/>
+        <w:t xml:space="preserve">  ON public.profiles FOR SELECT</w:t>
+        <w:br/>
+        <w:t xml:space="preserve">  TO authenticated</w:t>
+        <w:br/>
+        <w:t xml:space="preserve">  USING ((auth.jwt() -&gt; 'app_metadata' -&gt;&gt; 'role') = 'admin');</w:t>
+        <w:br/>
+        <w:br/>
+        <w:t>CREATE POLICY "profiles_update_own"</w:t>
+        <w:br/>
+        <w:t xml:space="preserve">  ON public.profiles FOR UPDATE</w:t>
+        <w:br/>
+        <w:t xml:space="preserve">  TO authenticated</w:t>
+        <w:br/>
+        <w:t xml:space="preserve">  USING (id = auth.uid())</w:t>
+        <w:br/>
+        <w:t xml:space="preserve">  WITH CHECK (id = auth.uid());</w:t>
+        <w:br/>
+        <w:br/>
+        <w:t>CREATE POLICY "profiles_insert_own"</w:t>
+        <w:br/>
+        <w:t xml:space="preserve">  ON public.profiles FOR INSERT</w:t>
+        <w:br/>
+        <w:t xml:space="preserve">  TO authenticated</w:t>
+        <w:br/>
+        <w:t xml:space="preserve">  WITH CHECK (id = auth.uid());</w:t>
+        <w:br/>
+        <w:br/>
+        <w:t>-- Cars catalog</w:t>
+        <w:br/>
+        <w:t>CREATE TABLE public.cars (</w:t>
+        <w:br/>
+        <w:t xml:space="preserve">  id bigserial PRIMARY KEY,</w:t>
+        <w:br/>
+        <w:t xml:space="preserve">  name text NOT NULL,</w:t>
+        <w:br/>
+        <w:t xml:space="preserve">  seats integer NOT NULL CHECK (seats &gt;= 2),</w:t>
+        <w:br/>
+        <w:t xml:space="preserve">  fuel text NOT NULL,</w:t>
+        <w:br/>
+        <w:t xml:space="preserve">  price integer NOT NULL CHECK (price &gt;= 1),</w:t>
+        <w:br/>
+        <w:t xml:space="preserve">  available boolean NOT NULL DEFAULT true,</w:t>
+        <w:br/>
+        <w:t xml:space="preserve">  images text[] NOT NULL DEFAULT '{}',</w:t>
+        <w:br/>
+        <w:t xml:space="preserve">  description text NOT NULL</w:t>
+        <w:br/>
+        <w:t>);</w:t>
+        <w:br/>
+        <w:br/>
+        <w:t>ALTER TABLE public.cars ENABLE ROW LEVEL SECURITY;</w:t>
+        <w:br/>
+        <w:br/>
+        <w:t>CREATE POLICY "cars_select_public"</w:t>
+        <w:br/>
+        <w:t xml:space="preserve">  ON public.cars FOR SELECT</w:t>
+        <w:br/>
+        <w:t xml:space="preserve">  TO anon, authenticated</w:t>
+        <w:br/>
+        <w:t xml:space="preserve">  USING (true);</w:t>
+        <w:br/>
+        <w:br/>
+        <w:t>CREATE POLICY "cars_insert_admin"</w:t>
+        <w:br/>
+        <w:t xml:space="preserve">  ON public.cars FOR INSERT</w:t>
+        <w:br/>
+        <w:t xml:space="preserve">  TO authenticated</w:t>
+        <w:br/>
+        <w:t xml:space="preserve">  WITH CHECK ((auth.jwt() -&gt; 'app_metadata' -&gt;&gt; 'role') = 'admin');</w:t>
+        <w:br/>
+        <w:br/>
+        <w:t>CREATE POLICY "cars_update_admin"</w:t>
+        <w:br/>
+        <w:t xml:space="preserve">  ON public.cars FOR UPDATE</w:t>
+        <w:br/>
+        <w:t xml:space="preserve">  TO authenticated</w:t>
+        <w:br/>
+        <w:t xml:space="preserve">  USING ((auth.jwt() -&gt; 'app_metadata' -&gt;&gt; 'role') = 'admin')</w:t>
+        <w:br/>
+        <w:t xml:space="preserve">  WITH CHECK ((auth.jwt() -&gt; 'app_metadata' -&gt;&gt; 'role') = 'admin');</w:t>
+        <w:br/>
+        <w:br/>
+        <w:t>CREATE POLICY "cars_delete_admin"</w:t>
+        <w:br/>
+        <w:t xml:space="preserve">  ON public.cars FOR DELETE</w:t>
+        <w:br/>
+        <w:t xml:space="preserve">  TO authenticated</w:t>
+        <w:br/>
+        <w:t xml:space="preserve">  USING ((auth.jwt() -&gt; 'app_metadata' -&gt;&gt; 'role') = 'admin');</w:t>
+        <w:br/>
+        <w:br/>
+        <w:t>-- Bookings</w:t>
+        <w:br/>
+        <w:t>CREATE TABLE public.bookings (</w:t>
+        <w:br/>
+        <w:t xml:space="preserve">  id bigserial PRIMARY KEY,</w:t>
+        <w:br/>
+        <w:t xml:space="preserve">  user_id uuid NOT NULL REFERENCES auth.users (id) ON DELETE CASCADE,</w:t>
+        <w:br/>
+        <w:t xml:space="preserve">  car_id bigint NOT NULL REFERENCES public.cars (id) ON DELETE RESTRICT,</w:t>
+        <w:br/>
+        <w:t xml:space="preserve">  pickup_date date NOT NULL,</w:t>
+        <w:br/>
+        <w:t xml:space="preserve">  return_date date NOT NULL CHECK (return_date &gt;= pickup_date),</w:t>
+        <w:br/>
+        <w:t xml:space="preserve">  total_price integer NOT NULL CHECK (total_price &gt;= 0),</w:t>
+        <w:br/>
+        <w:t xml:space="preserve">  status text NOT NULL CHECK (status IN ('confirmed', 'pending', 'completed', 'cancelled')),</w:t>
+        <w:br/>
+        <w:t xml:space="preserve">  created_at timestamptz NOT NULL DEFAULT now()</w:t>
+        <w:br/>
+        <w:t>);</w:t>
+        <w:br/>
+        <w:br/>
+        <w:t>ALTER TABLE public.bookings ENABLE ROW LEVEL SECURITY;</w:t>
+        <w:br/>
+        <w:br/>
+        <w:t>CREATE POLICY "bookings_select_own"</w:t>
+        <w:br/>
+        <w:t xml:space="preserve">  ON public.bookings FOR SELECT</w:t>
+        <w:br/>
+        <w:t xml:space="preserve">  TO authenticated</w:t>
+        <w:br/>
+        <w:t xml:space="preserve">  USING (user_id = auth.uid());</w:t>
+        <w:br/>
+        <w:br/>
+        <w:t>CREATE POLICY "bookings_select_admin"</w:t>
+        <w:br/>
+        <w:t xml:space="preserve">  ON public.bookings FOR SELECT</w:t>
+        <w:br/>
+        <w:t xml:space="preserve">  TO authenticated</w:t>
+        <w:br/>
+        <w:t xml:space="preserve">  USING ((auth.jwt() -&gt; 'app_metadata' -&gt;&gt; 'role') = 'admin');</w:t>
+        <w:br/>
+        <w:br/>
+        <w:t>CREATE POLICY "bookings_insert_own"</w:t>
+        <w:br/>
+        <w:t xml:space="preserve">  ON public.bookings FOR INSERT</w:t>
+        <w:br/>
+        <w:t xml:space="preserve">  TO authenticated</w:t>
+        <w:br/>
+        <w:t xml:space="preserve">  WITH CHECK (user_id = auth.uid());</w:t>
+        <w:br/>
+        <w:br/>
+        <w:t>CREATE POLICY "bookings_update_admin"</w:t>
+        <w:br/>
+        <w:t xml:space="preserve">  ON public.bookings FOR UPDATE</w:t>
+        <w:br/>
+        <w:t xml:space="preserve">  TO authenticated</w:t>
+        <w:br/>
+        <w:t xml:space="preserve">  USING ((auth.jwt() -&gt; 'app_metadata' -&gt;&gt; 'role') = 'admin')</w:t>
+        <w:br/>
+        <w:t xml:space="preserve">  WITH CHECK ((auth.jwt() -&gt; 'app_metadata' -&gt;&gt; 'role') = 'admin');</w:t>
+        <w:br/>
+        <w:br/>
+        <w:t>-- Auto-create profile on signup (for future sign-up; seed uses direct inserts)</w:t>
+        <w:br/>
+        <w:t>CREATE OR REPLACE FUNCTION public.handle_new_user()</w:t>
+        <w:br/>
+        <w:br/>
+        <w:t>// ... remainder truncated for report length ...</w:t>
+      </w:r>
+    </w:p>
+    <w:p>
+      <w:pPr>
+        <w:spacing w:after="120" w:line="276" w:lineRule="auto"/>
+      </w:pPr>
+      <w:r>
+        <w:rPr>
+          <w:rFonts w:ascii="Times New Roman" w:hAnsi="Times New Roman" w:eastAsia="Times New Roman"/>
+          <w:b w:val="0"/>
+          <w:sz w:val="24"/>
+        </w:rPr>
+        <w:t>Total source lines included: 1050.</w:t>
+      </w:r>
+    </w:p>
+    <w:p>
+      <w:r>
+        <w:br w:type="page"/>
+      </w:r>
+    </w:p>
+    <w:p>
+      <w:pPr>
+        <w:spacing w:before="200" w:after="120"/>
+      </w:pPr>
+      <w:r>
+        <w:rPr>
+          <w:rFonts w:ascii="Times New Roman" w:hAnsi="Times New Roman" w:eastAsia="Times New Roman"/>
+          <w:b/>
+          <w:sz w:val="28"/>
+        </w:rPr>
+        <w:t>Appendix H — Application Screenshots</w:t>
       </w:r>
     </w:p>
     <w:p>
@@ -10327,7 +12548,7 @@
                 <w:b w:val="0"/>
                 <w:sz w:val="24"/>
               </w:rPr>
-              <w:t>G.1</w:t>
+              <w:t>H.1</w:t>
             </w:r>
           </w:p>
         </w:tc>
@@ -10389,7 +12610,7 @@
                 <w:b w:val="0"/>
                 <w:sz w:val="24"/>
               </w:rPr>
-              <w:t>G.2</w:t>
+              <w:t>H.2</w:t>
             </w:r>
           </w:p>
         </w:tc>
@@ -10451,7 +12672,7 @@
                 <w:b w:val="0"/>
                 <w:sz w:val="24"/>
               </w:rPr>
-              <w:t>G.3</w:t>
+              <w:t>H.3</w:t>
             </w:r>
           </w:p>
         </w:tc>
@@ -10513,7 +12734,7 @@
                 <w:b w:val="0"/>
                 <w:sz w:val="24"/>
               </w:rPr>
-              <w:t>G.4</w:t>
+              <w:t>H.4</w:t>
             </w:r>
           </w:p>
         </w:tc>
@@ -10575,7 +12796,7 @@
                 <w:b w:val="0"/>
                 <w:sz w:val="24"/>
               </w:rPr>
-              <w:t>G.5</w:t>
+              <w:t>H.5</w:t>
             </w:r>
           </w:p>
         </w:tc>
@@ -10637,7 +12858,7 @@
                 <w:b w:val="0"/>
                 <w:sz w:val="24"/>
               </w:rPr>
-              <w:t>G.6</w:t>
+              <w:t>H.6</w:t>
             </w:r>
           </w:p>
         </w:tc>
@@ -10699,7 +12920,7 @@
                 <w:b w:val="0"/>
                 <w:sz w:val="24"/>
               </w:rPr>
-              <w:t>G.7</w:t>
+              <w:t>H.7</w:t>
             </w:r>
           </w:p>
         </w:tc>
@@ -10761,7 +12982,7 @@
                 <w:b w:val="0"/>
                 <w:sz w:val="24"/>
               </w:rPr>
-              <w:t>G.8</w:t>
+              <w:t>H.8</w:t>
             </w:r>
           </w:p>
         </w:tc>
@@ -10823,7 +13044,7 @@
                 <w:b w:val="0"/>
                 <w:sz w:val="24"/>
               </w:rPr>
-              <w:t>G.9</w:t>
+              <w:t>H.9</w:t>
             </w:r>
           </w:p>
         </w:tc>
@@ -10885,7 +13106,7 @@
           <w:b w:val="0"/>
           <w:sz w:val="24"/>
         </w:rPr>
-        <w:t>Figure G.1 — Home page hero section with Browse Cars button</w:t>
+        <w:t>Figure H.1 — Home page hero section with Browse Cars button</w:t>
       </w:r>
     </w:p>
     <w:p>
@@ -10938,7 +13159,7 @@
           <w:b w:val="0"/>
           <w:sz w:val="24"/>
         </w:rPr>
-        <w:t>Figure G.2 — Cars catalog with search and filters</w:t>
+        <w:t>Figure H.2 — Cars catalog with search and filters</w:t>
       </w:r>
     </w:p>
     <w:p>
@@ -10991,7 +13212,7 @@
           <w:b w:val="0"/>
           <w:sz w:val="24"/>
         </w:rPr>
-        <w:t>Figure G.3 — Car detail with image gallery</w:t>
+        <w:t>Figure H.3 — Car detail with image gallery</w:t>
       </w:r>
     </w:p>
     <w:p>
@@ -11044,7 +13265,7 @@
           <w:b w:val="0"/>
           <w:sz w:val="24"/>
         </w:rPr>
-        <w:t>Figure G.4 — Login page</w:t>
+        <w:t>Figure H.4 — Login page</w:t>
       </w:r>
     </w:p>
     <w:p>
@@ -11097,7 +13318,7 @@
           <w:b w:val="0"/>
           <w:sz w:val="24"/>
         </w:rPr>
-        <w:t>Figure G.5 — My Bookings table</w:t>
+        <w:t>Figure H.5 — My Bookings table</w:t>
       </w:r>
     </w:p>
     <w:p>
@@ -11150,7 +13371,7 @@
           <w:b w:val="0"/>
           <w:sz w:val="24"/>
         </w:rPr>
-        <w:t>Figure G.6 — Booking form with date pickers</w:t>
+        <w:t>Figure H.6 — Booking form with date pickers</w:t>
       </w:r>
     </w:p>
     <w:p>
@@ -11203,7 +13424,7 @@
           <w:b w:val="0"/>
           <w:sz w:val="24"/>
         </w:rPr>
-        <w:t>Figure G.7 — Admin dashboard statistics</w:t>
+        <w:t>Figure H.7 — Admin dashboard statistics</w:t>
       </w:r>
     </w:p>
     <w:p>
@@ -11256,7 +13477,7 @@
           <w:b w:val="0"/>
           <w:sz w:val="24"/>
         </w:rPr>
-        <w:t>Figure G.8 — Admin cars management</w:t>
+        <w:t>Figure H.8 — Admin cars management</w:t>
       </w:r>
     </w:p>
     <w:p>
@@ -11309,7 +13530,7 @@
           <w:b w:val="0"/>
           <w:sz w:val="24"/>
         </w:rPr>
-        <w:t>Figure G.9 — Admin bookings management</w:t>
+        <w:t>Figure H.9 — Admin bookings management</w:t>
       </w:r>
     </w:p>
     <w:p>
@@ -11362,7 +13583,7 @@
           <w:b w:val="0"/>
           <w:sz w:val="24"/>
         </w:rPr>
-        <w:t>Figures G.10 (Supabase Table Editor) and G.11 (Vercel deployment) should be captured manually as 10-supabase-tables.png and 11-vercel-deploy.png.</w:t>
+        <w:t>Figures H.10 (Supabase Table Editor) and H.11 (Vercel deployment) should be captured manually as 10-supabase-tables.png and 11-vercel-deploy.png.</w:t>
       </w:r>
     </w:p>
     <w:p>
@@ -11375,7 +13596,7 @@
           <w:b/>
           <w:sz w:val="28"/>
         </w:rPr>
-        <w:t>Appendix H — Glossary</w:t>
+        <w:t>Appendix I — Glossary</w:t>
       </w:r>
     </w:p>
     <w:p>
@@ -11453,7 +13674,7 @@
           <w:b/>
           <w:sz w:val="28"/>
         </w:rPr>
-        <w:t>Appendix I — npm Scripts Reference</w:t>
+        <w:t>Appendix J — npm Scripts Reference</w:t>
       </w:r>
     </w:p>
     <w:tbl>
@@ -11717,7 +13938,7 @@
                 <w:b w:val="0"/>
                 <w:sz w:val="24"/>
               </w:rPr>
-              <w:t>Capture UI screenshots for Appendix G</w:t>
+              <w:t>Capture UI screenshots for Appendix H</w:t>
             </w:r>
           </w:p>
         </w:tc>
@@ -11756,648 +13977,6 @@
       </w:tr>
     </w:tbl>
     <w:p/>
-    <w:p>
-      <w:pPr>
-        <w:spacing w:before="200" w:after="120"/>
-      </w:pPr>
-      <w:r>
-        <w:rPr>
-          <w:rFonts w:ascii="Times New Roman" w:hAnsi="Times New Roman" w:eastAsia="Times New Roman"/>
-          <w:b/>
-          <w:sz w:val="28"/>
-        </w:rPr>
-        <w:t>Appendix J — Source Code Listing</w:t>
-      </w:r>
-    </w:p>
-    <w:p>
-      <w:pPr>
-        <w:spacing w:after="120" w:line="276" w:lineRule="auto"/>
-      </w:pPr>
-      <w:r>
-        <w:rPr>
-          <w:rFonts w:ascii="Times New Roman" w:hAnsi="Times New Roman" w:eastAsia="Times New Roman"/>
-          <w:b w:val="0"/>
-          <w:sz w:val="24"/>
-        </w:rPr>
-        <w:t>Main source files for DriveEase. Full repository: https://github.com/ghariharanit/car-rental (branch main).</w:t>
-      </w:r>
-    </w:p>
-    <w:tbl>
-      <w:tblPr>
-        <w:tblStyle w:val="TableGrid"/>
-        <w:tblW w:type="auto" w:w="0"/>
-        <w:tblLook w:firstColumn="1" w:firstRow="1" w:lastColumn="0" w:lastRow="0" w:noHBand="0" w:noVBand="1" w:val="04A0"/>
-      </w:tblPr>
-      <w:tblGrid>
-        <w:gridCol w:w="3120"/>
-        <w:gridCol w:w="3120"/>
-        <w:gridCol w:w="3120"/>
-      </w:tblGrid>
-      <w:tr>
-        <w:tc>
-          <w:tcPr>
-            <w:tcW w:type="dxa" w:w="3120"/>
-          </w:tcPr>
-          <w:p>
-            <w:r>
-              <w:rPr>
-                <w:rFonts w:ascii="Times New Roman" w:hAnsi="Times New Roman" w:eastAsia="Times New Roman"/>
-                <w:b/>
-                <w:sz w:val="24"/>
-              </w:rPr>
-              <w:t>Layer</w:t>
-            </w:r>
-          </w:p>
-        </w:tc>
-        <w:tc>
-          <w:tcPr>
-            <w:tcW w:type="dxa" w:w="3120"/>
-          </w:tcPr>
-          <w:p>
-            <w:r>
-              <w:rPr>
-                <w:rFonts w:ascii="Times New Roman" w:hAnsi="Times New Roman" w:eastAsia="Times New Roman"/>
-                <w:b/>
-                <w:sz w:val="24"/>
-              </w:rPr>
-              <w:t>Path</w:t>
-            </w:r>
-          </w:p>
-        </w:tc>
-        <w:tc>
-          <w:tcPr>
-            <w:tcW w:type="dxa" w:w="3120"/>
-          </w:tcPr>
-          <w:p>
-            <w:r>
-              <w:rPr>
-                <w:rFonts w:ascii="Times New Roman" w:hAnsi="Times New Roman" w:eastAsia="Times New Roman"/>
-                <w:b/>
-                <w:sz w:val="24"/>
-              </w:rPr>
-              <w:t>Description</w:t>
-            </w:r>
-          </w:p>
-        </w:tc>
-      </w:tr>
-      <w:tr>
-        <w:tc>
-          <w:tcPr>
-            <w:tcW w:type="dxa" w:w="3120"/>
-          </w:tcPr>
-          <w:p>
-            <w:r>
-              <w:rPr>
-                <w:rFonts w:ascii="Times New Roman" w:hAnsi="Times New Roman" w:eastAsia="Times New Roman"/>
-                <w:b w:val="0"/>
-                <w:sz w:val="24"/>
-              </w:rPr>
-              <w:t>Routes</w:t>
-            </w:r>
-          </w:p>
-        </w:tc>
-        <w:tc>
-          <w:tcPr>
-            <w:tcW w:type="dxa" w:w="3120"/>
-          </w:tcPr>
-          <w:p>
-            <w:r>
-              <w:rPr>
-                <w:rFonts w:ascii="Times New Roman" w:hAnsi="Times New Roman" w:eastAsia="Times New Roman"/>
-                <w:b w:val="0"/>
-                <w:sz w:val="24"/>
-              </w:rPr>
-              <w:t>app/page.tsx</w:t>
-            </w:r>
-          </w:p>
-        </w:tc>
-        <w:tc>
-          <w:tcPr>
-            <w:tcW w:type="dxa" w:w="3120"/>
-          </w:tcPr>
-          <w:p>
-            <w:r>
-              <w:rPr>
-                <w:rFonts w:ascii="Times New Roman" w:hAnsi="Times New Roman" w:eastAsia="Times New Roman"/>
-                <w:b w:val="0"/>
-                <w:sz w:val="24"/>
-              </w:rPr>
-              <w:t>Home page</w:t>
-            </w:r>
-          </w:p>
-        </w:tc>
-      </w:tr>
-      <w:tr>
-        <w:tc>
-          <w:tcPr>
-            <w:tcW w:type="dxa" w:w="3120"/>
-          </w:tcPr>
-          <w:p>
-            <w:r>
-              <w:rPr>
-                <w:rFonts w:ascii="Times New Roman" w:hAnsi="Times New Roman" w:eastAsia="Times New Roman"/>
-                <w:b w:val="0"/>
-                <w:sz w:val="24"/>
-              </w:rPr>
-              <w:t>Routes</w:t>
-            </w:r>
-          </w:p>
-        </w:tc>
-        <w:tc>
-          <w:tcPr>
-            <w:tcW w:type="dxa" w:w="3120"/>
-          </w:tcPr>
-          <w:p>
-            <w:r>
-              <w:rPr>
-                <w:rFonts w:ascii="Times New Roman" w:hAnsi="Times New Roman" w:eastAsia="Times New Roman"/>
-                <w:b w:val="0"/>
-                <w:sz w:val="24"/>
-              </w:rPr>
-              <w:t>app/cars/</w:t>
-            </w:r>
-          </w:p>
-        </w:tc>
-        <w:tc>
-          <w:tcPr>
-            <w:tcW w:type="dxa" w:w="3120"/>
-          </w:tcPr>
-          <w:p>
-            <w:r>
-              <w:rPr>
-                <w:rFonts w:ascii="Times New Roman" w:hAnsi="Times New Roman" w:eastAsia="Times New Roman"/>
-                <w:b w:val="0"/>
-                <w:sz w:val="24"/>
-              </w:rPr>
-              <w:t>Catalog and car detail pages</w:t>
-            </w:r>
-          </w:p>
-        </w:tc>
-      </w:tr>
-      <w:tr>
-        <w:tc>
-          <w:tcPr>
-            <w:tcW w:type="dxa" w:w="3120"/>
-          </w:tcPr>
-          <w:p>
-            <w:r>
-              <w:rPr>
-                <w:rFonts w:ascii="Times New Roman" w:hAnsi="Times New Roman" w:eastAsia="Times New Roman"/>
-                <w:b w:val="0"/>
-                <w:sz w:val="24"/>
-              </w:rPr>
-              <w:t>Routes</w:t>
-            </w:r>
-          </w:p>
-        </w:tc>
-        <w:tc>
-          <w:tcPr>
-            <w:tcW w:type="dxa" w:w="3120"/>
-          </w:tcPr>
-          <w:p>
-            <w:r>
-              <w:rPr>
-                <w:rFonts w:ascii="Times New Roman" w:hAnsi="Times New Roman" w:eastAsia="Times New Roman"/>
-                <w:b w:val="0"/>
-                <w:sz w:val="24"/>
-              </w:rPr>
-              <w:t>app/admin/</w:t>
-            </w:r>
-          </w:p>
-        </w:tc>
-        <w:tc>
-          <w:tcPr>
-            <w:tcW w:type="dxa" w:w="3120"/>
-          </w:tcPr>
-          <w:p>
-            <w:r>
-              <w:rPr>
-                <w:rFonts w:ascii="Times New Roman" w:hAnsi="Times New Roman" w:eastAsia="Times New Roman"/>
-                <w:b w:val="0"/>
-                <w:sz w:val="24"/>
-              </w:rPr>
-              <w:t>Admin dashboard, cars, bookings</w:t>
-            </w:r>
-          </w:p>
-        </w:tc>
-      </w:tr>
-      <w:tr>
-        <w:tc>
-          <w:tcPr>
-            <w:tcW w:type="dxa" w:w="3120"/>
-          </w:tcPr>
-          <w:p>
-            <w:r>
-              <w:rPr>
-                <w:rFonts w:ascii="Times New Roman" w:hAnsi="Times New Roman" w:eastAsia="Times New Roman"/>
-                <w:b w:val="0"/>
-                <w:sz w:val="24"/>
-              </w:rPr>
-              <w:t>Server Actions</w:t>
-            </w:r>
-          </w:p>
-        </w:tc>
-        <w:tc>
-          <w:tcPr>
-            <w:tcW w:type="dxa" w:w="3120"/>
-          </w:tcPr>
-          <w:p>
-            <w:r>
-              <w:rPr>
-                <w:rFonts w:ascii="Times New Roman" w:hAnsi="Times New Roman" w:eastAsia="Times New Roman"/>
-                <w:b w:val="0"/>
-                <w:sz w:val="24"/>
-              </w:rPr>
-              <w:t>app/actions/</w:t>
-            </w:r>
-          </w:p>
-        </w:tc>
-        <w:tc>
-          <w:tcPr>
-            <w:tcW w:type="dxa" w:w="3120"/>
-          </w:tcPr>
-          <w:p>
-            <w:r>
-              <w:rPr>
-                <w:rFonts w:ascii="Times New Roman" w:hAnsi="Times New Roman" w:eastAsia="Times New Roman"/>
-                <w:b w:val="0"/>
-                <w:sz w:val="24"/>
-              </w:rPr>
-              <w:t>Auth, booking, admin mutations</w:t>
-            </w:r>
-          </w:p>
-        </w:tc>
-      </w:tr>
-      <w:tr>
-        <w:tc>
-          <w:tcPr>
-            <w:tcW w:type="dxa" w:w="3120"/>
-          </w:tcPr>
-          <w:p>
-            <w:r>
-              <w:rPr>
-                <w:rFonts w:ascii="Times New Roman" w:hAnsi="Times New Roman" w:eastAsia="Times New Roman"/>
-                <w:b w:val="0"/>
-                <w:sz w:val="24"/>
-              </w:rPr>
-              <w:t>Middleware</w:t>
-            </w:r>
-          </w:p>
-        </w:tc>
-        <w:tc>
-          <w:tcPr>
-            <w:tcW w:type="dxa" w:w="3120"/>
-          </w:tcPr>
-          <w:p>
-            <w:r>
-              <w:rPr>
-                <w:rFonts w:ascii="Times New Roman" w:hAnsi="Times New Roman" w:eastAsia="Times New Roman"/>
-                <w:b w:val="0"/>
-                <w:sz w:val="24"/>
-              </w:rPr>
-              <w:t>middleware.ts</w:t>
-            </w:r>
-          </w:p>
-        </w:tc>
-        <w:tc>
-          <w:tcPr>
-            <w:tcW w:type="dxa" w:w="3120"/>
-          </w:tcPr>
-          <w:p>
-            <w:r>
-              <w:rPr>
-                <w:rFonts w:ascii="Times New Roman" w:hAnsi="Times New Roman" w:eastAsia="Times New Roman"/>
-                <w:b w:val="0"/>
-                <w:sz w:val="24"/>
-              </w:rPr>
-              <w:t>Session refresh and route guards</w:t>
-            </w:r>
-          </w:p>
-        </w:tc>
-      </w:tr>
-      <w:tr>
-        <w:tc>
-          <w:tcPr>
-            <w:tcW w:type="dxa" w:w="3120"/>
-          </w:tcPr>
-          <w:p>
-            <w:r>
-              <w:rPr>
-                <w:rFonts w:ascii="Times New Roman" w:hAnsi="Times New Roman" w:eastAsia="Times New Roman"/>
-                <w:b w:val="0"/>
-                <w:sz w:val="24"/>
-              </w:rPr>
-              <w:t>Supabase</w:t>
-            </w:r>
-          </w:p>
-        </w:tc>
-        <w:tc>
-          <w:tcPr>
-            <w:tcW w:type="dxa" w:w="3120"/>
-          </w:tcPr>
-          <w:p>
-            <w:r>
-              <w:rPr>
-                <w:rFonts w:ascii="Times New Roman" w:hAnsi="Times New Roman" w:eastAsia="Times New Roman"/>
-                <w:b w:val="0"/>
-                <w:sz w:val="24"/>
-              </w:rPr>
-              <w:t>lib/supabase/</w:t>
-            </w:r>
-          </w:p>
-        </w:tc>
-        <w:tc>
-          <w:tcPr>
-            <w:tcW w:type="dxa" w:w="3120"/>
-          </w:tcPr>
-          <w:p>
-            <w:r>
-              <w:rPr>
-                <w:rFonts w:ascii="Times New Roman" w:hAnsi="Times New Roman" w:eastAsia="Times New Roman"/>
-                <w:b w:val="0"/>
-                <w:sz w:val="24"/>
-              </w:rPr>
-              <w:t>Server, middleware, admin clients</w:t>
-            </w:r>
-          </w:p>
-        </w:tc>
-      </w:tr>
-      <w:tr>
-        <w:tc>
-          <w:tcPr>
-            <w:tcW w:type="dxa" w:w="3120"/>
-          </w:tcPr>
-          <w:p>
-            <w:r>
-              <w:rPr>
-                <w:rFonts w:ascii="Times New Roman" w:hAnsi="Times New Roman" w:eastAsia="Times New Roman"/>
-                <w:b w:val="0"/>
-                <w:sz w:val="24"/>
-              </w:rPr>
-              <w:t>Data</w:t>
-            </w:r>
-          </w:p>
-        </w:tc>
-        <w:tc>
-          <w:tcPr>
-            <w:tcW w:type="dxa" w:w="3120"/>
-          </w:tcPr>
-          <w:p>
-            <w:r>
-              <w:rPr>
-                <w:rFonts w:ascii="Times New Roman" w:hAnsi="Times New Roman" w:eastAsia="Times New Roman"/>
-                <w:b w:val="0"/>
-                <w:sz w:val="24"/>
-              </w:rPr>
-              <w:t>lib/data.ts, lib/bookings.ts</w:t>
-            </w:r>
-          </w:p>
-        </w:tc>
-        <w:tc>
-          <w:tcPr>
-            <w:tcW w:type="dxa" w:w="3120"/>
-          </w:tcPr>
-          <w:p>
-            <w:r>
-              <w:rPr>
-                <w:rFonts w:ascii="Times New Roman" w:hAnsi="Times New Roman" w:eastAsia="Times New Roman"/>
-                <w:b w:val="0"/>
-                <w:sz w:val="24"/>
-              </w:rPr>
-              <w:t>Supabase read/write helpers</w:t>
-            </w:r>
-          </w:p>
-        </w:tc>
-      </w:tr>
-      <w:tr>
-        <w:tc>
-          <w:tcPr>
-            <w:tcW w:type="dxa" w:w="3120"/>
-          </w:tcPr>
-          <w:p>
-            <w:r>
-              <w:rPr>
-                <w:rFonts w:ascii="Times New Roman" w:hAnsi="Times New Roman" w:eastAsia="Times New Roman"/>
-                <w:b w:val="0"/>
-                <w:sz w:val="24"/>
-              </w:rPr>
-              <w:t>Database</w:t>
-            </w:r>
-          </w:p>
-        </w:tc>
-        <w:tc>
-          <w:tcPr>
-            <w:tcW w:type="dxa" w:w="3120"/>
-          </w:tcPr>
-          <w:p>
-            <w:r>
-              <w:rPr>
-                <w:rFonts w:ascii="Times New Roman" w:hAnsi="Times New Roman" w:eastAsia="Times New Roman"/>
-                <w:b w:val="0"/>
-                <w:sz w:val="24"/>
-              </w:rPr>
-              <w:t>supabase/migrations/</w:t>
-            </w:r>
-          </w:p>
-        </w:tc>
-        <w:tc>
-          <w:tcPr>
-            <w:tcW w:type="dxa" w:w="3120"/>
-          </w:tcPr>
-          <w:p>
-            <w:r>
-              <w:rPr>
-                <w:rFonts w:ascii="Times New Roman" w:hAnsi="Times New Roman" w:eastAsia="Times New Roman"/>
-                <w:b w:val="0"/>
-                <w:sz w:val="24"/>
-              </w:rPr>
-              <w:t>Schema and RLS SQL</w:t>
-            </w:r>
-          </w:p>
-        </w:tc>
-      </w:tr>
-      <w:tr>
-        <w:tc>
-          <w:tcPr>
-            <w:tcW w:type="dxa" w:w="3120"/>
-          </w:tcPr>
-          <w:p>
-            <w:r>
-              <w:rPr>
-                <w:rFonts w:ascii="Times New Roman" w:hAnsi="Times New Roman" w:eastAsia="Times New Roman"/>
-                <w:b w:val="0"/>
-                <w:sz w:val="24"/>
-              </w:rPr>
-              <w:t>Seed</w:t>
-            </w:r>
-          </w:p>
-        </w:tc>
-        <w:tc>
-          <w:tcPr>
-            <w:tcW w:type="dxa" w:w="3120"/>
-          </w:tcPr>
-          <w:p>
-            <w:r>
-              <w:rPr>
-                <w:rFonts w:ascii="Times New Roman" w:hAnsi="Times New Roman" w:eastAsia="Times New Roman"/>
-                <w:b w:val="0"/>
-                <w:sz w:val="24"/>
-              </w:rPr>
-              <w:t>scripts/seed-supabase.ts</w:t>
-            </w:r>
-          </w:p>
-        </w:tc>
-        <w:tc>
-          <w:tcPr>
-            <w:tcW w:type="dxa" w:w="3120"/>
-          </w:tcPr>
-          <w:p>
-            <w:r>
-              <w:rPr>
-                <w:rFonts w:ascii="Times New Roman" w:hAnsi="Times New Roman" w:eastAsia="Times New Roman"/>
-                <w:b w:val="0"/>
-                <w:sz w:val="24"/>
-              </w:rPr>
-              <w:t>Demo users, cars, bookings</w:t>
-            </w:r>
-          </w:p>
-        </w:tc>
-      </w:tr>
-      <w:tr>
-        <w:tc>
-          <w:tcPr>
-            <w:tcW w:type="dxa" w:w="3120"/>
-          </w:tcPr>
-          <w:p>
-            <w:r>
-              <w:rPr>
-                <w:rFonts w:ascii="Times New Roman" w:hAnsi="Times New Roman" w:eastAsia="Times New Roman"/>
-                <w:b w:val="0"/>
-                <w:sz w:val="24"/>
-              </w:rPr>
-              <w:t>Tests</w:t>
-            </w:r>
-          </w:p>
-        </w:tc>
-        <w:tc>
-          <w:tcPr>
-            <w:tcW w:type="dxa" w:w="3120"/>
-          </w:tcPr>
-          <w:p>
-            <w:r>
-              <w:rPr>
-                <w:rFonts w:ascii="Times New Roman" w:hAnsi="Times New Roman" w:eastAsia="Times New Roman"/>
-                <w:b w:val="0"/>
-                <w:sz w:val="24"/>
-              </w:rPr>
-              <w:t>e2e/, lib/*.test.ts</w:t>
-            </w:r>
-          </w:p>
-        </w:tc>
-        <w:tc>
-          <w:tcPr>
-            <w:tcW w:type="dxa" w:w="3120"/>
-          </w:tcPr>
-          <w:p>
-            <w:r>
-              <w:rPr>
-                <w:rFonts w:ascii="Times New Roman" w:hAnsi="Times New Roman" w:eastAsia="Times New Roman"/>
-                <w:b w:val="0"/>
-                <w:sz w:val="24"/>
-              </w:rPr>
-              <w:t>Playwright and Vitest tests</w:t>
-            </w:r>
-          </w:p>
-        </w:tc>
-      </w:tr>
-      <w:tr>
-        <w:tc>
-          <w:tcPr>
-            <w:tcW w:type="dxa" w:w="3120"/>
-          </w:tcPr>
-          <w:p>
-            <w:r>
-              <w:rPr>
-                <w:rFonts w:ascii="Times New Roman" w:hAnsi="Times New Roman" w:eastAsia="Times New Roman"/>
-                <w:b w:val="0"/>
-                <w:sz w:val="24"/>
-              </w:rPr>
-              <w:t>Docs</w:t>
-            </w:r>
-          </w:p>
-        </w:tc>
-        <w:tc>
-          <w:tcPr>
-            <w:tcW w:type="dxa" w:w="3120"/>
-          </w:tcPr>
-          <w:p>
-            <w:r>
-              <w:rPr>
-                <w:rFonts w:ascii="Times New Roman" w:hAnsi="Times New Roman" w:eastAsia="Times New Roman"/>
-                <w:b w:val="0"/>
-                <w:sz w:val="24"/>
-              </w:rPr>
-              <w:t>docs/, scripts/generate-project-doc.py</w:t>
-            </w:r>
-          </w:p>
-        </w:tc>
-        <w:tc>
-          <w:tcPr>
-            <w:tcW w:type="dxa" w:w="3120"/>
-          </w:tcPr>
-          <w:p>
-            <w:r>
-              <w:rPr>
-                <w:rFonts w:ascii="Times New Roman" w:hAnsi="Times New Roman" w:eastAsia="Times New Roman"/>
-                <w:b w:val="0"/>
-                <w:sz w:val="24"/>
-              </w:rPr>
-              <w:t>Report and generator</w:t>
-            </w:r>
-          </w:p>
-        </w:tc>
-      </w:tr>
-    </w:tbl>
-    <w:p/>
-    <w:p>
-      <w:pPr>
-        <w:spacing w:after="120" w:line="276" w:lineRule="auto"/>
-      </w:pPr>
-      <w:r>
-        <w:rPr>
-          <w:rFonts w:ascii="Times New Roman" w:hAnsi="Times New Roman" w:eastAsia="Times New Roman"/>
-          <w:b w:val="0"/>
-          <w:sz w:val="24"/>
-        </w:rPr>
-        <w:t>Representative excerpt — middleware.ts:</w:t>
-      </w:r>
-    </w:p>
-    <w:p>
-      <w:pPr>
-        <w:spacing w:after="120" w:line="276" w:lineRule="auto"/>
-      </w:pPr>
-      <w:r>
-        <w:rPr>
-          <w:rFonts w:ascii="Times New Roman" w:hAnsi="Times New Roman" w:eastAsia="Times New Roman"/>
-          <w:b w:val="0"/>
-          <w:sz w:val="24"/>
-        </w:rPr>
-        <w:t>export async function middleware(request) { return await updateSession(request); }</w:t>
-      </w:r>
-    </w:p>
-    <w:p>
-      <w:pPr>
-        <w:spacing w:after="120" w:line="276" w:lineRule="auto"/>
-      </w:pPr>
-      <w:r>
-        <w:rPr>
-          <w:rFonts w:ascii="Times New Roman" w:hAnsi="Times New Roman" w:eastAsia="Times New Roman"/>
-          <w:b w:val="0"/>
-          <w:sz w:val="24"/>
-        </w:rPr>
-        <w:t>Representative excerpt — createBookingAction validates session before Supabase insert.</w:t>
-      </w:r>
-    </w:p>
     <w:p>
       <w:r>
         <w:br w:type="page"/>

</xml_diff>